<commit_message>
Sửa tên GVHD thành Th.S Nguyễn Văn Danh trên báo cáo, slide và tài liệu
</commit_message>
<xml_diff>
--- a/docs/BaoCao_PhanManhHonHop.docx
+++ b/docs/BaoCao_PhanManhHonHop.docx
@@ -140,7 +140,7 @@
       </w:r>
       <w:r>
         <w:tab/>
-        <w:t>Nguyễn Văn Danh</w:t>
+        <w:t>Th.S Nguyễn Văn Danh</w:t>
       </w:r>
     </w:p>
     <w:p>
@@ -248,7 +248,7 @@
         <w:jc w:val="both"/>
       </w:pPr>
       <w:r>
-        <w:t>Để hoàn thành đồ án môn học Cơ Sở Dữ Liệu Nâng Cao, nhóm chúng em xin gửi lời cảm ơn chân thành đến thầy Nguyễn Văn Danh, giảng viên hướng dẫn. Trong suốt quá trình học tập và thực hiện đề tài, thầy đã tận tình giảng dạy, định hướng và góp ý, giúp nhóm hiểu rõ hơn các vấn đề trong thiết kế cơ sở dữ liệu phân tán.</w:t>
+        <w:t>Để hoàn thành đồ án môn học Cơ Sở Dữ Liệu Nâng Cao, nhóm chúng em xin gửi lời cảm ơn chân thành đến thầy Th.S Nguyễn Văn Danh, giảng viên hướng dẫn. Trong suốt quá trình học tập và thực hiện đề tài, thầy đã tận tình giảng dạy, định hướng và góp ý, giúp nhóm hiểu rõ hơn các vấn đề trong thiết kế cơ sở dữ liệu phân tán.</w:t>
       </w:r>
     </w:p>
     <w:p>
@@ -1153,7 +1153,7 @@
     <w:sdt>
       <w:sdtPr>
         <w:alias w:val="Mục lục"/>
-        <w:id w:val="226578130"/>
+        <w:id w:val="907498413"/>
       </w:sdtPr>
       <w:sdtEndPr/>
       <w:sdtContent>
@@ -1181,7 +1181,7 @@
           <w:r>
             <w:fldChar w:fldCharType="separate"/>
           </w:r>
-          <w:hyperlink w:anchor="_Toc243902268" w:history="1">
+          <w:hyperlink w:anchor="_Toc244207652" w:history="1">
             <w:r>
               <w:rPr>
                 <w:rStyle w:val="Hyperlink"/>
@@ -1205,7 +1205,7 @@
               <w:rPr>
                 <w:noProof/>
               </w:rPr>
-              <w:instrText xml:space="preserve"> PAGEREF _Toc243902268 \h </w:instrText>
+              <w:instrText xml:space="preserve"> PAGEREF _Toc244207652 \h </w:instrText>
             </w:r>
             <w:r>
               <w:rPr>
@@ -1247,7 +1247,7 @@
               <w14:ligatures w14:val="standardContextual"/>
             </w:rPr>
           </w:pPr>
-          <w:hyperlink w:anchor="_Toc243902269" w:history="1">
+          <w:hyperlink w:anchor="_Toc244207653" w:history="1">
             <w:r>
               <w:rPr>
                 <w:rStyle w:val="Hyperlink"/>
@@ -1271,7 +1271,7 @@
               <w:rPr>
                 <w:noProof/>
               </w:rPr>
-              <w:instrText xml:space="preserve"> PAGEREF _Toc243902269 \h </w:instrText>
+              <w:instrText xml:space="preserve"> PAGEREF _Toc244207653 \h </w:instrText>
             </w:r>
             <w:r>
               <w:rPr>
@@ -1313,7 +1313,7 @@
               <w14:ligatures w14:val="standardContextual"/>
             </w:rPr>
           </w:pPr>
-          <w:hyperlink w:anchor="_Toc243902270" w:history="1">
+          <w:hyperlink w:anchor="_Toc244207654" w:history="1">
             <w:r>
               <w:rPr>
                 <w:rStyle w:val="Hyperlink"/>
@@ -1337,7 +1337,7 @@
               <w:rPr>
                 <w:noProof/>
               </w:rPr>
-              <w:instrText xml:space="preserve"> PAGEREF _Toc243902270 \h </w:instrText>
+              <w:instrText xml:space="preserve"> PAGEREF _Toc244207654 \h </w:instrText>
             </w:r>
             <w:r>
               <w:rPr>
@@ -1379,7 +1379,7 @@
               <w14:ligatures w14:val="standardContextual"/>
             </w:rPr>
           </w:pPr>
-          <w:hyperlink w:anchor="_Toc243902271" w:history="1">
+          <w:hyperlink w:anchor="_Toc244207655" w:history="1">
             <w:r>
               <w:rPr>
                 <w:rStyle w:val="Hyperlink"/>
@@ -1403,7 +1403,7 @@
               <w:rPr>
                 <w:noProof/>
               </w:rPr>
-              <w:instrText xml:space="preserve"> PAGEREF _Toc243902271 \h </w:instrText>
+              <w:instrText xml:space="preserve"> PAGEREF _Toc244207655 \h </w:instrText>
             </w:r>
             <w:r>
               <w:rPr>
@@ -1445,7 +1445,7 @@
               <w14:ligatures w14:val="standardContextual"/>
             </w:rPr>
           </w:pPr>
-          <w:hyperlink w:anchor="_Toc243902272" w:history="1">
+          <w:hyperlink w:anchor="_Toc244207656" w:history="1">
             <w:r>
               <w:rPr>
                 <w:rStyle w:val="Hyperlink"/>
@@ -1469,7 +1469,7 @@
               <w:rPr>
                 <w:noProof/>
               </w:rPr>
-              <w:instrText xml:space="preserve"> PAGEREF _Toc243902272 \h </w:instrText>
+              <w:instrText xml:space="preserve"> PAGEREF _Toc244207656 \h </w:instrText>
             </w:r>
             <w:r>
               <w:rPr>
@@ -1511,7 +1511,7 @@
               <w14:ligatures w14:val="standardContextual"/>
             </w:rPr>
           </w:pPr>
-          <w:hyperlink w:anchor="_Toc243902273" w:history="1">
+          <w:hyperlink w:anchor="_Toc244207657" w:history="1">
             <w:r>
               <w:rPr>
                 <w:rStyle w:val="Hyperlink"/>
@@ -1535,7 +1535,7 @@
               <w:rPr>
                 <w:noProof/>
               </w:rPr>
-              <w:instrText xml:space="preserve"> PAGEREF _Toc243902273 \h </w:instrText>
+              <w:instrText xml:space="preserve"> PAGEREF _Toc244207657 \h </w:instrText>
             </w:r>
             <w:r>
               <w:rPr>
@@ -1577,7 +1577,7 @@
               <w14:ligatures w14:val="standardContextual"/>
             </w:rPr>
           </w:pPr>
-          <w:hyperlink w:anchor="_Toc243902274" w:history="1">
+          <w:hyperlink w:anchor="_Toc244207658" w:history="1">
             <w:r>
               <w:rPr>
                 <w:rStyle w:val="Hyperlink"/>
@@ -1601,7 +1601,7 @@
               <w:rPr>
                 <w:noProof/>
               </w:rPr>
-              <w:instrText xml:space="preserve"> PAGEREF _Toc243902274 \h </w:instrText>
+              <w:instrText xml:space="preserve"> PAGEREF _Toc244207658 \h </w:instrText>
             </w:r>
             <w:r>
               <w:rPr>
@@ -1643,7 +1643,7 @@
               <w14:ligatures w14:val="standardContextual"/>
             </w:rPr>
           </w:pPr>
-          <w:hyperlink w:anchor="_Toc243902275" w:history="1">
+          <w:hyperlink w:anchor="_Toc244207659" w:history="1">
             <w:r>
               <w:rPr>
                 <w:rStyle w:val="Hyperlink"/>
@@ -1667,7 +1667,7 @@
               <w:rPr>
                 <w:noProof/>
               </w:rPr>
-              <w:instrText xml:space="preserve"> PAGEREF _Toc243902275 \h </w:instrText>
+              <w:instrText xml:space="preserve"> PAGEREF _Toc244207659 \h </w:instrText>
             </w:r>
             <w:r>
               <w:rPr>
@@ -1709,7 +1709,7 @@
               <w14:ligatures w14:val="standardContextual"/>
             </w:rPr>
           </w:pPr>
-          <w:hyperlink w:anchor="_Toc243902276" w:history="1">
+          <w:hyperlink w:anchor="_Toc244207660" w:history="1">
             <w:r>
               <w:rPr>
                 <w:rStyle w:val="Hyperlink"/>
@@ -1733,7 +1733,7 @@
               <w:rPr>
                 <w:noProof/>
               </w:rPr>
-              <w:instrText xml:space="preserve"> PAGEREF _Toc243902276 \h </w:instrText>
+              <w:instrText xml:space="preserve"> PAGEREF _Toc244207660 \h </w:instrText>
             </w:r>
             <w:r>
               <w:rPr>
@@ -1775,7 +1775,7 @@
               <w14:ligatures w14:val="standardContextual"/>
             </w:rPr>
           </w:pPr>
-          <w:hyperlink w:anchor="_Toc243902277" w:history="1">
+          <w:hyperlink w:anchor="_Toc244207661" w:history="1">
             <w:r>
               <w:rPr>
                 <w:rStyle w:val="Hyperlink"/>
@@ -1799,7 +1799,7 @@
               <w:rPr>
                 <w:noProof/>
               </w:rPr>
-              <w:instrText xml:space="preserve"> PAGEREF _Toc243902277 \h </w:instrText>
+              <w:instrText xml:space="preserve"> PAGEREF _Toc244207661 \h </w:instrText>
             </w:r>
             <w:r>
               <w:rPr>
@@ -1841,7 +1841,7 @@
               <w14:ligatures w14:val="standardContextual"/>
             </w:rPr>
           </w:pPr>
-          <w:hyperlink w:anchor="_Toc243902278" w:history="1">
+          <w:hyperlink w:anchor="_Toc244207662" w:history="1">
             <w:r>
               <w:rPr>
                 <w:rStyle w:val="Hyperlink"/>
@@ -1865,7 +1865,7 @@
               <w:rPr>
                 <w:noProof/>
               </w:rPr>
-              <w:instrText xml:space="preserve"> PAGEREF _Toc243902278 \h </w:instrText>
+              <w:instrText xml:space="preserve"> PAGEREF _Toc244207662 \h </w:instrText>
             </w:r>
             <w:r>
               <w:rPr>
@@ -1907,7 +1907,7 @@
               <w14:ligatures w14:val="standardContextual"/>
             </w:rPr>
           </w:pPr>
-          <w:hyperlink w:anchor="_Toc243902279" w:history="1">
+          <w:hyperlink w:anchor="_Toc244207663" w:history="1">
             <w:r>
               <w:rPr>
                 <w:rStyle w:val="Hyperlink"/>
@@ -1931,7 +1931,7 @@
               <w:rPr>
                 <w:noProof/>
               </w:rPr>
-              <w:instrText xml:space="preserve"> PAGEREF _Toc243902279 \h </w:instrText>
+              <w:instrText xml:space="preserve"> PAGEREF _Toc244207663 \h </w:instrText>
             </w:r>
             <w:r>
               <w:rPr>
@@ -1973,7 +1973,7 @@
               <w14:ligatures w14:val="standardContextual"/>
             </w:rPr>
           </w:pPr>
-          <w:hyperlink w:anchor="_Toc243902280" w:history="1">
+          <w:hyperlink w:anchor="_Toc244207664" w:history="1">
             <w:r>
               <w:rPr>
                 <w:rStyle w:val="Hyperlink"/>
@@ -1997,7 +1997,7 @@
               <w:rPr>
                 <w:noProof/>
               </w:rPr>
-              <w:instrText xml:space="preserve"> PAGEREF _Toc243902280 \h </w:instrText>
+              <w:instrText xml:space="preserve"> PAGEREF _Toc244207664 \h </w:instrText>
             </w:r>
             <w:r>
               <w:rPr>
@@ -2039,7 +2039,7 @@
               <w14:ligatures w14:val="standardContextual"/>
             </w:rPr>
           </w:pPr>
-          <w:hyperlink w:anchor="_Toc243902281" w:history="1">
+          <w:hyperlink w:anchor="_Toc244207665" w:history="1">
             <w:r>
               <w:rPr>
                 <w:rStyle w:val="Hyperlink"/>
@@ -2063,7 +2063,7 @@
               <w:rPr>
                 <w:noProof/>
               </w:rPr>
-              <w:instrText xml:space="preserve"> PAGEREF _Toc243902281 \h </w:instrText>
+              <w:instrText xml:space="preserve"> PAGEREF _Toc244207665 \h </w:instrText>
             </w:r>
             <w:r>
               <w:rPr>
@@ -2105,7 +2105,7 @@
               <w14:ligatures w14:val="standardContextual"/>
             </w:rPr>
           </w:pPr>
-          <w:hyperlink w:anchor="_Toc243902282" w:history="1">
+          <w:hyperlink w:anchor="_Toc244207666" w:history="1">
             <w:r>
               <w:rPr>
                 <w:rStyle w:val="Hyperlink"/>
@@ -2129,7 +2129,7 @@
               <w:rPr>
                 <w:noProof/>
               </w:rPr>
-              <w:instrText xml:space="preserve"> PAGEREF _Toc243902282 \h </w:instrText>
+              <w:instrText xml:space="preserve"> PAGEREF _Toc244207666 \h </w:instrText>
             </w:r>
             <w:r>
               <w:rPr>
@@ -2171,7 +2171,7 @@
               <w14:ligatures w14:val="standardContextual"/>
             </w:rPr>
           </w:pPr>
-          <w:hyperlink w:anchor="_Toc243902283" w:history="1">
+          <w:hyperlink w:anchor="_Toc244207667" w:history="1">
             <w:r>
               <w:rPr>
                 <w:rStyle w:val="Hyperlink"/>
@@ -2195,7 +2195,7 @@
               <w:rPr>
                 <w:noProof/>
               </w:rPr>
-              <w:instrText xml:space="preserve"> PAGEREF _Toc243902283 \h </w:instrText>
+              <w:instrText xml:space="preserve"> PAGEREF _Toc244207667 \h </w:instrText>
             </w:r>
             <w:r>
               <w:rPr>
@@ -2237,7 +2237,7 @@
               <w14:ligatures w14:val="standardContextual"/>
             </w:rPr>
           </w:pPr>
-          <w:hyperlink w:anchor="_Toc243902284" w:history="1">
+          <w:hyperlink w:anchor="_Toc244207668" w:history="1">
             <w:r>
               <w:rPr>
                 <w:rStyle w:val="Hyperlink"/>
@@ -2261,7 +2261,7 @@
               <w:rPr>
                 <w:noProof/>
               </w:rPr>
-              <w:instrText xml:space="preserve"> PAGEREF _Toc243902284 \h </w:instrText>
+              <w:instrText xml:space="preserve"> PAGEREF _Toc244207668 \h </w:instrText>
             </w:r>
             <w:r>
               <w:rPr>
@@ -2303,7 +2303,7 @@
               <w14:ligatures w14:val="standardContextual"/>
             </w:rPr>
           </w:pPr>
-          <w:hyperlink w:anchor="_Toc243902285" w:history="1">
+          <w:hyperlink w:anchor="_Toc244207669" w:history="1">
             <w:r>
               <w:rPr>
                 <w:rStyle w:val="Hyperlink"/>
@@ -2327,7 +2327,7 @@
               <w:rPr>
                 <w:noProof/>
               </w:rPr>
-              <w:instrText xml:space="preserve"> PAGEREF _Toc243902285 \h </w:instrText>
+              <w:instrText xml:space="preserve"> PAGEREF _Toc244207669 \h </w:instrText>
             </w:r>
             <w:r>
               <w:rPr>
@@ -2369,7 +2369,7 @@
               <w14:ligatures w14:val="standardContextual"/>
             </w:rPr>
           </w:pPr>
-          <w:hyperlink w:anchor="_Toc243902286" w:history="1">
+          <w:hyperlink w:anchor="_Toc244207670" w:history="1">
             <w:r>
               <w:rPr>
                 <w:rStyle w:val="Hyperlink"/>
@@ -2393,7 +2393,7 @@
               <w:rPr>
                 <w:noProof/>
               </w:rPr>
-              <w:instrText xml:space="preserve"> PAGEREF _Toc243902286 \h </w:instrText>
+              <w:instrText xml:space="preserve"> PAGEREF _Toc244207670 \h </w:instrText>
             </w:r>
             <w:r>
               <w:rPr>
@@ -2435,7 +2435,7 @@
               <w14:ligatures w14:val="standardContextual"/>
             </w:rPr>
           </w:pPr>
-          <w:hyperlink w:anchor="_Toc243902287" w:history="1">
+          <w:hyperlink w:anchor="_Toc244207671" w:history="1">
             <w:r>
               <w:rPr>
                 <w:rStyle w:val="Hyperlink"/>
@@ -2459,7 +2459,7 @@
               <w:rPr>
                 <w:noProof/>
               </w:rPr>
-              <w:instrText xml:space="preserve"> PAGEREF _Toc243902287 \h </w:instrText>
+              <w:instrText xml:space="preserve"> PAGEREF _Toc244207671 \h </w:instrText>
             </w:r>
             <w:r>
               <w:rPr>
@@ -2501,7 +2501,7 @@
               <w14:ligatures w14:val="standardContextual"/>
             </w:rPr>
           </w:pPr>
-          <w:hyperlink w:anchor="_Toc243902288" w:history="1">
+          <w:hyperlink w:anchor="_Toc244207672" w:history="1">
             <w:r>
               <w:rPr>
                 <w:rStyle w:val="Hyperlink"/>
@@ -2525,7 +2525,7 @@
               <w:rPr>
                 <w:noProof/>
               </w:rPr>
-              <w:instrText xml:space="preserve"> PAGEREF _Toc243902288 \h </w:instrText>
+              <w:instrText xml:space="preserve"> PAGEREF _Toc244207672 \h </w:instrText>
             </w:r>
             <w:r>
               <w:rPr>
@@ -2567,7 +2567,7 @@
               <w14:ligatures w14:val="standardContextual"/>
             </w:rPr>
           </w:pPr>
-          <w:hyperlink w:anchor="_Toc243902289" w:history="1">
+          <w:hyperlink w:anchor="_Toc244207673" w:history="1">
             <w:r>
               <w:rPr>
                 <w:rStyle w:val="Hyperlink"/>
@@ -2591,7 +2591,7 @@
               <w:rPr>
                 <w:noProof/>
               </w:rPr>
-              <w:instrText xml:space="preserve"> PAGEREF _Toc243902289 \h </w:instrText>
+              <w:instrText xml:space="preserve"> PAGEREF _Toc244207673 \h </w:instrText>
             </w:r>
             <w:r>
               <w:rPr>
@@ -2633,7 +2633,7 @@
               <w14:ligatures w14:val="standardContextual"/>
             </w:rPr>
           </w:pPr>
-          <w:hyperlink w:anchor="_Toc243902290" w:history="1">
+          <w:hyperlink w:anchor="_Toc244207674" w:history="1">
             <w:r>
               <w:rPr>
                 <w:rStyle w:val="Hyperlink"/>
@@ -2657,7 +2657,7 @@
               <w:rPr>
                 <w:noProof/>
               </w:rPr>
-              <w:instrText xml:space="preserve"> PAGEREF _Toc243902290 \h </w:instrText>
+              <w:instrText xml:space="preserve"> PAGEREF _Toc244207674 \h </w:instrText>
             </w:r>
             <w:r>
               <w:rPr>
@@ -2699,7 +2699,7 @@
               <w14:ligatures w14:val="standardContextual"/>
             </w:rPr>
           </w:pPr>
-          <w:hyperlink w:anchor="_Toc243902291" w:history="1">
+          <w:hyperlink w:anchor="_Toc244207675" w:history="1">
             <w:r>
               <w:rPr>
                 <w:rStyle w:val="Hyperlink"/>
@@ -2723,7 +2723,7 @@
               <w:rPr>
                 <w:noProof/>
               </w:rPr>
-              <w:instrText xml:space="preserve"> PAGEREF _Toc243902291 \h </w:instrText>
+              <w:instrText xml:space="preserve"> PAGEREF _Toc244207675 \h </w:instrText>
             </w:r>
             <w:r>
               <w:rPr>
@@ -2765,7 +2765,7 @@
               <w14:ligatures w14:val="standardContextual"/>
             </w:rPr>
           </w:pPr>
-          <w:hyperlink w:anchor="_Toc243902292" w:history="1">
+          <w:hyperlink w:anchor="_Toc244207676" w:history="1">
             <w:r>
               <w:rPr>
                 <w:rStyle w:val="Hyperlink"/>
@@ -2789,7 +2789,7 @@
               <w:rPr>
                 <w:noProof/>
               </w:rPr>
-              <w:instrText xml:space="preserve"> PAGEREF _Toc243902292 \h </w:instrText>
+              <w:instrText xml:space="preserve"> PAGEREF _Toc244207676 \h </w:instrText>
             </w:r>
             <w:r>
               <w:rPr>
@@ -2831,7 +2831,7 @@
               <w14:ligatures w14:val="standardContextual"/>
             </w:rPr>
           </w:pPr>
-          <w:hyperlink w:anchor="_Toc243902293" w:history="1">
+          <w:hyperlink w:anchor="_Toc244207677" w:history="1">
             <w:r>
               <w:rPr>
                 <w:rStyle w:val="Hyperlink"/>
@@ -2855,7 +2855,7 @@
               <w:rPr>
                 <w:noProof/>
               </w:rPr>
-              <w:instrText xml:space="preserve"> PAGEREF _Toc243902293 \h </w:instrText>
+              <w:instrText xml:space="preserve"> PAGEREF _Toc244207677 \h </w:instrText>
             </w:r>
             <w:r>
               <w:rPr>
@@ -2897,7 +2897,7 @@
               <w14:ligatures w14:val="standardContextual"/>
             </w:rPr>
           </w:pPr>
-          <w:hyperlink w:anchor="_Toc243902294" w:history="1">
+          <w:hyperlink w:anchor="_Toc244207678" w:history="1">
             <w:r>
               <w:rPr>
                 <w:rStyle w:val="Hyperlink"/>
@@ -2921,7 +2921,7 @@
               <w:rPr>
                 <w:noProof/>
               </w:rPr>
-              <w:instrText xml:space="preserve"> PAGEREF _Toc243902294 \h </w:instrText>
+              <w:instrText xml:space="preserve"> PAGEREF _Toc244207678 \h </w:instrText>
             </w:r>
             <w:r>
               <w:rPr>
@@ -2963,7 +2963,7 @@
               <w14:ligatures w14:val="standardContextual"/>
             </w:rPr>
           </w:pPr>
-          <w:hyperlink w:anchor="_Toc243902295" w:history="1">
+          <w:hyperlink w:anchor="_Toc244207679" w:history="1">
             <w:r>
               <w:rPr>
                 <w:rStyle w:val="Hyperlink"/>
@@ -2987,7 +2987,7 @@
               <w:rPr>
                 <w:noProof/>
               </w:rPr>
-              <w:instrText xml:space="preserve"> PAGEREF _Toc243902295 \h </w:instrText>
+              <w:instrText xml:space="preserve"> PAGEREF _Toc244207679 \h </w:instrText>
             </w:r>
             <w:r>
               <w:rPr>
@@ -3029,7 +3029,7 @@
               <w14:ligatures w14:val="standardContextual"/>
             </w:rPr>
           </w:pPr>
-          <w:hyperlink w:anchor="_Toc243902296" w:history="1">
+          <w:hyperlink w:anchor="_Toc244207680" w:history="1">
             <w:r>
               <w:rPr>
                 <w:rStyle w:val="Hyperlink"/>
@@ -3053,7 +3053,7 @@
               <w:rPr>
                 <w:noProof/>
               </w:rPr>
-              <w:instrText xml:space="preserve"> PAGEREF _Toc243902296 \h </w:instrText>
+              <w:instrText xml:space="preserve"> PAGEREF _Toc244207680 \h </w:instrText>
             </w:r>
             <w:r>
               <w:rPr>
@@ -3095,7 +3095,7 @@
               <w14:ligatures w14:val="standardContextual"/>
             </w:rPr>
           </w:pPr>
-          <w:hyperlink w:anchor="_Toc243902297" w:history="1">
+          <w:hyperlink w:anchor="_Toc244207681" w:history="1">
             <w:r>
               <w:rPr>
                 <w:rStyle w:val="Hyperlink"/>
@@ -3119,7 +3119,7 @@
               <w:rPr>
                 <w:noProof/>
               </w:rPr>
-              <w:instrText xml:space="preserve"> PAGEREF _Toc243902297 \h </w:instrText>
+              <w:instrText xml:space="preserve"> PAGEREF _Toc244207681 \h </w:instrText>
             </w:r>
             <w:r>
               <w:rPr>
@@ -3161,7 +3161,7 @@
               <w14:ligatures w14:val="standardContextual"/>
             </w:rPr>
           </w:pPr>
-          <w:hyperlink w:anchor="_Toc243902298" w:history="1">
+          <w:hyperlink w:anchor="_Toc244207682" w:history="1">
             <w:r>
               <w:rPr>
                 <w:rStyle w:val="Hyperlink"/>
@@ -3185,7 +3185,7 @@
               <w:rPr>
                 <w:noProof/>
               </w:rPr>
-              <w:instrText xml:space="preserve"> PAGEREF _Toc243902298 \h </w:instrText>
+              <w:instrText xml:space="preserve"> PAGEREF _Toc244207682 \h </w:instrText>
             </w:r>
             <w:r>
               <w:rPr>
@@ -3227,7 +3227,7 @@
               <w14:ligatures w14:val="standardContextual"/>
             </w:rPr>
           </w:pPr>
-          <w:hyperlink w:anchor="_Toc243902299" w:history="1">
+          <w:hyperlink w:anchor="_Toc244207683" w:history="1">
             <w:r>
               <w:rPr>
                 <w:rStyle w:val="Hyperlink"/>
@@ -3251,7 +3251,7 @@
               <w:rPr>
                 <w:noProof/>
               </w:rPr>
-              <w:instrText xml:space="preserve"> PAGEREF _Toc243902299 \h </w:instrText>
+              <w:instrText xml:space="preserve"> PAGEREF _Toc244207683 \h </w:instrText>
             </w:r>
             <w:r>
               <w:rPr>
@@ -3293,7 +3293,7 @@
               <w14:ligatures w14:val="standardContextual"/>
             </w:rPr>
           </w:pPr>
-          <w:hyperlink w:anchor="_Toc243902300" w:history="1">
+          <w:hyperlink w:anchor="_Toc244207684" w:history="1">
             <w:r>
               <w:rPr>
                 <w:rStyle w:val="Hyperlink"/>
@@ -3317,7 +3317,7 @@
               <w:rPr>
                 <w:noProof/>
               </w:rPr>
-              <w:instrText xml:space="preserve"> PAGEREF _Toc243902300 \h </w:instrText>
+              <w:instrText xml:space="preserve"> PAGEREF _Toc244207684 \h </w:instrText>
             </w:r>
             <w:r>
               <w:rPr>
@@ -3359,7 +3359,7 @@
               <w14:ligatures w14:val="standardContextual"/>
             </w:rPr>
           </w:pPr>
-          <w:hyperlink w:anchor="_Toc243902301" w:history="1">
+          <w:hyperlink w:anchor="_Toc244207685" w:history="1">
             <w:r>
               <w:rPr>
                 <w:rStyle w:val="Hyperlink"/>
@@ -3383,7 +3383,7 @@
               <w:rPr>
                 <w:noProof/>
               </w:rPr>
-              <w:instrText xml:space="preserve"> PAGEREF _Toc243902301 \h </w:instrText>
+              <w:instrText xml:space="preserve"> PAGEREF _Toc244207685 \h </w:instrText>
             </w:r>
             <w:r>
               <w:rPr>
@@ -3425,7 +3425,7 @@
               <w14:ligatures w14:val="standardContextual"/>
             </w:rPr>
           </w:pPr>
-          <w:hyperlink w:anchor="_Toc243902302" w:history="1">
+          <w:hyperlink w:anchor="_Toc244207686" w:history="1">
             <w:r>
               <w:rPr>
                 <w:rStyle w:val="Hyperlink"/>
@@ -3449,7 +3449,7 @@
               <w:rPr>
                 <w:noProof/>
               </w:rPr>
-              <w:instrText xml:space="preserve"> PAGEREF _Toc243902302 \h </w:instrText>
+              <w:instrText xml:space="preserve"> PAGEREF _Toc244207686 \h </w:instrText>
             </w:r>
             <w:r>
               <w:rPr>
@@ -3491,7 +3491,7 @@
               <w14:ligatures w14:val="standardContextual"/>
             </w:rPr>
           </w:pPr>
-          <w:hyperlink w:anchor="_Toc243902303" w:history="1">
+          <w:hyperlink w:anchor="_Toc244207687" w:history="1">
             <w:r>
               <w:rPr>
                 <w:rStyle w:val="Hyperlink"/>
@@ -3515,7 +3515,7 @@
               <w:rPr>
                 <w:noProof/>
               </w:rPr>
-              <w:instrText xml:space="preserve"> PAGEREF _Toc243902303 \h </w:instrText>
+              <w:instrText xml:space="preserve"> PAGEREF _Toc244207687 \h </w:instrText>
             </w:r>
             <w:r>
               <w:rPr>
@@ -3557,7 +3557,7 @@
               <w14:ligatures w14:val="standardContextual"/>
             </w:rPr>
           </w:pPr>
-          <w:hyperlink w:anchor="_Toc243902304" w:history="1">
+          <w:hyperlink w:anchor="_Toc244207688" w:history="1">
             <w:r>
               <w:rPr>
                 <w:rStyle w:val="Hyperlink"/>
@@ -3581,7 +3581,7 @@
               <w:rPr>
                 <w:noProof/>
               </w:rPr>
-              <w:instrText xml:space="preserve"> PAGEREF _Toc243902304 \h </w:instrText>
+              <w:instrText xml:space="preserve"> PAGEREF _Toc244207688 \h </w:instrText>
             </w:r>
             <w:r>
               <w:rPr>
@@ -3623,7 +3623,7 @@
               <w14:ligatures w14:val="standardContextual"/>
             </w:rPr>
           </w:pPr>
-          <w:hyperlink w:anchor="_Toc243902305" w:history="1">
+          <w:hyperlink w:anchor="_Toc244207689" w:history="1">
             <w:r>
               <w:rPr>
                 <w:rStyle w:val="Hyperlink"/>
@@ -3647,7 +3647,7 @@
               <w:rPr>
                 <w:noProof/>
               </w:rPr>
-              <w:instrText xml:space="preserve"> PAGEREF _Toc243902305 \h </w:instrText>
+              <w:instrText xml:space="preserve"> PAGEREF _Toc244207689 \h </w:instrText>
             </w:r>
             <w:r>
               <w:rPr>
@@ -3689,7 +3689,7 @@
               <w14:ligatures w14:val="standardContextual"/>
             </w:rPr>
           </w:pPr>
-          <w:hyperlink w:anchor="_Toc243902306" w:history="1">
+          <w:hyperlink w:anchor="_Toc244207690" w:history="1">
             <w:r>
               <w:rPr>
                 <w:rStyle w:val="Hyperlink"/>
@@ -3713,7 +3713,7 @@
               <w:rPr>
                 <w:noProof/>
               </w:rPr>
-              <w:instrText xml:space="preserve"> PAGEREF _Toc243902306 \h </w:instrText>
+              <w:instrText xml:space="preserve"> PAGEREF _Toc244207690 \h </w:instrText>
             </w:r>
             <w:r>
               <w:rPr>
@@ -3755,7 +3755,7 @@
               <w14:ligatures w14:val="standardContextual"/>
             </w:rPr>
           </w:pPr>
-          <w:hyperlink w:anchor="_Toc243902307" w:history="1">
+          <w:hyperlink w:anchor="_Toc244207691" w:history="1">
             <w:r>
               <w:rPr>
                 <w:rStyle w:val="Hyperlink"/>
@@ -3779,7 +3779,7 @@
               <w:rPr>
                 <w:noProof/>
               </w:rPr>
-              <w:instrText xml:space="preserve"> PAGEREF _Toc243902307 \h </w:instrText>
+              <w:instrText xml:space="preserve"> PAGEREF _Toc244207691 \h </w:instrText>
             </w:r>
             <w:r>
               <w:rPr>
@@ -3821,7 +3821,7 @@
               <w14:ligatures w14:val="standardContextual"/>
             </w:rPr>
           </w:pPr>
-          <w:hyperlink w:anchor="_Toc243902308" w:history="1">
+          <w:hyperlink w:anchor="_Toc244207692" w:history="1">
             <w:r>
               <w:rPr>
                 <w:rStyle w:val="Hyperlink"/>
@@ -3845,7 +3845,7 @@
               <w:rPr>
                 <w:noProof/>
               </w:rPr>
-              <w:instrText xml:space="preserve"> PAGEREF _Toc243902308 \h </w:instrText>
+              <w:instrText xml:space="preserve"> PAGEREF _Toc244207692 \h </w:instrText>
             </w:r>
             <w:r>
               <w:rPr>
@@ -3887,7 +3887,7 @@
               <w14:ligatures w14:val="standardContextual"/>
             </w:rPr>
           </w:pPr>
-          <w:hyperlink w:anchor="_Toc243902309" w:history="1">
+          <w:hyperlink w:anchor="_Toc244207693" w:history="1">
             <w:r>
               <w:rPr>
                 <w:rStyle w:val="Hyperlink"/>
@@ -3911,7 +3911,7 @@
               <w:rPr>
                 <w:noProof/>
               </w:rPr>
-              <w:instrText xml:space="preserve"> PAGEREF _Toc243902309 \h </w:instrText>
+              <w:instrText xml:space="preserve"> PAGEREF _Toc244207693 \h </w:instrText>
             </w:r>
             <w:r>
               <w:rPr>
@@ -3953,7 +3953,7 @@
               <w14:ligatures w14:val="standardContextual"/>
             </w:rPr>
           </w:pPr>
-          <w:hyperlink w:anchor="_Toc243902310" w:history="1">
+          <w:hyperlink w:anchor="_Toc244207694" w:history="1">
             <w:r>
               <w:rPr>
                 <w:rStyle w:val="Hyperlink"/>
@@ -3977,7 +3977,7 @@
               <w:rPr>
                 <w:noProof/>
               </w:rPr>
-              <w:instrText xml:space="preserve"> PAGEREF _Toc243902310 \h </w:instrText>
+              <w:instrText xml:space="preserve"> PAGEREF _Toc244207694 \h </w:instrText>
             </w:r>
             <w:r>
               <w:rPr>
@@ -4019,7 +4019,7 @@
               <w14:ligatures w14:val="standardContextual"/>
             </w:rPr>
           </w:pPr>
-          <w:hyperlink w:anchor="_Toc243902311" w:history="1">
+          <w:hyperlink w:anchor="_Toc244207695" w:history="1">
             <w:r>
               <w:rPr>
                 <w:rStyle w:val="Hyperlink"/>
@@ -4043,7 +4043,7 @@
               <w:rPr>
                 <w:noProof/>
               </w:rPr>
-              <w:instrText xml:space="preserve"> PAGEREF _Toc243902311 \h </w:instrText>
+              <w:instrText xml:space="preserve"> PAGEREF _Toc244207695 \h </w:instrText>
             </w:r>
             <w:r>
               <w:rPr>
@@ -4085,7 +4085,7 @@
               <w14:ligatures w14:val="standardContextual"/>
             </w:rPr>
           </w:pPr>
-          <w:hyperlink w:anchor="_Toc243902312" w:history="1">
+          <w:hyperlink w:anchor="_Toc244207696" w:history="1">
             <w:r>
               <w:rPr>
                 <w:rStyle w:val="Hyperlink"/>
@@ -4109,7 +4109,7 @@
               <w:rPr>
                 <w:noProof/>
               </w:rPr>
-              <w:instrText xml:space="preserve"> PAGEREF _Toc243902312 \h </w:instrText>
+              <w:instrText xml:space="preserve"> PAGEREF _Toc244207696 \h </w:instrText>
             </w:r>
             <w:r>
               <w:rPr>
@@ -4151,7 +4151,7 @@
               <w14:ligatures w14:val="standardContextual"/>
             </w:rPr>
           </w:pPr>
-          <w:hyperlink w:anchor="_Toc243902313" w:history="1">
+          <w:hyperlink w:anchor="_Toc244207697" w:history="1">
             <w:r>
               <w:rPr>
                 <w:rStyle w:val="Hyperlink"/>
@@ -4175,7 +4175,7 @@
               <w:rPr>
                 <w:noProof/>
               </w:rPr>
-              <w:instrText xml:space="preserve"> PAGEREF _Toc243902313 \h </w:instrText>
+              <w:instrText xml:space="preserve"> PAGEREF _Toc244207697 \h </w:instrText>
             </w:r>
             <w:r>
               <w:rPr>
@@ -4217,7 +4217,7 @@
               <w14:ligatures w14:val="standardContextual"/>
             </w:rPr>
           </w:pPr>
-          <w:hyperlink w:anchor="_Toc243902314" w:history="1">
+          <w:hyperlink w:anchor="_Toc244207698" w:history="1">
             <w:r>
               <w:rPr>
                 <w:rStyle w:val="Hyperlink"/>
@@ -4241,7 +4241,7 @@
               <w:rPr>
                 <w:noProof/>
               </w:rPr>
-              <w:instrText xml:space="preserve"> PAGEREF _Toc243902314 \h </w:instrText>
+              <w:instrText xml:space="preserve"> PAGEREF _Toc244207698 \h </w:instrText>
             </w:r>
             <w:r>
               <w:rPr>
@@ -4283,7 +4283,7 @@
               <w14:ligatures w14:val="standardContextual"/>
             </w:rPr>
           </w:pPr>
-          <w:hyperlink w:anchor="_Toc243902315" w:history="1">
+          <w:hyperlink w:anchor="_Toc244207699" w:history="1">
             <w:r>
               <w:rPr>
                 <w:rStyle w:val="Hyperlink"/>
@@ -4307,7 +4307,7 @@
               <w:rPr>
                 <w:noProof/>
               </w:rPr>
-              <w:instrText xml:space="preserve"> PAGEREF _Toc243902315 \h </w:instrText>
+              <w:instrText xml:space="preserve"> PAGEREF _Toc244207699 \h </w:instrText>
             </w:r>
             <w:r>
               <w:rPr>
@@ -4349,7 +4349,7 @@
               <w14:ligatures w14:val="standardContextual"/>
             </w:rPr>
           </w:pPr>
-          <w:hyperlink w:anchor="_Toc243902316" w:history="1">
+          <w:hyperlink w:anchor="_Toc244207700" w:history="1">
             <w:r>
               <w:rPr>
                 <w:rStyle w:val="Hyperlink"/>
@@ -4373,7 +4373,7 @@
               <w:rPr>
                 <w:noProof/>
               </w:rPr>
-              <w:instrText xml:space="preserve"> PAGEREF _Toc243902316 \h </w:instrText>
+              <w:instrText xml:space="preserve"> PAGEREF _Toc244207700 \h </w:instrText>
             </w:r>
             <w:r>
               <w:rPr>
@@ -4415,7 +4415,7 @@
               <w14:ligatures w14:val="standardContextual"/>
             </w:rPr>
           </w:pPr>
-          <w:hyperlink w:anchor="_Toc243902317" w:history="1">
+          <w:hyperlink w:anchor="_Toc244207701" w:history="1">
             <w:r>
               <w:rPr>
                 <w:rStyle w:val="Hyperlink"/>
@@ -4439,7 +4439,7 @@
               <w:rPr>
                 <w:noProof/>
               </w:rPr>
-              <w:instrText xml:space="preserve"> PAGEREF _Toc243902317 \h </w:instrText>
+              <w:instrText xml:space="preserve"> PAGEREF _Toc244207701 \h </w:instrText>
             </w:r>
             <w:r>
               <w:rPr>
@@ -4481,7 +4481,7 @@
               <w14:ligatures w14:val="standardContextual"/>
             </w:rPr>
           </w:pPr>
-          <w:hyperlink w:anchor="_Toc243902318" w:history="1">
+          <w:hyperlink w:anchor="_Toc244207702" w:history="1">
             <w:r>
               <w:rPr>
                 <w:rStyle w:val="Hyperlink"/>
@@ -4505,7 +4505,7 @@
               <w:rPr>
                 <w:noProof/>
               </w:rPr>
-              <w:instrText xml:space="preserve"> PAGEREF _Toc243902318 \h </w:instrText>
+              <w:instrText xml:space="preserve"> PAGEREF _Toc244207702 \h </w:instrText>
             </w:r>
             <w:r>
               <w:rPr>
@@ -4547,7 +4547,7 @@
               <w14:ligatures w14:val="standardContextual"/>
             </w:rPr>
           </w:pPr>
-          <w:hyperlink w:anchor="_Toc243902319" w:history="1">
+          <w:hyperlink w:anchor="_Toc244207703" w:history="1">
             <w:r>
               <w:rPr>
                 <w:rStyle w:val="Hyperlink"/>
@@ -4571,7 +4571,7 @@
               <w:rPr>
                 <w:noProof/>
               </w:rPr>
-              <w:instrText xml:space="preserve"> PAGEREF _Toc243902319 \h </w:instrText>
+              <w:instrText xml:space="preserve"> PAGEREF _Toc244207703 \h </w:instrText>
             </w:r>
             <w:r>
               <w:rPr>
@@ -4613,7 +4613,7 @@
               <w14:ligatures w14:val="standardContextual"/>
             </w:rPr>
           </w:pPr>
-          <w:hyperlink w:anchor="_Toc243902320" w:history="1">
+          <w:hyperlink w:anchor="_Toc244207704" w:history="1">
             <w:r>
               <w:rPr>
                 <w:rStyle w:val="Hyperlink"/>
@@ -4637,7 +4637,7 @@
               <w:rPr>
                 <w:noProof/>
               </w:rPr>
-              <w:instrText xml:space="preserve"> PAGEREF _Toc243902320 \h </w:instrText>
+              <w:instrText xml:space="preserve"> PAGEREF _Toc244207704 \h </w:instrText>
             </w:r>
             <w:r>
               <w:rPr>
@@ -4679,7 +4679,7 @@
               <w14:ligatures w14:val="standardContextual"/>
             </w:rPr>
           </w:pPr>
-          <w:hyperlink w:anchor="_Toc243902321" w:history="1">
+          <w:hyperlink w:anchor="_Toc244207705" w:history="1">
             <w:r>
               <w:rPr>
                 <w:rStyle w:val="Hyperlink"/>
@@ -4703,7 +4703,7 @@
               <w:rPr>
                 <w:noProof/>
               </w:rPr>
-              <w:instrText xml:space="preserve"> PAGEREF _Toc243902321 \h </w:instrText>
+              <w:instrText xml:space="preserve"> PAGEREF _Toc244207705 \h </w:instrText>
             </w:r>
             <w:r>
               <w:rPr>
@@ -4745,7 +4745,7 @@
               <w14:ligatures w14:val="standardContextual"/>
             </w:rPr>
           </w:pPr>
-          <w:hyperlink w:anchor="_Toc243902322" w:history="1">
+          <w:hyperlink w:anchor="_Toc244207706" w:history="1">
             <w:r>
               <w:rPr>
                 <w:rStyle w:val="Hyperlink"/>
@@ -4769,7 +4769,7 @@
               <w:rPr>
                 <w:noProof/>
               </w:rPr>
-              <w:instrText xml:space="preserve"> PAGEREF _Toc243902322 \h </w:instrText>
+              <w:instrText xml:space="preserve"> PAGEREF _Toc244207706 \h </w:instrText>
             </w:r>
             <w:r>
               <w:rPr>
@@ -4811,7 +4811,7 @@
               <w14:ligatures w14:val="standardContextual"/>
             </w:rPr>
           </w:pPr>
-          <w:hyperlink w:anchor="_Toc243902323" w:history="1">
+          <w:hyperlink w:anchor="_Toc244207707" w:history="1">
             <w:r>
               <w:rPr>
                 <w:rStyle w:val="Hyperlink"/>
@@ -4835,7 +4835,7 @@
               <w:rPr>
                 <w:noProof/>
               </w:rPr>
-              <w:instrText xml:space="preserve"> PAGEREF _Toc243902323 \h </w:instrText>
+              <w:instrText xml:space="preserve"> PAGEREF _Toc244207707 \h </w:instrText>
             </w:r>
             <w:r>
               <w:rPr>
@@ -4877,7 +4877,7 @@
               <w14:ligatures w14:val="standardContextual"/>
             </w:rPr>
           </w:pPr>
-          <w:hyperlink w:anchor="_Toc243902324" w:history="1">
+          <w:hyperlink w:anchor="_Toc244207708" w:history="1">
             <w:r>
               <w:rPr>
                 <w:rStyle w:val="Hyperlink"/>
@@ -4901,7 +4901,7 @@
               <w:rPr>
                 <w:noProof/>
               </w:rPr>
-              <w:instrText xml:space="preserve"> PAGEREF _Toc243902324 \h </w:instrText>
+              <w:instrText xml:space="preserve"> PAGEREF _Toc244207708 \h </w:instrText>
             </w:r>
             <w:r>
               <w:rPr>
@@ -4943,7 +4943,7 @@
               <w14:ligatures w14:val="standardContextual"/>
             </w:rPr>
           </w:pPr>
-          <w:hyperlink w:anchor="_Toc243902325" w:history="1">
+          <w:hyperlink w:anchor="_Toc244207709" w:history="1">
             <w:r>
               <w:rPr>
                 <w:rStyle w:val="Hyperlink"/>
@@ -4967,7 +4967,7 @@
               <w:rPr>
                 <w:noProof/>
               </w:rPr>
-              <w:instrText xml:space="preserve"> PAGEREF _Toc243902325 \h </w:instrText>
+              <w:instrText xml:space="preserve"> PAGEREF _Toc244207709 \h </w:instrText>
             </w:r>
             <w:r>
               <w:rPr>
@@ -5009,7 +5009,7 @@
               <w14:ligatures w14:val="standardContextual"/>
             </w:rPr>
           </w:pPr>
-          <w:hyperlink w:anchor="_Toc243902326" w:history="1">
+          <w:hyperlink w:anchor="_Toc244207710" w:history="1">
             <w:r>
               <w:rPr>
                 <w:rStyle w:val="Hyperlink"/>
@@ -5033,7 +5033,7 @@
               <w:rPr>
                 <w:noProof/>
               </w:rPr>
-              <w:instrText xml:space="preserve"> PAGEREF _Toc243902326 \h </w:instrText>
+              <w:instrText xml:space="preserve"> PAGEREF _Toc244207710 \h </w:instrText>
             </w:r>
             <w:r>
               <w:rPr>
@@ -5075,7 +5075,7 @@
               <w14:ligatures w14:val="standardContextual"/>
             </w:rPr>
           </w:pPr>
-          <w:hyperlink w:anchor="_Toc243902327" w:history="1">
+          <w:hyperlink w:anchor="_Toc244207711" w:history="1">
             <w:r>
               <w:rPr>
                 <w:rStyle w:val="Hyperlink"/>
@@ -5099,7 +5099,7 @@
               <w:rPr>
                 <w:noProof/>
               </w:rPr>
-              <w:instrText xml:space="preserve"> PAGEREF _Toc243902327 \h </w:instrText>
+              <w:instrText xml:space="preserve"> PAGEREF _Toc244207711 \h </w:instrText>
             </w:r>
             <w:r>
               <w:rPr>
@@ -5141,7 +5141,7 @@
               <w14:ligatures w14:val="standardContextual"/>
             </w:rPr>
           </w:pPr>
-          <w:hyperlink w:anchor="_Toc243902328" w:history="1">
+          <w:hyperlink w:anchor="_Toc244207712" w:history="1">
             <w:r>
               <w:rPr>
                 <w:rStyle w:val="Hyperlink"/>
@@ -5165,7 +5165,7 @@
               <w:rPr>
                 <w:noProof/>
               </w:rPr>
-              <w:instrText xml:space="preserve"> PAGEREF _Toc243902328 \h </w:instrText>
+              <w:instrText xml:space="preserve"> PAGEREF _Toc244207712 \h </w:instrText>
             </w:r>
             <w:r>
               <w:rPr>
@@ -5207,7 +5207,7 @@
               <w14:ligatures w14:val="standardContextual"/>
             </w:rPr>
           </w:pPr>
-          <w:hyperlink w:anchor="_Toc243902329" w:history="1">
+          <w:hyperlink w:anchor="_Toc244207713" w:history="1">
             <w:r>
               <w:rPr>
                 <w:rStyle w:val="Hyperlink"/>
@@ -5231,7 +5231,7 @@
               <w:rPr>
                 <w:noProof/>
               </w:rPr>
-              <w:instrText xml:space="preserve"> PAGEREF _Toc243902329 \h </w:instrText>
+              <w:instrText xml:space="preserve"> PAGEREF _Toc244207713 \h </w:instrText>
             </w:r>
             <w:r>
               <w:rPr>
@@ -5273,7 +5273,7 @@
               <w14:ligatures w14:val="standardContextual"/>
             </w:rPr>
           </w:pPr>
-          <w:hyperlink w:anchor="_Toc243902330" w:history="1">
+          <w:hyperlink w:anchor="_Toc244207714" w:history="1">
             <w:r>
               <w:rPr>
                 <w:rStyle w:val="Hyperlink"/>
@@ -5297,7 +5297,7 @@
               <w:rPr>
                 <w:noProof/>
               </w:rPr>
-              <w:instrText xml:space="preserve"> PAGEREF _Toc243902330 \h </w:instrText>
+              <w:instrText xml:space="preserve"> PAGEREF _Toc244207714 \h </w:instrText>
             </w:r>
             <w:r>
               <w:rPr>
@@ -5339,7 +5339,7 @@
               <w14:ligatures w14:val="standardContextual"/>
             </w:rPr>
           </w:pPr>
-          <w:hyperlink w:anchor="_Toc243902331" w:history="1">
+          <w:hyperlink w:anchor="_Toc244207715" w:history="1">
             <w:r>
               <w:rPr>
                 <w:rStyle w:val="Hyperlink"/>
@@ -5363,7 +5363,7 @@
               <w:rPr>
                 <w:noProof/>
               </w:rPr>
-              <w:instrText xml:space="preserve"> PAGEREF _Toc243902331 \h </w:instrText>
+              <w:instrText xml:space="preserve"> PAGEREF _Toc244207715 \h </w:instrText>
             </w:r>
             <w:r>
               <w:rPr>
@@ -5405,7 +5405,7 @@
               <w14:ligatures w14:val="standardContextual"/>
             </w:rPr>
           </w:pPr>
-          <w:hyperlink w:anchor="_Toc243902332" w:history="1">
+          <w:hyperlink w:anchor="_Toc244207716" w:history="1">
             <w:r>
               <w:rPr>
                 <w:rStyle w:val="Hyperlink"/>
@@ -5429,7 +5429,7 @@
               <w:rPr>
                 <w:noProof/>
               </w:rPr>
-              <w:instrText xml:space="preserve"> PAGEREF _Toc243902332 \h </w:instrText>
+              <w:instrText xml:space="preserve"> PAGEREF _Toc244207716 \h </w:instrText>
             </w:r>
             <w:r>
               <w:rPr>
@@ -5471,7 +5471,7 @@
               <w14:ligatures w14:val="standardContextual"/>
             </w:rPr>
           </w:pPr>
-          <w:hyperlink w:anchor="_Toc243902333" w:history="1">
+          <w:hyperlink w:anchor="_Toc244207717" w:history="1">
             <w:r>
               <w:rPr>
                 <w:rStyle w:val="Hyperlink"/>
@@ -5495,7 +5495,7 @@
               <w:rPr>
                 <w:noProof/>
               </w:rPr>
-              <w:instrText xml:space="preserve"> PAGEREF _Toc243902333 \h </w:instrText>
+              <w:instrText xml:space="preserve"> PAGEREF _Toc244207717 \h </w:instrText>
             </w:r>
             <w:r>
               <w:rPr>
@@ -5537,7 +5537,7 @@
               <w14:ligatures w14:val="standardContextual"/>
             </w:rPr>
           </w:pPr>
-          <w:hyperlink w:anchor="_Toc243902334" w:history="1">
+          <w:hyperlink w:anchor="_Toc244207718" w:history="1">
             <w:r>
               <w:rPr>
                 <w:rStyle w:val="Hyperlink"/>
@@ -5561,7 +5561,7 @@
               <w:rPr>
                 <w:noProof/>
               </w:rPr>
-              <w:instrText xml:space="preserve"> PAGEREF _Toc243902334 \h </w:instrText>
+              <w:instrText xml:space="preserve"> PAGEREF _Toc244207718 \h </w:instrText>
             </w:r>
             <w:r>
               <w:rPr>
@@ -5603,7 +5603,7 @@
               <w14:ligatures w14:val="standardContextual"/>
             </w:rPr>
           </w:pPr>
-          <w:hyperlink w:anchor="_Toc243902335" w:history="1">
+          <w:hyperlink w:anchor="_Toc244207719" w:history="1">
             <w:r>
               <w:rPr>
                 <w:rStyle w:val="Hyperlink"/>
@@ -5627,7 +5627,7 @@
               <w:rPr>
                 <w:noProof/>
               </w:rPr>
-              <w:instrText xml:space="preserve"> PAGEREF _Toc243902335 \h </w:instrText>
+              <w:instrText xml:space="preserve"> PAGEREF _Toc244207719 \h </w:instrText>
             </w:r>
             <w:r>
               <w:rPr>
@@ -5669,7 +5669,7 @@
               <w14:ligatures w14:val="standardContextual"/>
             </w:rPr>
           </w:pPr>
-          <w:hyperlink w:anchor="_Toc243902336" w:history="1">
+          <w:hyperlink w:anchor="_Toc244207720" w:history="1">
             <w:r>
               <w:rPr>
                 <w:rStyle w:val="Hyperlink"/>
@@ -5693,7 +5693,7 @@
               <w:rPr>
                 <w:noProof/>
               </w:rPr>
-              <w:instrText xml:space="preserve"> PAGEREF _Toc243902336 \h </w:instrText>
+              <w:instrText xml:space="preserve"> PAGEREF _Toc244207720 \h </w:instrText>
             </w:r>
             <w:r>
               <w:rPr>
@@ -5735,7 +5735,7 @@
               <w14:ligatures w14:val="standardContextual"/>
             </w:rPr>
           </w:pPr>
-          <w:hyperlink w:anchor="_Toc243902337" w:history="1">
+          <w:hyperlink w:anchor="_Toc244207721" w:history="1">
             <w:r>
               <w:rPr>
                 <w:rStyle w:val="Hyperlink"/>
@@ -5759,7 +5759,7 @@
               <w:rPr>
                 <w:noProof/>
               </w:rPr>
-              <w:instrText xml:space="preserve"> PAGEREF _Toc243902337 \h </w:instrText>
+              <w:instrText xml:space="preserve"> PAGEREF _Toc244207721 \h </w:instrText>
             </w:r>
             <w:r>
               <w:rPr>
@@ -5801,7 +5801,7 @@
               <w14:ligatures w14:val="standardContextual"/>
             </w:rPr>
           </w:pPr>
-          <w:hyperlink w:anchor="_Toc243902338" w:history="1">
+          <w:hyperlink w:anchor="_Toc244207722" w:history="1">
             <w:r>
               <w:rPr>
                 <w:rStyle w:val="Hyperlink"/>
@@ -5825,7 +5825,7 @@
               <w:rPr>
                 <w:noProof/>
               </w:rPr>
-              <w:instrText xml:space="preserve"> PAGEREF _Toc243902338 \h </w:instrText>
+              <w:instrText xml:space="preserve"> PAGEREF _Toc244207722 \h </w:instrText>
             </w:r>
             <w:r>
               <w:rPr>
@@ -5867,7 +5867,7 @@
               <w14:ligatures w14:val="standardContextual"/>
             </w:rPr>
           </w:pPr>
-          <w:hyperlink w:anchor="_Toc243902339" w:history="1">
+          <w:hyperlink w:anchor="_Toc244207723" w:history="1">
             <w:r>
               <w:rPr>
                 <w:rStyle w:val="Hyperlink"/>
@@ -5891,7 +5891,7 @@
               <w:rPr>
                 <w:noProof/>
               </w:rPr>
-              <w:instrText xml:space="preserve"> PAGEREF _Toc243902339 \h </w:instrText>
+              <w:instrText xml:space="preserve"> PAGEREF _Toc244207723 \h </w:instrText>
             </w:r>
             <w:r>
               <w:rPr>
@@ -5933,7 +5933,7 @@
               <w14:ligatures w14:val="standardContextual"/>
             </w:rPr>
           </w:pPr>
-          <w:hyperlink w:anchor="_Toc243902340" w:history="1">
+          <w:hyperlink w:anchor="_Toc244207724" w:history="1">
             <w:r>
               <w:rPr>
                 <w:rStyle w:val="Hyperlink"/>
@@ -5957,7 +5957,7 @@
               <w:rPr>
                 <w:noProof/>
               </w:rPr>
-              <w:instrText xml:space="preserve"> PAGEREF _Toc243902340 \h </w:instrText>
+              <w:instrText xml:space="preserve"> PAGEREF _Toc244207724 \h </w:instrText>
             </w:r>
             <w:r>
               <w:rPr>
@@ -5999,7 +5999,7 @@
               <w14:ligatures w14:val="standardContextual"/>
             </w:rPr>
           </w:pPr>
-          <w:hyperlink w:anchor="_Toc243902341" w:history="1">
+          <w:hyperlink w:anchor="_Toc244207725" w:history="1">
             <w:r>
               <w:rPr>
                 <w:rStyle w:val="Hyperlink"/>
@@ -6023,7 +6023,7 @@
               <w:rPr>
                 <w:noProof/>
               </w:rPr>
-              <w:instrText xml:space="preserve"> PAGEREF _Toc243902341 \h </w:instrText>
+              <w:instrText xml:space="preserve"> PAGEREF _Toc244207725 \h </w:instrText>
             </w:r>
             <w:r>
               <w:rPr>
@@ -6065,7 +6065,7 @@
               <w14:ligatures w14:val="standardContextual"/>
             </w:rPr>
           </w:pPr>
-          <w:hyperlink w:anchor="_Toc243902342" w:history="1">
+          <w:hyperlink w:anchor="_Toc244207726" w:history="1">
             <w:r>
               <w:rPr>
                 <w:rStyle w:val="Hyperlink"/>
@@ -6089,7 +6089,7 @@
               <w:rPr>
                 <w:noProof/>
               </w:rPr>
-              <w:instrText xml:space="preserve"> PAGEREF _Toc243902342 \h </w:instrText>
+              <w:instrText xml:space="preserve"> PAGEREF _Toc244207726 \h </w:instrText>
             </w:r>
             <w:r>
               <w:rPr>
@@ -6131,7 +6131,7 @@
               <w14:ligatures w14:val="standardContextual"/>
             </w:rPr>
           </w:pPr>
-          <w:hyperlink w:anchor="_Toc243902343" w:history="1">
+          <w:hyperlink w:anchor="_Toc244207727" w:history="1">
             <w:r>
               <w:rPr>
                 <w:rStyle w:val="Hyperlink"/>
@@ -6155,7 +6155,7 @@
               <w:rPr>
                 <w:noProof/>
               </w:rPr>
-              <w:instrText xml:space="preserve"> PAGEREF _Toc243902343 \h </w:instrText>
+              <w:instrText xml:space="preserve"> PAGEREF _Toc244207727 \h </w:instrText>
             </w:r>
             <w:r>
               <w:rPr>
@@ -6197,7 +6197,7 @@
               <w14:ligatures w14:val="standardContextual"/>
             </w:rPr>
           </w:pPr>
-          <w:hyperlink w:anchor="_Toc243902344" w:history="1">
+          <w:hyperlink w:anchor="_Toc244207728" w:history="1">
             <w:r>
               <w:rPr>
                 <w:rStyle w:val="Hyperlink"/>
@@ -6221,7 +6221,7 @@
               <w:rPr>
                 <w:noProof/>
               </w:rPr>
-              <w:instrText xml:space="preserve"> PAGEREF _Toc243902344 \h </w:instrText>
+              <w:instrText xml:space="preserve"> PAGEREF _Toc244207728 \h </w:instrText>
             </w:r>
             <w:r>
               <w:rPr>
@@ -6263,7 +6263,7 @@
               <w14:ligatures w14:val="standardContextual"/>
             </w:rPr>
           </w:pPr>
-          <w:hyperlink w:anchor="_Toc243902345" w:history="1">
+          <w:hyperlink w:anchor="_Toc244207729" w:history="1">
             <w:r>
               <w:rPr>
                 <w:rStyle w:val="Hyperlink"/>
@@ -6287,7 +6287,7 @@
               <w:rPr>
                 <w:noProof/>
               </w:rPr>
-              <w:instrText xml:space="preserve"> PAGEREF _Toc243902345 \h </w:instrText>
+              <w:instrText xml:space="preserve"> PAGEREF _Toc244207729 \h </w:instrText>
             </w:r>
             <w:r>
               <w:rPr>
@@ -6329,7 +6329,7 @@
               <w14:ligatures w14:val="standardContextual"/>
             </w:rPr>
           </w:pPr>
-          <w:hyperlink w:anchor="_Toc243902346" w:history="1">
+          <w:hyperlink w:anchor="_Toc244207730" w:history="1">
             <w:r>
               <w:rPr>
                 <w:rStyle w:val="Hyperlink"/>
@@ -6353,7 +6353,7 @@
               <w:rPr>
                 <w:noProof/>
               </w:rPr>
-              <w:instrText xml:space="preserve"> PAGEREF _Toc243902346 \h </w:instrText>
+              <w:instrText xml:space="preserve"> PAGEREF _Toc244207730 \h </w:instrText>
             </w:r>
             <w:r>
               <w:rPr>
@@ -7790,7 +7790,7 @@
     <w:sdt>
       <w:sdtPr>
         <w:alias w:val="Danh mục hình"/>
-        <w:id w:val="768202560"/>
+        <w:id w:val="1916508640"/>
       </w:sdtPr>
       <w:sdtEndPr/>
       <w:sdtContent>
@@ -7818,7 +7818,7 @@
           <w:r>
             <w:fldChar w:fldCharType="separate"/>
           </w:r>
-          <w:hyperlink w:anchor="_Toc243902347" w:history="1">
+          <w:hyperlink w:anchor="_Toc244207731" w:history="1">
             <w:r>
               <w:rPr>
                 <w:rStyle w:val="Hyperlink"/>
@@ -7855,7 +7855,7 @@
               <w:rPr>
                 <w:noProof/>
               </w:rPr>
-              <w:instrText xml:space="preserve"> PAGEREF _Toc243902347 \h </w:instrText>
+              <w:instrText xml:space="preserve"> PAGEREF _Toc244207731 \h </w:instrText>
             </w:r>
             <w:r>
               <w:rPr>
@@ -7897,7 +7897,7 @@
               <w14:ligatures w14:val="standardContextual"/>
             </w:rPr>
           </w:pPr>
-          <w:hyperlink w:anchor="_Toc243902348" w:history="1">
+          <w:hyperlink w:anchor="_Toc244207732" w:history="1">
             <w:r>
               <w:rPr>
                 <w:rStyle w:val="Hyperlink"/>
@@ -7934,7 +7934,7 @@
               <w:rPr>
                 <w:noProof/>
               </w:rPr>
-              <w:instrText xml:space="preserve"> PAGEREF _Toc243902348 \h </w:instrText>
+              <w:instrText xml:space="preserve"> PAGEREF _Toc244207732 \h </w:instrText>
             </w:r>
             <w:r>
               <w:rPr>
@@ -7976,7 +7976,7 @@
               <w14:ligatures w14:val="standardContextual"/>
             </w:rPr>
           </w:pPr>
-          <w:hyperlink w:anchor="_Toc243902349" w:history="1">
+          <w:hyperlink w:anchor="_Toc244207733" w:history="1">
             <w:r>
               <w:rPr>
                 <w:rStyle w:val="Hyperlink"/>
@@ -8013,7 +8013,7 @@
               <w:rPr>
                 <w:noProof/>
               </w:rPr>
-              <w:instrText xml:space="preserve"> PAGEREF _Toc243902349 \h </w:instrText>
+              <w:instrText xml:space="preserve"> PAGEREF _Toc244207733 \h </w:instrText>
             </w:r>
             <w:r>
               <w:rPr>
@@ -8055,7 +8055,7 @@
               <w14:ligatures w14:val="standardContextual"/>
             </w:rPr>
           </w:pPr>
-          <w:hyperlink w:anchor="_Toc243902350" w:history="1">
+          <w:hyperlink w:anchor="_Toc244207734" w:history="1">
             <w:r>
               <w:rPr>
                 <w:rStyle w:val="Hyperlink"/>
@@ -8092,7 +8092,7 @@
               <w:rPr>
                 <w:noProof/>
               </w:rPr>
-              <w:instrText xml:space="preserve"> PAGEREF _Toc243902350 \h </w:instrText>
+              <w:instrText xml:space="preserve"> PAGEREF _Toc244207734 \h </w:instrText>
             </w:r>
             <w:r>
               <w:rPr>
@@ -8134,7 +8134,7 @@
               <w14:ligatures w14:val="standardContextual"/>
             </w:rPr>
           </w:pPr>
-          <w:hyperlink w:anchor="_Toc243902351" w:history="1">
+          <w:hyperlink w:anchor="_Toc244207735" w:history="1">
             <w:r>
               <w:rPr>
                 <w:rStyle w:val="Hyperlink"/>
@@ -8171,7 +8171,7 @@
               <w:rPr>
                 <w:noProof/>
               </w:rPr>
-              <w:instrText xml:space="preserve"> PAGEREF _Toc243902351 \h </w:instrText>
+              <w:instrText xml:space="preserve"> PAGEREF _Toc244207735 \h </w:instrText>
             </w:r>
             <w:r>
               <w:rPr>
@@ -8213,7 +8213,7 @@
               <w14:ligatures w14:val="standardContextual"/>
             </w:rPr>
           </w:pPr>
-          <w:hyperlink w:anchor="_Toc243902352" w:history="1">
+          <w:hyperlink w:anchor="_Toc244207736" w:history="1">
             <w:r>
               <w:rPr>
                 <w:rStyle w:val="Hyperlink"/>
@@ -8250,7 +8250,7 @@
               <w:rPr>
                 <w:noProof/>
               </w:rPr>
-              <w:instrText xml:space="preserve"> PAGEREF _Toc243902352 \h </w:instrText>
+              <w:instrText xml:space="preserve"> PAGEREF _Toc244207736 \h </w:instrText>
             </w:r>
             <w:r>
               <w:rPr>
@@ -8292,7 +8292,7 @@
               <w14:ligatures w14:val="standardContextual"/>
             </w:rPr>
           </w:pPr>
-          <w:hyperlink w:anchor="_Toc243902353" w:history="1">
+          <w:hyperlink w:anchor="_Toc244207737" w:history="1">
             <w:r>
               <w:rPr>
                 <w:rStyle w:val="Hyperlink"/>
@@ -8329,7 +8329,7 @@
               <w:rPr>
                 <w:noProof/>
               </w:rPr>
-              <w:instrText xml:space="preserve"> PAGEREF _Toc243902353 \h </w:instrText>
+              <w:instrText xml:space="preserve"> PAGEREF _Toc244207737 \h </w:instrText>
             </w:r>
             <w:r>
               <w:rPr>
@@ -8371,7 +8371,7 @@
               <w14:ligatures w14:val="standardContextual"/>
             </w:rPr>
           </w:pPr>
-          <w:hyperlink w:anchor="_Toc243902354" w:history="1">
+          <w:hyperlink w:anchor="_Toc244207738" w:history="1">
             <w:r>
               <w:rPr>
                 <w:rStyle w:val="Hyperlink"/>
@@ -8408,7 +8408,7 @@
               <w:rPr>
                 <w:noProof/>
               </w:rPr>
-              <w:instrText xml:space="preserve"> PAGEREF _Toc243902354 \h </w:instrText>
+              <w:instrText xml:space="preserve"> PAGEREF _Toc244207738 \h </w:instrText>
             </w:r>
             <w:r>
               <w:rPr>
@@ -8450,7 +8450,7 @@
               <w14:ligatures w14:val="standardContextual"/>
             </w:rPr>
           </w:pPr>
-          <w:hyperlink w:anchor="_Toc243902355" w:history="1">
+          <w:hyperlink w:anchor="_Toc244207739" w:history="1">
             <w:r>
               <w:rPr>
                 <w:rStyle w:val="Hyperlink"/>
@@ -8487,7 +8487,7 @@
               <w:rPr>
                 <w:noProof/>
               </w:rPr>
-              <w:instrText xml:space="preserve"> PAGEREF _Toc243902355 \h </w:instrText>
+              <w:instrText xml:space="preserve"> PAGEREF _Toc244207739 \h </w:instrText>
             </w:r>
             <w:r>
               <w:rPr>
@@ -8534,7 +8534,7 @@
     <w:sdt>
       <w:sdtPr>
         <w:alias w:val="Danh mục bảng"/>
-        <w:id w:val="570465939"/>
+        <w:id w:val="2012946939"/>
       </w:sdtPr>
       <w:sdtEndPr/>
       <w:sdtContent>
@@ -8562,7 +8562,7 @@
           <w:r>
             <w:fldChar w:fldCharType="separate"/>
           </w:r>
-          <w:hyperlink w:anchor="_Toc243902356" w:history="1">
+          <w:hyperlink w:anchor="_Toc244207740" w:history="1">
             <w:r>
               <w:rPr>
                 <w:rStyle w:val="Hyperlink"/>
@@ -8599,7 +8599,7 @@
               <w:rPr>
                 <w:noProof/>
               </w:rPr>
-              <w:instrText xml:space="preserve"> PAGEREF _Toc243902356 \h </w:instrText>
+              <w:instrText xml:space="preserve"> PAGEREF _Toc244207740 \h </w:instrText>
             </w:r>
             <w:r>
               <w:rPr>
@@ -8641,7 +8641,7 @@
               <w14:ligatures w14:val="standardContextual"/>
             </w:rPr>
           </w:pPr>
-          <w:hyperlink w:anchor="_Toc243902357" w:history="1">
+          <w:hyperlink w:anchor="_Toc244207741" w:history="1">
             <w:r>
               <w:rPr>
                 <w:rStyle w:val="Hyperlink"/>
@@ -8678,7 +8678,7 @@
               <w:rPr>
                 <w:noProof/>
               </w:rPr>
-              <w:instrText xml:space="preserve"> PAGEREF _Toc243902357 \h </w:instrText>
+              <w:instrText xml:space="preserve"> PAGEREF _Toc244207741 \h </w:instrText>
             </w:r>
             <w:r>
               <w:rPr>
@@ -8720,7 +8720,7 @@
               <w14:ligatures w14:val="standardContextual"/>
             </w:rPr>
           </w:pPr>
-          <w:hyperlink w:anchor="_Toc243902358" w:history="1">
+          <w:hyperlink w:anchor="_Toc244207742" w:history="1">
             <w:r>
               <w:rPr>
                 <w:rStyle w:val="Hyperlink"/>
@@ -8757,7 +8757,7 @@
               <w:rPr>
                 <w:noProof/>
               </w:rPr>
-              <w:instrText xml:space="preserve"> PAGEREF _Toc243902358 \h </w:instrText>
+              <w:instrText xml:space="preserve"> PAGEREF _Toc244207742 \h </w:instrText>
             </w:r>
             <w:r>
               <w:rPr>
@@ -8799,7 +8799,7 @@
               <w14:ligatures w14:val="standardContextual"/>
             </w:rPr>
           </w:pPr>
-          <w:hyperlink w:anchor="_Toc243902359" w:history="1">
+          <w:hyperlink w:anchor="_Toc244207743" w:history="1">
             <w:r>
               <w:rPr>
                 <w:rStyle w:val="Hyperlink"/>
@@ -8836,7 +8836,7 @@
               <w:rPr>
                 <w:noProof/>
               </w:rPr>
-              <w:instrText xml:space="preserve"> PAGEREF _Toc243902359 \h </w:instrText>
+              <w:instrText xml:space="preserve"> PAGEREF _Toc244207743 \h </w:instrText>
             </w:r>
             <w:r>
               <w:rPr>
@@ -8878,7 +8878,7 @@
               <w14:ligatures w14:val="standardContextual"/>
             </w:rPr>
           </w:pPr>
-          <w:hyperlink w:anchor="_Toc243902360" w:history="1">
+          <w:hyperlink w:anchor="_Toc244207744" w:history="1">
             <w:r>
               <w:rPr>
                 <w:rStyle w:val="Hyperlink"/>
@@ -8915,7 +8915,7 @@
               <w:rPr>
                 <w:noProof/>
               </w:rPr>
-              <w:instrText xml:space="preserve"> PAGEREF _Toc243902360 \h </w:instrText>
+              <w:instrText xml:space="preserve"> PAGEREF _Toc244207744 \h </w:instrText>
             </w:r>
             <w:r>
               <w:rPr>
@@ -8957,7 +8957,7 @@
               <w14:ligatures w14:val="standardContextual"/>
             </w:rPr>
           </w:pPr>
-          <w:hyperlink w:anchor="_Toc243902361" w:history="1">
+          <w:hyperlink w:anchor="_Toc244207745" w:history="1">
             <w:r>
               <w:rPr>
                 <w:rStyle w:val="Hyperlink"/>
@@ -8994,7 +8994,7 @@
               <w:rPr>
                 <w:noProof/>
               </w:rPr>
-              <w:instrText xml:space="preserve"> PAGEREF _Toc243902361 \h </w:instrText>
+              <w:instrText xml:space="preserve"> PAGEREF _Toc244207745 \h </w:instrText>
             </w:r>
             <w:r>
               <w:rPr>
@@ -9036,7 +9036,7 @@
               <w14:ligatures w14:val="standardContextual"/>
             </w:rPr>
           </w:pPr>
-          <w:hyperlink w:anchor="_Toc243902362" w:history="1">
+          <w:hyperlink w:anchor="_Toc244207746" w:history="1">
             <w:r>
               <w:rPr>
                 <w:rStyle w:val="Hyperlink"/>
@@ -9073,7 +9073,7 @@
               <w:rPr>
                 <w:noProof/>
               </w:rPr>
-              <w:instrText xml:space="preserve"> PAGEREF _Toc243902362 \h </w:instrText>
+              <w:instrText xml:space="preserve"> PAGEREF _Toc244207746 \h </w:instrText>
             </w:r>
             <w:r>
               <w:rPr>
@@ -9115,7 +9115,7 @@
               <w14:ligatures w14:val="standardContextual"/>
             </w:rPr>
           </w:pPr>
-          <w:hyperlink w:anchor="_Toc243902363" w:history="1">
+          <w:hyperlink w:anchor="_Toc244207747" w:history="1">
             <w:r>
               <w:rPr>
                 <w:rStyle w:val="Hyperlink"/>
@@ -9152,7 +9152,7 @@
               <w:rPr>
                 <w:noProof/>
               </w:rPr>
-              <w:instrText xml:space="preserve"> PAGEREF _Toc243902363 \h </w:instrText>
+              <w:instrText xml:space="preserve"> PAGEREF _Toc244207747 \h </w:instrText>
             </w:r>
             <w:r>
               <w:rPr>
@@ -9194,7 +9194,7 @@
               <w14:ligatures w14:val="standardContextual"/>
             </w:rPr>
           </w:pPr>
-          <w:hyperlink w:anchor="_Toc243902364" w:history="1">
+          <w:hyperlink w:anchor="_Toc244207748" w:history="1">
             <w:r>
               <w:rPr>
                 <w:rStyle w:val="Hyperlink"/>
@@ -9231,7 +9231,7 @@
               <w:rPr>
                 <w:noProof/>
               </w:rPr>
-              <w:instrText xml:space="preserve"> PAGEREF _Toc243902364 \h </w:instrText>
+              <w:instrText xml:space="preserve"> PAGEREF _Toc244207748 \h </w:instrText>
             </w:r>
             <w:r>
               <w:rPr>
@@ -9273,7 +9273,7 @@
               <w14:ligatures w14:val="standardContextual"/>
             </w:rPr>
           </w:pPr>
-          <w:hyperlink w:anchor="_Toc243902365" w:history="1">
+          <w:hyperlink w:anchor="_Toc244207749" w:history="1">
             <w:r>
               <w:rPr>
                 <w:rStyle w:val="Hyperlink"/>
@@ -9310,7 +9310,7 @@
               <w:rPr>
                 <w:noProof/>
               </w:rPr>
-              <w:instrText xml:space="preserve"> PAGEREF _Toc243902365 \h </w:instrText>
+              <w:instrText xml:space="preserve"> PAGEREF _Toc244207749 \h </w:instrText>
             </w:r>
             <w:r>
               <w:rPr>
@@ -9352,7 +9352,7 @@
               <w14:ligatures w14:val="standardContextual"/>
             </w:rPr>
           </w:pPr>
-          <w:hyperlink w:anchor="_Toc243902366" w:history="1">
+          <w:hyperlink w:anchor="_Toc244207750" w:history="1">
             <w:r>
               <w:rPr>
                 <w:rStyle w:val="Hyperlink"/>
@@ -9389,7 +9389,7 @@
               <w:rPr>
                 <w:noProof/>
               </w:rPr>
-              <w:instrText xml:space="preserve"> PAGEREF _Toc243902366 \h </w:instrText>
+              <w:instrText xml:space="preserve"> PAGEREF _Toc244207750 \h </w:instrText>
             </w:r>
             <w:r>
               <w:rPr>
@@ -9431,7 +9431,7 @@
               <w14:ligatures w14:val="standardContextual"/>
             </w:rPr>
           </w:pPr>
-          <w:hyperlink w:anchor="_Toc243902367" w:history="1">
+          <w:hyperlink w:anchor="_Toc244207751" w:history="1">
             <w:r>
               <w:rPr>
                 <w:rStyle w:val="Hyperlink"/>
@@ -9468,7 +9468,7 @@
               <w:rPr>
                 <w:noProof/>
               </w:rPr>
-              <w:instrText xml:space="preserve"> PAGEREF _Toc243902367 \h </w:instrText>
+              <w:instrText xml:space="preserve"> PAGEREF _Toc244207751 \h </w:instrText>
             </w:r>
             <w:r>
               <w:rPr>
@@ -9510,7 +9510,7 @@
               <w14:ligatures w14:val="standardContextual"/>
             </w:rPr>
           </w:pPr>
-          <w:hyperlink w:anchor="_Toc243902368" w:history="1">
+          <w:hyperlink w:anchor="_Toc244207752" w:history="1">
             <w:r>
               <w:rPr>
                 <w:rStyle w:val="Hyperlink"/>
@@ -9547,7 +9547,7 @@
               <w:rPr>
                 <w:noProof/>
               </w:rPr>
-              <w:instrText xml:space="preserve"> PAGEREF _Toc243902368 \h </w:instrText>
+              <w:instrText xml:space="preserve"> PAGEREF _Toc244207752 \h </w:instrText>
             </w:r>
             <w:r>
               <w:rPr>
@@ -9589,7 +9589,7 @@
               <w14:ligatures w14:val="standardContextual"/>
             </w:rPr>
           </w:pPr>
-          <w:hyperlink w:anchor="_Toc243902369" w:history="1">
+          <w:hyperlink w:anchor="_Toc244207753" w:history="1">
             <w:r>
               <w:rPr>
                 <w:rStyle w:val="Hyperlink"/>
@@ -9626,7 +9626,7 @@
               <w:rPr>
                 <w:noProof/>
               </w:rPr>
-              <w:instrText xml:space="preserve"> PAGEREF _Toc243902369 \h </w:instrText>
+              <w:instrText xml:space="preserve"> PAGEREF _Toc244207753 \h </w:instrText>
             </w:r>
             <w:r>
               <w:rPr>
@@ -9668,7 +9668,7 @@
               <w14:ligatures w14:val="standardContextual"/>
             </w:rPr>
           </w:pPr>
-          <w:hyperlink w:anchor="_Toc243902370" w:history="1">
+          <w:hyperlink w:anchor="_Toc244207754" w:history="1">
             <w:r>
               <w:rPr>
                 <w:rStyle w:val="Hyperlink"/>
@@ -9705,7 +9705,7 @@
               <w:rPr>
                 <w:noProof/>
               </w:rPr>
-              <w:instrText xml:space="preserve"> PAGEREF _Toc243902370 \h </w:instrText>
+              <w:instrText xml:space="preserve"> PAGEREF _Toc244207754 \h </w:instrText>
             </w:r>
             <w:r>
               <w:rPr>
@@ -9747,7 +9747,7 @@
               <w14:ligatures w14:val="standardContextual"/>
             </w:rPr>
           </w:pPr>
-          <w:hyperlink w:anchor="_Toc243902371" w:history="1">
+          <w:hyperlink w:anchor="_Toc244207755" w:history="1">
             <w:r>
               <w:rPr>
                 <w:rStyle w:val="Hyperlink"/>
@@ -9784,7 +9784,7 @@
               <w:rPr>
                 <w:noProof/>
               </w:rPr>
-              <w:instrText xml:space="preserve"> PAGEREF _Toc243902371 \h </w:instrText>
+              <w:instrText xml:space="preserve"> PAGEREF _Toc244207755 \h </w:instrText>
             </w:r>
             <w:r>
               <w:rPr>
@@ -9826,7 +9826,7 @@
               <w14:ligatures w14:val="standardContextual"/>
             </w:rPr>
           </w:pPr>
-          <w:hyperlink w:anchor="_Toc243902372" w:history="1">
+          <w:hyperlink w:anchor="_Toc244207756" w:history="1">
             <w:r>
               <w:rPr>
                 <w:rStyle w:val="Hyperlink"/>
@@ -9863,7 +9863,7 @@
               <w:rPr>
                 <w:noProof/>
               </w:rPr>
-              <w:instrText xml:space="preserve"> PAGEREF _Toc243902372 \h </w:instrText>
+              <w:instrText xml:space="preserve"> PAGEREF _Toc244207756 \h </w:instrText>
             </w:r>
             <w:r>
               <w:rPr>
@@ -9905,7 +9905,7 @@
               <w14:ligatures w14:val="standardContextual"/>
             </w:rPr>
           </w:pPr>
-          <w:hyperlink w:anchor="_Toc243902373" w:history="1">
+          <w:hyperlink w:anchor="_Toc244207757" w:history="1">
             <w:r>
               <w:rPr>
                 <w:rStyle w:val="Hyperlink"/>
@@ -9942,7 +9942,7 @@
               <w:rPr>
                 <w:noProof/>
               </w:rPr>
-              <w:instrText xml:space="preserve"> PAGEREF _Toc243902373 \h </w:instrText>
+              <w:instrText xml:space="preserve"> PAGEREF _Toc244207757 \h </w:instrText>
             </w:r>
             <w:r>
               <w:rPr>
@@ -9993,7 +9993,7 @@
         <w:pStyle w:val="Heading1"/>
         <w:pageBreakBefore/>
       </w:pPr>
-      <w:bookmarkStart w:id="0" w:name="_Toc243902268"/>
+      <w:bookmarkStart w:id="0" w:name="_Toc244207652"/>
       <w:r>
         <w:lastRenderedPageBreak/>
         <w:t>LỜI MỞ ĐẦU</w:t>
@@ -10004,7 +10004,7 @@
       <w:pPr>
         <w:pStyle w:val="Heading2"/>
       </w:pPr>
-      <w:bookmarkStart w:id="1" w:name="_Toc243902269"/>
+      <w:bookmarkStart w:id="1" w:name="_Toc244207653"/>
       <w:r>
         <w:t>Lý do chọn đề tài</w:t>
       </w:r>
@@ -10077,7 +10077,7 @@
       <w:pPr>
         <w:pStyle w:val="Heading2"/>
       </w:pPr>
-      <w:bookmarkStart w:id="2" w:name="_Toc243902270"/>
+      <w:bookmarkStart w:id="2" w:name="_Toc244207654"/>
       <w:r>
         <w:t>Mục tiêu đề tài</w:t>
       </w:r>
@@ -10143,7 +10143,7 @@
       <w:pPr>
         <w:pStyle w:val="Heading2"/>
       </w:pPr>
-      <w:bookmarkStart w:id="3" w:name="_Toc243902271"/>
+      <w:bookmarkStart w:id="3" w:name="_Toc244207655"/>
       <w:r>
         <w:t>Đối tượng và phạm vi</w:t>
       </w:r>
@@ -10196,7 +10196,7 @@
       <w:pPr>
         <w:pStyle w:val="Heading2"/>
       </w:pPr>
-      <w:bookmarkStart w:id="4" w:name="_Toc243902272"/>
+      <w:bookmarkStart w:id="4" w:name="_Toc244207656"/>
       <w:r>
         <w:t>Phương pháp thực hiện</w:t>
       </w:r>
@@ -10248,7 +10248,7 @@
       <w:pPr>
         <w:pStyle w:val="Heading2"/>
       </w:pPr>
-      <w:bookmarkStart w:id="5" w:name="_Toc243902273"/>
+      <w:bookmarkStart w:id="5" w:name="_Toc244207657"/>
       <w:r>
         <w:t>Bố cục báo cáo</w:t>
       </w:r>
@@ -10371,7 +10371,7 @@
         <w:pStyle w:val="Heading1"/>
         <w:pageBreakBefore/>
       </w:pPr>
-      <w:bookmarkStart w:id="6" w:name="_Toc243902274"/>
+      <w:bookmarkStart w:id="6" w:name="_Toc244207658"/>
       <w:r>
         <w:lastRenderedPageBreak/>
         <w:t>CHƯƠNG 1. TỔNG QUAN VỀ CƠ SỞ DỮ LIỆU PHÂN TÁN</w:t>
@@ -10382,7 +10382,7 @@
       <w:pPr>
         <w:pStyle w:val="Heading2"/>
       </w:pPr>
-      <w:bookmarkStart w:id="7" w:name="_Toc243902275"/>
+      <w:bookmarkStart w:id="7" w:name="_Toc244207659"/>
       <w:r>
         <w:t>1.1 Khái niệm cơ sở dữ liệu phân tán</w:t>
       </w:r>
@@ -10511,7 +10511,7 @@
           <w:noProof/>
         </w:rPr>
         <w:drawing>
-          <wp:inline distT="0" distB="0" distL="0" distR="0" wp14:anchorId="4D1EE217" wp14:editId="34D47269">
+          <wp:inline distT="0" distB="0" distL="0" distR="0" wp14:anchorId="2B2A8723" wp14:editId="198F080F">
             <wp:extent cx="5619750" cy="3619500"/>
             <wp:effectExtent l="0" t="0" r="0" b="0"/>
             <wp:docPr id="1" name="Picture 1"/>
@@ -10556,7 +10556,7 @@
         <w:spacing w:after="160"/>
         <w:jc w:val="center"/>
       </w:pPr>
-      <w:bookmarkStart w:id="8" w:name="_Toc243902347"/>
+      <w:bookmarkStart w:id="8" w:name="_Toc244207731"/>
       <w:r>
         <w:rPr>
           <w:b/>
@@ -10579,7 +10579,7 @@
       <w:pPr>
         <w:pStyle w:val="Heading2"/>
       </w:pPr>
-      <w:bookmarkStart w:id="9" w:name="_Toc243902276"/>
+      <w:bookmarkStart w:id="9" w:name="_Toc244207660"/>
       <w:r>
         <w:lastRenderedPageBreak/>
         <w:t>1.2 So sánh CSDL tập trung và CSDL phân tán</w:t>
@@ -10603,7 +10603,7 @@
         <w:spacing w:before="120" w:after="160"/>
         <w:jc w:val="center"/>
       </w:pPr>
-      <w:bookmarkStart w:id="10" w:name="_Toc243902356"/>
+      <w:bookmarkStart w:id="10" w:name="_Toc244207740"/>
       <w:r>
         <w:rPr>
           <w:b/>
@@ -11470,7 +11470,7 @@
       <w:pPr>
         <w:pStyle w:val="Heading2"/>
       </w:pPr>
-      <w:bookmarkStart w:id="11" w:name="_Toc243902277"/>
+      <w:bookmarkStart w:id="11" w:name="_Toc244207661"/>
       <w:r>
         <w:t>1.3 Kiến trúc tham chiếu của CSDL phân tán</w:t>
       </w:r>
@@ -11592,7 +11592,7 @@
           <w:noProof/>
         </w:rPr>
         <w:drawing>
-          <wp:inline distT="0" distB="0" distL="0" distR="0" wp14:anchorId="5535E8C1" wp14:editId="102F2050">
+          <wp:inline distT="0" distB="0" distL="0" distR="0" wp14:anchorId="1F34DFB9" wp14:editId="4A777F7E">
             <wp:extent cx="5619750" cy="4905375"/>
             <wp:effectExtent l="0" t="0" r="0" b="0"/>
             <wp:docPr id="2" name="Picture 2"/>
@@ -11637,7 +11637,7 @@
         <w:spacing w:after="160"/>
         <w:jc w:val="center"/>
       </w:pPr>
-      <w:bookmarkStart w:id="12" w:name="_Toc243902348"/>
+      <w:bookmarkStart w:id="12" w:name="_Toc244207732"/>
       <w:r>
         <w:rPr>
           <w:b/>
@@ -11660,7 +11660,7 @@
       <w:pPr>
         <w:pStyle w:val="Heading2"/>
       </w:pPr>
-      <w:bookmarkStart w:id="13" w:name="_Toc243902278"/>
+      <w:bookmarkStart w:id="13" w:name="_Toc244207662"/>
       <w:r>
         <w:t>1.4 Tính trong suốt trong CSDL phân tán</w:t>
       </w:r>
@@ -11775,7 +11775,7 @@
       <w:pPr>
         <w:pStyle w:val="Heading2"/>
       </w:pPr>
-      <w:bookmarkStart w:id="14" w:name="_Toc243902279"/>
+      <w:bookmarkStart w:id="14" w:name="_Toc244207663"/>
       <w:r>
         <w:t>1.5 Thiết kế cơ sở dữ liệu phân tán</w:t>
       </w:r>
@@ -11785,7 +11785,7 @@
       <w:pPr>
         <w:pStyle w:val="Heading3"/>
       </w:pPr>
-      <w:bookmarkStart w:id="15" w:name="_Toc243902280"/>
+      <w:bookmarkStart w:id="15" w:name="_Toc244207664"/>
       <w:r>
         <w:t>1.5.1 Hai hướng tiếp cận</w:t>
       </w:r>
@@ -11837,7 +11837,7 @@
       <w:pPr>
         <w:pStyle w:val="Heading3"/>
       </w:pPr>
-      <w:bookmarkStart w:id="16" w:name="_Toc243902281"/>
+      <w:bookmarkStart w:id="16" w:name="_Toc244207665"/>
       <w:r>
         <w:t>1.5.2 Hai bài toán chính: phân mảnh và cấp phát</w:t>
       </w:r>
@@ -11913,7 +11913,7 @@
       <w:pPr>
         <w:pStyle w:val="Heading2"/>
       </w:pPr>
-      <w:bookmarkStart w:id="17" w:name="_Toc243902282"/>
+      <w:bookmarkStart w:id="17" w:name="_Toc244207666"/>
       <w:r>
         <w:t>1.6 Kết chương</w:t>
       </w:r>
@@ -11934,7 +11934,7 @@
         <w:pStyle w:val="Heading1"/>
         <w:pageBreakBefore/>
       </w:pPr>
-      <w:bookmarkStart w:id="18" w:name="_Toc243902283"/>
+      <w:bookmarkStart w:id="18" w:name="_Toc244207667"/>
       <w:r>
         <w:lastRenderedPageBreak/>
         <w:t>CHƯƠNG 2. PHÂN MẢNH DỮ LIỆU TRONG CSDL PHÂN TÁN</w:t>
@@ -11945,7 +11945,7 @@
       <w:pPr>
         <w:pStyle w:val="Heading2"/>
       </w:pPr>
-      <w:bookmarkStart w:id="19" w:name="_Toc243902284"/>
+      <w:bookmarkStart w:id="19" w:name="_Toc244207668"/>
       <w:r>
         <w:t>2.1 Lý do và đơn vị phân mảnh</w:t>
       </w:r>
@@ -12125,7 +12125,7 @@
           <w:noProof/>
         </w:rPr>
         <w:drawing>
-          <wp:inline distT="0" distB="0" distL="0" distR="0" wp14:anchorId="7AF75BA0" wp14:editId="7E82FCA9">
+          <wp:inline distT="0" distB="0" distL="0" distR="0" wp14:anchorId="6562E2F5" wp14:editId="1DA9B735">
             <wp:extent cx="5619750" cy="1790700"/>
             <wp:effectExtent l="0" t="0" r="0" b="0"/>
             <wp:docPr id="3" name="Picture 3"/>
@@ -12170,7 +12170,7 @@
         <w:spacing w:after="160"/>
         <w:jc w:val="center"/>
       </w:pPr>
-      <w:bookmarkStart w:id="20" w:name="_Toc243902349"/>
+      <w:bookmarkStart w:id="20" w:name="_Toc244207733"/>
       <w:r>
         <w:rPr>
           <w:b/>
@@ -12193,7 +12193,7 @@
       <w:pPr>
         <w:pStyle w:val="Heading2"/>
       </w:pPr>
-      <w:bookmarkStart w:id="21" w:name="_Toc243902285"/>
+      <w:bookmarkStart w:id="21" w:name="_Toc244207669"/>
       <w:r>
         <w:lastRenderedPageBreak/>
         <w:t>2.2 Các quy tắc đúng đắn của phân mảnh</w:t>
@@ -12331,7 +12331,7 @@
       <w:pPr>
         <w:pStyle w:val="Heading2"/>
       </w:pPr>
-      <w:bookmarkStart w:id="22" w:name="_Toc243902286"/>
+      <w:bookmarkStart w:id="22" w:name="_Toc244207670"/>
       <w:r>
         <w:t>2.3 Phân mảnh ngang nguyên thủy</w:t>
       </w:r>
@@ -12341,7 +12341,7 @@
       <w:pPr>
         <w:pStyle w:val="Heading3"/>
       </w:pPr>
-      <w:bookmarkStart w:id="23" w:name="_Toc243902287"/>
+      <w:bookmarkStart w:id="23" w:name="_Toc244207671"/>
       <w:r>
         <w:t>2.3.1 Định nghĩa</w:t>
       </w:r>
@@ -12437,7 +12437,7 @@
       <w:pPr>
         <w:pStyle w:val="Heading3"/>
       </w:pPr>
-      <w:bookmarkStart w:id="24" w:name="_Toc243902288"/>
+      <w:bookmarkStart w:id="24" w:name="_Toc244207672"/>
       <w:r>
         <w:t>2.3.2 Vị từ đơn giản và vị từ hội sơ cấp</w:t>
       </w:r>
@@ -12607,7 +12607,7 @@
       <w:pPr>
         <w:pStyle w:val="Heading3"/>
       </w:pPr>
-      <w:bookmarkStart w:id="25" w:name="_Toc243902289"/>
+      <w:bookmarkStart w:id="25" w:name="_Toc244207673"/>
       <w:r>
         <w:t>2.3.3 Tính đầy đủ và cực tiểu của tập vị từ</w:t>
       </w:r>
@@ -12774,7 +12774,7 @@
       <w:pPr>
         <w:pStyle w:val="Heading3"/>
       </w:pPr>
-      <w:bookmarkStart w:id="26" w:name="_Toc243902290"/>
+      <w:bookmarkStart w:id="26" w:name="_Toc244207674"/>
       <w:r>
         <w:t>2.3.4 Ví dụ</w:t>
       </w:r>
@@ -12997,7 +12997,7 @@
       <w:pPr>
         <w:pStyle w:val="Heading2"/>
       </w:pPr>
-      <w:bookmarkStart w:id="27" w:name="_Toc243902291"/>
+      <w:bookmarkStart w:id="27" w:name="_Toc244207675"/>
       <w:r>
         <w:t>2.4 Phân mảnh ngang dẫn xuất</w:t>
       </w:r>
@@ -13007,7 +13007,7 @@
       <w:pPr>
         <w:pStyle w:val="Heading3"/>
       </w:pPr>
-      <w:bookmarkStart w:id="28" w:name="_Toc243902292"/>
+      <w:bookmarkStart w:id="28" w:name="_Toc244207676"/>
       <w:r>
         <w:t>2.4.1 Định nghĩa</w:t>
       </w:r>
@@ -13112,7 +13112,7 @@
       <w:pPr>
         <w:pStyle w:val="Heading3"/>
       </w:pPr>
-      <w:bookmarkStart w:id="29" w:name="_Toc243902293"/>
+      <w:bookmarkStart w:id="29" w:name="_Toc244207677"/>
       <w:r>
         <w:t>2.4.2 Ví dụ</w:t>
       </w:r>
@@ -13227,7 +13227,7 @@
           <w:noProof/>
         </w:rPr>
         <w:drawing>
-          <wp:inline distT="0" distB="0" distL="0" distR="0" wp14:anchorId="0223E333" wp14:editId="35CFBC1F">
+          <wp:inline distT="0" distB="0" distL="0" distR="0" wp14:anchorId="12E63CCE" wp14:editId="25B7686E">
             <wp:extent cx="5619750" cy="1228725"/>
             <wp:effectExtent l="0" t="0" r="0" b="0"/>
             <wp:docPr id="4" name="Picture 4"/>
@@ -13272,7 +13272,7 @@
         <w:spacing w:after="160"/>
         <w:jc w:val="center"/>
       </w:pPr>
-      <w:bookmarkStart w:id="30" w:name="_Toc243902350"/>
+      <w:bookmarkStart w:id="30" w:name="_Toc244207734"/>
       <w:r>
         <w:rPr>
           <w:b/>
@@ -13344,7 +13344,7 @@
       <w:pPr>
         <w:pStyle w:val="Heading3"/>
       </w:pPr>
-      <w:bookmarkStart w:id="31" w:name="_Toc243902294"/>
+      <w:bookmarkStart w:id="31" w:name="_Toc244207678"/>
       <w:r>
         <w:t>2.4.3 Tính đúng đắn và lựa chọn quan hệ chủ</w:t>
       </w:r>
@@ -13445,7 +13445,7 @@
       <w:pPr>
         <w:pStyle w:val="Heading2"/>
       </w:pPr>
-      <w:bookmarkStart w:id="32" w:name="_Toc243902295"/>
+      <w:bookmarkStart w:id="32" w:name="_Toc244207679"/>
       <w:r>
         <w:t>2.5 Phân mảnh dọc</w:t>
       </w:r>
@@ -13455,7 +13455,7 @@
       <w:pPr>
         <w:pStyle w:val="Heading3"/>
       </w:pPr>
-      <w:bookmarkStart w:id="33" w:name="_Toc243902296"/>
+      <w:bookmarkStart w:id="33" w:name="_Toc244207680"/>
       <w:r>
         <w:t>2.5.1 Định nghĩa</w:t>
       </w:r>
@@ -13606,7 +13606,7 @@
       <w:pPr>
         <w:pStyle w:val="Heading3"/>
       </w:pPr>
-      <w:bookmarkStart w:id="34" w:name="_Toc243902297"/>
+      <w:bookmarkStart w:id="34" w:name="_Toc244207681"/>
       <w:r>
         <w:t>2.5.2 Ma trận sử dụng và ma trận ái lực</w:t>
       </w:r>
@@ -13792,7 +13792,7 @@
       <w:pPr>
         <w:pStyle w:val="Heading3"/>
       </w:pPr>
-      <w:bookmarkStart w:id="35" w:name="_Toc243902298"/>
+      <w:bookmarkStart w:id="35" w:name="_Toc244207682"/>
       <w:r>
         <w:t>2.5.3 Thuật toán BEA</w:t>
       </w:r>
@@ -13967,7 +13967,7 @@
       <w:pPr>
         <w:pStyle w:val="Heading3"/>
       </w:pPr>
-      <w:bookmarkStart w:id="36" w:name="_Toc243902299"/>
+      <w:bookmarkStart w:id="36" w:name="_Toc244207683"/>
       <w:r>
         <w:t>2.5.4 Thuật toán SPLIT</w:t>
       </w:r>
@@ -14011,7 +14011,7 @@
       <w:pPr>
         <w:pStyle w:val="Heading3"/>
       </w:pPr>
-      <w:bookmarkStart w:id="37" w:name="_Toc243902300"/>
+      <w:bookmarkStart w:id="37" w:name="_Toc244207684"/>
       <w:r>
         <w:t>2.5.5 Ví dụ</w:t>
       </w:r>
@@ -14034,7 +14034,7 @@
         <w:spacing w:before="120" w:after="160"/>
         <w:jc w:val="center"/>
       </w:pPr>
-      <w:bookmarkStart w:id="38" w:name="_Toc243902357"/>
+      <w:bookmarkStart w:id="38" w:name="_Toc244207741"/>
       <w:r>
         <w:rPr>
           <w:b/>
@@ -15029,7 +15029,7 @@
         <w:spacing w:before="120" w:after="160"/>
         <w:jc w:val="center"/>
       </w:pPr>
-      <w:bookmarkStart w:id="39" w:name="_Toc243902358"/>
+      <w:bookmarkStart w:id="39" w:name="_Toc244207742"/>
       <w:r>
         <w:rPr>
           <w:b/>
@@ -16033,7 +16033,7 @@
         <w:spacing w:before="120" w:after="160"/>
         <w:jc w:val="center"/>
       </w:pPr>
-      <w:bookmarkStart w:id="40" w:name="_Toc243902359"/>
+      <w:bookmarkStart w:id="40" w:name="_Toc244207743"/>
       <w:r>
         <w:rPr>
           <w:b/>
@@ -17225,7 +17225,7 @@
         <w:spacing w:before="120" w:after="160"/>
         <w:jc w:val="center"/>
       </w:pPr>
-      <w:bookmarkStart w:id="41" w:name="_Toc243902360"/>
+      <w:bookmarkStart w:id="41" w:name="_Toc244207744"/>
       <w:r>
         <w:rPr>
           <w:b/>
@@ -18415,7 +18415,7 @@
         <w:spacing w:before="120" w:after="160"/>
         <w:jc w:val="center"/>
       </w:pPr>
-      <w:bookmarkStart w:id="42" w:name="_Toc243902361"/>
+      <w:bookmarkStart w:id="42" w:name="_Toc244207745"/>
       <w:r>
         <w:rPr>
           <w:b/>
@@ -19330,7 +19330,7 @@
       <w:pPr>
         <w:pStyle w:val="Heading2"/>
       </w:pPr>
-      <w:bookmarkStart w:id="43" w:name="_Toc243902301"/>
+      <w:bookmarkStart w:id="43" w:name="_Toc244207685"/>
       <w:r>
         <w:t>2.6 Cấp phát và nhân bản</w:t>
       </w:r>
@@ -19426,7 +19426,7 @@
       <w:pPr>
         <w:pStyle w:val="Heading2"/>
       </w:pPr>
-      <w:bookmarkStart w:id="44" w:name="_Toc243902302"/>
+      <w:bookmarkStart w:id="44" w:name="_Toc244207686"/>
       <w:r>
         <w:lastRenderedPageBreak/>
         <w:t>2.7 Kết chương</w:t>
@@ -19448,7 +19448,7 @@
         <w:pStyle w:val="Heading1"/>
         <w:pageBreakBefore/>
       </w:pPr>
-      <w:bookmarkStart w:id="45" w:name="_Toc243902303"/>
+      <w:bookmarkStart w:id="45" w:name="_Toc244207687"/>
       <w:r>
         <w:lastRenderedPageBreak/>
         <w:t>CHƯƠNG 3. PHÂN MẢNH HỖN HỢP</w:t>
@@ -19459,7 +19459,7 @@
       <w:pPr>
         <w:pStyle w:val="Heading2"/>
       </w:pPr>
-      <w:bookmarkStart w:id="46" w:name="_Toc243902304"/>
+      <w:bookmarkStart w:id="46" w:name="_Toc244207688"/>
       <w:r>
         <w:t>3.1 Định nghĩa và động cơ sử dụng</w:t>
       </w:r>
@@ -19469,7 +19469,7 @@
       <w:pPr>
         <w:pStyle w:val="Heading3"/>
       </w:pPr>
-      <w:bookmarkStart w:id="47" w:name="_Toc243902305"/>
+      <w:bookmarkStart w:id="47" w:name="_Toc244207689"/>
       <w:r>
         <w:t>3.1.1 Động cơ</w:t>
       </w:r>
@@ -19512,7 +19512,7 @@
         <w:spacing w:before="120" w:after="160"/>
         <w:jc w:val="center"/>
       </w:pPr>
-      <w:bookmarkStart w:id="48" w:name="_Toc243902362"/>
+      <w:bookmarkStart w:id="48" w:name="_Toc244207746"/>
       <w:r>
         <w:rPr>
           <w:b/>
@@ -20057,7 +20057,7 @@
       <w:pPr>
         <w:pStyle w:val="Heading3"/>
       </w:pPr>
-      <w:bookmarkStart w:id="49" w:name="_Toc243902306"/>
+      <w:bookmarkStart w:id="49" w:name="_Toc244207690"/>
       <w:r>
         <w:t>3.1.2 Định nghĩa</w:t>
       </w:r>
@@ -20238,7 +20238,7 @@
       <w:pPr>
         <w:pStyle w:val="Heading2"/>
       </w:pPr>
-      <w:bookmarkStart w:id="50" w:name="_Toc243902307"/>
+      <w:bookmarkStart w:id="50" w:name="_Toc244207691"/>
       <w:r>
         <w:t>3.2 Chiến lược ngang trước, dọc sau (HV)</w:t>
       </w:r>
@@ -20417,7 +20417,7 @@
         </w:rPr>
         <w:lastRenderedPageBreak/>
         <w:drawing>
-          <wp:inline distT="0" distB="0" distL="0" distR="0" wp14:anchorId="7D70CBA0" wp14:editId="6B40AC36">
+          <wp:inline distT="0" distB="0" distL="0" distR="0" wp14:anchorId="082E0347" wp14:editId="684080EC">
             <wp:extent cx="5619750" cy="2800350"/>
             <wp:effectExtent l="0" t="0" r="0" b="0"/>
             <wp:docPr id="5" name="Picture 5"/>
@@ -20462,7 +20462,7 @@
         <w:spacing w:after="160"/>
         <w:jc w:val="center"/>
       </w:pPr>
-      <w:bookmarkStart w:id="51" w:name="_Toc243902351"/>
+      <w:bookmarkStart w:id="51" w:name="_Toc244207735"/>
       <w:r>
         <w:rPr>
           <w:b/>
@@ -20485,7 +20485,7 @@
       <w:pPr>
         <w:pStyle w:val="Heading2"/>
       </w:pPr>
-      <w:bookmarkStart w:id="52" w:name="_Toc243902308"/>
+      <w:bookmarkStart w:id="52" w:name="_Toc244207692"/>
       <w:r>
         <w:t>3.3 Chiến lược dọc trước, ngang sau (VH)</w:t>
       </w:r>
@@ -20671,7 +20671,7 @@
         </w:rPr>
         <w:lastRenderedPageBreak/>
         <w:drawing>
-          <wp:inline distT="0" distB="0" distL="0" distR="0" wp14:anchorId="2B1B93D2" wp14:editId="5C02B109">
+          <wp:inline distT="0" distB="0" distL="0" distR="0" wp14:anchorId="0D9EDE8A" wp14:editId="22CC10D4">
             <wp:extent cx="5619750" cy="3028950"/>
             <wp:effectExtent l="0" t="0" r="0" b="0"/>
             <wp:docPr id="6" name="Picture 6"/>
@@ -20716,7 +20716,7 @@
         <w:spacing w:after="160"/>
         <w:jc w:val="center"/>
       </w:pPr>
-      <w:bookmarkStart w:id="53" w:name="_Toc243902352"/>
+      <w:bookmarkStart w:id="53" w:name="_Toc244207736"/>
       <w:r>
         <w:rPr>
           <w:b/>
@@ -20739,7 +20739,7 @@
       <w:pPr>
         <w:pStyle w:val="Heading3"/>
       </w:pPr>
-      <w:bookmarkStart w:id="54" w:name="_Toc243902309"/>
+      <w:bookmarkStart w:id="54" w:name="_Toc244207693"/>
       <w:r>
         <w:t>3.3.1 Quan hệ giữa HV và VH</w:t>
       </w:r>
@@ -20897,7 +20897,7 @@
       <w:pPr>
         <w:pStyle w:val="Heading2"/>
       </w:pPr>
-      <w:bookmarkStart w:id="55" w:name="_Toc243902310"/>
+      <w:bookmarkStart w:id="55" w:name="_Toc244207694"/>
       <w:r>
         <w:t>3.4 Cây phân mảnh và biểu diễn bằng đại số quan hệ</w:t>
       </w:r>
@@ -21110,7 +21110,7 @@
       <w:pPr>
         <w:pStyle w:val="Heading2"/>
       </w:pPr>
-      <w:bookmarkStart w:id="56" w:name="_Toc243902311"/>
+      <w:bookmarkStart w:id="56" w:name="_Toc244207695"/>
       <w:r>
         <w:t>3.5 Tái thiết quan hệ toàn cục</w:t>
       </w:r>
@@ -21569,7 +21569,7 @@
       <w:pPr>
         <w:pStyle w:val="Heading2"/>
       </w:pPr>
-      <w:bookmarkStart w:id="57" w:name="_Toc243902312"/>
+      <w:bookmarkStart w:id="57" w:name="_Toc244207696"/>
       <w:r>
         <w:t>3.6 Kiểm tra tính đúng đắn</w:t>
       </w:r>
@@ -21717,7 +21717,7 @@
       <w:pPr>
         <w:pStyle w:val="Heading2"/>
       </w:pPr>
-      <w:bookmarkStart w:id="58" w:name="_Toc243902313"/>
+      <w:bookmarkStart w:id="58" w:name="_Toc244207697"/>
       <w:r>
         <w:t>3.7 Cấp phát mảnh hỗn hợp và ảnh hưởng đến xử lý</w:t>
       </w:r>
@@ -21727,7 +21727,7 @@
       <w:pPr>
         <w:pStyle w:val="Heading3"/>
       </w:pPr>
-      <w:bookmarkStart w:id="59" w:name="_Toc243902314"/>
+      <w:bookmarkStart w:id="59" w:name="_Toc244207698"/>
       <w:r>
         <w:t>3.7.1 Cấp phát</w:t>
       </w:r>
@@ -21757,7 +21757,7 @@
       <w:pPr>
         <w:pStyle w:val="Heading3"/>
       </w:pPr>
-      <w:bookmarkStart w:id="60" w:name="_Toc243902315"/>
+      <w:bookmarkStart w:id="60" w:name="_Toc244207699"/>
       <w:r>
         <w:t>3.7.2 Ảnh hưởng đến xử lý truy vấn</w:t>
       </w:r>
@@ -21911,7 +21911,7 @@
       <w:pPr>
         <w:pStyle w:val="Heading3"/>
       </w:pPr>
-      <w:bookmarkStart w:id="61" w:name="_Toc243902316"/>
+      <w:bookmarkStart w:id="61" w:name="_Toc244207700"/>
       <w:r>
         <w:lastRenderedPageBreak/>
         <w:t>3.7.3 Ảnh hưởng đến cập nhật và giao dịch</w:t>
@@ -21994,7 +21994,7 @@
       <w:pPr>
         <w:pStyle w:val="Heading2"/>
       </w:pPr>
-      <w:bookmarkStart w:id="62" w:name="_Toc243902317"/>
+      <w:bookmarkStart w:id="62" w:name="_Toc244207701"/>
       <w:r>
         <w:t>3.8 Ưu điểm, hạn chế và so sánh</w:t>
       </w:r>
@@ -22178,7 +22178,7 @@
         <w:spacing w:before="120" w:after="160"/>
         <w:jc w:val="center"/>
       </w:pPr>
-      <w:bookmarkStart w:id="63" w:name="_Toc243902363"/>
+      <w:bookmarkStart w:id="63" w:name="_Toc244207747"/>
       <w:r>
         <w:rPr>
           <w:b/>
@@ -23291,7 +23291,7 @@
       <w:pPr>
         <w:pStyle w:val="Heading2"/>
       </w:pPr>
-      <w:bookmarkStart w:id="64" w:name="_Toc243902318"/>
+      <w:bookmarkStart w:id="64" w:name="_Toc244207702"/>
       <w:r>
         <w:t>3.9 Hỗ trợ trong các hệ quản trị thực tế</w:t>
       </w:r>
@@ -23507,7 +23507,7 @@
       <w:pPr>
         <w:pStyle w:val="Heading2"/>
       </w:pPr>
-      <w:bookmarkStart w:id="65" w:name="_Toc243902319"/>
+      <w:bookmarkStart w:id="65" w:name="_Toc244207703"/>
       <w:r>
         <w:t>3.10 Kết chương</w:t>
       </w:r>
@@ -23532,7 +23532,7 @@
         <w:pStyle w:val="Heading1"/>
         <w:pageBreakBefore/>
       </w:pPr>
-      <w:bookmarkStart w:id="66" w:name="_Toc243902320"/>
+      <w:bookmarkStart w:id="66" w:name="_Toc244207704"/>
       <w:r>
         <w:lastRenderedPageBreak/>
         <w:t>CHƯƠNG 4. ỨNG DỤNG PHÂN MẢNH HỖN HỢP CHO HỆ THỐNG QUẢN LÝ ĐƠN HÀNG</w:t>
@@ -23543,7 +23543,7 @@
       <w:pPr>
         <w:pStyle w:val="Heading2"/>
       </w:pPr>
-      <w:bookmarkStart w:id="67" w:name="_Toc243902321"/>
+      <w:bookmarkStart w:id="67" w:name="_Toc244207705"/>
       <w:r>
         <w:t>4.1 Mô tả bài toán</w:t>
       </w:r>
@@ -23566,7 +23566,7 @@
         <w:spacing w:before="120" w:after="160"/>
         <w:jc w:val="center"/>
       </w:pPr>
-      <w:bookmarkStart w:id="68" w:name="_Toc243902364"/>
+      <w:bookmarkStart w:id="68" w:name="_Toc244207748"/>
       <w:r>
         <w:rPr>
           <w:b/>
@@ -24377,7 +24377,7 @@
       <w:pPr>
         <w:pStyle w:val="Heading2"/>
       </w:pPr>
-      <w:bookmarkStart w:id="69" w:name="_Toc243902322"/>
+      <w:bookmarkStart w:id="69" w:name="_Toc244207706"/>
       <w:r>
         <w:t>4.2 Lược đồ toàn cục</w:t>
       </w:r>
@@ -24568,7 +24568,7 @@
           <w:noProof/>
         </w:rPr>
         <w:drawing>
-          <wp:inline distT="0" distB="0" distL="0" distR="0" wp14:anchorId="6E4E86A0" wp14:editId="558F9897">
+          <wp:inline distT="0" distB="0" distL="0" distR="0" wp14:anchorId="09AE4D71" wp14:editId="7EDD92E8">
             <wp:extent cx="5619750" cy="3076575"/>
             <wp:effectExtent l="0" t="0" r="0" b="0"/>
             <wp:docPr id="7" name="Picture 7"/>
@@ -24613,7 +24613,7 @@
         <w:spacing w:after="160"/>
         <w:jc w:val="center"/>
       </w:pPr>
-      <w:bookmarkStart w:id="70" w:name="_Toc243902353"/>
+      <w:bookmarkStart w:id="70" w:name="_Toc244207737"/>
       <w:r>
         <w:rPr>
           <w:b/>
@@ -24636,7 +24636,7 @@
       <w:pPr>
         <w:pStyle w:val="Heading2"/>
       </w:pPr>
-      <w:bookmarkStart w:id="71" w:name="_Toc243902323"/>
+      <w:bookmarkStart w:id="71" w:name="_Toc244207707"/>
       <w:r>
         <w:t>4.3 Phân tích ứng dụng</w:t>
       </w:r>
@@ -24659,7 +24659,7 @@
         <w:spacing w:before="120" w:after="160"/>
         <w:jc w:val="center"/>
       </w:pPr>
-      <w:bookmarkStart w:id="72" w:name="_Toc243902365"/>
+      <w:bookmarkStart w:id="72" w:name="_Toc244207749"/>
       <w:r>
         <w:rPr>
           <w:b/>
@@ -26007,7 +26007,7 @@
           <w:noProof/>
         </w:rPr>
         <w:drawing>
-          <wp:inline distT="0" distB="0" distL="0" distR="0" wp14:anchorId="00DDCB6D" wp14:editId="57D1BDA8">
+          <wp:inline distT="0" distB="0" distL="0" distR="0" wp14:anchorId="1559CA97" wp14:editId="30BDC385">
             <wp:extent cx="5619750" cy="1809750"/>
             <wp:effectExtent l="0" t="0" r="0" b="0"/>
             <wp:docPr id="8" name="Picture 8"/>
@@ -26052,7 +26052,7 @@
         <w:spacing w:after="160"/>
         <w:jc w:val="center"/>
       </w:pPr>
-      <w:bookmarkStart w:id="73" w:name="_Toc243902354"/>
+      <w:bookmarkStart w:id="73" w:name="_Toc244207738"/>
       <w:r>
         <w:rPr>
           <w:b/>
@@ -26075,7 +26075,7 @@
       <w:pPr>
         <w:pStyle w:val="Heading2"/>
       </w:pPr>
-      <w:bookmarkStart w:id="74" w:name="_Toc243902324"/>
+      <w:bookmarkStart w:id="74" w:name="_Toc244207708"/>
       <w:r>
         <w:t>4.4 Thiết kế phân mảnh</w:t>
       </w:r>
@@ -26098,7 +26098,7 @@
         <w:spacing w:before="120" w:after="160"/>
         <w:jc w:val="center"/>
       </w:pPr>
-      <w:bookmarkStart w:id="75" w:name="_Toc243902366"/>
+      <w:bookmarkStart w:id="75" w:name="_Toc244207750"/>
       <w:r>
         <w:rPr>
           <w:b/>
@@ -26914,7 +26914,7 @@
       <w:pPr>
         <w:pStyle w:val="Heading3"/>
       </w:pPr>
-      <w:bookmarkStart w:id="76" w:name="_Toc243902325"/>
+      <w:bookmarkStart w:id="76" w:name="_Toc244207709"/>
       <w:r>
         <w:t>4.4.1 KhachHang – phân mảnh hỗn hợp HV</w:t>
       </w:r>
@@ -27317,7 +27317,7 @@
       <w:pPr>
         <w:pStyle w:val="Heading3"/>
       </w:pPr>
-      <w:bookmarkStart w:id="77" w:name="_Toc243902326"/>
+      <w:bookmarkStart w:id="77" w:name="_Toc244207710"/>
       <w:r>
         <w:t>4.4.2 NhanVien – phân mảnh hỗn hợp VH</w:t>
       </w:r>
@@ -27616,7 +27616,7 @@
       <w:pPr>
         <w:pStyle w:val="Heading3"/>
       </w:pPr>
-      <w:bookmarkStart w:id="78" w:name="_Toc243902327"/>
+      <w:bookmarkStart w:id="78" w:name="_Toc244207711"/>
       <w:r>
         <w:t>4.4.3 DonHang, ChiTietDonHang – phân mảnh ngang dẫn xuất</w:t>
       </w:r>
@@ -27748,7 +27748,7 @@
       <w:pPr>
         <w:pStyle w:val="Heading3"/>
       </w:pPr>
-      <w:bookmarkStart w:id="79" w:name="_Toc243902328"/>
+      <w:bookmarkStart w:id="79" w:name="_Toc244207712"/>
       <w:r>
         <w:t>4.4.4 ChiNhanh, SanPham – nhân bản toàn phần</w:t>
       </w:r>
@@ -27768,7 +27768,7 @@
       <w:pPr>
         <w:pStyle w:val="Heading2"/>
       </w:pPr>
-      <w:bookmarkStart w:id="80" w:name="_Toc243902329"/>
+      <w:bookmarkStart w:id="80" w:name="_Toc244207713"/>
       <w:r>
         <w:t>4.5 Kiểm tra tính đúng đắn</w:t>
       </w:r>
@@ -27791,7 +27791,7 @@
         <w:spacing w:before="120" w:after="160"/>
         <w:jc w:val="center"/>
       </w:pPr>
-      <w:bookmarkStart w:id="81" w:name="_Toc243902367"/>
+      <w:bookmarkStart w:id="81" w:name="_Toc244207751"/>
       <w:r>
         <w:rPr>
           <w:b/>
@@ -28317,7 +28317,7 @@
       <w:pPr>
         <w:pStyle w:val="Heading2"/>
       </w:pPr>
-      <w:bookmarkStart w:id="82" w:name="_Toc243902330"/>
+      <w:bookmarkStart w:id="82" w:name="_Toc244207714"/>
       <w:r>
         <w:lastRenderedPageBreak/>
         <w:t>4.6 Lược đồ cấp phát</w:t>
@@ -28341,7 +28341,7 @@
         <w:spacing w:before="120" w:after="160"/>
         <w:jc w:val="center"/>
       </w:pPr>
-      <w:bookmarkStart w:id="83" w:name="_Toc243902368"/>
+      <w:bookmarkStart w:id="83" w:name="_Toc244207752"/>
       <w:r>
         <w:rPr>
           <w:b/>
@@ -28738,7 +28738,7 @@
           <w:noProof/>
         </w:rPr>
         <w:drawing>
-          <wp:inline distT="0" distB="0" distL="0" distR="0" wp14:anchorId="2465C48E" wp14:editId="6F323773">
+          <wp:inline distT="0" distB="0" distL="0" distR="0" wp14:anchorId="7B0295C9" wp14:editId="2D39435F">
             <wp:extent cx="5619750" cy="3486150"/>
             <wp:effectExtent l="0" t="0" r="0" b="0"/>
             <wp:docPr id="9" name="Picture 9"/>
@@ -28783,7 +28783,7 @@
         <w:spacing w:after="160"/>
         <w:jc w:val="center"/>
       </w:pPr>
-      <w:bookmarkStart w:id="84" w:name="_Toc243902355"/>
+      <w:bookmarkStart w:id="84" w:name="_Toc244207739"/>
       <w:r>
         <w:rPr>
           <w:b/>
@@ -28892,7 +28892,7 @@
       <w:pPr>
         <w:pStyle w:val="Heading2"/>
       </w:pPr>
-      <w:bookmarkStart w:id="85" w:name="_Toc243902331"/>
+      <w:bookmarkStart w:id="85" w:name="_Toc244207715"/>
       <w:r>
         <w:lastRenderedPageBreak/>
         <w:t>4.7 Cài đặt thực nghiệm trên SQL Server</w:t>
@@ -28903,7 +28903,7 @@
       <w:pPr>
         <w:pStyle w:val="Heading3"/>
       </w:pPr>
-      <w:bookmarkStart w:id="86" w:name="_Toc243902332"/>
+      <w:bookmarkStart w:id="86" w:name="_Toc244207716"/>
       <w:r>
         <w:t>4.7.1 Môi trường và cách mô phỏng</w:t>
       </w:r>
@@ -28972,7 +28972,7 @@
         <w:spacing w:before="120" w:after="160"/>
         <w:jc w:val="center"/>
       </w:pPr>
-      <w:bookmarkStart w:id="87" w:name="_Toc243902369"/>
+      <w:bookmarkStart w:id="87" w:name="_Toc244207753"/>
       <w:r>
         <w:rPr>
           <w:b/>
@@ -29372,7 +29372,7 @@
       <w:pPr>
         <w:pStyle w:val="Heading3"/>
       </w:pPr>
-      <w:bookmarkStart w:id="88" w:name="_Toc243902333"/>
+      <w:bookmarkStart w:id="88" w:name="_Toc244207717"/>
       <w:r>
         <w:t>4.7.2 Tạo các mảnh</w:t>
       </w:r>
@@ -29801,7 +29801,7 @@
         <w:spacing w:before="120" w:after="160"/>
         <w:jc w:val="center"/>
       </w:pPr>
-      <w:bookmarkStart w:id="89" w:name="_Toc243902370"/>
+      <w:bookmarkStart w:id="89" w:name="_Toc244207754"/>
       <w:r>
         <w:rPr>
           <w:b/>
@@ -30209,7 +30209,7 @@
       <w:pPr>
         <w:pStyle w:val="Heading3"/>
       </w:pPr>
-      <w:bookmarkStart w:id="90" w:name="_Toc243902334"/>
+      <w:bookmarkStart w:id="90" w:name="_Toc244207718"/>
       <w:r>
         <w:t>4.7.3 Tái thiết và kiểm tra tính đúng đắn</w:t>
       </w:r>
@@ -30573,7 +30573,7 @@
         <w:spacing w:before="120" w:after="160"/>
         <w:jc w:val="center"/>
       </w:pPr>
-      <w:bookmarkStart w:id="91" w:name="_Toc243902371"/>
+      <w:bookmarkStart w:id="91" w:name="_Toc244207755"/>
       <w:r>
         <w:rPr>
           <w:b/>
@@ -33293,7 +33293,7 @@
       <w:pPr>
         <w:pStyle w:val="Heading3"/>
       </w:pPr>
-      <w:bookmarkStart w:id="92" w:name="_Toc243902335"/>
+      <w:bookmarkStart w:id="92" w:name="_Toc244207719"/>
       <w:r>
         <w:t>4.7.4 Truy vấn minh họa</w:t>
       </w:r>
@@ -33480,7 +33480,7 @@
         <w:spacing w:before="120" w:after="160"/>
         <w:jc w:val="center"/>
       </w:pPr>
-      <w:bookmarkStart w:id="93" w:name="_Toc243902372"/>
+      <w:bookmarkStart w:id="93" w:name="_Toc244207756"/>
       <w:r>
         <w:rPr>
           <w:b/>
@@ -34264,7 +34264,7 @@
         <w:spacing w:before="120" w:after="160"/>
         <w:jc w:val="center"/>
       </w:pPr>
-      <w:bookmarkStart w:id="94" w:name="_Toc243902373"/>
+      <w:bookmarkStart w:id="94" w:name="_Toc244207757"/>
       <w:r>
         <w:rPr>
           <w:b/>
@@ -34819,7 +34819,7 @@
       <w:pPr>
         <w:pStyle w:val="Heading3"/>
       </w:pPr>
-      <w:bookmarkStart w:id="95" w:name="_Toc243902336"/>
+      <w:bookmarkStart w:id="95" w:name="_Toc244207720"/>
       <w:r>
         <w:t>4.7.5 Giao dịch phân tán</w:t>
       </w:r>
@@ -35466,7 +35466,7 @@
       <w:pPr>
         <w:pStyle w:val="Heading2"/>
       </w:pPr>
-      <w:bookmarkStart w:id="96" w:name="_Toc243902337"/>
+      <w:bookmarkStart w:id="96" w:name="_Toc244207721"/>
       <w:r>
         <w:t>4.8 Đánh giá</w:t>
       </w:r>
@@ -35630,7 +35630,7 @@
       <w:pPr>
         <w:pStyle w:val="Heading2"/>
       </w:pPr>
-      <w:bookmarkStart w:id="97" w:name="_Toc243902338"/>
+      <w:bookmarkStart w:id="97" w:name="_Toc244207722"/>
       <w:r>
         <w:t>4.9 Kết chương</w:t>
       </w:r>
@@ -35655,7 +35655,7 @@
         <w:pStyle w:val="Heading1"/>
         <w:pageBreakBefore/>
       </w:pPr>
-      <w:bookmarkStart w:id="98" w:name="_Toc243902339"/>
+      <w:bookmarkStart w:id="98" w:name="_Toc244207723"/>
       <w:r>
         <w:lastRenderedPageBreak/>
         <w:t>CHƯƠNG 5. KẾT LUẬN VÀ HƯỚNG PHÁT TRIỂN</w:t>
@@ -35666,7 +35666,7 @@
       <w:pPr>
         <w:pStyle w:val="Heading2"/>
       </w:pPr>
-      <w:bookmarkStart w:id="99" w:name="_Toc243902340"/>
+      <w:bookmarkStart w:id="99" w:name="_Toc244207724"/>
       <w:r>
         <w:t>5.1 Kết quả đạt được</w:t>
       </w:r>
@@ -35719,7 +35719,7 @@
       <w:pPr>
         <w:pStyle w:val="Heading2"/>
       </w:pPr>
-      <w:bookmarkStart w:id="100" w:name="_Toc243902341"/>
+      <w:bookmarkStart w:id="100" w:name="_Toc244207725"/>
       <w:r>
         <w:t>5.2 Hạn chế</w:t>
       </w:r>
@@ -35785,7 +35785,7 @@
       <w:pPr>
         <w:pStyle w:val="Heading2"/>
       </w:pPr>
-      <w:bookmarkStart w:id="101" w:name="_Toc243902342"/>
+      <w:bookmarkStart w:id="101" w:name="_Toc244207726"/>
       <w:r>
         <w:t>5.3 Hướng phát triển</w:t>
       </w:r>
@@ -35867,7 +35867,7 @@
         <w:pStyle w:val="Heading1"/>
         <w:pageBreakBefore/>
       </w:pPr>
-      <w:bookmarkStart w:id="102" w:name="_Toc243902343"/>
+      <w:bookmarkStart w:id="102" w:name="_Toc244207727"/>
       <w:r>
         <w:lastRenderedPageBreak/>
         <w:t>TÀI LIỆU THAM KHẢO</w:t>
@@ -35982,7 +35982,7 @@
         <w:pStyle w:val="Heading1"/>
         <w:pageBreakBefore/>
       </w:pPr>
-      <w:bookmarkStart w:id="103" w:name="_Toc243902344"/>
+      <w:bookmarkStart w:id="103" w:name="_Toc244207728"/>
       <w:r>
         <w:lastRenderedPageBreak/>
         <w:t>PHỤ LỤC</w:t>
@@ -36003,7 +36003,7 @@
       <w:pPr>
         <w:pStyle w:val="Heading2"/>
       </w:pPr>
-      <w:bookmarkStart w:id="104" w:name="_Toc243902345"/>
+      <w:bookmarkStart w:id="104" w:name="_Toc244207729"/>
       <w:r>
         <w:t>Phụ lục A. Script tái thiết và kiểm tra tính đúng đắn</w:t>
       </w:r>
@@ -43181,7 +43181,7 @@
       <w:pPr>
         <w:pStyle w:val="Heading2"/>
       </w:pPr>
-      <w:bookmarkStart w:id="105" w:name="_Toc243902346"/>
+      <w:bookmarkStart w:id="105" w:name="_Toc244207730"/>
       <w:r>
         <w:t>Phụ lục B. Script truy vấn minh họa và giao dịch phân tán</w:t>
       </w:r>
@@ -51035,122 +51035,122 @@
 <file path=word/numbering.xml><?xml version="1.0" encoding="utf-8"?>
 <w:numbering xmlns:wpc="http://schemas.microsoft.com/office/word/2010/wordprocessingCanvas" xmlns:cx="http://schemas.microsoft.com/office/drawing/2014/chartex" xmlns:cx1="http://schemas.microsoft.com/office/drawing/2015/9/8/chartex" xmlns:cx2="http://schemas.microsoft.com/office/drawing/2015/10/21/chartex" xmlns:cx3="http://schemas.microsoft.com/office/drawing/2016/5/9/chartex" xmlns:cx4="http://schemas.microsoft.com/office/drawing/2016/5/10/chartex" xmlns:cx5="http://schemas.microsoft.com/office/drawing/2016/5/11/chartex" xmlns:cx6="http://schemas.microsoft.com/office/drawing/2016/5/12/chartex" xmlns:cx7="http://schemas.microsoft.com/office/drawing/2016/5/13/chartex" xmlns:cx8="http://schemas.microsoft.com/office/drawing/2016/5/14/chartex" xmlns:mc="http://schemas.openxmlformats.org/markup-compatibility/2006" xmlns:aink="http://schemas.microsoft.com/office/drawing/2016/ink" xmlns:am3d="http://schemas.microsoft.com/office/drawing/2017/model3d" xmlns:o="urn:schemas-microsoft-com:office:office" xmlns:oel="http://schemas.microsoft.com/office/2019/extlst" xmlns:r="http://schemas.openxmlformats.org/officeDocument/2006/relationships" xmlns:m="http://schemas.openxmlformats.org/officeDocument/2006/math" xmlns:v="urn:schemas-microsoft-com:vml" xmlns:wp14="http://schemas.microsoft.com/office/word/2010/wordprocessingDrawing" xmlns:wp="http://schemas.openxmlformats.org/drawingml/2006/wordprocessingDrawing" xmlns:w10="urn:schemas-microsoft-com:office:word" xmlns:w="http://schemas.openxmlformats.org/wordprocessingml/2006/main" xmlns:w14="http://schemas.microsoft.com/office/word/2010/wordml" xmlns:w15="http://schemas.microsoft.com/office/word/2012/wordml" xmlns:w16cex="http://schemas.microsoft.com/office/word/2018/wordml/cex" xmlns:w16cid="http://schemas.microsoft.com/office/word/2016/wordml/cid" xmlns:w16="http://schemas.microsoft.com/office/word/2018/wordml" xmlns:w16sdtdh="http://schemas.microsoft.com/office/word/2020/wordml/sdtdatahash" xmlns:w16se="http://schemas.microsoft.com/office/word/2015/wordml/symex" xmlns:wpg="http://schemas.microsoft.com/office/word/2010/wordprocessingGroup" xmlns:wpi="http://schemas.microsoft.com/office/word/2010/wordprocessingInk" xmlns:wne="http://schemas.microsoft.com/office/word/2006/wordml" xmlns:wps="http://schemas.microsoft.com/office/word/2010/wordprocessingShape" mc:Ignorable="w14 w15 w16se w16cid w16 w16cex w16sdtdh wp14">
   <w:abstractNum w:abstractNumId="0" w15:restartNumberingAfterBreak="0">
-    <w:nsid w:val="28690EA6"/>
+    <w:nsid w:val="4C9B25EB"/>
     <w:multiLevelType w:val="hybridMultilevel"/>
-    <w:tmpl w:val="51A8F99A"/>
-    <w:lvl w:ilvl="0" w:tplc="3F7A75CC">
+    <w:tmpl w:val="C0FABC8E"/>
+    <w:lvl w:ilvl="0" w:tplc="2E96B50E">
       <w:start w:val="1"/>
-      <w:numFmt w:val="decimal"/>
-      <w:lvlText w:val="%1."/>
+      <w:numFmt w:val="bullet"/>
+      <w:lvlText w:val="–"/>
       <w:lvlJc w:val="left"/>
       <w:pPr>
         <w:ind w:left="720" w:hanging="360"/>
       </w:pPr>
     </w:lvl>
-    <w:lvl w:ilvl="1" w:tplc="841C8D88">
+    <w:lvl w:ilvl="1" w:tplc="5C62AFE4" w:tentative="1">
+      <w:start w:val="1"/>
+      <w:numFmt w:val="bullet"/>
+      <w:lvlText w:val="+"/>
+      <w:lvlJc w:val="left"/>
+      <w:pPr>
+        <w:ind w:left="1260" w:hanging="360"/>
+      </w:pPr>
+    </w:lvl>
+    <w:lvl w:ilvl="2" w:tplc="3FA03E3A">
       <w:numFmt w:val="decimal"/>
       <w:lvlText w:val=""/>
       <w:lvlJc w:val="left"/>
     </w:lvl>
-    <w:lvl w:ilvl="2" w:tplc="FE9C5D4A">
+    <w:lvl w:ilvl="3" w:tplc="882A3FD8">
       <w:numFmt w:val="decimal"/>
       <w:lvlText w:val=""/>
       <w:lvlJc w:val="left"/>
     </w:lvl>
-    <w:lvl w:ilvl="3" w:tplc="4F667AEC">
+    <w:lvl w:ilvl="4" w:tplc="C2A23C76">
       <w:numFmt w:val="decimal"/>
       <w:lvlText w:val=""/>
       <w:lvlJc w:val="left"/>
     </w:lvl>
-    <w:lvl w:ilvl="4" w:tplc="5030AB52">
+    <w:lvl w:ilvl="5" w:tplc="0262A774">
       <w:numFmt w:val="decimal"/>
       <w:lvlText w:val=""/>
       <w:lvlJc w:val="left"/>
     </w:lvl>
-    <w:lvl w:ilvl="5" w:tplc="E996AE9E">
+    <w:lvl w:ilvl="6" w:tplc="8D5ED292">
       <w:numFmt w:val="decimal"/>
       <w:lvlText w:val=""/>
       <w:lvlJc w:val="left"/>
     </w:lvl>
-    <w:lvl w:ilvl="6" w:tplc="95B24EBE">
+    <w:lvl w:ilvl="7" w:tplc="D804C536">
       <w:numFmt w:val="decimal"/>
       <w:lvlText w:val=""/>
       <w:lvlJc w:val="left"/>
     </w:lvl>
-    <w:lvl w:ilvl="7" w:tplc="40DC95AE">
-      <w:numFmt w:val="decimal"/>
-      <w:lvlText w:val=""/>
-      <w:lvlJc w:val="left"/>
-    </w:lvl>
-    <w:lvl w:ilvl="8" w:tplc="DE306BD0">
+    <w:lvl w:ilvl="8" w:tplc="2E9C75A0">
       <w:numFmt w:val="decimal"/>
       <w:lvlText w:val=""/>
       <w:lvlJc w:val="left"/>
     </w:lvl>
   </w:abstractNum>
   <w:abstractNum w:abstractNumId="1" w15:restartNumberingAfterBreak="0">
-    <w:nsid w:val="2CE224DE"/>
+    <w:nsid w:val="57B346BA"/>
     <w:multiLevelType w:val="hybridMultilevel"/>
-    <w:tmpl w:val="3998F3FC"/>
-    <w:lvl w:ilvl="0" w:tplc="9BDA9F30">
+    <w:tmpl w:val="0BB2F614"/>
+    <w:lvl w:ilvl="0" w:tplc="E0C227DA">
       <w:start w:val="1"/>
-      <w:numFmt w:val="bullet"/>
-      <w:lvlText w:val="–"/>
+      <w:numFmt w:val="decimal"/>
+      <w:lvlText w:val="%1."/>
       <w:lvlJc w:val="left"/>
       <w:pPr>
         <w:ind w:left="720" w:hanging="360"/>
       </w:pPr>
     </w:lvl>
-    <w:lvl w:ilvl="1" w:tplc="6BB0B7C2" w:tentative="1">
-      <w:start w:val="1"/>
-      <w:numFmt w:val="bullet"/>
-      <w:lvlText w:val="+"/>
-      <w:lvlJc w:val="left"/>
-      <w:pPr>
-        <w:ind w:left="1260" w:hanging="360"/>
-      </w:pPr>
-    </w:lvl>
-    <w:lvl w:ilvl="2" w:tplc="1CB836BC">
+    <w:lvl w:ilvl="1" w:tplc="35C2AF38">
       <w:numFmt w:val="decimal"/>
       <w:lvlText w:val=""/>
       <w:lvlJc w:val="left"/>
     </w:lvl>
-    <w:lvl w:ilvl="3" w:tplc="1F30C298">
+    <w:lvl w:ilvl="2" w:tplc="99864FDE">
       <w:numFmt w:val="decimal"/>
       <w:lvlText w:val=""/>
       <w:lvlJc w:val="left"/>
     </w:lvl>
-    <w:lvl w:ilvl="4" w:tplc="EE281232">
+    <w:lvl w:ilvl="3" w:tplc="747E8BC8">
       <w:numFmt w:val="decimal"/>
       <w:lvlText w:val=""/>
       <w:lvlJc w:val="left"/>
     </w:lvl>
-    <w:lvl w:ilvl="5" w:tplc="67F24F00">
+    <w:lvl w:ilvl="4" w:tplc="F4EC9094">
       <w:numFmt w:val="decimal"/>
       <w:lvlText w:val=""/>
       <w:lvlJc w:val="left"/>
     </w:lvl>
-    <w:lvl w:ilvl="6" w:tplc="392A632E">
+    <w:lvl w:ilvl="5" w:tplc="15B29398">
       <w:numFmt w:val="decimal"/>
       <w:lvlText w:val=""/>
       <w:lvlJc w:val="left"/>
     </w:lvl>
-    <w:lvl w:ilvl="7" w:tplc="79BA39DC">
+    <w:lvl w:ilvl="6" w:tplc="A5042D2E">
       <w:numFmt w:val="decimal"/>
       <w:lvlText w:val=""/>
       <w:lvlJc w:val="left"/>
     </w:lvl>
-    <w:lvl w:ilvl="8" w:tplc="101A222C">
+    <w:lvl w:ilvl="7" w:tplc="967CB9D6">
+      <w:numFmt w:val="decimal"/>
+      <w:lvlText w:val=""/>
+      <w:lvlJc w:val="left"/>
+    </w:lvl>
+    <w:lvl w:ilvl="8" w:tplc="D20A77C8">
       <w:numFmt w:val="decimal"/>
       <w:lvlText w:val=""/>
       <w:lvlJc w:val="left"/>
     </w:lvl>
   </w:abstractNum>
   <w:abstractNum w:abstractNumId="2" w15:restartNumberingAfterBreak="0">
-    <w:nsid w:val="4EC63E0F"/>
+    <w:nsid w:val="6F073C37"/>
     <w:multiLevelType w:val="hybridMultilevel"/>
-    <w:tmpl w:val="EDEC296A"/>
-    <w:lvl w:ilvl="0" w:tplc="34400A8A" w:tentative="1">
+    <w:tmpl w:val="A2401186"/>
+    <w:lvl w:ilvl="0" w:tplc="997A82EC" w:tentative="1">
       <w:start w:val="1"/>
       <w:numFmt w:val="bullet"/>
       <w:lvlText w:val="●"/>
@@ -51159,7 +51159,7 @@
         <w:ind w:left="720" w:hanging="360"/>
       </w:pPr>
     </w:lvl>
-    <w:lvl w:ilvl="1" w:tplc="D2942562" w:tentative="1">
+    <w:lvl w:ilvl="1" w:tplc="11DEBEF0" w:tentative="1">
       <w:start w:val="1"/>
       <w:numFmt w:val="bullet"/>
       <w:lvlText w:val="○"/>
@@ -51168,7 +51168,7 @@
         <w:ind w:left="1440" w:hanging="360"/>
       </w:pPr>
     </w:lvl>
-    <w:lvl w:ilvl="2" w:tplc="69BA9D22" w:tentative="1">
+    <w:lvl w:ilvl="2" w:tplc="76562F00" w:tentative="1">
       <w:start w:val="1"/>
       <w:numFmt w:val="bullet"/>
       <w:lvlText w:val="■"/>
@@ -51177,7 +51177,7 @@
         <w:ind w:left="2160" w:hanging="360"/>
       </w:pPr>
     </w:lvl>
-    <w:lvl w:ilvl="3" w:tplc="ABC8A3D0" w:tentative="1">
+    <w:lvl w:ilvl="3" w:tplc="6568D210" w:tentative="1">
       <w:start w:val="1"/>
       <w:numFmt w:val="bullet"/>
       <w:lvlText w:val="●"/>
@@ -51186,7 +51186,7 @@
         <w:ind w:left="2880" w:hanging="360"/>
       </w:pPr>
     </w:lvl>
-    <w:lvl w:ilvl="4" w:tplc="0E4E4962" w:tentative="1">
+    <w:lvl w:ilvl="4" w:tplc="65B09A64" w:tentative="1">
       <w:start w:val="1"/>
       <w:numFmt w:val="bullet"/>
       <w:lvlText w:val="○"/>
@@ -51195,7 +51195,7 @@
         <w:ind w:left="3600" w:hanging="360"/>
       </w:pPr>
     </w:lvl>
-    <w:lvl w:ilvl="5" w:tplc="AB7A0CE0" w:tentative="1">
+    <w:lvl w:ilvl="5" w:tplc="779E55EC" w:tentative="1">
       <w:start w:val="1"/>
       <w:numFmt w:val="bullet"/>
       <w:lvlText w:val="■"/>
@@ -51204,7 +51204,7 @@
         <w:ind w:left="4320" w:hanging="360"/>
       </w:pPr>
     </w:lvl>
-    <w:lvl w:ilvl="6" w:tplc="53B0FE8E" w:tentative="1">
+    <w:lvl w:ilvl="6" w:tplc="ABE88F62" w:tentative="1">
       <w:start w:val="1"/>
       <w:numFmt w:val="bullet"/>
       <w:lvlText w:val="●"/>
@@ -51213,7 +51213,7 @@
         <w:ind w:left="5040" w:hanging="360"/>
       </w:pPr>
     </w:lvl>
-    <w:lvl w:ilvl="7" w:tplc="38709CF6" w:tentative="1">
+    <w:lvl w:ilvl="7" w:tplc="1F14AFB6" w:tentative="1">
       <w:start w:val="1"/>
       <w:numFmt w:val="bullet"/>
       <w:lvlText w:val="●"/>
@@ -51222,7 +51222,7 @@
         <w:ind w:left="5760" w:hanging="360"/>
       </w:pPr>
     </w:lvl>
-    <w:lvl w:ilvl="8" w:tplc="0CFEDA4A" w:tentative="1">
+    <w:lvl w:ilvl="8" w:tplc="5094C5B2" w:tentative="1">
       <w:start w:val="1"/>
       <w:numFmt w:val="bullet"/>
       <w:lvlText w:val="●"/>
@@ -51232,14 +51232,14 @@
       </w:pPr>
     </w:lvl>
   </w:abstractNum>
-  <w:num w:numId="1" w16cid:durableId="540098300">
+  <w:num w:numId="1" w16cid:durableId="651447657">
     <w:abstractNumId w:val="2"/>
     <w:lvlOverride w:ilvl="0">
       <w:startOverride w:val="1"/>
     </w:lvlOverride>
   </w:num>
-  <w:num w:numId="2" w16cid:durableId="568153547">
-    <w:abstractNumId w:val="1"/>
+  <w:num w:numId="2" w16cid:durableId="717169372">
+    <w:abstractNumId w:val="0"/>
     <w:lvlOverride w:ilvl="0">
       <w:startOverride w:val="1"/>
     </w:lvlOverride>
@@ -51247,20 +51247,20 @@
       <w:startOverride w:val="1"/>
     </w:lvlOverride>
   </w:num>
-  <w:num w:numId="3" w16cid:durableId="1997414025">
-    <w:abstractNumId w:val="0"/>
+  <w:num w:numId="3" w16cid:durableId="1044332624">
+    <w:abstractNumId w:val="1"/>
     <w:lvlOverride w:ilvl="0">
       <w:startOverride w:val="1"/>
     </w:lvlOverride>
   </w:num>
-  <w:num w:numId="4" w16cid:durableId="316033770">
-    <w:abstractNumId w:val="0"/>
+  <w:num w:numId="4" w16cid:durableId="434790140">
+    <w:abstractNumId w:val="1"/>
     <w:lvlOverride w:ilvl="0">
       <w:startOverride w:val="1"/>
     </w:lvlOverride>
   </w:num>
-  <w:num w:numId="5" w16cid:durableId="1711415993">
-    <w:abstractNumId w:val="0"/>
+  <w:num w:numId="5" w16cid:durableId="1057431056">
+    <w:abstractNumId w:val="1"/>
     <w:lvlOverride w:ilvl="0">
       <w:startOverride w:val="1"/>
     </w:lvlOverride>

</xml_diff>

<commit_message>
Sua hoc vi GVHD
</commit_message>
<xml_diff>
--- a/docs/BaoCao_PhanManhHonHop.docx
+++ b/docs/BaoCao_PhanManhHonHop.docx
@@ -140,7 +140,7 @@
       </w:r>
       <w:r>
         <w:tab/>
-        <w:t>Th.S Nguyễn Văn Danh</w:t>
+        <w:t>ThS. Nguyễn Văn Danh</w:t>
       </w:r>
     </w:p>
     <w:p>
@@ -248,7 +248,7 @@
         <w:jc w:val="both"/>
       </w:pPr>
       <w:r>
-        <w:t>Để hoàn thành đồ án môn học Cơ Sở Dữ Liệu Nâng Cao, nhóm chúng em xin gửi lời cảm ơn chân thành đến thầy Th.S Nguyễn Văn Danh, giảng viên hướng dẫn. Trong suốt quá trình học tập và thực hiện đề tài, thầy đã tận tình giảng dạy, định hướng và góp ý, giúp nhóm hiểu rõ hơn các vấn đề trong thiết kế cơ sở dữ liệu phân tán.</w:t>
+        <w:t>Để hoàn thành đồ án môn học Cơ Sở Dữ Liệu Nâng Cao, nhóm chúng em xin gửi lời cảm ơn chân thành đến thầy ThS. Nguyễn Văn Danh, giảng viên hướng dẫn. Trong suốt quá trình học tập và thực hiện đề tài, thầy đã tận tình giảng dạy, định hướng và góp ý, giúp nhóm hiểu rõ hơn các vấn đề trong thiết kế cơ sở dữ liệu phân tán.</w:t>
       </w:r>
     </w:p>
     <w:p>
@@ -1153,7 +1153,7 @@
     <w:sdt>
       <w:sdtPr>
         <w:alias w:val="Mục lục"/>
-        <w:id w:val="907498413"/>
+        <w:id w:val="514741298"/>
       </w:sdtPr>
       <w:sdtEndPr/>
       <w:sdtContent>
@@ -1181,7 +1181,7 @@
           <w:r>
             <w:fldChar w:fldCharType="separate"/>
           </w:r>
-          <w:hyperlink w:anchor="_Toc244207652" w:history="1">
+          <w:hyperlink w:anchor="_Toc244208323" w:history="1">
             <w:r>
               <w:rPr>
                 <w:rStyle w:val="Hyperlink"/>
@@ -1205,7 +1205,7 @@
               <w:rPr>
                 <w:noProof/>
               </w:rPr>
-              <w:instrText xml:space="preserve"> PAGEREF _Toc244207652 \h </w:instrText>
+              <w:instrText xml:space="preserve"> PAGEREF _Toc244208323 \h </w:instrText>
             </w:r>
             <w:r>
               <w:rPr>
@@ -1247,7 +1247,7 @@
               <w14:ligatures w14:val="standardContextual"/>
             </w:rPr>
           </w:pPr>
-          <w:hyperlink w:anchor="_Toc244207653" w:history="1">
+          <w:hyperlink w:anchor="_Toc244208324" w:history="1">
             <w:r>
               <w:rPr>
                 <w:rStyle w:val="Hyperlink"/>
@@ -1271,7 +1271,7 @@
               <w:rPr>
                 <w:noProof/>
               </w:rPr>
-              <w:instrText xml:space="preserve"> PAGEREF _Toc244207653 \h </w:instrText>
+              <w:instrText xml:space="preserve"> PAGEREF _Toc244208324 \h </w:instrText>
             </w:r>
             <w:r>
               <w:rPr>
@@ -1313,7 +1313,7 @@
               <w14:ligatures w14:val="standardContextual"/>
             </w:rPr>
           </w:pPr>
-          <w:hyperlink w:anchor="_Toc244207654" w:history="1">
+          <w:hyperlink w:anchor="_Toc244208325" w:history="1">
             <w:r>
               <w:rPr>
                 <w:rStyle w:val="Hyperlink"/>
@@ -1337,7 +1337,7 @@
               <w:rPr>
                 <w:noProof/>
               </w:rPr>
-              <w:instrText xml:space="preserve"> PAGEREF _Toc244207654 \h </w:instrText>
+              <w:instrText xml:space="preserve"> PAGEREF _Toc244208325 \h </w:instrText>
             </w:r>
             <w:r>
               <w:rPr>
@@ -1379,7 +1379,7 @@
               <w14:ligatures w14:val="standardContextual"/>
             </w:rPr>
           </w:pPr>
-          <w:hyperlink w:anchor="_Toc244207655" w:history="1">
+          <w:hyperlink w:anchor="_Toc244208326" w:history="1">
             <w:r>
               <w:rPr>
                 <w:rStyle w:val="Hyperlink"/>
@@ -1403,7 +1403,7 @@
               <w:rPr>
                 <w:noProof/>
               </w:rPr>
-              <w:instrText xml:space="preserve"> PAGEREF _Toc244207655 \h </w:instrText>
+              <w:instrText xml:space="preserve"> PAGEREF _Toc244208326 \h </w:instrText>
             </w:r>
             <w:r>
               <w:rPr>
@@ -1445,7 +1445,7 @@
               <w14:ligatures w14:val="standardContextual"/>
             </w:rPr>
           </w:pPr>
-          <w:hyperlink w:anchor="_Toc244207656" w:history="1">
+          <w:hyperlink w:anchor="_Toc244208327" w:history="1">
             <w:r>
               <w:rPr>
                 <w:rStyle w:val="Hyperlink"/>
@@ -1469,7 +1469,7 @@
               <w:rPr>
                 <w:noProof/>
               </w:rPr>
-              <w:instrText xml:space="preserve"> PAGEREF _Toc244207656 \h </w:instrText>
+              <w:instrText xml:space="preserve"> PAGEREF _Toc244208327 \h </w:instrText>
             </w:r>
             <w:r>
               <w:rPr>
@@ -1511,7 +1511,7 @@
               <w14:ligatures w14:val="standardContextual"/>
             </w:rPr>
           </w:pPr>
-          <w:hyperlink w:anchor="_Toc244207657" w:history="1">
+          <w:hyperlink w:anchor="_Toc244208328" w:history="1">
             <w:r>
               <w:rPr>
                 <w:rStyle w:val="Hyperlink"/>
@@ -1535,7 +1535,7 @@
               <w:rPr>
                 <w:noProof/>
               </w:rPr>
-              <w:instrText xml:space="preserve"> PAGEREF _Toc244207657 \h </w:instrText>
+              <w:instrText xml:space="preserve"> PAGEREF _Toc244208328 \h </w:instrText>
             </w:r>
             <w:r>
               <w:rPr>
@@ -1577,7 +1577,7 @@
               <w14:ligatures w14:val="standardContextual"/>
             </w:rPr>
           </w:pPr>
-          <w:hyperlink w:anchor="_Toc244207658" w:history="1">
+          <w:hyperlink w:anchor="_Toc244208329" w:history="1">
             <w:r>
               <w:rPr>
                 <w:rStyle w:val="Hyperlink"/>
@@ -1601,7 +1601,7 @@
               <w:rPr>
                 <w:noProof/>
               </w:rPr>
-              <w:instrText xml:space="preserve"> PAGEREF _Toc244207658 \h </w:instrText>
+              <w:instrText xml:space="preserve"> PAGEREF _Toc244208329 \h </w:instrText>
             </w:r>
             <w:r>
               <w:rPr>
@@ -1643,7 +1643,7 @@
               <w14:ligatures w14:val="standardContextual"/>
             </w:rPr>
           </w:pPr>
-          <w:hyperlink w:anchor="_Toc244207659" w:history="1">
+          <w:hyperlink w:anchor="_Toc244208330" w:history="1">
             <w:r>
               <w:rPr>
                 <w:rStyle w:val="Hyperlink"/>
@@ -1667,7 +1667,7 @@
               <w:rPr>
                 <w:noProof/>
               </w:rPr>
-              <w:instrText xml:space="preserve"> PAGEREF _Toc244207659 \h </w:instrText>
+              <w:instrText xml:space="preserve"> PAGEREF _Toc244208330 \h </w:instrText>
             </w:r>
             <w:r>
               <w:rPr>
@@ -1709,7 +1709,7 @@
               <w14:ligatures w14:val="standardContextual"/>
             </w:rPr>
           </w:pPr>
-          <w:hyperlink w:anchor="_Toc244207660" w:history="1">
+          <w:hyperlink w:anchor="_Toc244208331" w:history="1">
             <w:r>
               <w:rPr>
                 <w:rStyle w:val="Hyperlink"/>
@@ -1733,7 +1733,7 @@
               <w:rPr>
                 <w:noProof/>
               </w:rPr>
-              <w:instrText xml:space="preserve"> PAGEREF _Toc244207660 \h </w:instrText>
+              <w:instrText xml:space="preserve"> PAGEREF _Toc244208331 \h </w:instrText>
             </w:r>
             <w:r>
               <w:rPr>
@@ -1775,7 +1775,7 @@
               <w14:ligatures w14:val="standardContextual"/>
             </w:rPr>
           </w:pPr>
-          <w:hyperlink w:anchor="_Toc244207661" w:history="1">
+          <w:hyperlink w:anchor="_Toc244208332" w:history="1">
             <w:r>
               <w:rPr>
                 <w:rStyle w:val="Hyperlink"/>
@@ -1799,7 +1799,7 @@
               <w:rPr>
                 <w:noProof/>
               </w:rPr>
-              <w:instrText xml:space="preserve"> PAGEREF _Toc244207661 \h </w:instrText>
+              <w:instrText xml:space="preserve"> PAGEREF _Toc244208332 \h </w:instrText>
             </w:r>
             <w:r>
               <w:rPr>
@@ -1841,7 +1841,7 @@
               <w14:ligatures w14:val="standardContextual"/>
             </w:rPr>
           </w:pPr>
-          <w:hyperlink w:anchor="_Toc244207662" w:history="1">
+          <w:hyperlink w:anchor="_Toc244208333" w:history="1">
             <w:r>
               <w:rPr>
                 <w:rStyle w:val="Hyperlink"/>
@@ -1865,7 +1865,7 @@
               <w:rPr>
                 <w:noProof/>
               </w:rPr>
-              <w:instrText xml:space="preserve"> PAGEREF _Toc244207662 \h </w:instrText>
+              <w:instrText xml:space="preserve"> PAGEREF _Toc244208333 \h </w:instrText>
             </w:r>
             <w:r>
               <w:rPr>
@@ -1907,7 +1907,7 @@
               <w14:ligatures w14:val="standardContextual"/>
             </w:rPr>
           </w:pPr>
-          <w:hyperlink w:anchor="_Toc244207663" w:history="1">
+          <w:hyperlink w:anchor="_Toc244208334" w:history="1">
             <w:r>
               <w:rPr>
                 <w:rStyle w:val="Hyperlink"/>
@@ -1931,7 +1931,7 @@
               <w:rPr>
                 <w:noProof/>
               </w:rPr>
-              <w:instrText xml:space="preserve"> PAGEREF _Toc244207663 \h </w:instrText>
+              <w:instrText xml:space="preserve"> PAGEREF _Toc244208334 \h </w:instrText>
             </w:r>
             <w:r>
               <w:rPr>
@@ -1973,7 +1973,7 @@
               <w14:ligatures w14:val="standardContextual"/>
             </w:rPr>
           </w:pPr>
-          <w:hyperlink w:anchor="_Toc244207664" w:history="1">
+          <w:hyperlink w:anchor="_Toc244208335" w:history="1">
             <w:r>
               <w:rPr>
                 <w:rStyle w:val="Hyperlink"/>
@@ -1997,7 +1997,7 @@
               <w:rPr>
                 <w:noProof/>
               </w:rPr>
-              <w:instrText xml:space="preserve"> PAGEREF _Toc244207664 \h </w:instrText>
+              <w:instrText xml:space="preserve"> PAGEREF _Toc244208335 \h </w:instrText>
             </w:r>
             <w:r>
               <w:rPr>
@@ -2039,7 +2039,7 @@
               <w14:ligatures w14:val="standardContextual"/>
             </w:rPr>
           </w:pPr>
-          <w:hyperlink w:anchor="_Toc244207665" w:history="1">
+          <w:hyperlink w:anchor="_Toc244208336" w:history="1">
             <w:r>
               <w:rPr>
                 <w:rStyle w:val="Hyperlink"/>
@@ -2063,7 +2063,7 @@
               <w:rPr>
                 <w:noProof/>
               </w:rPr>
-              <w:instrText xml:space="preserve"> PAGEREF _Toc244207665 \h </w:instrText>
+              <w:instrText xml:space="preserve"> PAGEREF _Toc244208336 \h </w:instrText>
             </w:r>
             <w:r>
               <w:rPr>
@@ -2105,7 +2105,7 @@
               <w14:ligatures w14:val="standardContextual"/>
             </w:rPr>
           </w:pPr>
-          <w:hyperlink w:anchor="_Toc244207666" w:history="1">
+          <w:hyperlink w:anchor="_Toc244208337" w:history="1">
             <w:r>
               <w:rPr>
                 <w:rStyle w:val="Hyperlink"/>
@@ -2129,7 +2129,7 @@
               <w:rPr>
                 <w:noProof/>
               </w:rPr>
-              <w:instrText xml:space="preserve"> PAGEREF _Toc244207666 \h </w:instrText>
+              <w:instrText xml:space="preserve"> PAGEREF _Toc244208337 \h </w:instrText>
             </w:r>
             <w:r>
               <w:rPr>
@@ -2171,7 +2171,7 @@
               <w14:ligatures w14:val="standardContextual"/>
             </w:rPr>
           </w:pPr>
-          <w:hyperlink w:anchor="_Toc244207667" w:history="1">
+          <w:hyperlink w:anchor="_Toc244208338" w:history="1">
             <w:r>
               <w:rPr>
                 <w:rStyle w:val="Hyperlink"/>
@@ -2195,7 +2195,7 @@
               <w:rPr>
                 <w:noProof/>
               </w:rPr>
-              <w:instrText xml:space="preserve"> PAGEREF _Toc244207667 \h </w:instrText>
+              <w:instrText xml:space="preserve"> PAGEREF _Toc244208338 \h </w:instrText>
             </w:r>
             <w:r>
               <w:rPr>
@@ -2237,7 +2237,7 @@
               <w14:ligatures w14:val="standardContextual"/>
             </w:rPr>
           </w:pPr>
-          <w:hyperlink w:anchor="_Toc244207668" w:history="1">
+          <w:hyperlink w:anchor="_Toc244208339" w:history="1">
             <w:r>
               <w:rPr>
                 <w:rStyle w:val="Hyperlink"/>
@@ -2261,7 +2261,7 @@
               <w:rPr>
                 <w:noProof/>
               </w:rPr>
-              <w:instrText xml:space="preserve"> PAGEREF _Toc244207668 \h </w:instrText>
+              <w:instrText xml:space="preserve"> PAGEREF _Toc244208339 \h </w:instrText>
             </w:r>
             <w:r>
               <w:rPr>
@@ -2303,7 +2303,7 @@
               <w14:ligatures w14:val="standardContextual"/>
             </w:rPr>
           </w:pPr>
-          <w:hyperlink w:anchor="_Toc244207669" w:history="1">
+          <w:hyperlink w:anchor="_Toc244208340" w:history="1">
             <w:r>
               <w:rPr>
                 <w:rStyle w:val="Hyperlink"/>
@@ -2327,7 +2327,7 @@
               <w:rPr>
                 <w:noProof/>
               </w:rPr>
-              <w:instrText xml:space="preserve"> PAGEREF _Toc244207669 \h </w:instrText>
+              <w:instrText xml:space="preserve"> PAGEREF _Toc244208340 \h </w:instrText>
             </w:r>
             <w:r>
               <w:rPr>
@@ -2369,7 +2369,7 @@
               <w14:ligatures w14:val="standardContextual"/>
             </w:rPr>
           </w:pPr>
-          <w:hyperlink w:anchor="_Toc244207670" w:history="1">
+          <w:hyperlink w:anchor="_Toc244208341" w:history="1">
             <w:r>
               <w:rPr>
                 <w:rStyle w:val="Hyperlink"/>
@@ -2393,7 +2393,7 @@
               <w:rPr>
                 <w:noProof/>
               </w:rPr>
-              <w:instrText xml:space="preserve"> PAGEREF _Toc244207670 \h </w:instrText>
+              <w:instrText xml:space="preserve"> PAGEREF _Toc244208341 \h </w:instrText>
             </w:r>
             <w:r>
               <w:rPr>
@@ -2435,7 +2435,7 @@
               <w14:ligatures w14:val="standardContextual"/>
             </w:rPr>
           </w:pPr>
-          <w:hyperlink w:anchor="_Toc244207671" w:history="1">
+          <w:hyperlink w:anchor="_Toc244208342" w:history="1">
             <w:r>
               <w:rPr>
                 <w:rStyle w:val="Hyperlink"/>
@@ -2459,7 +2459,7 @@
               <w:rPr>
                 <w:noProof/>
               </w:rPr>
-              <w:instrText xml:space="preserve"> PAGEREF _Toc244207671 \h </w:instrText>
+              <w:instrText xml:space="preserve"> PAGEREF _Toc244208342 \h </w:instrText>
             </w:r>
             <w:r>
               <w:rPr>
@@ -2501,7 +2501,7 @@
               <w14:ligatures w14:val="standardContextual"/>
             </w:rPr>
           </w:pPr>
-          <w:hyperlink w:anchor="_Toc244207672" w:history="1">
+          <w:hyperlink w:anchor="_Toc244208343" w:history="1">
             <w:r>
               <w:rPr>
                 <w:rStyle w:val="Hyperlink"/>
@@ -2525,7 +2525,7 @@
               <w:rPr>
                 <w:noProof/>
               </w:rPr>
-              <w:instrText xml:space="preserve"> PAGEREF _Toc244207672 \h </w:instrText>
+              <w:instrText xml:space="preserve"> PAGEREF _Toc244208343 \h </w:instrText>
             </w:r>
             <w:r>
               <w:rPr>
@@ -2567,7 +2567,7 @@
               <w14:ligatures w14:val="standardContextual"/>
             </w:rPr>
           </w:pPr>
-          <w:hyperlink w:anchor="_Toc244207673" w:history="1">
+          <w:hyperlink w:anchor="_Toc244208344" w:history="1">
             <w:r>
               <w:rPr>
                 <w:rStyle w:val="Hyperlink"/>
@@ -2591,7 +2591,7 @@
               <w:rPr>
                 <w:noProof/>
               </w:rPr>
-              <w:instrText xml:space="preserve"> PAGEREF _Toc244207673 \h </w:instrText>
+              <w:instrText xml:space="preserve"> PAGEREF _Toc244208344 \h </w:instrText>
             </w:r>
             <w:r>
               <w:rPr>
@@ -2633,7 +2633,7 @@
               <w14:ligatures w14:val="standardContextual"/>
             </w:rPr>
           </w:pPr>
-          <w:hyperlink w:anchor="_Toc244207674" w:history="1">
+          <w:hyperlink w:anchor="_Toc244208345" w:history="1">
             <w:r>
               <w:rPr>
                 <w:rStyle w:val="Hyperlink"/>
@@ -2657,7 +2657,7 @@
               <w:rPr>
                 <w:noProof/>
               </w:rPr>
-              <w:instrText xml:space="preserve"> PAGEREF _Toc244207674 \h </w:instrText>
+              <w:instrText xml:space="preserve"> PAGEREF _Toc244208345 \h </w:instrText>
             </w:r>
             <w:r>
               <w:rPr>
@@ -2699,7 +2699,7 @@
               <w14:ligatures w14:val="standardContextual"/>
             </w:rPr>
           </w:pPr>
-          <w:hyperlink w:anchor="_Toc244207675" w:history="1">
+          <w:hyperlink w:anchor="_Toc244208346" w:history="1">
             <w:r>
               <w:rPr>
                 <w:rStyle w:val="Hyperlink"/>
@@ -2723,7 +2723,7 @@
               <w:rPr>
                 <w:noProof/>
               </w:rPr>
-              <w:instrText xml:space="preserve"> PAGEREF _Toc244207675 \h </w:instrText>
+              <w:instrText xml:space="preserve"> PAGEREF _Toc244208346 \h </w:instrText>
             </w:r>
             <w:r>
               <w:rPr>
@@ -2765,7 +2765,7 @@
               <w14:ligatures w14:val="standardContextual"/>
             </w:rPr>
           </w:pPr>
-          <w:hyperlink w:anchor="_Toc244207676" w:history="1">
+          <w:hyperlink w:anchor="_Toc244208347" w:history="1">
             <w:r>
               <w:rPr>
                 <w:rStyle w:val="Hyperlink"/>
@@ -2789,7 +2789,7 @@
               <w:rPr>
                 <w:noProof/>
               </w:rPr>
-              <w:instrText xml:space="preserve"> PAGEREF _Toc244207676 \h </w:instrText>
+              <w:instrText xml:space="preserve"> PAGEREF _Toc244208347 \h </w:instrText>
             </w:r>
             <w:r>
               <w:rPr>
@@ -2831,7 +2831,7 @@
               <w14:ligatures w14:val="standardContextual"/>
             </w:rPr>
           </w:pPr>
-          <w:hyperlink w:anchor="_Toc244207677" w:history="1">
+          <w:hyperlink w:anchor="_Toc244208348" w:history="1">
             <w:r>
               <w:rPr>
                 <w:rStyle w:val="Hyperlink"/>
@@ -2855,7 +2855,7 @@
               <w:rPr>
                 <w:noProof/>
               </w:rPr>
-              <w:instrText xml:space="preserve"> PAGEREF _Toc244207677 \h </w:instrText>
+              <w:instrText xml:space="preserve"> PAGEREF _Toc244208348 \h </w:instrText>
             </w:r>
             <w:r>
               <w:rPr>
@@ -2897,7 +2897,7 @@
               <w14:ligatures w14:val="standardContextual"/>
             </w:rPr>
           </w:pPr>
-          <w:hyperlink w:anchor="_Toc244207678" w:history="1">
+          <w:hyperlink w:anchor="_Toc244208349" w:history="1">
             <w:r>
               <w:rPr>
                 <w:rStyle w:val="Hyperlink"/>
@@ -2921,7 +2921,7 @@
               <w:rPr>
                 <w:noProof/>
               </w:rPr>
-              <w:instrText xml:space="preserve"> PAGEREF _Toc244207678 \h </w:instrText>
+              <w:instrText xml:space="preserve"> PAGEREF _Toc244208349 \h </w:instrText>
             </w:r>
             <w:r>
               <w:rPr>
@@ -2963,7 +2963,7 @@
               <w14:ligatures w14:val="standardContextual"/>
             </w:rPr>
           </w:pPr>
-          <w:hyperlink w:anchor="_Toc244207679" w:history="1">
+          <w:hyperlink w:anchor="_Toc244208350" w:history="1">
             <w:r>
               <w:rPr>
                 <w:rStyle w:val="Hyperlink"/>
@@ -2987,7 +2987,7 @@
               <w:rPr>
                 <w:noProof/>
               </w:rPr>
-              <w:instrText xml:space="preserve"> PAGEREF _Toc244207679 \h </w:instrText>
+              <w:instrText xml:space="preserve"> PAGEREF _Toc244208350 \h </w:instrText>
             </w:r>
             <w:r>
               <w:rPr>
@@ -3029,7 +3029,7 @@
               <w14:ligatures w14:val="standardContextual"/>
             </w:rPr>
           </w:pPr>
-          <w:hyperlink w:anchor="_Toc244207680" w:history="1">
+          <w:hyperlink w:anchor="_Toc244208351" w:history="1">
             <w:r>
               <w:rPr>
                 <w:rStyle w:val="Hyperlink"/>
@@ -3053,7 +3053,7 @@
               <w:rPr>
                 <w:noProof/>
               </w:rPr>
-              <w:instrText xml:space="preserve"> PAGEREF _Toc244207680 \h </w:instrText>
+              <w:instrText xml:space="preserve"> PAGEREF _Toc244208351 \h </w:instrText>
             </w:r>
             <w:r>
               <w:rPr>
@@ -3095,7 +3095,7 @@
               <w14:ligatures w14:val="standardContextual"/>
             </w:rPr>
           </w:pPr>
-          <w:hyperlink w:anchor="_Toc244207681" w:history="1">
+          <w:hyperlink w:anchor="_Toc244208352" w:history="1">
             <w:r>
               <w:rPr>
                 <w:rStyle w:val="Hyperlink"/>
@@ -3119,7 +3119,7 @@
               <w:rPr>
                 <w:noProof/>
               </w:rPr>
-              <w:instrText xml:space="preserve"> PAGEREF _Toc244207681 \h </w:instrText>
+              <w:instrText xml:space="preserve"> PAGEREF _Toc244208352 \h </w:instrText>
             </w:r>
             <w:r>
               <w:rPr>
@@ -3161,7 +3161,7 @@
               <w14:ligatures w14:val="standardContextual"/>
             </w:rPr>
           </w:pPr>
-          <w:hyperlink w:anchor="_Toc244207682" w:history="1">
+          <w:hyperlink w:anchor="_Toc244208353" w:history="1">
             <w:r>
               <w:rPr>
                 <w:rStyle w:val="Hyperlink"/>
@@ -3185,7 +3185,7 @@
               <w:rPr>
                 <w:noProof/>
               </w:rPr>
-              <w:instrText xml:space="preserve"> PAGEREF _Toc244207682 \h </w:instrText>
+              <w:instrText xml:space="preserve"> PAGEREF _Toc244208353 \h </w:instrText>
             </w:r>
             <w:r>
               <w:rPr>
@@ -3227,7 +3227,7 @@
               <w14:ligatures w14:val="standardContextual"/>
             </w:rPr>
           </w:pPr>
-          <w:hyperlink w:anchor="_Toc244207683" w:history="1">
+          <w:hyperlink w:anchor="_Toc244208354" w:history="1">
             <w:r>
               <w:rPr>
                 <w:rStyle w:val="Hyperlink"/>
@@ -3251,7 +3251,7 @@
               <w:rPr>
                 <w:noProof/>
               </w:rPr>
-              <w:instrText xml:space="preserve"> PAGEREF _Toc244207683 \h </w:instrText>
+              <w:instrText xml:space="preserve"> PAGEREF _Toc244208354 \h </w:instrText>
             </w:r>
             <w:r>
               <w:rPr>
@@ -3293,7 +3293,7 @@
               <w14:ligatures w14:val="standardContextual"/>
             </w:rPr>
           </w:pPr>
-          <w:hyperlink w:anchor="_Toc244207684" w:history="1">
+          <w:hyperlink w:anchor="_Toc244208355" w:history="1">
             <w:r>
               <w:rPr>
                 <w:rStyle w:val="Hyperlink"/>
@@ -3317,7 +3317,7 @@
               <w:rPr>
                 <w:noProof/>
               </w:rPr>
-              <w:instrText xml:space="preserve"> PAGEREF _Toc244207684 \h </w:instrText>
+              <w:instrText xml:space="preserve"> PAGEREF _Toc244208355 \h </w:instrText>
             </w:r>
             <w:r>
               <w:rPr>
@@ -3359,7 +3359,7 @@
               <w14:ligatures w14:val="standardContextual"/>
             </w:rPr>
           </w:pPr>
-          <w:hyperlink w:anchor="_Toc244207685" w:history="1">
+          <w:hyperlink w:anchor="_Toc244208356" w:history="1">
             <w:r>
               <w:rPr>
                 <w:rStyle w:val="Hyperlink"/>
@@ -3383,7 +3383,7 @@
               <w:rPr>
                 <w:noProof/>
               </w:rPr>
-              <w:instrText xml:space="preserve"> PAGEREF _Toc244207685 \h </w:instrText>
+              <w:instrText xml:space="preserve"> PAGEREF _Toc244208356 \h </w:instrText>
             </w:r>
             <w:r>
               <w:rPr>
@@ -3425,7 +3425,7 @@
               <w14:ligatures w14:val="standardContextual"/>
             </w:rPr>
           </w:pPr>
-          <w:hyperlink w:anchor="_Toc244207686" w:history="1">
+          <w:hyperlink w:anchor="_Toc244208357" w:history="1">
             <w:r>
               <w:rPr>
                 <w:rStyle w:val="Hyperlink"/>
@@ -3449,7 +3449,7 @@
               <w:rPr>
                 <w:noProof/>
               </w:rPr>
-              <w:instrText xml:space="preserve"> PAGEREF _Toc244207686 \h </w:instrText>
+              <w:instrText xml:space="preserve"> PAGEREF _Toc244208357 \h </w:instrText>
             </w:r>
             <w:r>
               <w:rPr>
@@ -3491,7 +3491,7 @@
               <w14:ligatures w14:val="standardContextual"/>
             </w:rPr>
           </w:pPr>
-          <w:hyperlink w:anchor="_Toc244207687" w:history="1">
+          <w:hyperlink w:anchor="_Toc244208358" w:history="1">
             <w:r>
               <w:rPr>
                 <w:rStyle w:val="Hyperlink"/>
@@ -3515,7 +3515,7 @@
               <w:rPr>
                 <w:noProof/>
               </w:rPr>
-              <w:instrText xml:space="preserve"> PAGEREF _Toc244207687 \h </w:instrText>
+              <w:instrText xml:space="preserve"> PAGEREF _Toc244208358 \h </w:instrText>
             </w:r>
             <w:r>
               <w:rPr>
@@ -3557,7 +3557,7 @@
               <w14:ligatures w14:val="standardContextual"/>
             </w:rPr>
           </w:pPr>
-          <w:hyperlink w:anchor="_Toc244207688" w:history="1">
+          <w:hyperlink w:anchor="_Toc244208359" w:history="1">
             <w:r>
               <w:rPr>
                 <w:rStyle w:val="Hyperlink"/>
@@ -3581,7 +3581,7 @@
               <w:rPr>
                 <w:noProof/>
               </w:rPr>
-              <w:instrText xml:space="preserve"> PAGEREF _Toc244207688 \h </w:instrText>
+              <w:instrText xml:space="preserve"> PAGEREF _Toc244208359 \h </w:instrText>
             </w:r>
             <w:r>
               <w:rPr>
@@ -3623,7 +3623,7 @@
               <w14:ligatures w14:val="standardContextual"/>
             </w:rPr>
           </w:pPr>
-          <w:hyperlink w:anchor="_Toc244207689" w:history="1">
+          <w:hyperlink w:anchor="_Toc244208360" w:history="1">
             <w:r>
               <w:rPr>
                 <w:rStyle w:val="Hyperlink"/>
@@ -3647,7 +3647,7 @@
               <w:rPr>
                 <w:noProof/>
               </w:rPr>
-              <w:instrText xml:space="preserve"> PAGEREF _Toc244207689 \h </w:instrText>
+              <w:instrText xml:space="preserve"> PAGEREF _Toc244208360 \h </w:instrText>
             </w:r>
             <w:r>
               <w:rPr>
@@ -3689,7 +3689,7 @@
               <w14:ligatures w14:val="standardContextual"/>
             </w:rPr>
           </w:pPr>
-          <w:hyperlink w:anchor="_Toc244207690" w:history="1">
+          <w:hyperlink w:anchor="_Toc244208361" w:history="1">
             <w:r>
               <w:rPr>
                 <w:rStyle w:val="Hyperlink"/>
@@ -3713,7 +3713,7 @@
               <w:rPr>
                 <w:noProof/>
               </w:rPr>
-              <w:instrText xml:space="preserve"> PAGEREF _Toc244207690 \h </w:instrText>
+              <w:instrText xml:space="preserve"> PAGEREF _Toc244208361 \h </w:instrText>
             </w:r>
             <w:r>
               <w:rPr>
@@ -3755,7 +3755,7 @@
               <w14:ligatures w14:val="standardContextual"/>
             </w:rPr>
           </w:pPr>
-          <w:hyperlink w:anchor="_Toc244207691" w:history="1">
+          <w:hyperlink w:anchor="_Toc244208362" w:history="1">
             <w:r>
               <w:rPr>
                 <w:rStyle w:val="Hyperlink"/>
@@ -3779,7 +3779,7 @@
               <w:rPr>
                 <w:noProof/>
               </w:rPr>
-              <w:instrText xml:space="preserve"> PAGEREF _Toc244207691 \h </w:instrText>
+              <w:instrText xml:space="preserve"> PAGEREF _Toc244208362 \h </w:instrText>
             </w:r>
             <w:r>
               <w:rPr>
@@ -3821,7 +3821,7 @@
               <w14:ligatures w14:val="standardContextual"/>
             </w:rPr>
           </w:pPr>
-          <w:hyperlink w:anchor="_Toc244207692" w:history="1">
+          <w:hyperlink w:anchor="_Toc244208363" w:history="1">
             <w:r>
               <w:rPr>
                 <w:rStyle w:val="Hyperlink"/>
@@ -3845,7 +3845,7 @@
               <w:rPr>
                 <w:noProof/>
               </w:rPr>
-              <w:instrText xml:space="preserve"> PAGEREF _Toc244207692 \h </w:instrText>
+              <w:instrText xml:space="preserve"> PAGEREF _Toc244208363 \h </w:instrText>
             </w:r>
             <w:r>
               <w:rPr>
@@ -3887,7 +3887,7 @@
               <w14:ligatures w14:val="standardContextual"/>
             </w:rPr>
           </w:pPr>
-          <w:hyperlink w:anchor="_Toc244207693" w:history="1">
+          <w:hyperlink w:anchor="_Toc244208364" w:history="1">
             <w:r>
               <w:rPr>
                 <w:rStyle w:val="Hyperlink"/>
@@ -3911,7 +3911,7 @@
               <w:rPr>
                 <w:noProof/>
               </w:rPr>
-              <w:instrText xml:space="preserve"> PAGEREF _Toc244207693 \h </w:instrText>
+              <w:instrText xml:space="preserve"> PAGEREF _Toc244208364 \h </w:instrText>
             </w:r>
             <w:r>
               <w:rPr>
@@ -3953,7 +3953,7 @@
               <w14:ligatures w14:val="standardContextual"/>
             </w:rPr>
           </w:pPr>
-          <w:hyperlink w:anchor="_Toc244207694" w:history="1">
+          <w:hyperlink w:anchor="_Toc244208365" w:history="1">
             <w:r>
               <w:rPr>
                 <w:rStyle w:val="Hyperlink"/>
@@ -3977,7 +3977,7 @@
               <w:rPr>
                 <w:noProof/>
               </w:rPr>
-              <w:instrText xml:space="preserve"> PAGEREF _Toc244207694 \h </w:instrText>
+              <w:instrText xml:space="preserve"> PAGEREF _Toc244208365 \h </w:instrText>
             </w:r>
             <w:r>
               <w:rPr>
@@ -4019,7 +4019,7 @@
               <w14:ligatures w14:val="standardContextual"/>
             </w:rPr>
           </w:pPr>
-          <w:hyperlink w:anchor="_Toc244207695" w:history="1">
+          <w:hyperlink w:anchor="_Toc244208366" w:history="1">
             <w:r>
               <w:rPr>
                 <w:rStyle w:val="Hyperlink"/>
@@ -4043,7 +4043,7 @@
               <w:rPr>
                 <w:noProof/>
               </w:rPr>
-              <w:instrText xml:space="preserve"> PAGEREF _Toc244207695 \h </w:instrText>
+              <w:instrText xml:space="preserve"> PAGEREF _Toc244208366 \h </w:instrText>
             </w:r>
             <w:r>
               <w:rPr>
@@ -4085,7 +4085,7 @@
               <w14:ligatures w14:val="standardContextual"/>
             </w:rPr>
           </w:pPr>
-          <w:hyperlink w:anchor="_Toc244207696" w:history="1">
+          <w:hyperlink w:anchor="_Toc244208367" w:history="1">
             <w:r>
               <w:rPr>
                 <w:rStyle w:val="Hyperlink"/>
@@ -4109,7 +4109,7 @@
               <w:rPr>
                 <w:noProof/>
               </w:rPr>
-              <w:instrText xml:space="preserve"> PAGEREF _Toc244207696 \h </w:instrText>
+              <w:instrText xml:space="preserve"> PAGEREF _Toc244208367 \h </w:instrText>
             </w:r>
             <w:r>
               <w:rPr>
@@ -4151,7 +4151,7 @@
               <w14:ligatures w14:val="standardContextual"/>
             </w:rPr>
           </w:pPr>
-          <w:hyperlink w:anchor="_Toc244207697" w:history="1">
+          <w:hyperlink w:anchor="_Toc244208368" w:history="1">
             <w:r>
               <w:rPr>
                 <w:rStyle w:val="Hyperlink"/>
@@ -4175,7 +4175,7 @@
               <w:rPr>
                 <w:noProof/>
               </w:rPr>
-              <w:instrText xml:space="preserve"> PAGEREF _Toc244207697 \h </w:instrText>
+              <w:instrText xml:space="preserve"> PAGEREF _Toc244208368 \h </w:instrText>
             </w:r>
             <w:r>
               <w:rPr>
@@ -4217,7 +4217,7 @@
               <w14:ligatures w14:val="standardContextual"/>
             </w:rPr>
           </w:pPr>
-          <w:hyperlink w:anchor="_Toc244207698" w:history="1">
+          <w:hyperlink w:anchor="_Toc244208369" w:history="1">
             <w:r>
               <w:rPr>
                 <w:rStyle w:val="Hyperlink"/>
@@ -4241,7 +4241,7 @@
               <w:rPr>
                 <w:noProof/>
               </w:rPr>
-              <w:instrText xml:space="preserve"> PAGEREF _Toc244207698 \h </w:instrText>
+              <w:instrText xml:space="preserve"> PAGEREF _Toc244208369 \h </w:instrText>
             </w:r>
             <w:r>
               <w:rPr>
@@ -4283,7 +4283,7 @@
               <w14:ligatures w14:val="standardContextual"/>
             </w:rPr>
           </w:pPr>
-          <w:hyperlink w:anchor="_Toc244207699" w:history="1">
+          <w:hyperlink w:anchor="_Toc244208370" w:history="1">
             <w:r>
               <w:rPr>
                 <w:rStyle w:val="Hyperlink"/>
@@ -4307,7 +4307,7 @@
               <w:rPr>
                 <w:noProof/>
               </w:rPr>
-              <w:instrText xml:space="preserve"> PAGEREF _Toc244207699 \h </w:instrText>
+              <w:instrText xml:space="preserve"> PAGEREF _Toc244208370 \h </w:instrText>
             </w:r>
             <w:r>
               <w:rPr>
@@ -4349,7 +4349,7 @@
               <w14:ligatures w14:val="standardContextual"/>
             </w:rPr>
           </w:pPr>
-          <w:hyperlink w:anchor="_Toc244207700" w:history="1">
+          <w:hyperlink w:anchor="_Toc244208371" w:history="1">
             <w:r>
               <w:rPr>
                 <w:rStyle w:val="Hyperlink"/>
@@ -4373,7 +4373,7 @@
               <w:rPr>
                 <w:noProof/>
               </w:rPr>
-              <w:instrText xml:space="preserve"> PAGEREF _Toc244207700 \h </w:instrText>
+              <w:instrText xml:space="preserve"> PAGEREF _Toc244208371 \h </w:instrText>
             </w:r>
             <w:r>
               <w:rPr>
@@ -4415,7 +4415,7 @@
               <w14:ligatures w14:val="standardContextual"/>
             </w:rPr>
           </w:pPr>
-          <w:hyperlink w:anchor="_Toc244207701" w:history="1">
+          <w:hyperlink w:anchor="_Toc244208372" w:history="1">
             <w:r>
               <w:rPr>
                 <w:rStyle w:val="Hyperlink"/>
@@ -4439,7 +4439,7 @@
               <w:rPr>
                 <w:noProof/>
               </w:rPr>
-              <w:instrText xml:space="preserve"> PAGEREF _Toc244207701 \h </w:instrText>
+              <w:instrText xml:space="preserve"> PAGEREF _Toc244208372 \h </w:instrText>
             </w:r>
             <w:r>
               <w:rPr>
@@ -4481,7 +4481,7 @@
               <w14:ligatures w14:val="standardContextual"/>
             </w:rPr>
           </w:pPr>
-          <w:hyperlink w:anchor="_Toc244207702" w:history="1">
+          <w:hyperlink w:anchor="_Toc244208373" w:history="1">
             <w:r>
               <w:rPr>
                 <w:rStyle w:val="Hyperlink"/>
@@ -4505,7 +4505,7 @@
               <w:rPr>
                 <w:noProof/>
               </w:rPr>
-              <w:instrText xml:space="preserve"> PAGEREF _Toc244207702 \h </w:instrText>
+              <w:instrText xml:space="preserve"> PAGEREF _Toc244208373 \h </w:instrText>
             </w:r>
             <w:r>
               <w:rPr>
@@ -4547,7 +4547,7 @@
               <w14:ligatures w14:val="standardContextual"/>
             </w:rPr>
           </w:pPr>
-          <w:hyperlink w:anchor="_Toc244207703" w:history="1">
+          <w:hyperlink w:anchor="_Toc244208374" w:history="1">
             <w:r>
               <w:rPr>
                 <w:rStyle w:val="Hyperlink"/>
@@ -4571,7 +4571,7 @@
               <w:rPr>
                 <w:noProof/>
               </w:rPr>
-              <w:instrText xml:space="preserve"> PAGEREF _Toc244207703 \h </w:instrText>
+              <w:instrText xml:space="preserve"> PAGEREF _Toc244208374 \h </w:instrText>
             </w:r>
             <w:r>
               <w:rPr>
@@ -4613,7 +4613,7 @@
               <w14:ligatures w14:val="standardContextual"/>
             </w:rPr>
           </w:pPr>
-          <w:hyperlink w:anchor="_Toc244207704" w:history="1">
+          <w:hyperlink w:anchor="_Toc244208375" w:history="1">
             <w:r>
               <w:rPr>
                 <w:rStyle w:val="Hyperlink"/>
@@ -4637,7 +4637,7 @@
               <w:rPr>
                 <w:noProof/>
               </w:rPr>
-              <w:instrText xml:space="preserve"> PAGEREF _Toc244207704 \h </w:instrText>
+              <w:instrText xml:space="preserve"> PAGEREF _Toc244208375 \h </w:instrText>
             </w:r>
             <w:r>
               <w:rPr>
@@ -4679,7 +4679,7 @@
               <w14:ligatures w14:val="standardContextual"/>
             </w:rPr>
           </w:pPr>
-          <w:hyperlink w:anchor="_Toc244207705" w:history="1">
+          <w:hyperlink w:anchor="_Toc244208376" w:history="1">
             <w:r>
               <w:rPr>
                 <w:rStyle w:val="Hyperlink"/>
@@ -4703,7 +4703,7 @@
               <w:rPr>
                 <w:noProof/>
               </w:rPr>
-              <w:instrText xml:space="preserve"> PAGEREF _Toc244207705 \h </w:instrText>
+              <w:instrText xml:space="preserve"> PAGEREF _Toc244208376 \h </w:instrText>
             </w:r>
             <w:r>
               <w:rPr>
@@ -4745,7 +4745,7 @@
               <w14:ligatures w14:val="standardContextual"/>
             </w:rPr>
           </w:pPr>
-          <w:hyperlink w:anchor="_Toc244207706" w:history="1">
+          <w:hyperlink w:anchor="_Toc244208377" w:history="1">
             <w:r>
               <w:rPr>
                 <w:rStyle w:val="Hyperlink"/>
@@ -4769,7 +4769,7 @@
               <w:rPr>
                 <w:noProof/>
               </w:rPr>
-              <w:instrText xml:space="preserve"> PAGEREF _Toc244207706 \h </w:instrText>
+              <w:instrText xml:space="preserve"> PAGEREF _Toc244208377 \h </w:instrText>
             </w:r>
             <w:r>
               <w:rPr>
@@ -4811,7 +4811,7 @@
               <w14:ligatures w14:val="standardContextual"/>
             </w:rPr>
           </w:pPr>
-          <w:hyperlink w:anchor="_Toc244207707" w:history="1">
+          <w:hyperlink w:anchor="_Toc244208378" w:history="1">
             <w:r>
               <w:rPr>
                 <w:rStyle w:val="Hyperlink"/>
@@ -4835,7 +4835,7 @@
               <w:rPr>
                 <w:noProof/>
               </w:rPr>
-              <w:instrText xml:space="preserve"> PAGEREF _Toc244207707 \h </w:instrText>
+              <w:instrText xml:space="preserve"> PAGEREF _Toc244208378 \h </w:instrText>
             </w:r>
             <w:r>
               <w:rPr>
@@ -4877,7 +4877,7 @@
               <w14:ligatures w14:val="standardContextual"/>
             </w:rPr>
           </w:pPr>
-          <w:hyperlink w:anchor="_Toc244207708" w:history="1">
+          <w:hyperlink w:anchor="_Toc244208379" w:history="1">
             <w:r>
               <w:rPr>
                 <w:rStyle w:val="Hyperlink"/>
@@ -4901,7 +4901,7 @@
               <w:rPr>
                 <w:noProof/>
               </w:rPr>
-              <w:instrText xml:space="preserve"> PAGEREF _Toc244207708 \h </w:instrText>
+              <w:instrText xml:space="preserve"> PAGEREF _Toc244208379 \h </w:instrText>
             </w:r>
             <w:r>
               <w:rPr>
@@ -4943,7 +4943,7 @@
               <w14:ligatures w14:val="standardContextual"/>
             </w:rPr>
           </w:pPr>
-          <w:hyperlink w:anchor="_Toc244207709" w:history="1">
+          <w:hyperlink w:anchor="_Toc244208380" w:history="1">
             <w:r>
               <w:rPr>
                 <w:rStyle w:val="Hyperlink"/>
@@ -4967,7 +4967,7 @@
               <w:rPr>
                 <w:noProof/>
               </w:rPr>
-              <w:instrText xml:space="preserve"> PAGEREF _Toc244207709 \h </w:instrText>
+              <w:instrText xml:space="preserve"> PAGEREF _Toc244208380 \h </w:instrText>
             </w:r>
             <w:r>
               <w:rPr>
@@ -5009,7 +5009,7 @@
               <w14:ligatures w14:val="standardContextual"/>
             </w:rPr>
           </w:pPr>
-          <w:hyperlink w:anchor="_Toc244207710" w:history="1">
+          <w:hyperlink w:anchor="_Toc244208381" w:history="1">
             <w:r>
               <w:rPr>
                 <w:rStyle w:val="Hyperlink"/>
@@ -5033,7 +5033,7 @@
               <w:rPr>
                 <w:noProof/>
               </w:rPr>
-              <w:instrText xml:space="preserve"> PAGEREF _Toc244207710 \h </w:instrText>
+              <w:instrText xml:space="preserve"> PAGEREF _Toc244208381 \h </w:instrText>
             </w:r>
             <w:r>
               <w:rPr>
@@ -5075,7 +5075,7 @@
               <w14:ligatures w14:val="standardContextual"/>
             </w:rPr>
           </w:pPr>
-          <w:hyperlink w:anchor="_Toc244207711" w:history="1">
+          <w:hyperlink w:anchor="_Toc244208382" w:history="1">
             <w:r>
               <w:rPr>
                 <w:rStyle w:val="Hyperlink"/>
@@ -5099,7 +5099,7 @@
               <w:rPr>
                 <w:noProof/>
               </w:rPr>
-              <w:instrText xml:space="preserve"> PAGEREF _Toc244207711 \h </w:instrText>
+              <w:instrText xml:space="preserve"> PAGEREF _Toc244208382 \h </w:instrText>
             </w:r>
             <w:r>
               <w:rPr>
@@ -5141,7 +5141,7 @@
               <w14:ligatures w14:val="standardContextual"/>
             </w:rPr>
           </w:pPr>
-          <w:hyperlink w:anchor="_Toc244207712" w:history="1">
+          <w:hyperlink w:anchor="_Toc244208383" w:history="1">
             <w:r>
               <w:rPr>
                 <w:rStyle w:val="Hyperlink"/>
@@ -5165,7 +5165,7 @@
               <w:rPr>
                 <w:noProof/>
               </w:rPr>
-              <w:instrText xml:space="preserve"> PAGEREF _Toc244207712 \h </w:instrText>
+              <w:instrText xml:space="preserve"> PAGEREF _Toc244208383 \h </w:instrText>
             </w:r>
             <w:r>
               <w:rPr>
@@ -5207,7 +5207,7 @@
               <w14:ligatures w14:val="standardContextual"/>
             </w:rPr>
           </w:pPr>
-          <w:hyperlink w:anchor="_Toc244207713" w:history="1">
+          <w:hyperlink w:anchor="_Toc244208384" w:history="1">
             <w:r>
               <w:rPr>
                 <w:rStyle w:val="Hyperlink"/>
@@ -5231,7 +5231,7 @@
               <w:rPr>
                 <w:noProof/>
               </w:rPr>
-              <w:instrText xml:space="preserve"> PAGEREF _Toc244207713 \h </w:instrText>
+              <w:instrText xml:space="preserve"> PAGEREF _Toc244208384 \h </w:instrText>
             </w:r>
             <w:r>
               <w:rPr>
@@ -5273,7 +5273,7 @@
               <w14:ligatures w14:val="standardContextual"/>
             </w:rPr>
           </w:pPr>
-          <w:hyperlink w:anchor="_Toc244207714" w:history="1">
+          <w:hyperlink w:anchor="_Toc244208385" w:history="1">
             <w:r>
               <w:rPr>
                 <w:rStyle w:val="Hyperlink"/>
@@ -5297,7 +5297,7 @@
               <w:rPr>
                 <w:noProof/>
               </w:rPr>
-              <w:instrText xml:space="preserve"> PAGEREF _Toc244207714 \h </w:instrText>
+              <w:instrText xml:space="preserve"> PAGEREF _Toc244208385 \h </w:instrText>
             </w:r>
             <w:r>
               <w:rPr>
@@ -5339,7 +5339,7 @@
               <w14:ligatures w14:val="standardContextual"/>
             </w:rPr>
           </w:pPr>
-          <w:hyperlink w:anchor="_Toc244207715" w:history="1">
+          <w:hyperlink w:anchor="_Toc244208386" w:history="1">
             <w:r>
               <w:rPr>
                 <w:rStyle w:val="Hyperlink"/>
@@ -5363,7 +5363,7 @@
               <w:rPr>
                 <w:noProof/>
               </w:rPr>
-              <w:instrText xml:space="preserve"> PAGEREF _Toc244207715 \h </w:instrText>
+              <w:instrText xml:space="preserve"> PAGEREF _Toc244208386 \h </w:instrText>
             </w:r>
             <w:r>
               <w:rPr>
@@ -5405,7 +5405,7 @@
               <w14:ligatures w14:val="standardContextual"/>
             </w:rPr>
           </w:pPr>
-          <w:hyperlink w:anchor="_Toc244207716" w:history="1">
+          <w:hyperlink w:anchor="_Toc244208387" w:history="1">
             <w:r>
               <w:rPr>
                 <w:rStyle w:val="Hyperlink"/>
@@ -5429,7 +5429,7 @@
               <w:rPr>
                 <w:noProof/>
               </w:rPr>
-              <w:instrText xml:space="preserve"> PAGEREF _Toc244207716 \h </w:instrText>
+              <w:instrText xml:space="preserve"> PAGEREF _Toc244208387 \h </w:instrText>
             </w:r>
             <w:r>
               <w:rPr>
@@ -5471,7 +5471,7 @@
               <w14:ligatures w14:val="standardContextual"/>
             </w:rPr>
           </w:pPr>
-          <w:hyperlink w:anchor="_Toc244207717" w:history="1">
+          <w:hyperlink w:anchor="_Toc244208388" w:history="1">
             <w:r>
               <w:rPr>
                 <w:rStyle w:val="Hyperlink"/>
@@ -5495,7 +5495,7 @@
               <w:rPr>
                 <w:noProof/>
               </w:rPr>
-              <w:instrText xml:space="preserve"> PAGEREF _Toc244207717 \h </w:instrText>
+              <w:instrText xml:space="preserve"> PAGEREF _Toc244208388 \h </w:instrText>
             </w:r>
             <w:r>
               <w:rPr>
@@ -5537,7 +5537,7 @@
               <w14:ligatures w14:val="standardContextual"/>
             </w:rPr>
           </w:pPr>
-          <w:hyperlink w:anchor="_Toc244207718" w:history="1">
+          <w:hyperlink w:anchor="_Toc244208389" w:history="1">
             <w:r>
               <w:rPr>
                 <w:rStyle w:val="Hyperlink"/>
@@ -5561,7 +5561,7 @@
               <w:rPr>
                 <w:noProof/>
               </w:rPr>
-              <w:instrText xml:space="preserve"> PAGEREF _Toc244207718 \h </w:instrText>
+              <w:instrText xml:space="preserve"> PAGEREF _Toc244208389 \h </w:instrText>
             </w:r>
             <w:r>
               <w:rPr>
@@ -5603,7 +5603,7 @@
               <w14:ligatures w14:val="standardContextual"/>
             </w:rPr>
           </w:pPr>
-          <w:hyperlink w:anchor="_Toc244207719" w:history="1">
+          <w:hyperlink w:anchor="_Toc244208390" w:history="1">
             <w:r>
               <w:rPr>
                 <w:rStyle w:val="Hyperlink"/>
@@ -5627,7 +5627,7 @@
               <w:rPr>
                 <w:noProof/>
               </w:rPr>
-              <w:instrText xml:space="preserve"> PAGEREF _Toc244207719 \h </w:instrText>
+              <w:instrText xml:space="preserve"> PAGEREF _Toc244208390 \h </w:instrText>
             </w:r>
             <w:r>
               <w:rPr>
@@ -5669,7 +5669,7 @@
               <w14:ligatures w14:val="standardContextual"/>
             </w:rPr>
           </w:pPr>
-          <w:hyperlink w:anchor="_Toc244207720" w:history="1">
+          <w:hyperlink w:anchor="_Toc244208391" w:history="1">
             <w:r>
               <w:rPr>
                 <w:rStyle w:val="Hyperlink"/>
@@ -5693,7 +5693,7 @@
               <w:rPr>
                 <w:noProof/>
               </w:rPr>
-              <w:instrText xml:space="preserve"> PAGEREF _Toc244207720 \h </w:instrText>
+              <w:instrText xml:space="preserve"> PAGEREF _Toc244208391 \h </w:instrText>
             </w:r>
             <w:r>
               <w:rPr>
@@ -5735,7 +5735,7 @@
               <w14:ligatures w14:val="standardContextual"/>
             </w:rPr>
           </w:pPr>
-          <w:hyperlink w:anchor="_Toc244207721" w:history="1">
+          <w:hyperlink w:anchor="_Toc244208392" w:history="1">
             <w:r>
               <w:rPr>
                 <w:rStyle w:val="Hyperlink"/>
@@ -5759,7 +5759,7 @@
               <w:rPr>
                 <w:noProof/>
               </w:rPr>
-              <w:instrText xml:space="preserve"> PAGEREF _Toc244207721 \h </w:instrText>
+              <w:instrText xml:space="preserve"> PAGEREF _Toc244208392 \h </w:instrText>
             </w:r>
             <w:r>
               <w:rPr>
@@ -5801,7 +5801,7 @@
               <w14:ligatures w14:val="standardContextual"/>
             </w:rPr>
           </w:pPr>
-          <w:hyperlink w:anchor="_Toc244207722" w:history="1">
+          <w:hyperlink w:anchor="_Toc244208393" w:history="1">
             <w:r>
               <w:rPr>
                 <w:rStyle w:val="Hyperlink"/>
@@ -5825,7 +5825,7 @@
               <w:rPr>
                 <w:noProof/>
               </w:rPr>
-              <w:instrText xml:space="preserve"> PAGEREF _Toc244207722 \h </w:instrText>
+              <w:instrText xml:space="preserve"> PAGEREF _Toc244208393 \h </w:instrText>
             </w:r>
             <w:r>
               <w:rPr>
@@ -5867,7 +5867,7 @@
               <w14:ligatures w14:val="standardContextual"/>
             </w:rPr>
           </w:pPr>
-          <w:hyperlink w:anchor="_Toc244207723" w:history="1">
+          <w:hyperlink w:anchor="_Toc244208394" w:history="1">
             <w:r>
               <w:rPr>
                 <w:rStyle w:val="Hyperlink"/>
@@ -5891,7 +5891,7 @@
               <w:rPr>
                 <w:noProof/>
               </w:rPr>
-              <w:instrText xml:space="preserve"> PAGEREF _Toc244207723 \h </w:instrText>
+              <w:instrText xml:space="preserve"> PAGEREF _Toc244208394 \h </w:instrText>
             </w:r>
             <w:r>
               <w:rPr>
@@ -5933,7 +5933,7 @@
               <w14:ligatures w14:val="standardContextual"/>
             </w:rPr>
           </w:pPr>
-          <w:hyperlink w:anchor="_Toc244207724" w:history="1">
+          <w:hyperlink w:anchor="_Toc244208395" w:history="1">
             <w:r>
               <w:rPr>
                 <w:rStyle w:val="Hyperlink"/>
@@ -5957,7 +5957,7 @@
               <w:rPr>
                 <w:noProof/>
               </w:rPr>
-              <w:instrText xml:space="preserve"> PAGEREF _Toc244207724 \h </w:instrText>
+              <w:instrText xml:space="preserve"> PAGEREF _Toc244208395 \h </w:instrText>
             </w:r>
             <w:r>
               <w:rPr>
@@ -5999,7 +5999,7 @@
               <w14:ligatures w14:val="standardContextual"/>
             </w:rPr>
           </w:pPr>
-          <w:hyperlink w:anchor="_Toc244207725" w:history="1">
+          <w:hyperlink w:anchor="_Toc244208396" w:history="1">
             <w:r>
               <w:rPr>
                 <w:rStyle w:val="Hyperlink"/>
@@ -6023,7 +6023,7 @@
               <w:rPr>
                 <w:noProof/>
               </w:rPr>
-              <w:instrText xml:space="preserve"> PAGEREF _Toc244207725 \h </w:instrText>
+              <w:instrText xml:space="preserve"> PAGEREF _Toc244208396 \h </w:instrText>
             </w:r>
             <w:r>
               <w:rPr>
@@ -6065,7 +6065,7 @@
               <w14:ligatures w14:val="standardContextual"/>
             </w:rPr>
           </w:pPr>
-          <w:hyperlink w:anchor="_Toc244207726" w:history="1">
+          <w:hyperlink w:anchor="_Toc244208397" w:history="1">
             <w:r>
               <w:rPr>
                 <w:rStyle w:val="Hyperlink"/>
@@ -6089,7 +6089,7 @@
               <w:rPr>
                 <w:noProof/>
               </w:rPr>
-              <w:instrText xml:space="preserve"> PAGEREF _Toc244207726 \h </w:instrText>
+              <w:instrText xml:space="preserve"> PAGEREF _Toc244208397 \h </w:instrText>
             </w:r>
             <w:r>
               <w:rPr>
@@ -6131,7 +6131,7 @@
               <w14:ligatures w14:val="standardContextual"/>
             </w:rPr>
           </w:pPr>
-          <w:hyperlink w:anchor="_Toc244207727" w:history="1">
+          <w:hyperlink w:anchor="_Toc244208398" w:history="1">
             <w:r>
               <w:rPr>
                 <w:rStyle w:val="Hyperlink"/>
@@ -6155,7 +6155,7 @@
               <w:rPr>
                 <w:noProof/>
               </w:rPr>
-              <w:instrText xml:space="preserve"> PAGEREF _Toc244207727 \h </w:instrText>
+              <w:instrText xml:space="preserve"> PAGEREF _Toc244208398 \h </w:instrText>
             </w:r>
             <w:r>
               <w:rPr>
@@ -6197,7 +6197,7 @@
               <w14:ligatures w14:val="standardContextual"/>
             </w:rPr>
           </w:pPr>
-          <w:hyperlink w:anchor="_Toc244207728" w:history="1">
+          <w:hyperlink w:anchor="_Toc244208399" w:history="1">
             <w:r>
               <w:rPr>
                 <w:rStyle w:val="Hyperlink"/>
@@ -6221,7 +6221,7 @@
               <w:rPr>
                 <w:noProof/>
               </w:rPr>
-              <w:instrText xml:space="preserve"> PAGEREF _Toc244207728 \h </w:instrText>
+              <w:instrText xml:space="preserve"> PAGEREF _Toc244208399 \h </w:instrText>
             </w:r>
             <w:r>
               <w:rPr>
@@ -6263,7 +6263,7 @@
               <w14:ligatures w14:val="standardContextual"/>
             </w:rPr>
           </w:pPr>
-          <w:hyperlink w:anchor="_Toc244207729" w:history="1">
+          <w:hyperlink w:anchor="_Toc244208400" w:history="1">
             <w:r>
               <w:rPr>
                 <w:rStyle w:val="Hyperlink"/>
@@ -6287,7 +6287,7 @@
               <w:rPr>
                 <w:noProof/>
               </w:rPr>
-              <w:instrText xml:space="preserve"> PAGEREF _Toc244207729 \h </w:instrText>
+              <w:instrText xml:space="preserve"> PAGEREF _Toc244208400 \h </w:instrText>
             </w:r>
             <w:r>
               <w:rPr>
@@ -6329,7 +6329,7 @@
               <w14:ligatures w14:val="standardContextual"/>
             </w:rPr>
           </w:pPr>
-          <w:hyperlink w:anchor="_Toc244207730" w:history="1">
+          <w:hyperlink w:anchor="_Toc244208401" w:history="1">
             <w:r>
               <w:rPr>
                 <w:rStyle w:val="Hyperlink"/>
@@ -6353,7 +6353,7 @@
               <w:rPr>
                 <w:noProof/>
               </w:rPr>
-              <w:instrText xml:space="preserve"> PAGEREF _Toc244207730 \h </w:instrText>
+              <w:instrText xml:space="preserve"> PAGEREF _Toc244208401 \h </w:instrText>
             </w:r>
             <w:r>
               <w:rPr>
@@ -7790,7 +7790,7 @@
     <w:sdt>
       <w:sdtPr>
         <w:alias w:val="Danh mục hình"/>
-        <w:id w:val="1916508640"/>
+        <w:id w:val="1299416259"/>
       </w:sdtPr>
       <w:sdtEndPr/>
       <w:sdtContent>
@@ -7818,7 +7818,7 @@
           <w:r>
             <w:fldChar w:fldCharType="separate"/>
           </w:r>
-          <w:hyperlink w:anchor="_Toc244207731" w:history="1">
+          <w:hyperlink w:anchor="_Toc244208402" w:history="1">
             <w:r>
               <w:rPr>
                 <w:rStyle w:val="Hyperlink"/>
@@ -7855,7 +7855,7 @@
               <w:rPr>
                 <w:noProof/>
               </w:rPr>
-              <w:instrText xml:space="preserve"> PAGEREF _Toc244207731 \h </w:instrText>
+              <w:instrText xml:space="preserve"> PAGEREF _Toc244208402 \h </w:instrText>
             </w:r>
             <w:r>
               <w:rPr>
@@ -7897,7 +7897,7 @@
               <w14:ligatures w14:val="standardContextual"/>
             </w:rPr>
           </w:pPr>
-          <w:hyperlink w:anchor="_Toc244207732" w:history="1">
+          <w:hyperlink w:anchor="_Toc244208403" w:history="1">
             <w:r>
               <w:rPr>
                 <w:rStyle w:val="Hyperlink"/>
@@ -7934,7 +7934,7 @@
               <w:rPr>
                 <w:noProof/>
               </w:rPr>
-              <w:instrText xml:space="preserve"> PAGEREF _Toc244207732 \h </w:instrText>
+              <w:instrText xml:space="preserve"> PAGEREF _Toc244208403 \h </w:instrText>
             </w:r>
             <w:r>
               <w:rPr>
@@ -7976,7 +7976,7 @@
               <w14:ligatures w14:val="standardContextual"/>
             </w:rPr>
           </w:pPr>
-          <w:hyperlink w:anchor="_Toc244207733" w:history="1">
+          <w:hyperlink w:anchor="_Toc244208404" w:history="1">
             <w:r>
               <w:rPr>
                 <w:rStyle w:val="Hyperlink"/>
@@ -8013,7 +8013,7 @@
               <w:rPr>
                 <w:noProof/>
               </w:rPr>
-              <w:instrText xml:space="preserve"> PAGEREF _Toc244207733 \h </w:instrText>
+              <w:instrText xml:space="preserve"> PAGEREF _Toc244208404 \h </w:instrText>
             </w:r>
             <w:r>
               <w:rPr>
@@ -8055,7 +8055,7 @@
               <w14:ligatures w14:val="standardContextual"/>
             </w:rPr>
           </w:pPr>
-          <w:hyperlink w:anchor="_Toc244207734" w:history="1">
+          <w:hyperlink w:anchor="_Toc244208405" w:history="1">
             <w:r>
               <w:rPr>
                 <w:rStyle w:val="Hyperlink"/>
@@ -8092,7 +8092,7 @@
               <w:rPr>
                 <w:noProof/>
               </w:rPr>
-              <w:instrText xml:space="preserve"> PAGEREF _Toc244207734 \h </w:instrText>
+              <w:instrText xml:space="preserve"> PAGEREF _Toc244208405 \h </w:instrText>
             </w:r>
             <w:r>
               <w:rPr>
@@ -8134,7 +8134,7 @@
               <w14:ligatures w14:val="standardContextual"/>
             </w:rPr>
           </w:pPr>
-          <w:hyperlink w:anchor="_Toc244207735" w:history="1">
+          <w:hyperlink w:anchor="_Toc244208406" w:history="1">
             <w:r>
               <w:rPr>
                 <w:rStyle w:val="Hyperlink"/>
@@ -8171,7 +8171,7 @@
               <w:rPr>
                 <w:noProof/>
               </w:rPr>
-              <w:instrText xml:space="preserve"> PAGEREF _Toc244207735 \h </w:instrText>
+              <w:instrText xml:space="preserve"> PAGEREF _Toc244208406 \h </w:instrText>
             </w:r>
             <w:r>
               <w:rPr>
@@ -8213,7 +8213,7 @@
               <w14:ligatures w14:val="standardContextual"/>
             </w:rPr>
           </w:pPr>
-          <w:hyperlink w:anchor="_Toc244207736" w:history="1">
+          <w:hyperlink w:anchor="_Toc244208407" w:history="1">
             <w:r>
               <w:rPr>
                 <w:rStyle w:val="Hyperlink"/>
@@ -8250,7 +8250,7 @@
               <w:rPr>
                 <w:noProof/>
               </w:rPr>
-              <w:instrText xml:space="preserve"> PAGEREF _Toc244207736 \h </w:instrText>
+              <w:instrText xml:space="preserve"> PAGEREF _Toc244208407 \h </w:instrText>
             </w:r>
             <w:r>
               <w:rPr>
@@ -8292,7 +8292,7 @@
               <w14:ligatures w14:val="standardContextual"/>
             </w:rPr>
           </w:pPr>
-          <w:hyperlink w:anchor="_Toc244207737" w:history="1">
+          <w:hyperlink w:anchor="_Toc244208408" w:history="1">
             <w:r>
               <w:rPr>
                 <w:rStyle w:val="Hyperlink"/>
@@ -8329,7 +8329,7 @@
               <w:rPr>
                 <w:noProof/>
               </w:rPr>
-              <w:instrText xml:space="preserve"> PAGEREF _Toc244207737 \h </w:instrText>
+              <w:instrText xml:space="preserve"> PAGEREF _Toc244208408 \h </w:instrText>
             </w:r>
             <w:r>
               <w:rPr>
@@ -8371,7 +8371,7 @@
               <w14:ligatures w14:val="standardContextual"/>
             </w:rPr>
           </w:pPr>
-          <w:hyperlink w:anchor="_Toc244207738" w:history="1">
+          <w:hyperlink w:anchor="_Toc244208409" w:history="1">
             <w:r>
               <w:rPr>
                 <w:rStyle w:val="Hyperlink"/>
@@ -8408,7 +8408,7 @@
               <w:rPr>
                 <w:noProof/>
               </w:rPr>
-              <w:instrText xml:space="preserve"> PAGEREF _Toc244207738 \h </w:instrText>
+              <w:instrText xml:space="preserve"> PAGEREF _Toc244208409 \h </w:instrText>
             </w:r>
             <w:r>
               <w:rPr>
@@ -8450,7 +8450,7 @@
               <w14:ligatures w14:val="standardContextual"/>
             </w:rPr>
           </w:pPr>
-          <w:hyperlink w:anchor="_Toc244207739" w:history="1">
+          <w:hyperlink w:anchor="_Toc244208410" w:history="1">
             <w:r>
               <w:rPr>
                 <w:rStyle w:val="Hyperlink"/>
@@ -8487,7 +8487,7 @@
               <w:rPr>
                 <w:noProof/>
               </w:rPr>
-              <w:instrText xml:space="preserve"> PAGEREF _Toc244207739 \h </w:instrText>
+              <w:instrText xml:space="preserve"> PAGEREF _Toc244208410 \h </w:instrText>
             </w:r>
             <w:r>
               <w:rPr>
@@ -8534,7 +8534,7 @@
     <w:sdt>
       <w:sdtPr>
         <w:alias w:val="Danh mục bảng"/>
-        <w:id w:val="2012946939"/>
+        <w:id w:val="-1677031775"/>
       </w:sdtPr>
       <w:sdtEndPr/>
       <w:sdtContent>
@@ -8562,7 +8562,7 @@
           <w:r>
             <w:fldChar w:fldCharType="separate"/>
           </w:r>
-          <w:hyperlink w:anchor="_Toc244207740" w:history="1">
+          <w:hyperlink w:anchor="_Toc244208411" w:history="1">
             <w:r>
               <w:rPr>
                 <w:rStyle w:val="Hyperlink"/>
@@ -8599,7 +8599,7 @@
               <w:rPr>
                 <w:noProof/>
               </w:rPr>
-              <w:instrText xml:space="preserve"> PAGEREF _Toc244207740 \h </w:instrText>
+              <w:instrText xml:space="preserve"> PAGEREF _Toc244208411 \h </w:instrText>
             </w:r>
             <w:r>
               <w:rPr>
@@ -8641,7 +8641,7 @@
               <w14:ligatures w14:val="standardContextual"/>
             </w:rPr>
           </w:pPr>
-          <w:hyperlink w:anchor="_Toc244207741" w:history="1">
+          <w:hyperlink w:anchor="_Toc244208412" w:history="1">
             <w:r>
               <w:rPr>
                 <w:rStyle w:val="Hyperlink"/>
@@ -8678,7 +8678,7 @@
               <w:rPr>
                 <w:noProof/>
               </w:rPr>
-              <w:instrText xml:space="preserve"> PAGEREF _Toc244207741 \h </w:instrText>
+              <w:instrText xml:space="preserve"> PAGEREF _Toc244208412 \h </w:instrText>
             </w:r>
             <w:r>
               <w:rPr>
@@ -8720,7 +8720,7 @@
               <w14:ligatures w14:val="standardContextual"/>
             </w:rPr>
           </w:pPr>
-          <w:hyperlink w:anchor="_Toc244207742" w:history="1">
+          <w:hyperlink w:anchor="_Toc244208413" w:history="1">
             <w:r>
               <w:rPr>
                 <w:rStyle w:val="Hyperlink"/>
@@ -8757,7 +8757,7 @@
               <w:rPr>
                 <w:noProof/>
               </w:rPr>
-              <w:instrText xml:space="preserve"> PAGEREF _Toc244207742 \h </w:instrText>
+              <w:instrText xml:space="preserve"> PAGEREF _Toc244208413 \h </w:instrText>
             </w:r>
             <w:r>
               <w:rPr>
@@ -8799,7 +8799,7 @@
               <w14:ligatures w14:val="standardContextual"/>
             </w:rPr>
           </w:pPr>
-          <w:hyperlink w:anchor="_Toc244207743" w:history="1">
+          <w:hyperlink w:anchor="_Toc244208414" w:history="1">
             <w:r>
               <w:rPr>
                 <w:rStyle w:val="Hyperlink"/>
@@ -8836,7 +8836,7 @@
               <w:rPr>
                 <w:noProof/>
               </w:rPr>
-              <w:instrText xml:space="preserve"> PAGEREF _Toc244207743 \h </w:instrText>
+              <w:instrText xml:space="preserve"> PAGEREF _Toc244208414 \h </w:instrText>
             </w:r>
             <w:r>
               <w:rPr>
@@ -8878,7 +8878,7 @@
               <w14:ligatures w14:val="standardContextual"/>
             </w:rPr>
           </w:pPr>
-          <w:hyperlink w:anchor="_Toc244207744" w:history="1">
+          <w:hyperlink w:anchor="_Toc244208415" w:history="1">
             <w:r>
               <w:rPr>
                 <w:rStyle w:val="Hyperlink"/>
@@ -8915,7 +8915,7 @@
               <w:rPr>
                 <w:noProof/>
               </w:rPr>
-              <w:instrText xml:space="preserve"> PAGEREF _Toc244207744 \h </w:instrText>
+              <w:instrText xml:space="preserve"> PAGEREF _Toc244208415 \h </w:instrText>
             </w:r>
             <w:r>
               <w:rPr>
@@ -8957,7 +8957,7 @@
               <w14:ligatures w14:val="standardContextual"/>
             </w:rPr>
           </w:pPr>
-          <w:hyperlink w:anchor="_Toc244207745" w:history="1">
+          <w:hyperlink w:anchor="_Toc244208416" w:history="1">
             <w:r>
               <w:rPr>
                 <w:rStyle w:val="Hyperlink"/>
@@ -8994,7 +8994,7 @@
               <w:rPr>
                 <w:noProof/>
               </w:rPr>
-              <w:instrText xml:space="preserve"> PAGEREF _Toc244207745 \h </w:instrText>
+              <w:instrText xml:space="preserve"> PAGEREF _Toc244208416 \h </w:instrText>
             </w:r>
             <w:r>
               <w:rPr>
@@ -9036,7 +9036,7 @@
               <w14:ligatures w14:val="standardContextual"/>
             </w:rPr>
           </w:pPr>
-          <w:hyperlink w:anchor="_Toc244207746" w:history="1">
+          <w:hyperlink w:anchor="_Toc244208417" w:history="1">
             <w:r>
               <w:rPr>
                 <w:rStyle w:val="Hyperlink"/>
@@ -9073,7 +9073,7 @@
               <w:rPr>
                 <w:noProof/>
               </w:rPr>
-              <w:instrText xml:space="preserve"> PAGEREF _Toc244207746 \h </w:instrText>
+              <w:instrText xml:space="preserve"> PAGEREF _Toc244208417 \h </w:instrText>
             </w:r>
             <w:r>
               <w:rPr>
@@ -9115,7 +9115,7 @@
               <w14:ligatures w14:val="standardContextual"/>
             </w:rPr>
           </w:pPr>
-          <w:hyperlink w:anchor="_Toc244207747" w:history="1">
+          <w:hyperlink w:anchor="_Toc244208418" w:history="1">
             <w:r>
               <w:rPr>
                 <w:rStyle w:val="Hyperlink"/>
@@ -9152,7 +9152,7 @@
               <w:rPr>
                 <w:noProof/>
               </w:rPr>
-              <w:instrText xml:space="preserve"> PAGEREF _Toc244207747 \h </w:instrText>
+              <w:instrText xml:space="preserve"> PAGEREF _Toc244208418 \h </w:instrText>
             </w:r>
             <w:r>
               <w:rPr>
@@ -9194,7 +9194,7 @@
               <w14:ligatures w14:val="standardContextual"/>
             </w:rPr>
           </w:pPr>
-          <w:hyperlink w:anchor="_Toc244207748" w:history="1">
+          <w:hyperlink w:anchor="_Toc244208419" w:history="1">
             <w:r>
               <w:rPr>
                 <w:rStyle w:val="Hyperlink"/>
@@ -9231,7 +9231,7 @@
               <w:rPr>
                 <w:noProof/>
               </w:rPr>
-              <w:instrText xml:space="preserve"> PAGEREF _Toc244207748 \h </w:instrText>
+              <w:instrText xml:space="preserve"> PAGEREF _Toc244208419 \h </w:instrText>
             </w:r>
             <w:r>
               <w:rPr>
@@ -9273,7 +9273,7 @@
               <w14:ligatures w14:val="standardContextual"/>
             </w:rPr>
           </w:pPr>
-          <w:hyperlink w:anchor="_Toc244207749" w:history="1">
+          <w:hyperlink w:anchor="_Toc244208420" w:history="1">
             <w:r>
               <w:rPr>
                 <w:rStyle w:val="Hyperlink"/>
@@ -9310,7 +9310,7 @@
               <w:rPr>
                 <w:noProof/>
               </w:rPr>
-              <w:instrText xml:space="preserve"> PAGEREF _Toc244207749 \h </w:instrText>
+              <w:instrText xml:space="preserve"> PAGEREF _Toc244208420 \h </w:instrText>
             </w:r>
             <w:r>
               <w:rPr>
@@ -9352,7 +9352,7 @@
               <w14:ligatures w14:val="standardContextual"/>
             </w:rPr>
           </w:pPr>
-          <w:hyperlink w:anchor="_Toc244207750" w:history="1">
+          <w:hyperlink w:anchor="_Toc244208421" w:history="1">
             <w:r>
               <w:rPr>
                 <w:rStyle w:val="Hyperlink"/>
@@ -9389,7 +9389,7 @@
               <w:rPr>
                 <w:noProof/>
               </w:rPr>
-              <w:instrText xml:space="preserve"> PAGEREF _Toc244207750 \h </w:instrText>
+              <w:instrText xml:space="preserve"> PAGEREF _Toc244208421 \h </w:instrText>
             </w:r>
             <w:r>
               <w:rPr>
@@ -9431,7 +9431,7 @@
               <w14:ligatures w14:val="standardContextual"/>
             </w:rPr>
           </w:pPr>
-          <w:hyperlink w:anchor="_Toc244207751" w:history="1">
+          <w:hyperlink w:anchor="_Toc244208422" w:history="1">
             <w:r>
               <w:rPr>
                 <w:rStyle w:val="Hyperlink"/>
@@ -9468,7 +9468,7 @@
               <w:rPr>
                 <w:noProof/>
               </w:rPr>
-              <w:instrText xml:space="preserve"> PAGEREF _Toc244207751 \h </w:instrText>
+              <w:instrText xml:space="preserve"> PAGEREF _Toc244208422 \h </w:instrText>
             </w:r>
             <w:r>
               <w:rPr>
@@ -9510,7 +9510,7 @@
               <w14:ligatures w14:val="standardContextual"/>
             </w:rPr>
           </w:pPr>
-          <w:hyperlink w:anchor="_Toc244207752" w:history="1">
+          <w:hyperlink w:anchor="_Toc244208423" w:history="1">
             <w:r>
               <w:rPr>
                 <w:rStyle w:val="Hyperlink"/>
@@ -9547,7 +9547,7 @@
               <w:rPr>
                 <w:noProof/>
               </w:rPr>
-              <w:instrText xml:space="preserve"> PAGEREF _Toc244207752 \h </w:instrText>
+              <w:instrText xml:space="preserve"> PAGEREF _Toc244208423 \h </w:instrText>
             </w:r>
             <w:r>
               <w:rPr>
@@ -9589,7 +9589,7 @@
               <w14:ligatures w14:val="standardContextual"/>
             </w:rPr>
           </w:pPr>
-          <w:hyperlink w:anchor="_Toc244207753" w:history="1">
+          <w:hyperlink w:anchor="_Toc244208424" w:history="1">
             <w:r>
               <w:rPr>
                 <w:rStyle w:val="Hyperlink"/>
@@ -9626,7 +9626,7 @@
               <w:rPr>
                 <w:noProof/>
               </w:rPr>
-              <w:instrText xml:space="preserve"> PAGEREF _Toc244207753 \h </w:instrText>
+              <w:instrText xml:space="preserve"> PAGEREF _Toc244208424 \h </w:instrText>
             </w:r>
             <w:r>
               <w:rPr>
@@ -9668,7 +9668,7 @@
               <w14:ligatures w14:val="standardContextual"/>
             </w:rPr>
           </w:pPr>
-          <w:hyperlink w:anchor="_Toc244207754" w:history="1">
+          <w:hyperlink w:anchor="_Toc244208425" w:history="1">
             <w:r>
               <w:rPr>
                 <w:rStyle w:val="Hyperlink"/>
@@ -9705,7 +9705,7 @@
               <w:rPr>
                 <w:noProof/>
               </w:rPr>
-              <w:instrText xml:space="preserve"> PAGEREF _Toc244207754 \h </w:instrText>
+              <w:instrText xml:space="preserve"> PAGEREF _Toc244208425 \h </w:instrText>
             </w:r>
             <w:r>
               <w:rPr>
@@ -9747,7 +9747,7 @@
               <w14:ligatures w14:val="standardContextual"/>
             </w:rPr>
           </w:pPr>
-          <w:hyperlink w:anchor="_Toc244207755" w:history="1">
+          <w:hyperlink w:anchor="_Toc244208426" w:history="1">
             <w:r>
               <w:rPr>
                 <w:rStyle w:val="Hyperlink"/>
@@ -9784,7 +9784,7 @@
               <w:rPr>
                 <w:noProof/>
               </w:rPr>
-              <w:instrText xml:space="preserve"> PAGEREF _Toc244207755 \h </w:instrText>
+              <w:instrText xml:space="preserve"> PAGEREF _Toc244208426 \h </w:instrText>
             </w:r>
             <w:r>
               <w:rPr>
@@ -9826,7 +9826,7 @@
               <w14:ligatures w14:val="standardContextual"/>
             </w:rPr>
           </w:pPr>
-          <w:hyperlink w:anchor="_Toc244207756" w:history="1">
+          <w:hyperlink w:anchor="_Toc244208427" w:history="1">
             <w:r>
               <w:rPr>
                 <w:rStyle w:val="Hyperlink"/>
@@ -9863,7 +9863,7 @@
               <w:rPr>
                 <w:noProof/>
               </w:rPr>
-              <w:instrText xml:space="preserve"> PAGEREF _Toc244207756 \h </w:instrText>
+              <w:instrText xml:space="preserve"> PAGEREF _Toc244208427 \h </w:instrText>
             </w:r>
             <w:r>
               <w:rPr>
@@ -9905,7 +9905,7 @@
               <w14:ligatures w14:val="standardContextual"/>
             </w:rPr>
           </w:pPr>
-          <w:hyperlink w:anchor="_Toc244207757" w:history="1">
+          <w:hyperlink w:anchor="_Toc244208428" w:history="1">
             <w:r>
               <w:rPr>
                 <w:rStyle w:val="Hyperlink"/>
@@ -9942,7 +9942,7 @@
               <w:rPr>
                 <w:noProof/>
               </w:rPr>
-              <w:instrText xml:space="preserve"> PAGEREF _Toc244207757 \h </w:instrText>
+              <w:instrText xml:space="preserve"> PAGEREF _Toc244208428 \h </w:instrText>
             </w:r>
             <w:r>
               <w:rPr>
@@ -9993,7 +9993,7 @@
         <w:pStyle w:val="Heading1"/>
         <w:pageBreakBefore/>
       </w:pPr>
-      <w:bookmarkStart w:id="0" w:name="_Toc244207652"/>
+      <w:bookmarkStart w:id="0" w:name="_Toc244208323"/>
       <w:r>
         <w:lastRenderedPageBreak/>
         <w:t>LỜI MỞ ĐẦU</w:t>
@@ -10004,7 +10004,7 @@
       <w:pPr>
         <w:pStyle w:val="Heading2"/>
       </w:pPr>
-      <w:bookmarkStart w:id="1" w:name="_Toc244207653"/>
+      <w:bookmarkStart w:id="1" w:name="_Toc244208324"/>
       <w:r>
         <w:t>Lý do chọn đề tài</w:t>
       </w:r>
@@ -10077,7 +10077,7 @@
       <w:pPr>
         <w:pStyle w:val="Heading2"/>
       </w:pPr>
-      <w:bookmarkStart w:id="2" w:name="_Toc244207654"/>
+      <w:bookmarkStart w:id="2" w:name="_Toc244208325"/>
       <w:r>
         <w:t>Mục tiêu đề tài</w:t>
       </w:r>
@@ -10143,7 +10143,7 @@
       <w:pPr>
         <w:pStyle w:val="Heading2"/>
       </w:pPr>
-      <w:bookmarkStart w:id="3" w:name="_Toc244207655"/>
+      <w:bookmarkStart w:id="3" w:name="_Toc244208326"/>
       <w:r>
         <w:t>Đối tượng và phạm vi</w:t>
       </w:r>
@@ -10196,7 +10196,7 @@
       <w:pPr>
         <w:pStyle w:val="Heading2"/>
       </w:pPr>
-      <w:bookmarkStart w:id="4" w:name="_Toc244207656"/>
+      <w:bookmarkStart w:id="4" w:name="_Toc244208327"/>
       <w:r>
         <w:t>Phương pháp thực hiện</w:t>
       </w:r>
@@ -10248,7 +10248,7 @@
       <w:pPr>
         <w:pStyle w:val="Heading2"/>
       </w:pPr>
-      <w:bookmarkStart w:id="5" w:name="_Toc244207657"/>
+      <w:bookmarkStart w:id="5" w:name="_Toc244208328"/>
       <w:r>
         <w:t>Bố cục báo cáo</w:t>
       </w:r>
@@ -10371,7 +10371,7 @@
         <w:pStyle w:val="Heading1"/>
         <w:pageBreakBefore/>
       </w:pPr>
-      <w:bookmarkStart w:id="6" w:name="_Toc244207658"/>
+      <w:bookmarkStart w:id="6" w:name="_Toc244208329"/>
       <w:r>
         <w:lastRenderedPageBreak/>
         <w:t>CHƯƠNG 1. TỔNG QUAN VỀ CƠ SỞ DỮ LIỆU PHÂN TÁN</w:t>
@@ -10382,7 +10382,7 @@
       <w:pPr>
         <w:pStyle w:val="Heading2"/>
       </w:pPr>
-      <w:bookmarkStart w:id="7" w:name="_Toc244207659"/>
+      <w:bookmarkStart w:id="7" w:name="_Toc244208330"/>
       <w:r>
         <w:t>1.1 Khái niệm cơ sở dữ liệu phân tán</w:t>
       </w:r>
@@ -10511,7 +10511,7 @@
           <w:noProof/>
         </w:rPr>
         <w:drawing>
-          <wp:inline distT="0" distB="0" distL="0" distR="0" wp14:anchorId="2B2A8723" wp14:editId="198F080F">
+          <wp:inline distT="0" distB="0" distL="0" distR="0" wp14:anchorId="6D75FB35" wp14:editId="62330422">
             <wp:extent cx="5619750" cy="3619500"/>
             <wp:effectExtent l="0" t="0" r="0" b="0"/>
             <wp:docPr id="1" name="Picture 1"/>
@@ -10556,7 +10556,7 @@
         <w:spacing w:after="160"/>
         <w:jc w:val="center"/>
       </w:pPr>
-      <w:bookmarkStart w:id="8" w:name="_Toc244207731"/>
+      <w:bookmarkStart w:id="8" w:name="_Toc244208402"/>
       <w:r>
         <w:rPr>
           <w:b/>
@@ -10579,7 +10579,7 @@
       <w:pPr>
         <w:pStyle w:val="Heading2"/>
       </w:pPr>
-      <w:bookmarkStart w:id="9" w:name="_Toc244207660"/>
+      <w:bookmarkStart w:id="9" w:name="_Toc244208331"/>
       <w:r>
         <w:lastRenderedPageBreak/>
         <w:t>1.2 So sánh CSDL tập trung và CSDL phân tán</w:t>
@@ -10603,7 +10603,7 @@
         <w:spacing w:before="120" w:after="160"/>
         <w:jc w:val="center"/>
       </w:pPr>
-      <w:bookmarkStart w:id="10" w:name="_Toc244207740"/>
+      <w:bookmarkStart w:id="10" w:name="_Toc244208411"/>
       <w:r>
         <w:rPr>
           <w:b/>
@@ -11470,7 +11470,7 @@
       <w:pPr>
         <w:pStyle w:val="Heading2"/>
       </w:pPr>
-      <w:bookmarkStart w:id="11" w:name="_Toc244207661"/>
+      <w:bookmarkStart w:id="11" w:name="_Toc244208332"/>
       <w:r>
         <w:t>1.3 Kiến trúc tham chiếu của CSDL phân tán</w:t>
       </w:r>
@@ -11592,7 +11592,7 @@
           <w:noProof/>
         </w:rPr>
         <w:drawing>
-          <wp:inline distT="0" distB="0" distL="0" distR="0" wp14:anchorId="1F34DFB9" wp14:editId="4A777F7E">
+          <wp:inline distT="0" distB="0" distL="0" distR="0" wp14:anchorId="5A326B22" wp14:editId="5B44EEF0">
             <wp:extent cx="5619750" cy="4905375"/>
             <wp:effectExtent l="0" t="0" r="0" b="0"/>
             <wp:docPr id="2" name="Picture 2"/>
@@ -11637,7 +11637,7 @@
         <w:spacing w:after="160"/>
         <w:jc w:val="center"/>
       </w:pPr>
-      <w:bookmarkStart w:id="12" w:name="_Toc244207732"/>
+      <w:bookmarkStart w:id="12" w:name="_Toc244208403"/>
       <w:r>
         <w:rPr>
           <w:b/>
@@ -11660,7 +11660,7 @@
       <w:pPr>
         <w:pStyle w:val="Heading2"/>
       </w:pPr>
-      <w:bookmarkStart w:id="13" w:name="_Toc244207662"/>
+      <w:bookmarkStart w:id="13" w:name="_Toc244208333"/>
       <w:r>
         <w:t>1.4 Tính trong suốt trong CSDL phân tán</w:t>
       </w:r>
@@ -11775,7 +11775,7 @@
       <w:pPr>
         <w:pStyle w:val="Heading2"/>
       </w:pPr>
-      <w:bookmarkStart w:id="14" w:name="_Toc244207663"/>
+      <w:bookmarkStart w:id="14" w:name="_Toc244208334"/>
       <w:r>
         <w:t>1.5 Thiết kế cơ sở dữ liệu phân tán</w:t>
       </w:r>
@@ -11785,7 +11785,7 @@
       <w:pPr>
         <w:pStyle w:val="Heading3"/>
       </w:pPr>
-      <w:bookmarkStart w:id="15" w:name="_Toc244207664"/>
+      <w:bookmarkStart w:id="15" w:name="_Toc244208335"/>
       <w:r>
         <w:t>1.5.1 Hai hướng tiếp cận</w:t>
       </w:r>
@@ -11837,7 +11837,7 @@
       <w:pPr>
         <w:pStyle w:val="Heading3"/>
       </w:pPr>
-      <w:bookmarkStart w:id="16" w:name="_Toc244207665"/>
+      <w:bookmarkStart w:id="16" w:name="_Toc244208336"/>
       <w:r>
         <w:t>1.5.2 Hai bài toán chính: phân mảnh và cấp phát</w:t>
       </w:r>
@@ -11913,7 +11913,7 @@
       <w:pPr>
         <w:pStyle w:val="Heading2"/>
       </w:pPr>
-      <w:bookmarkStart w:id="17" w:name="_Toc244207666"/>
+      <w:bookmarkStart w:id="17" w:name="_Toc244208337"/>
       <w:r>
         <w:t>1.6 Kết chương</w:t>
       </w:r>
@@ -11934,7 +11934,7 @@
         <w:pStyle w:val="Heading1"/>
         <w:pageBreakBefore/>
       </w:pPr>
-      <w:bookmarkStart w:id="18" w:name="_Toc244207667"/>
+      <w:bookmarkStart w:id="18" w:name="_Toc244208338"/>
       <w:r>
         <w:lastRenderedPageBreak/>
         <w:t>CHƯƠNG 2. PHÂN MẢNH DỮ LIỆU TRONG CSDL PHÂN TÁN</w:t>
@@ -11945,7 +11945,7 @@
       <w:pPr>
         <w:pStyle w:val="Heading2"/>
       </w:pPr>
-      <w:bookmarkStart w:id="19" w:name="_Toc244207668"/>
+      <w:bookmarkStart w:id="19" w:name="_Toc244208339"/>
       <w:r>
         <w:t>2.1 Lý do và đơn vị phân mảnh</w:t>
       </w:r>
@@ -12125,7 +12125,7 @@
           <w:noProof/>
         </w:rPr>
         <w:drawing>
-          <wp:inline distT="0" distB="0" distL="0" distR="0" wp14:anchorId="6562E2F5" wp14:editId="1DA9B735">
+          <wp:inline distT="0" distB="0" distL="0" distR="0" wp14:anchorId="7E8F4320" wp14:editId="590F2FF0">
             <wp:extent cx="5619750" cy="1790700"/>
             <wp:effectExtent l="0" t="0" r="0" b="0"/>
             <wp:docPr id="3" name="Picture 3"/>
@@ -12170,7 +12170,7 @@
         <w:spacing w:after="160"/>
         <w:jc w:val="center"/>
       </w:pPr>
-      <w:bookmarkStart w:id="20" w:name="_Toc244207733"/>
+      <w:bookmarkStart w:id="20" w:name="_Toc244208404"/>
       <w:r>
         <w:rPr>
           <w:b/>
@@ -12193,7 +12193,7 @@
       <w:pPr>
         <w:pStyle w:val="Heading2"/>
       </w:pPr>
-      <w:bookmarkStart w:id="21" w:name="_Toc244207669"/>
+      <w:bookmarkStart w:id="21" w:name="_Toc244208340"/>
       <w:r>
         <w:lastRenderedPageBreak/>
         <w:t>2.2 Các quy tắc đúng đắn của phân mảnh</w:t>
@@ -12331,7 +12331,7 @@
       <w:pPr>
         <w:pStyle w:val="Heading2"/>
       </w:pPr>
-      <w:bookmarkStart w:id="22" w:name="_Toc244207670"/>
+      <w:bookmarkStart w:id="22" w:name="_Toc244208341"/>
       <w:r>
         <w:t>2.3 Phân mảnh ngang nguyên thủy</w:t>
       </w:r>
@@ -12341,7 +12341,7 @@
       <w:pPr>
         <w:pStyle w:val="Heading3"/>
       </w:pPr>
-      <w:bookmarkStart w:id="23" w:name="_Toc244207671"/>
+      <w:bookmarkStart w:id="23" w:name="_Toc244208342"/>
       <w:r>
         <w:t>2.3.1 Định nghĩa</w:t>
       </w:r>
@@ -12437,7 +12437,7 @@
       <w:pPr>
         <w:pStyle w:val="Heading3"/>
       </w:pPr>
-      <w:bookmarkStart w:id="24" w:name="_Toc244207672"/>
+      <w:bookmarkStart w:id="24" w:name="_Toc244208343"/>
       <w:r>
         <w:t>2.3.2 Vị từ đơn giản và vị từ hội sơ cấp</w:t>
       </w:r>
@@ -12607,7 +12607,7 @@
       <w:pPr>
         <w:pStyle w:val="Heading3"/>
       </w:pPr>
-      <w:bookmarkStart w:id="25" w:name="_Toc244207673"/>
+      <w:bookmarkStart w:id="25" w:name="_Toc244208344"/>
       <w:r>
         <w:t>2.3.3 Tính đầy đủ và cực tiểu của tập vị từ</w:t>
       </w:r>
@@ -12774,7 +12774,7 @@
       <w:pPr>
         <w:pStyle w:val="Heading3"/>
       </w:pPr>
-      <w:bookmarkStart w:id="26" w:name="_Toc244207674"/>
+      <w:bookmarkStart w:id="26" w:name="_Toc244208345"/>
       <w:r>
         <w:t>2.3.4 Ví dụ</w:t>
       </w:r>
@@ -12997,7 +12997,7 @@
       <w:pPr>
         <w:pStyle w:val="Heading2"/>
       </w:pPr>
-      <w:bookmarkStart w:id="27" w:name="_Toc244207675"/>
+      <w:bookmarkStart w:id="27" w:name="_Toc244208346"/>
       <w:r>
         <w:t>2.4 Phân mảnh ngang dẫn xuất</w:t>
       </w:r>
@@ -13007,7 +13007,7 @@
       <w:pPr>
         <w:pStyle w:val="Heading3"/>
       </w:pPr>
-      <w:bookmarkStart w:id="28" w:name="_Toc244207676"/>
+      <w:bookmarkStart w:id="28" w:name="_Toc244208347"/>
       <w:r>
         <w:t>2.4.1 Định nghĩa</w:t>
       </w:r>
@@ -13112,7 +13112,7 @@
       <w:pPr>
         <w:pStyle w:val="Heading3"/>
       </w:pPr>
-      <w:bookmarkStart w:id="29" w:name="_Toc244207677"/>
+      <w:bookmarkStart w:id="29" w:name="_Toc244208348"/>
       <w:r>
         <w:t>2.4.2 Ví dụ</w:t>
       </w:r>
@@ -13227,7 +13227,7 @@
           <w:noProof/>
         </w:rPr>
         <w:drawing>
-          <wp:inline distT="0" distB="0" distL="0" distR="0" wp14:anchorId="12E63CCE" wp14:editId="25B7686E">
+          <wp:inline distT="0" distB="0" distL="0" distR="0" wp14:anchorId="36AEFA35" wp14:editId="71C18BEE">
             <wp:extent cx="5619750" cy="1228725"/>
             <wp:effectExtent l="0" t="0" r="0" b="0"/>
             <wp:docPr id="4" name="Picture 4"/>
@@ -13272,7 +13272,7 @@
         <w:spacing w:after="160"/>
         <w:jc w:val="center"/>
       </w:pPr>
-      <w:bookmarkStart w:id="30" w:name="_Toc244207734"/>
+      <w:bookmarkStart w:id="30" w:name="_Toc244208405"/>
       <w:r>
         <w:rPr>
           <w:b/>
@@ -13344,7 +13344,7 @@
       <w:pPr>
         <w:pStyle w:val="Heading3"/>
       </w:pPr>
-      <w:bookmarkStart w:id="31" w:name="_Toc244207678"/>
+      <w:bookmarkStart w:id="31" w:name="_Toc244208349"/>
       <w:r>
         <w:t>2.4.3 Tính đúng đắn và lựa chọn quan hệ chủ</w:t>
       </w:r>
@@ -13445,7 +13445,7 @@
       <w:pPr>
         <w:pStyle w:val="Heading2"/>
       </w:pPr>
-      <w:bookmarkStart w:id="32" w:name="_Toc244207679"/>
+      <w:bookmarkStart w:id="32" w:name="_Toc244208350"/>
       <w:r>
         <w:t>2.5 Phân mảnh dọc</w:t>
       </w:r>
@@ -13455,7 +13455,7 @@
       <w:pPr>
         <w:pStyle w:val="Heading3"/>
       </w:pPr>
-      <w:bookmarkStart w:id="33" w:name="_Toc244207680"/>
+      <w:bookmarkStart w:id="33" w:name="_Toc244208351"/>
       <w:r>
         <w:t>2.5.1 Định nghĩa</w:t>
       </w:r>
@@ -13606,7 +13606,7 @@
       <w:pPr>
         <w:pStyle w:val="Heading3"/>
       </w:pPr>
-      <w:bookmarkStart w:id="34" w:name="_Toc244207681"/>
+      <w:bookmarkStart w:id="34" w:name="_Toc244208352"/>
       <w:r>
         <w:t>2.5.2 Ma trận sử dụng và ma trận ái lực</w:t>
       </w:r>
@@ -13792,7 +13792,7 @@
       <w:pPr>
         <w:pStyle w:val="Heading3"/>
       </w:pPr>
-      <w:bookmarkStart w:id="35" w:name="_Toc244207682"/>
+      <w:bookmarkStart w:id="35" w:name="_Toc244208353"/>
       <w:r>
         <w:t>2.5.3 Thuật toán BEA</w:t>
       </w:r>
@@ -13967,7 +13967,7 @@
       <w:pPr>
         <w:pStyle w:val="Heading3"/>
       </w:pPr>
-      <w:bookmarkStart w:id="36" w:name="_Toc244207683"/>
+      <w:bookmarkStart w:id="36" w:name="_Toc244208354"/>
       <w:r>
         <w:t>2.5.4 Thuật toán SPLIT</w:t>
       </w:r>
@@ -14011,7 +14011,7 @@
       <w:pPr>
         <w:pStyle w:val="Heading3"/>
       </w:pPr>
-      <w:bookmarkStart w:id="37" w:name="_Toc244207684"/>
+      <w:bookmarkStart w:id="37" w:name="_Toc244208355"/>
       <w:r>
         <w:t>2.5.5 Ví dụ</w:t>
       </w:r>
@@ -14034,7 +14034,7 @@
         <w:spacing w:before="120" w:after="160"/>
         <w:jc w:val="center"/>
       </w:pPr>
-      <w:bookmarkStart w:id="38" w:name="_Toc244207741"/>
+      <w:bookmarkStart w:id="38" w:name="_Toc244208412"/>
       <w:r>
         <w:rPr>
           <w:b/>
@@ -15029,7 +15029,7 @@
         <w:spacing w:before="120" w:after="160"/>
         <w:jc w:val="center"/>
       </w:pPr>
-      <w:bookmarkStart w:id="39" w:name="_Toc244207742"/>
+      <w:bookmarkStart w:id="39" w:name="_Toc244208413"/>
       <w:r>
         <w:rPr>
           <w:b/>
@@ -16033,7 +16033,7 @@
         <w:spacing w:before="120" w:after="160"/>
         <w:jc w:val="center"/>
       </w:pPr>
-      <w:bookmarkStart w:id="40" w:name="_Toc244207743"/>
+      <w:bookmarkStart w:id="40" w:name="_Toc244208414"/>
       <w:r>
         <w:rPr>
           <w:b/>
@@ -17225,7 +17225,7 @@
         <w:spacing w:before="120" w:after="160"/>
         <w:jc w:val="center"/>
       </w:pPr>
-      <w:bookmarkStart w:id="41" w:name="_Toc244207744"/>
+      <w:bookmarkStart w:id="41" w:name="_Toc244208415"/>
       <w:r>
         <w:rPr>
           <w:b/>
@@ -18415,7 +18415,7 @@
         <w:spacing w:before="120" w:after="160"/>
         <w:jc w:val="center"/>
       </w:pPr>
-      <w:bookmarkStart w:id="42" w:name="_Toc244207745"/>
+      <w:bookmarkStart w:id="42" w:name="_Toc244208416"/>
       <w:r>
         <w:rPr>
           <w:b/>
@@ -19330,7 +19330,7 @@
       <w:pPr>
         <w:pStyle w:val="Heading2"/>
       </w:pPr>
-      <w:bookmarkStart w:id="43" w:name="_Toc244207685"/>
+      <w:bookmarkStart w:id="43" w:name="_Toc244208356"/>
       <w:r>
         <w:t>2.6 Cấp phát và nhân bản</w:t>
       </w:r>
@@ -19426,7 +19426,7 @@
       <w:pPr>
         <w:pStyle w:val="Heading2"/>
       </w:pPr>
-      <w:bookmarkStart w:id="44" w:name="_Toc244207686"/>
+      <w:bookmarkStart w:id="44" w:name="_Toc244208357"/>
       <w:r>
         <w:lastRenderedPageBreak/>
         <w:t>2.7 Kết chương</w:t>
@@ -19448,7 +19448,7 @@
         <w:pStyle w:val="Heading1"/>
         <w:pageBreakBefore/>
       </w:pPr>
-      <w:bookmarkStart w:id="45" w:name="_Toc244207687"/>
+      <w:bookmarkStart w:id="45" w:name="_Toc244208358"/>
       <w:r>
         <w:lastRenderedPageBreak/>
         <w:t>CHƯƠNG 3. PHÂN MẢNH HỖN HỢP</w:t>
@@ -19459,7 +19459,7 @@
       <w:pPr>
         <w:pStyle w:val="Heading2"/>
       </w:pPr>
-      <w:bookmarkStart w:id="46" w:name="_Toc244207688"/>
+      <w:bookmarkStart w:id="46" w:name="_Toc244208359"/>
       <w:r>
         <w:t>3.1 Định nghĩa và động cơ sử dụng</w:t>
       </w:r>
@@ -19469,7 +19469,7 @@
       <w:pPr>
         <w:pStyle w:val="Heading3"/>
       </w:pPr>
-      <w:bookmarkStart w:id="47" w:name="_Toc244207689"/>
+      <w:bookmarkStart w:id="47" w:name="_Toc244208360"/>
       <w:r>
         <w:t>3.1.1 Động cơ</w:t>
       </w:r>
@@ -19512,7 +19512,7 @@
         <w:spacing w:before="120" w:after="160"/>
         <w:jc w:val="center"/>
       </w:pPr>
-      <w:bookmarkStart w:id="48" w:name="_Toc244207746"/>
+      <w:bookmarkStart w:id="48" w:name="_Toc244208417"/>
       <w:r>
         <w:rPr>
           <w:b/>
@@ -20057,7 +20057,7 @@
       <w:pPr>
         <w:pStyle w:val="Heading3"/>
       </w:pPr>
-      <w:bookmarkStart w:id="49" w:name="_Toc244207690"/>
+      <w:bookmarkStart w:id="49" w:name="_Toc244208361"/>
       <w:r>
         <w:t>3.1.2 Định nghĩa</w:t>
       </w:r>
@@ -20238,7 +20238,7 @@
       <w:pPr>
         <w:pStyle w:val="Heading2"/>
       </w:pPr>
-      <w:bookmarkStart w:id="50" w:name="_Toc244207691"/>
+      <w:bookmarkStart w:id="50" w:name="_Toc244208362"/>
       <w:r>
         <w:t>3.2 Chiến lược ngang trước, dọc sau (HV)</w:t>
       </w:r>
@@ -20417,7 +20417,7 @@
         </w:rPr>
         <w:lastRenderedPageBreak/>
         <w:drawing>
-          <wp:inline distT="0" distB="0" distL="0" distR="0" wp14:anchorId="082E0347" wp14:editId="684080EC">
+          <wp:inline distT="0" distB="0" distL="0" distR="0" wp14:anchorId="29223102" wp14:editId="1FBEE3D5">
             <wp:extent cx="5619750" cy="2800350"/>
             <wp:effectExtent l="0" t="0" r="0" b="0"/>
             <wp:docPr id="5" name="Picture 5"/>
@@ -20462,7 +20462,7 @@
         <w:spacing w:after="160"/>
         <w:jc w:val="center"/>
       </w:pPr>
-      <w:bookmarkStart w:id="51" w:name="_Toc244207735"/>
+      <w:bookmarkStart w:id="51" w:name="_Toc244208406"/>
       <w:r>
         <w:rPr>
           <w:b/>
@@ -20485,7 +20485,7 @@
       <w:pPr>
         <w:pStyle w:val="Heading2"/>
       </w:pPr>
-      <w:bookmarkStart w:id="52" w:name="_Toc244207692"/>
+      <w:bookmarkStart w:id="52" w:name="_Toc244208363"/>
       <w:r>
         <w:t>3.3 Chiến lược dọc trước, ngang sau (VH)</w:t>
       </w:r>
@@ -20671,7 +20671,7 @@
         </w:rPr>
         <w:lastRenderedPageBreak/>
         <w:drawing>
-          <wp:inline distT="0" distB="0" distL="0" distR="0" wp14:anchorId="0D9EDE8A" wp14:editId="22CC10D4">
+          <wp:inline distT="0" distB="0" distL="0" distR="0" wp14:anchorId="79372E81" wp14:editId="54FFF9AE">
             <wp:extent cx="5619750" cy="3028950"/>
             <wp:effectExtent l="0" t="0" r="0" b="0"/>
             <wp:docPr id="6" name="Picture 6"/>
@@ -20716,7 +20716,7 @@
         <w:spacing w:after="160"/>
         <w:jc w:val="center"/>
       </w:pPr>
-      <w:bookmarkStart w:id="53" w:name="_Toc244207736"/>
+      <w:bookmarkStart w:id="53" w:name="_Toc244208407"/>
       <w:r>
         <w:rPr>
           <w:b/>
@@ -20739,7 +20739,7 @@
       <w:pPr>
         <w:pStyle w:val="Heading3"/>
       </w:pPr>
-      <w:bookmarkStart w:id="54" w:name="_Toc244207693"/>
+      <w:bookmarkStart w:id="54" w:name="_Toc244208364"/>
       <w:r>
         <w:t>3.3.1 Quan hệ giữa HV và VH</w:t>
       </w:r>
@@ -20897,7 +20897,7 @@
       <w:pPr>
         <w:pStyle w:val="Heading2"/>
       </w:pPr>
-      <w:bookmarkStart w:id="55" w:name="_Toc244207694"/>
+      <w:bookmarkStart w:id="55" w:name="_Toc244208365"/>
       <w:r>
         <w:t>3.4 Cây phân mảnh và biểu diễn bằng đại số quan hệ</w:t>
       </w:r>
@@ -21110,7 +21110,7 @@
       <w:pPr>
         <w:pStyle w:val="Heading2"/>
       </w:pPr>
-      <w:bookmarkStart w:id="56" w:name="_Toc244207695"/>
+      <w:bookmarkStart w:id="56" w:name="_Toc244208366"/>
       <w:r>
         <w:t>3.5 Tái thiết quan hệ toàn cục</w:t>
       </w:r>
@@ -21569,7 +21569,7 @@
       <w:pPr>
         <w:pStyle w:val="Heading2"/>
       </w:pPr>
-      <w:bookmarkStart w:id="57" w:name="_Toc244207696"/>
+      <w:bookmarkStart w:id="57" w:name="_Toc244208367"/>
       <w:r>
         <w:t>3.6 Kiểm tra tính đúng đắn</w:t>
       </w:r>
@@ -21717,7 +21717,7 @@
       <w:pPr>
         <w:pStyle w:val="Heading2"/>
       </w:pPr>
-      <w:bookmarkStart w:id="58" w:name="_Toc244207697"/>
+      <w:bookmarkStart w:id="58" w:name="_Toc244208368"/>
       <w:r>
         <w:t>3.7 Cấp phát mảnh hỗn hợp và ảnh hưởng đến xử lý</w:t>
       </w:r>
@@ -21727,7 +21727,7 @@
       <w:pPr>
         <w:pStyle w:val="Heading3"/>
       </w:pPr>
-      <w:bookmarkStart w:id="59" w:name="_Toc244207698"/>
+      <w:bookmarkStart w:id="59" w:name="_Toc244208369"/>
       <w:r>
         <w:t>3.7.1 Cấp phát</w:t>
       </w:r>
@@ -21757,7 +21757,7 @@
       <w:pPr>
         <w:pStyle w:val="Heading3"/>
       </w:pPr>
-      <w:bookmarkStart w:id="60" w:name="_Toc244207699"/>
+      <w:bookmarkStart w:id="60" w:name="_Toc244208370"/>
       <w:r>
         <w:t>3.7.2 Ảnh hưởng đến xử lý truy vấn</w:t>
       </w:r>
@@ -21911,7 +21911,7 @@
       <w:pPr>
         <w:pStyle w:val="Heading3"/>
       </w:pPr>
-      <w:bookmarkStart w:id="61" w:name="_Toc244207700"/>
+      <w:bookmarkStart w:id="61" w:name="_Toc244208371"/>
       <w:r>
         <w:lastRenderedPageBreak/>
         <w:t>3.7.3 Ảnh hưởng đến cập nhật và giao dịch</w:t>
@@ -21994,7 +21994,7 @@
       <w:pPr>
         <w:pStyle w:val="Heading2"/>
       </w:pPr>
-      <w:bookmarkStart w:id="62" w:name="_Toc244207701"/>
+      <w:bookmarkStart w:id="62" w:name="_Toc244208372"/>
       <w:r>
         <w:t>3.8 Ưu điểm, hạn chế và so sánh</w:t>
       </w:r>
@@ -22178,7 +22178,7 @@
         <w:spacing w:before="120" w:after="160"/>
         <w:jc w:val="center"/>
       </w:pPr>
-      <w:bookmarkStart w:id="63" w:name="_Toc244207747"/>
+      <w:bookmarkStart w:id="63" w:name="_Toc244208418"/>
       <w:r>
         <w:rPr>
           <w:b/>
@@ -23291,7 +23291,7 @@
       <w:pPr>
         <w:pStyle w:val="Heading2"/>
       </w:pPr>
-      <w:bookmarkStart w:id="64" w:name="_Toc244207702"/>
+      <w:bookmarkStart w:id="64" w:name="_Toc244208373"/>
       <w:r>
         <w:t>3.9 Hỗ trợ trong các hệ quản trị thực tế</w:t>
       </w:r>
@@ -23507,7 +23507,7 @@
       <w:pPr>
         <w:pStyle w:val="Heading2"/>
       </w:pPr>
-      <w:bookmarkStart w:id="65" w:name="_Toc244207703"/>
+      <w:bookmarkStart w:id="65" w:name="_Toc244208374"/>
       <w:r>
         <w:t>3.10 Kết chương</w:t>
       </w:r>
@@ -23532,7 +23532,7 @@
         <w:pStyle w:val="Heading1"/>
         <w:pageBreakBefore/>
       </w:pPr>
-      <w:bookmarkStart w:id="66" w:name="_Toc244207704"/>
+      <w:bookmarkStart w:id="66" w:name="_Toc244208375"/>
       <w:r>
         <w:lastRenderedPageBreak/>
         <w:t>CHƯƠNG 4. ỨNG DỤNG PHÂN MẢNH HỖN HỢP CHO HỆ THỐNG QUẢN LÝ ĐƠN HÀNG</w:t>
@@ -23543,7 +23543,7 @@
       <w:pPr>
         <w:pStyle w:val="Heading2"/>
       </w:pPr>
-      <w:bookmarkStart w:id="67" w:name="_Toc244207705"/>
+      <w:bookmarkStart w:id="67" w:name="_Toc244208376"/>
       <w:r>
         <w:t>4.1 Mô tả bài toán</w:t>
       </w:r>
@@ -23566,7 +23566,7 @@
         <w:spacing w:before="120" w:after="160"/>
         <w:jc w:val="center"/>
       </w:pPr>
-      <w:bookmarkStart w:id="68" w:name="_Toc244207748"/>
+      <w:bookmarkStart w:id="68" w:name="_Toc244208419"/>
       <w:r>
         <w:rPr>
           <w:b/>
@@ -24377,7 +24377,7 @@
       <w:pPr>
         <w:pStyle w:val="Heading2"/>
       </w:pPr>
-      <w:bookmarkStart w:id="69" w:name="_Toc244207706"/>
+      <w:bookmarkStart w:id="69" w:name="_Toc244208377"/>
       <w:r>
         <w:t>4.2 Lược đồ toàn cục</w:t>
       </w:r>
@@ -24568,7 +24568,7 @@
           <w:noProof/>
         </w:rPr>
         <w:drawing>
-          <wp:inline distT="0" distB="0" distL="0" distR="0" wp14:anchorId="09AE4D71" wp14:editId="7EDD92E8">
+          <wp:inline distT="0" distB="0" distL="0" distR="0" wp14:anchorId="7B1A7AEC" wp14:editId="41EAB375">
             <wp:extent cx="5619750" cy="3076575"/>
             <wp:effectExtent l="0" t="0" r="0" b="0"/>
             <wp:docPr id="7" name="Picture 7"/>
@@ -24613,7 +24613,7 @@
         <w:spacing w:after="160"/>
         <w:jc w:val="center"/>
       </w:pPr>
-      <w:bookmarkStart w:id="70" w:name="_Toc244207737"/>
+      <w:bookmarkStart w:id="70" w:name="_Toc244208408"/>
       <w:r>
         <w:rPr>
           <w:b/>
@@ -24636,7 +24636,7 @@
       <w:pPr>
         <w:pStyle w:val="Heading2"/>
       </w:pPr>
-      <w:bookmarkStart w:id="71" w:name="_Toc244207707"/>
+      <w:bookmarkStart w:id="71" w:name="_Toc244208378"/>
       <w:r>
         <w:t>4.3 Phân tích ứng dụng</w:t>
       </w:r>
@@ -24659,7 +24659,7 @@
         <w:spacing w:before="120" w:after="160"/>
         <w:jc w:val="center"/>
       </w:pPr>
-      <w:bookmarkStart w:id="72" w:name="_Toc244207749"/>
+      <w:bookmarkStart w:id="72" w:name="_Toc244208420"/>
       <w:r>
         <w:rPr>
           <w:b/>
@@ -26007,7 +26007,7 @@
           <w:noProof/>
         </w:rPr>
         <w:drawing>
-          <wp:inline distT="0" distB="0" distL="0" distR="0" wp14:anchorId="1559CA97" wp14:editId="30BDC385">
+          <wp:inline distT="0" distB="0" distL="0" distR="0" wp14:anchorId="63F375EE" wp14:editId="0E0010EB">
             <wp:extent cx="5619750" cy="1809750"/>
             <wp:effectExtent l="0" t="0" r="0" b="0"/>
             <wp:docPr id="8" name="Picture 8"/>
@@ -26052,7 +26052,7 @@
         <w:spacing w:after="160"/>
         <w:jc w:val="center"/>
       </w:pPr>
-      <w:bookmarkStart w:id="73" w:name="_Toc244207738"/>
+      <w:bookmarkStart w:id="73" w:name="_Toc244208409"/>
       <w:r>
         <w:rPr>
           <w:b/>
@@ -26075,7 +26075,7 @@
       <w:pPr>
         <w:pStyle w:val="Heading2"/>
       </w:pPr>
-      <w:bookmarkStart w:id="74" w:name="_Toc244207708"/>
+      <w:bookmarkStart w:id="74" w:name="_Toc244208379"/>
       <w:r>
         <w:t>4.4 Thiết kế phân mảnh</w:t>
       </w:r>
@@ -26098,7 +26098,7 @@
         <w:spacing w:before="120" w:after="160"/>
         <w:jc w:val="center"/>
       </w:pPr>
-      <w:bookmarkStart w:id="75" w:name="_Toc244207750"/>
+      <w:bookmarkStart w:id="75" w:name="_Toc244208421"/>
       <w:r>
         <w:rPr>
           <w:b/>
@@ -26914,7 +26914,7 @@
       <w:pPr>
         <w:pStyle w:val="Heading3"/>
       </w:pPr>
-      <w:bookmarkStart w:id="76" w:name="_Toc244207709"/>
+      <w:bookmarkStart w:id="76" w:name="_Toc244208380"/>
       <w:r>
         <w:t>4.4.1 KhachHang – phân mảnh hỗn hợp HV</w:t>
       </w:r>
@@ -27317,7 +27317,7 @@
       <w:pPr>
         <w:pStyle w:val="Heading3"/>
       </w:pPr>
-      <w:bookmarkStart w:id="77" w:name="_Toc244207710"/>
+      <w:bookmarkStart w:id="77" w:name="_Toc244208381"/>
       <w:r>
         <w:t>4.4.2 NhanVien – phân mảnh hỗn hợp VH</w:t>
       </w:r>
@@ -27616,7 +27616,7 @@
       <w:pPr>
         <w:pStyle w:val="Heading3"/>
       </w:pPr>
-      <w:bookmarkStart w:id="78" w:name="_Toc244207711"/>
+      <w:bookmarkStart w:id="78" w:name="_Toc244208382"/>
       <w:r>
         <w:t>4.4.3 DonHang, ChiTietDonHang – phân mảnh ngang dẫn xuất</w:t>
       </w:r>
@@ -27748,7 +27748,7 @@
       <w:pPr>
         <w:pStyle w:val="Heading3"/>
       </w:pPr>
-      <w:bookmarkStart w:id="79" w:name="_Toc244207712"/>
+      <w:bookmarkStart w:id="79" w:name="_Toc244208383"/>
       <w:r>
         <w:t>4.4.4 ChiNhanh, SanPham – nhân bản toàn phần</w:t>
       </w:r>
@@ -27768,7 +27768,7 @@
       <w:pPr>
         <w:pStyle w:val="Heading2"/>
       </w:pPr>
-      <w:bookmarkStart w:id="80" w:name="_Toc244207713"/>
+      <w:bookmarkStart w:id="80" w:name="_Toc244208384"/>
       <w:r>
         <w:t>4.5 Kiểm tra tính đúng đắn</w:t>
       </w:r>
@@ -27791,7 +27791,7 @@
         <w:spacing w:before="120" w:after="160"/>
         <w:jc w:val="center"/>
       </w:pPr>
-      <w:bookmarkStart w:id="81" w:name="_Toc244207751"/>
+      <w:bookmarkStart w:id="81" w:name="_Toc244208422"/>
       <w:r>
         <w:rPr>
           <w:b/>
@@ -28317,7 +28317,7 @@
       <w:pPr>
         <w:pStyle w:val="Heading2"/>
       </w:pPr>
-      <w:bookmarkStart w:id="82" w:name="_Toc244207714"/>
+      <w:bookmarkStart w:id="82" w:name="_Toc244208385"/>
       <w:r>
         <w:lastRenderedPageBreak/>
         <w:t>4.6 Lược đồ cấp phát</w:t>
@@ -28341,7 +28341,7 @@
         <w:spacing w:before="120" w:after="160"/>
         <w:jc w:val="center"/>
       </w:pPr>
-      <w:bookmarkStart w:id="83" w:name="_Toc244207752"/>
+      <w:bookmarkStart w:id="83" w:name="_Toc244208423"/>
       <w:r>
         <w:rPr>
           <w:b/>
@@ -28738,7 +28738,7 @@
           <w:noProof/>
         </w:rPr>
         <w:drawing>
-          <wp:inline distT="0" distB="0" distL="0" distR="0" wp14:anchorId="7B0295C9" wp14:editId="2D39435F">
+          <wp:inline distT="0" distB="0" distL="0" distR="0" wp14:anchorId="3395B89A" wp14:editId="11D7AC63">
             <wp:extent cx="5619750" cy="3486150"/>
             <wp:effectExtent l="0" t="0" r="0" b="0"/>
             <wp:docPr id="9" name="Picture 9"/>
@@ -28783,7 +28783,7 @@
         <w:spacing w:after="160"/>
         <w:jc w:val="center"/>
       </w:pPr>
-      <w:bookmarkStart w:id="84" w:name="_Toc244207739"/>
+      <w:bookmarkStart w:id="84" w:name="_Toc244208410"/>
       <w:r>
         <w:rPr>
           <w:b/>
@@ -28892,7 +28892,7 @@
       <w:pPr>
         <w:pStyle w:val="Heading2"/>
       </w:pPr>
-      <w:bookmarkStart w:id="85" w:name="_Toc244207715"/>
+      <w:bookmarkStart w:id="85" w:name="_Toc244208386"/>
       <w:r>
         <w:lastRenderedPageBreak/>
         <w:t>4.7 Cài đặt thực nghiệm trên SQL Server</w:t>
@@ -28903,7 +28903,7 @@
       <w:pPr>
         <w:pStyle w:val="Heading3"/>
       </w:pPr>
-      <w:bookmarkStart w:id="86" w:name="_Toc244207716"/>
+      <w:bookmarkStart w:id="86" w:name="_Toc244208387"/>
       <w:r>
         <w:t>4.7.1 Môi trường và cách mô phỏng</w:t>
       </w:r>
@@ -28972,7 +28972,7 @@
         <w:spacing w:before="120" w:after="160"/>
         <w:jc w:val="center"/>
       </w:pPr>
-      <w:bookmarkStart w:id="87" w:name="_Toc244207753"/>
+      <w:bookmarkStart w:id="87" w:name="_Toc244208424"/>
       <w:r>
         <w:rPr>
           <w:b/>
@@ -29372,7 +29372,7 @@
       <w:pPr>
         <w:pStyle w:val="Heading3"/>
       </w:pPr>
-      <w:bookmarkStart w:id="88" w:name="_Toc244207717"/>
+      <w:bookmarkStart w:id="88" w:name="_Toc244208388"/>
       <w:r>
         <w:t>4.7.2 Tạo các mảnh</w:t>
       </w:r>
@@ -29801,7 +29801,7 @@
         <w:spacing w:before="120" w:after="160"/>
         <w:jc w:val="center"/>
       </w:pPr>
-      <w:bookmarkStart w:id="89" w:name="_Toc244207754"/>
+      <w:bookmarkStart w:id="89" w:name="_Toc244208425"/>
       <w:r>
         <w:rPr>
           <w:b/>
@@ -30209,7 +30209,7 @@
       <w:pPr>
         <w:pStyle w:val="Heading3"/>
       </w:pPr>
-      <w:bookmarkStart w:id="90" w:name="_Toc244207718"/>
+      <w:bookmarkStart w:id="90" w:name="_Toc244208389"/>
       <w:r>
         <w:t>4.7.3 Tái thiết và kiểm tra tính đúng đắn</w:t>
       </w:r>
@@ -30573,7 +30573,7 @@
         <w:spacing w:before="120" w:after="160"/>
         <w:jc w:val="center"/>
       </w:pPr>
-      <w:bookmarkStart w:id="91" w:name="_Toc244207755"/>
+      <w:bookmarkStart w:id="91" w:name="_Toc244208426"/>
       <w:r>
         <w:rPr>
           <w:b/>
@@ -33293,7 +33293,7 @@
       <w:pPr>
         <w:pStyle w:val="Heading3"/>
       </w:pPr>
-      <w:bookmarkStart w:id="92" w:name="_Toc244207719"/>
+      <w:bookmarkStart w:id="92" w:name="_Toc244208390"/>
       <w:r>
         <w:t>4.7.4 Truy vấn minh họa</w:t>
       </w:r>
@@ -33480,7 +33480,7 @@
         <w:spacing w:before="120" w:after="160"/>
         <w:jc w:val="center"/>
       </w:pPr>
-      <w:bookmarkStart w:id="93" w:name="_Toc244207756"/>
+      <w:bookmarkStart w:id="93" w:name="_Toc244208427"/>
       <w:r>
         <w:rPr>
           <w:b/>
@@ -34264,7 +34264,7 @@
         <w:spacing w:before="120" w:after="160"/>
         <w:jc w:val="center"/>
       </w:pPr>
-      <w:bookmarkStart w:id="94" w:name="_Toc244207757"/>
+      <w:bookmarkStart w:id="94" w:name="_Toc244208428"/>
       <w:r>
         <w:rPr>
           <w:b/>
@@ -34819,7 +34819,7 @@
       <w:pPr>
         <w:pStyle w:val="Heading3"/>
       </w:pPr>
-      <w:bookmarkStart w:id="95" w:name="_Toc244207720"/>
+      <w:bookmarkStart w:id="95" w:name="_Toc244208391"/>
       <w:r>
         <w:t>4.7.5 Giao dịch phân tán</w:t>
       </w:r>
@@ -35466,7 +35466,7 @@
       <w:pPr>
         <w:pStyle w:val="Heading2"/>
       </w:pPr>
-      <w:bookmarkStart w:id="96" w:name="_Toc244207721"/>
+      <w:bookmarkStart w:id="96" w:name="_Toc244208392"/>
       <w:r>
         <w:t>4.8 Đánh giá</w:t>
       </w:r>
@@ -35630,7 +35630,7 @@
       <w:pPr>
         <w:pStyle w:val="Heading2"/>
       </w:pPr>
-      <w:bookmarkStart w:id="97" w:name="_Toc244207722"/>
+      <w:bookmarkStart w:id="97" w:name="_Toc244208393"/>
       <w:r>
         <w:t>4.9 Kết chương</w:t>
       </w:r>
@@ -35655,7 +35655,7 @@
         <w:pStyle w:val="Heading1"/>
         <w:pageBreakBefore/>
       </w:pPr>
-      <w:bookmarkStart w:id="98" w:name="_Toc244207723"/>
+      <w:bookmarkStart w:id="98" w:name="_Toc244208394"/>
       <w:r>
         <w:lastRenderedPageBreak/>
         <w:t>CHƯƠNG 5. KẾT LUẬN VÀ HƯỚNG PHÁT TRIỂN</w:t>
@@ -35666,7 +35666,7 @@
       <w:pPr>
         <w:pStyle w:val="Heading2"/>
       </w:pPr>
-      <w:bookmarkStart w:id="99" w:name="_Toc244207724"/>
+      <w:bookmarkStart w:id="99" w:name="_Toc244208395"/>
       <w:r>
         <w:t>5.1 Kết quả đạt được</w:t>
       </w:r>
@@ -35719,7 +35719,7 @@
       <w:pPr>
         <w:pStyle w:val="Heading2"/>
       </w:pPr>
-      <w:bookmarkStart w:id="100" w:name="_Toc244207725"/>
+      <w:bookmarkStart w:id="100" w:name="_Toc244208396"/>
       <w:r>
         <w:t>5.2 Hạn chế</w:t>
       </w:r>
@@ -35785,7 +35785,7 @@
       <w:pPr>
         <w:pStyle w:val="Heading2"/>
       </w:pPr>
-      <w:bookmarkStart w:id="101" w:name="_Toc244207726"/>
+      <w:bookmarkStart w:id="101" w:name="_Toc244208397"/>
       <w:r>
         <w:t>5.3 Hướng phát triển</w:t>
       </w:r>
@@ -35867,7 +35867,7 @@
         <w:pStyle w:val="Heading1"/>
         <w:pageBreakBefore/>
       </w:pPr>
-      <w:bookmarkStart w:id="102" w:name="_Toc244207727"/>
+      <w:bookmarkStart w:id="102" w:name="_Toc244208398"/>
       <w:r>
         <w:lastRenderedPageBreak/>
         <w:t>TÀI LIỆU THAM KHẢO</w:t>
@@ -35982,7 +35982,7 @@
         <w:pStyle w:val="Heading1"/>
         <w:pageBreakBefore/>
       </w:pPr>
-      <w:bookmarkStart w:id="103" w:name="_Toc244207728"/>
+      <w:bookmarkStart w:id="103" w:name="_Toc244208399"/>
       <w:r>
         <w:lastRenderedPageBreak/>
         <w:t>PHỤ LỤC</w:t>
@@ -36003,7 +36003,7 @@
       <w:pPr>
         <w:pStyle w:val="Heading2"/>
       </w:pPr>
-      <w:bookmarkStart w:id="104" w:name="_Toc244207729"/>
+      <w:bookmarkStart w:id="104" w:name="_Toc244208400"/>
       <w:r>
         <w:t>Phụ lục A. Script tái thiết và kiểm tra tính đúng đắn</w:t>
       </w:r>
@@ -43181,7 +43181,7 @@
       <w:pPr>
         <w:pStyle w:val="Heading2"/>
       </w:pPr>
-      <w:bookmarkStart w:id="105" w:name="_Toc244207730"/>
+      <w:bookmarkStart w:id="105" w:name="_Toc244208401"/>
       <w:r>
         <w:t>Phụ lục B. Script truy vấn minh họa và giao dịch phân tán</w:t>
       </w:r>
@@ -51035,10 +51035,10 @@
 <file path=word/numbering.xml><?xml version="1.0" encoding="utf-8"?>
 <w:numbering xmlns:wpc="http://schemas.microsoft.com/office/word/2010/wordprocessingCanvas" xmlns:cx="http://schemas.microsoft.com/office/drawing/2014/chartex" xmlns:cx1="http://schemas.microsoft.com/office/drawing/2015/9/8/chartex" xmlns:cx2="http://schemas.microsoft.com/office/drawing/2015/10/21/chartex" xmlns:cx3="http://schemas.microsoft.com/office/drawing/2016/5/9/chartex" xmlns:cx4="http://schemas.microsoft.com/office/drawing/2016/5/10/chartex" xmlns:cx5="http://schemas.microsoft.com/office/drawing/2016/5/11/chartex" xmlns:cx6="http://schemas.microsoft.com/office/drawing/2016/5/12/chartex" xmlns:cx7="http://schemas.microsoft.com/office/drawing/2016/5/13/chartex" xmlns:cx8="http://schemas.microsoft.com/office/drawing/2016/5/14/chartex" xmlns:mc="http://schemas.openxmlformats.org/markup-compatibility/2006" xmlns:aink="http://schemas.microsoft.com/office/drawing/2016/ink" xmlns:am3d="http://schemas.microsoft.com/office/drawing/2017/model3d" xmlns:o="urn:schemas-microsoft-com:office:office" xmlns:oel="http://schemas.microsoft.com/office/2019/extlst" xmlns:r="http://schemas.openxmlformats.org/officeDocument/2006/relationships" xmlns:m="http://schemas.openxmlformats.org/officeDocument/2006/math" xmlns:v="urn:schemas-microsoft-com:vml" xmlns:wp14="http://schemas.microsoft.com/office/word/2010/wordprocessingDrawing" xmlns:wp="http://schemas.openxmlformats.org/drawingml/2006/wordprocessingDrawing" xmlns:w10="urn:schemas-microsoft-com:office:word" xmlns:w="http://schemas.openxmlformats.org/wordprocessingml/2006/main" xmlns:w14="http://schemas.microsoft.com/office/word/2010/wordml" xmlns:w15="http://schemas.microsoft.com/office/word/2012/wordml" xmlns:w16cex="http://schemas.microsoft.com/office/word/2018/wordml/cex" xmlns:w16cid="http://schemas.microsoft.com/office/word/2016/wordml/cid" xmlns:w16="http://schemas.microsoft.com/office/word/2018/wordml" xmlns:w16sdtdh="http://schemas.microsoft.com/office/word/2020/wordml/sdtdatahash" xmlns:w16se="http://schemas.microsoft.com/office/word/2015/wordml/symex" xmlns:wpg="http://schemas.microsoft.com/office/word/2010/wordprocessingGroup" xmlns:wpi="http://schemas.microsoft.com/office/word/2010/wordprocessingInk" xmlns:wne="http://schemas.microsoft.com/office/word/2006/wordml" xmlns:wps="http://schemas.microsoft.com/office/word/2010/wordprocessingShape" mc:Ignorable="w14 w15 w16se w16cid w16 w16cex w16sdtdh wp14">
   <w:abstractNum w:abstractNumId="0" w15:restartNumberingAfterBreak="0">
-    <w:nsid w:val="4C9B25EB"/>
+    <w:nsid w:val="21016764"/>
     <w:multiLevelType w:val="hybridMultilevel"/>
-    <w:tmpl w:val="C0FABC8E"/>
-    <w:lvl w:ilvl="0" w:tplc="2E96B50E">
+    <w:tmpl w:val="86C01CC0"/>
+    <w:lvl w:ilvl="0" w:tplc="402C62AC">
       <w:start w:val="1"/>
       <w:numFmt w:val="bullet"/>
       <w:lvlText w:val="–"/>
@@ -51047,7 +51047,7 @@
         <w:ind w:left="720" w:hanging="360"/>
       </w:pPr>
     </w:lvl>
-    <w:lvl w:ilvl="1" w:tplc="5C62AFE4" w:tentative="1">
+    <w:lvl w:ilvl="1" w:tplc="C1AA3002" w:tentative="1">
       <w:start w:val="1"/>
       <w:numFmt w:val="bullet"/>
       <w:lvlText w:val="+"/>
@@ -51056,47 +51056,133 @@
         <w:ind w:left="1260" w:hanging="360"/>
       </w:pPr>
     </w:lvl>
-    <w:lvl w:ilvl="2" w:tplc="3FA03E3A">
+    <w:lvl w:ilvl="2" w:tplc="358452B4">
       <w:numFmt w:val="decimal"/>
       <w:lvlText w:val=""/>
       <w:lvlJc w:val="left"/>
     </w:lvl>
-    <w:lvl w:ilvl="3" w:tplc="882A3FD8">
+    <w:lvl w:ilvl="3" w:tplc="1C008542">
       <w:numFmt w:val="decimal"/>
       <w:lvlText w:val=""/>
       <w:lvlJc w:val="left"/>
     </w:lvl>
-    <w:lvl w:ilvl="4" w:tplc="C2A23C76">
+    <w:lvl w:ilvl="4" w:tplc="C9185B86">
       <w:numFmt w:val="decimal"/>
       <w:lvlText w:val=""/>
       <w:lvlJc w:val="left"/>
     </w:lvl>
-    <w:lvl w:ilvl="5" w:tplc="0262A774">
+    <w:lvl w:ilvl="5" w:tplc="97BA24E4">
       <w:numFmt w:val="decimal"/>
       <w:lvlText w:val=""/>
       <w:lvlJc w:val="left"/>
     </w:lvl>
-    <w:lvl w:ilvl="6" w:tplc="8D5ED292">
+    <w:lvl w:ilvl="6" w:tplc="A68234A2">
       <w:numFmt w:val="decimal"/>
       <w:lvlText w:val=""/>
       <w:lvlJc w:val="left"/>
     </w:lvl>
-    <w:lvl w:ilvl="7" w:tplc="D804C536">
+    <w:lvl w:ilvl="7" w:tplc="90B4AB6A">
       <w:numFmt w:val="decimal"/>
       <w:lvlText w:val=""/>
       <w:lvlJc w:val="left"/>
     </w:lvl>
-    <w:lvl w:ilvl="8" w:tplc="2E9C75A0">
+    <w:lvl w:ilvl="8" w:tplc="A81A5FE4">
       <w:numFmt w:val="decimal"/>
       <w:lvlText w:val=""/>
       <w:lvlJc w:val="left"/>
     </w:lvl>
   </w:abstractNum>
   <w:abstractNum w:abstractNumId="1" w15:restartNumberingAfterBreak="0">
-    <w:nsid w:val="57B346BA"/>
+    <w:nsid w:val="34F60225"/>
     <w:multiLevelType w:val="hybridMultilevel"/>
-    <w:tmpl w:val="0BB2F614"/>
-    <w:lvl w:ilvl="0" w:tplc="E0C227DA">
+    <w:tmpl w:val="E9F870D4"/>
+    <w:lvl w:ilvl="0" w:tplc="010CA13E" w:tentative="1">
+      <w:start w:val="1"/>
+      <w:numFmt w:val="bullet"/>
+      <w:lvlText w:val="●"/>
+      <w:lvlJc w:val="left"/>
+      <w:pPr>
+        <w:ind w:left="720" w:hanging="360"/>
+      </w:pPr>
+    </w:lvl>
+    <w:lvl w:ilvl="1" w:tplc="304C53EC" w:tentative="1">
+      <w:start w:val="1"/>
+      <w:numFmt w:val="bullet"/>
+      <w:lvlText w:val="○"/>
+      <w:lvlJc w:val="left"/>
+      <w:pPr>
+        <w:ind w:left="1440" w:hanging="360"/>
+      </w:pPr>
+    </w:lvl>
+    <w:lvl w:ilvl="2" w:tplc="EF32E3BC" w:tentative="1">
+      <w:start w:val="1"/>
+      <w:numFmt w:val="bullet"/>
+      <w:lvlText w:val="■"/>
+      <w:lvlJc w:val="left"/>
+      <w:pPr>
+        <w:ind w:left="2160" w:hanging="360"/>
+      </w:pPr>
+    </w:lvl>
+    <w:lvl w:ilvl="3" w:tplc="4F5025D6" w:tentative="1">
+      <w:start w:val="1"/>
+      <w:numFmt w:val="bullet"/>
+      <w:lvlText w:val="●"/>
+      <w:lvlJc w:val="left"/>
+      <w:pPr>
+        <w:ind w:left="2880" w:hanging="360"/>
+      </w:pPr>
+    </w:lvl>
+    <w:lvl w:ilvl="4" w:tplc="044AFEA4" w:tentative="1">
+      <w:start w:val="1"/>
+      <w:numFmt w:val="bullet"/>
+      <w:lvlText w:val="○"/>
+      <w:lvlJc w:val="left"/>
+      <w:pPr>
+        <w:ind w:left="3600" w:hanging="360"/>
+      </w:pPr>
+    </w:lvl>
+    <w:lvl w:ilvl="5" w:tplc="8F5640FA" w:tentative="1">
+      <w:start w:val="1"/>
+      <w:numFmt w:val="bullet"/>
+      <w:lvlText w:val="■"/>
+      <w:lvlJc w:val="left"/>
+      <w:pPr>
+        <w:ind w:left="4320" w:hanging="360"/>
+      </w:pPr>
+    </w:lvl>
+    <w:lvl w:ilvl="6" w:tplc="3078E00C" w:tentative="1">
+      <w:start w:val="1"/>
+      <w:numFmt w:val="bullet"/>
+      <w:lvlText w:val="●"/>
+      <w:lvlJc w:val="left"/>
+      <w:pPr>
+        <w:ind w:left="5040" w:hanging="360"/>
+      </w:pPr>
+    </w:lvl>
+    <w:lvl w:ilvl="7" w:tplc="DF7AD840" w:tentative="1">
+      <w:start w:val="1"/>
+      <w:numFmt w:val="bullet"/>
+      <w:lvlText w:val="●"/>
+      <w:lvlJc w:val="left"/>
+      <w:pPr>
+        <w:ind w:left="5760" w:hanging="360"/>
+      </w:pPr>
+    </w:lvl>
+    <w:lvl w:ilvl="8" w:tplc="B15E0A1E" w:tentative="1">
+      <w:start w:val="1"/>
+      <w:numFmt w:val="bullet"/>
+      <w:lvlText w:val="●"/>
+      <w:lvlJc w:val="left"/>
+      <w:pPr>
+        <w:ind w:left="6480" w:hanging="360"/>
+      </w:pPr>
+    </w:lvl>
+  </w:abstractNum>
+  <w:abstractNum w:abstractNumId="2" w15:restartNumberingAfterBreak="0">
+    <w:nsid w:val="4CA80A82"/>
+    <w:multiLevelType w:val="hybridMultilevel"/>
+    <w:tmpl w:val="BDEA2A28"/>
+    <w:lvl w:ilvl="0" w:tplc="A6AE14E0">
       <w:start w:val="1"/>
       <w:numFmt w:val="decimal"/>
       <w:lvlText w:val="%1."/>
@@ -51105,140 +51191,54 @@
         <w:ind w:left="720" w:hanging="360"/>
       </w:pPr>
     </w:lvl>
-    <w:lvl w:ilvl="1" w:tplc="35C2AF38">
+    <w:lvl w:ilvl="1" w:tplc="483CAC64">
       <w:numFmt w:val="decimal"/>
       <w:lvlText w:val=""/>
       <w:lvlJc w:val="left"/>
     </w:lvl>
-    <w:lvl w:ilvl="2" w:tplc="99864FDE">
+    <w:lvl w:ilvl="2" w:tplc="16E0189A">
       <w:numFmt w:val="decimal"/>
       <w:lvlText w:val=""/>
       <w:lvlJc w:val="left"/>
     </w:lvl>
-    <w:lvl w:ilvl="3" w:tplc="747E8BC8">
+    <w:lvl w:ilvl="3" w:tplc="1806232A">
       <w:numFmt w:val="decimal"/>
       <w:lvlText w:val=""/>
       <w:lvlJc w:val="left"/>
     </w:lvl>
-    <w:lvl w:ilvl="4" w:tplc="F4EC9094">
+    <w:lvl w:ilvl="4" w:tplc="7102ECF0">
       <w:numFmt w:val="decimal"/>
       <w:lvlText w:val=""/>
       <w:lvlJc w:val="left"/>
     </w:lvl>
-    <w:lvl w:ilvl="5" w:tplc="15B29398">
+    <w:lvl w:ilvl="5" w:tplc="4570664C">
       <w:numFmt w:val="decimal"/>
       <w:lvlText w:val=""/>
       <w:lvlJc w:val="left"/>
     </w:lvl>
-    <w:lvl w:ilvl="6" w:tplc="A5042D2E">
+    <w:lvl w:ilvl="6" w:tplc="020E1380">
       <w:numFmt w:val="decimal"/>
       <w:lvlText w:val=""/>
       <w:lvlJc w:val="left"/>
     </w:lvl>
-    <w:lvl w:ilvl="7" w:tplc="967CB9D6">
+    <w:lvl w:ilvl="7" w:tplc="52F84798">
       <w:numFmt w:val="decimal"/>
       <w:lvlText w:val=""/>
       <w:lvlJc w:val="left"/>
     </w:lvl>
-    <w:lvl w:ilvl="8" w:tplc="D20A77C8">
+    <w:lvl w:ilvl="8" w:tplc="28D029AA">
       <w:numFmt w:val="decimal"/>
       <w:lvlText w:val=""/>
       <w:lvlJc w:val="left"/>
     </w:lvl>
   </w:abstractNum>
-  <w:abstractNum w:abstractNumId="2" w15:restartNumberingAfterBreak="0">
-    <w:nsid w:val="6F073C37"/>
-    <w:multiLevelType w:val="hybridMultilevel"/>
-    <w:tmpl w:val="A2401186"/>
-    <w:lvl w:ilvl="0" w:tplc="997A82EC" w:tentative="1">
-      <w:start w:val="1"/>
-      <w:numFmt w:val="bullet"/>
-      <w:lvlText w:val="●"/>
-      <w:lvlJc w:val="left"/>
-      <w:pPr>
-        <w:ind w:left="720" w:hanging="360"/>
-      </w:pPr>
-    </w:lvl>
-    <w:lvl w:ilvl="1" w:tplc="11DEBEF0" w:tentative="1">
-      <w:start w:val="1"/>
-      <w:numFmt w:val="bullet"/>
-      <w:lvlText w:val="○"/>
-      <w:lvlJc w:val="left"/>
-      <w:pPr>
-        <w:ind w:left="1440" w:hanging="360"/>
-      </w:pPr>
-    </w:lvl>
-    <w:lvl w:ilvl="2" w:tplc="76562F00" w:tentative="1">
-      <w:start w:val="1"/>
-      <w:numFmt w:val="bullet"/>
-      <w:lvlText w:val="■"/>
-      <w:lvlJc w:val="left"/>
-      <w:pPr>
-        <w:ind w:left="2160" w:hanging="360"/>
-      </w:pPr>
-    </w:lvl>
-    <w:lvl w:ilvl="3" w:tplc="6568D210" w:tentative="1">
-      <w:start w:val="1"/>
-      <w:numFmt w:val="bullet"/>
-      <w:lvlText w:val="●"/>
-      <w:lvlJc w:val="left"/>
-      <w:pPr>
-        <w:ind w:left="2880" w:hanging="360"/>
-      </w:pPr>
-    </w:lvl>
-    <w:lvl w:ilvl="4" w:tplc="65B09A64" w:tentative="1">
-      <w:start w:val="1"/>
-      <w:numFmt w:val="bullet"/>
-      <w:lvlText w:val="○"/>
-      <w:lvlJc w:val="left"/>
-      <w:pPr>
-        <w:ind w:left="3600" w:hanging="360"/>
-      </w:pPr>
-    </w:lvl>
-    <w:lvl w:ilvl="5" w:tplc="779E55EC" w:tentative="1">
-      <w:start w:val="1"/>
-      <w:numFmt w:val="bullet"/>
-      <w:lvlText w:val="■"/>
-      <w:lvlJc w:val="left"/>
-      <w:pPr>
-        <w:ind w:left="4320" w:hanging="360"/>
-      </w:pPr>
-    </w:lvl>
-    <w:lvl w:ilvl="6" w:tplc="ABE88F62" w:tentative="1">
-      <w:start w:val="1"/>
-      <w:numFmt w:val="bullet"/>
-      <w:lvlText w:val="●"/>
-      <w:lvlJc w:val="left"/>
-      <w:pPr>
-        <w:ind w:left="5040" w:hanging="360"/>
-      </w:pPr>
-    </w:lvl>
-    <w:lvl w:ilvl="7" w:tplc="1F14AFB6" w:tentative="1">
-      <w:start w:val="1"/>
-      <w:numFmt w:val="bullet"/>
-      <w:lvlText w:val="●"/>
-      <w:lvlJc w:val="left"/>
-      <w:pPr>
-        <w:ind w:left="5760" w:hanging="360"/>
-      </w:pPr>
-    </w:lvl>
-    <w:lvl w:ilvl="8" w:tplc="5094C5B2" w:tentative="1">
-      <w:start w:val="1"/>
-      <w:numFmt w:val="bullet"/>
-      <w:lvlText w:val="●"/>
-      <w:lvlJc w:val="left"/>
-      <w:pPr>
-        <w:ind w:left="6480" w:hanging="360"/>
-      </w:pPr>
-    </w:lvl>
-  </w:abstractNum>
-  <w:num w:numId="1" w16cid:durableId="651447657">
-    <w:abstractNumId w:val="2"/>
+  <w:num w:numId="1" w16cid:durableId="272520828">
+    <w:abstractNumId w:val="1"/>
     <w:lvlOverride w:ilvl="0">
       <w:startOverride w:val="1"/>
     </w:lvlOverride>
   </w:num>
-  <w:num w:numId="2" w16cid:durableId="717169372">
+  <w:num w:numId="2" w16cid:durableId="1419062409">
     <w:abstractNumId w:val="0"/>
     <w:lvlOverride w:ilvl="0">
       <w:startOverride w:val="1"/>
@@ -51247,20 +51247,20 @@
       <w:startOverride w:val="1"/>
     </w:lvlOverride>
   </w:num>
-  <w:num w:numId="3" w16cid:durableId="1044332624">
-    <w:abstractNumId w:val="1"/>
+  <w:num w:numId="3" w16cid:durableId="1926645597">
+    <w:abstractNumId w:val="2"/>
     <w:lvlOverride w:ilvl="0">
       <w:startOverride w:val="1"/>
     </w:lvlOverride>
   </w:num>
-  <w:num w:numId="4" w16cid:durableId="434790140">
-    <w:abstractNumId w:val="1"/>
+  <w:num w:numId="4" w16cid:durableId="1475760875">
+    <w:abstractNumId w:val="2"/>
     <w:lvlOverride w:ilvl="0">
       <w:startOverride w:val="1"/>
     </w:lvlOverride>
   </w:num>
-  <w:num w:numId="5" w16cid:durableId="1057431056">
-    <w:abstractNumId w:val="1"/>
+  <w:num w:numId="5" w16cid:durableId="1356426310">
+    <w:abstractNumId w:val="2"/>
     <w:lvlOverride w:ilvl="0">
       <w:startOverride w:val="1"/>
     </w:lvlOverride>

</xml_diff>

<commit_message>
Đổi cách viết học vị GVHD sang ThS. Nguyễn Văn Danh
</commit_message>
<xml_diff>
--- a/docs/BaoCao_PhanManhHonHop.docx
+++ b/docs/BaoCao_PhanManhHonHop.docx
@@ -140,7 +140,7 @@
       </w:r>
       <w:r>
         <w:tab/>
-        <w:t>Th.S Nguyễn Văn Danh</w:t>
+        <w:t>ThS. Nguyễn Văn Danh</w:t>
       </w:r>
     </w:p>
     <w:p>
@@ -248,7 +248,7 @@
         <w:jc w:val="both"/>
       </w:pPr>
       <w:r>
-        <w:t>Để hoàn thành đồ án môn học Cơ Sở Dữ Liệu Nâng Cao, nhóm chúng em xin gửi lời cảm ơn chân thành đến thầy Th.S Nguyễn Văn Danh, giảng viên hướng dẫn. Trong suốt quá trình học tập và thực hiện đề tài, thầy đã tận tình giảng dạy, định hướng và góp ý, giúp nhóm hiểu rõ hơn các vấn đề trong thiết kế cơ sở dữ liệu phân tán.</w:t>
+        <w:t>Để hoàn thành đồ án môn học Cơ Sở Dữ Liệu Nâng Cao, nhóm chúng em xin gửi lời cảm ơn chân thành đến thầy ThS. Nguyễn Văn Danh, giảng viên hướng dẫn. Trong suốt quá trình học tập và thực hiện đề tài, thầy đã tận tình giảng dạy, định hướng và góp ý, giúp nhóm hiểu rõ hơn các vấn đề trong thiết kế cơ sở dữ liệu phân tán.</w:t>
       </w:r>
     </w:p>
     <w:p>
@@ -1153,7 +1153,7 @@
     <w:sdt>
       <w:sdtPr>
         <w:alias w:val="Mục lục"/>
-        <w:id w:val="907498413"/>
+        <w:id w:val="514741298"/>
       </w:sdtPr>
       <w:sdtEndPr/>
       <w:sdtContent>
@@ -1181,7 +1181,7 @@
           <w:r>
             <w:fldChar w:fldCharType="separate"/>
           </w:r>
-          <w:hyperlink w:anchor="_Toc244207652" w:history="1">
+          <w:hyperlink w:anchor="_Toc244208323" w:history="1">
             <w:r>
               <w:rPr>
                 <w:rStyle w:val="Hyperlink"/>
@@ -1205,7 +1205,7 @@
               <w:rPr>
                 <w:noProof/>
               </w:rPr>
-              <w:instrText xml:space="preserve"> PAGEREF _Toc244207652 \h </w:instrText>
+              <w:instrText xml:space="preserve"> PAGEREF _Toc244208323 \h </w:instrText>
             </w:r>
             <w:r>
               <w:rPr>
@@ -1247,7 +1247,7 @@
               <w14:ligatures w14:val="standardContextual"/>
             </w:rPr>
           </w:pPr>
-          <w:hyperlink w:anchor="_Toc244207653" w:history="1">
+          <w:hyperlink w:anchor="_Toc244208324" w:history="1">
             <w:r>
               <w:rPr>
                 <w:rStyle w:val="Hyperlink"/>
@@ -1271,7 +1271,7 @@
               <w:rPr>
                 <w:noProof/>
               </w:rPr>
-              <w:instrText xml:space="preserve"> PAGEREF _Toc244207653 \h </w:instrText>
+              <w:instrText xml:space="preserve"> PAGEREF _Toc244208324 \h </w:instrText>
             </w:r>
             <w:r>
               <w:rPr>
@@ -1313,7 +1313,7 @@
               <w14:ligatures w14:val="standardContextual"/>
             </w:rPr>
           </w:pPr>
-          <w:hyperlink w:anchor="_Toc244207654" w:history="1">
+          <w:hyperlink w:anchor="_Toc244208325" w:history="1">
             <w:r>
               <w:rPr>
                 <w:rStyle w:val="Hyperlink"/>
@@ -1337,7 +1337,7 @@
               <w:rPr>
                 <w:noProof/>
               </w:rPr>
-              <w:instrText xml:space="preserve"> PAGEREF _Toc244207654 \h </w:instrText>
+              <w:instrText xml:space="preserve"> PAGEREF _Toc244208325 \h </w:instrText>
             </w:r>
             <w:r>
               <w:rPr>
@@ -1379,7 +1379,7 @@
               <w14:ligatures w14:val="standardContextual"/>
             </w:rPr>
           </w:pPr>
-          <w:hyperlink w:anchor="_Toc244207655" w:history="1">
+          <w:hyperlink w:anchor="_Toc244208326" w:history="1">
             <w:r>
               <w:rPr>
                 <w:rStyle w:val="Hyperlink"/>
@@ -1403,7 +1403,7 @@
               <w:rPr>
                 <w:noProof/>
               </w:rPr>
-              <w:instrText xml:space="preserve"> PAGEREF _Toc244207655 \h </w:instrText>
+              <w:instrText xml:space="preserve"> PAGEREF _Toc244208326 \h </w:instrText>
             </w:r>
             <w:r>
               <w:rPr>
@@ -1445,7 +1445,7 @@
               <w14:ligatures w14:val="standardContextual"/>
             </w:rPr>
           </w:pPr>
-          <w:hyperlink w:anchor="_Toc244207656" w:history="1">
+          <w:hyperlink w:anchor="_Toc244208327" w:history="1">
             <w:r>
               <w:rPr>
                 <w:rStyle w:val="Hyperlink"/>
@@ -1469,7 +1469,7 @@
               <w:rPr>
                 <w:noProof/>
               </w:rPr>
-              <w:instrText xml:space="preserve"> PAGEREF _Toc244207656 \h </w:instrText>
+              <w:instrText xml:space="preserve"> PAGEREF _Toc244208327 \h </w:instrText>
             </w:r>
             <w:r>
               <w:rPr>
@@ -1511,7 +1511,7 @@
               <w14:ligatures w14:val="standardContextual"/>
             </w:rPr>
           </w:pPr>
-          <w:hyperlink w:anchor="_Toc244207657" w:history="1">
+          <w:hyperlink w:anchor="_Toc244208328" w:history="1">
             <w:r>
               <w:rPr>
                 <w:rStyle w:val="Hyperlink"/>
@@ -1535,7 +1535,7 @@
               <w:rPr>
                 <w:noProof/>
               </w:rPr>
-              <w:instrText xml:space="preserve"> PAGEREF _Toc244207657 \h </w:instrText>
+              <w:instrText xml:space="preserve"> PAGEREF _Toc244208328 \h </w:instrText>
             </w:r>
             <w:r>
               <w:rPr>
@@ -1577,7 +1577,7 @@
               <w14:ligatures w14:val="standardContextual"/>
             </w:rPr>
           </w:pPr>
-          <w:hyperlink w:anchor="_Toc244207658" w:history="1">
+          <w:hyperlink w:anchor="_Toc244208329" w:history="1">
             <w:r>
               <w:rPr>
                 <w:rStyle w:val="Hyperlink"/>
@@ -1601,7 +1601,7 @@
               <w:rPr>
                 <w:noProof/>
               </w:rPr>
-              <w:instrText xml:space="preserve"> PAGEREF _Toc244207658 \h </w:instrText>
+              <w:instrText xml:space="preserve"> PAGEREF _Toc244208329 \h </w:instrText>
             </w:r>
             <w:r>
               <w:rPr>
@@ -1643,7 +1643,7 @@
               <w14:ligatures w14:val="standardContextual"/>
             </w:rPr>
           </w:pPr>
-          <w:hyperlink w:anchor="_Toc244207659" w:history="1">
+          <w:hyperlink w:anchor="_Toc244208330" w:history="1">
             <w:r>
               <w:rPr>
                 <w:rStyle w:val="Hyperlink"/>
@@ -1667,7 +1667,7 @@
               <w:rPr>
                 <w:noProof/>
               </w:rPr>
-              <w:instrText xml:space="preserve"> PAGEREF _Toc244207659 \h </w:instrText>
+              <w:instrText xml:space="preserve"> PAGEREF _Toc244208330 \h </w:instrText>
             </w:r>
             <w:r>
               <w:rPr>
@@ -1709,7 +1709,7 @@
               <w14:ligatures w14:val="standardContextual"/>
             </w:rPr>
           </w:pPr>
-          <w:hyperlink w:anchor="_Toc244207660" w:history="1">
+          <w:hyperlink w:anchor="_Toc244208331" w:history="1">
             <w:r>
               <w:rPr>
                 <w:rStyle w:val="Hyperlink"/>
@@ -1733,7 +1733,7 @@
               <w:rPr>
                 <w:noProof/>
               </w:rPr>
-              <w:instrText xml:space="preserve"> PAGEREF _Toc244207660 \h </w:instrText>
+              <w:instrText xml:space="preserve"> PAGEREF _Toc244208331 \h </w:instrText>
             </w:r>
             <w:r>
               <w:rPr>
@@ -1775,7 +1775,7 @@
               <w14:ligatures w14:val="standardContextual"/>
             </w:rPr>
           </w:pPr>
-          <w:hyperlink w:anchor="_Toc244207661" w:history="1">
+          <w:hyperlink w:anchor="_Toc244208332" w:history="1">
             <w:r>
               <w:rPr>
                 <w:rStyle w:val="Hyperlink"/>
@@ -1799,7 +1799,7 @@
               <w:rPr>
                 <w:noProof/>
               </w:rPr>
-              <w:instrText xml:space="preserve"> PAGEREF _Toc244207661 \h </w:instrText>
+              <w:instrText xml:space="preserve"> PAGEREF _Toc244208332 \h </w:instrText>
             </w:r>
             <w:r>
               <w:rPr>
@@ -1841,7 +1841,7 @@
               <w14:ligatures w14:val="standardContextual"/>
             </w:rPr>
           </w:pPr>
-          <w:hyperlink w:anchor="_Toc244207662" w:history="1">
+          <w:hyperlink w:anchor="_Toc244208333" w:history="1">
             <w:r>
               <w:rPr>
                 <w:rStyle w:val="Hyperlink"/>
@@ -1865,7 +1865,7 @@
               <w:rPr>
                 <w:noProof/>
               </w:rPr>
-              <w:instrText xml:space="preserve"> PAGEREF _Toc244207662 \h </w:instrText>
+              <w:instrText xml:space="preserve"> PAGEREF _Toc244208333 \h </w:instrText>
             </w:r>
             <w:r>
               <w:rPr>
@@ -1907,7 +1907,7 @@
               <w14:ligatures w14:val="standardContextual"/>
             </w:rPr>
           </w:pPr>
-          <w:hyperlink w:anchor="_Toc244207663" w:history="1">
+          <w:hyperlink w:anchor="_Toc244208334" w:history="1">
             <w:r>
               <w:rPr>
                 <w:rStyle w:val="Hyperlink"/>
@@ -1931,7 +1931,7 @@
               <w:rPr>
                 <w:noProof/>
               </w:rPr>
-              <w:instrText xml:space="preserve"> PAGEREF _Toc244207663 \h </w:instrText>
+              <w:instrText xml:space="preserve"> PAGEREF _Toc244208334 \h </w:instrText>
             </w:r>
             <w:r>
               <w:rPr>
@@ -1973,7 +1973,7 @@
               <w14:ligatures w14:val="standardContextual"/>
             </w:rPr>
           </w:pPr>
-          <w:hyperlink w:anchor="_Toc244207664" w:history="1">
+          <w:hyperlink w:anchor="_Toc244208335" w:history="1">
             <w:r>
               <w:rPr>
                 <w:rStyle w:val="Hyperlink"/>
@@ -1997,7 +1997,7 @@
               <w:rPr>
                 <w:noProof/>
               </w:rPr>
-              <w:instrText xml:space="preserve"> PAGEREF _Toc244207664 \h </w:instrText>
+              <w:instrText xml:space="preserve"> PAGEREF _Toc244208335 \h </w:instrText>
             </w:r>
             <w:r>
               <w:rPr>
@@ -2039,7 +2039,7 @@
               <w14:ligatures w14:val="standardContextual"/>
             </w:rPr>
           </w:pPr>
-          <w:hyperlink w:anchor="_Toc244207665" w:history="1">
+          <w:hyperlink w:anchor="_Toc244208336" w:history="1">
             <w:r>
               <w:rPr>
                 <w:rStyle w:val="Hyperlink"/>
@@ -2063,7 +2063,7 @@
               <w:rPr>
                 <w:noProof/>
               </w:rPr>
-              <w:instrText xml:space="preserve"> PAGEREF _Toc244207665 \h </w:instrText>
+              <w:instrText xml:space="preserve"> PAGEREF _Toc244208336 \h </w:instrText>
             </w:r>
             <w:r>
               <w:rPr>
@@ -2105,7 +2105,7 @@
               <w14:ligatures w14:val="standardContextual"/>
             </w:rPr>
           </w:pPr>
-          <w:hyperlink w:anchor="_Toc244207666" w:history="1">
+          <w:hyperlink w:anchor="_Toc244208337" w:history="1">
             <w:r>
               <w:rPr>
                 <w:rStyle w:val="Hyperlink"/>
@@ -2129,7 +2129,7 @@
               <w:rPr>
                 <w:noProof/>
               </w:rPr>
-              <w:instrText xml:space="preserve"> PAGEREF _Toc244207666 \h </w:instrText>
+              <w:instrText xml:space="preserve"> PAGEREF _Toc244208337 \h </w:instrText>
             </w:r>
             <w:r>
               <w:rPr>
@@ -2171,7 +2171,7 @@
               <w14:ligatures w14:val="standardContextual"/>
             </w:rPr>
           </w:pPr>
-          <w:hyperlink w:anchor="_Toc244207667" w:history="1">
+          <w:hyperlink w:anchor="_Toc244208338" w:history="1">
             <w:r>
               <w:rPr>
                 <w:rStyle w:val="Hyperlink"/>
@@ -2195,7 +2195,7 @@
               <w:rPr>
                 <w:noProof/>
               </w:rPr>
-              <w:instrText xml:space="preserve"> PAGEREF _Toc244207667 \h </w:instrText>
+              <w:instrText xml:space="preserve"> PAGEREF _Toc244208338 \h </w:instrText>
             </w:r>
             <w:r>
               <w:rPr>
@@ -2237,7 +2237,7 @@
               <w14:ligatures w14:val="standardContextual"/>
             </w:rPr>
           </w:pPr>
-          <w:hyperlink w:anchor="_Toc244207668" w:history="1">
+          <w:hyperlink w:anchor="_Toc244208339" w:history="1">
             <w:r>
               <w:rPr>
                 <w:rStyle w:val="Hyperlink"/>
@@ -2261,7 +2261,7 @@
               <w:rPr>
                 <w:noProof/>
               </w:rPr>
-              <w:instrText xml:space="preserve"> PAGEREF _Toc244207668 \h </w:instrText>
+              <w:instrText xml:space="preserve"> PAGEREF _Toc244208339 \h </w:instrText>
             </w:r>
             <w:r>
               <w:rPr>
@@ -2303,7 +2303,7 @@
               <w14:ligatures w14:val="standardContextual"/>
             </w:rPr>
           </w:pPr>
-          <w:hyperlink w:anchor="_Toc244207669" w:history="1">
+          <w:hyperlink w:anchor="_Toc244208340" w:history="1">
             <w:r>
               <w:rPr>
                 <w:rStyle w:val="Hyperlink"/>
@@ -2327,7 +2327,7 @@
               <w:rPr>
                 <w:noProof/>
               </w:rPr>
-              <w:instrText xml:space="preserve"> PAGEREF _Toc244207669 \h </w:instrText>
+              <w:instrText xml:space="preserve"> PAGEREF _Toc244208340 \h </w:instrText>
             </w:r>
             <w:r>
               <w:rPr>
@@ -2369,7 +2369,7 @@
               <w14:ligatures w14:val="standardContextual"/>
             </w:rPr>
           </w:pPr>
-          <w:hyperlink w:anchor="_Toc244207670" w:history="1">
+          <w:hyperlink w:anchor="_Toc244208341" w:history="1">
             <w:r>
               <w:rPr>
                 <w:rStyle w:val="Hyperlink"/>
@@ -2393,7 +2393,7 @@
               <w:rPr>
                 <w:noProof/>
               </w:rPr>
-              <w:instrText xml:space="preserve"> PAGEREF _Toc244207670 \h </w:instrText>
+              <w:instrText xml:space="preserve"> PAGEREF _Toc244208341 \h </w:instrText>
             </w:r>
             <w:r>
               <w:rPr>
@@ -2435,7 +2435,7 @@
               <w14:ligatures w14:val="standardContextual"/>
             </w:rPr>
           </w:pPr>
-          <w:hyperlink w:anchor="_Toc244207671" w:history="1">
+          <w:hyperlink w:anchor="_Toc244208342" w:history="1">
             <w:r>
               <w:rPr>
                 <w:rStyle w:val="Hyperlink"/>
@@ -2459,7 +2459,7 @@
               <w:rPr>
                 <w:noProof/>
               </w:rPr>
-              <w:instrText xml:space="preserve"> PAGEREF _Toc244207671 \h </w:instrText>
+              <w:instrText xml:space="preserve"> PAGEREF _Toc244208342 \h </w:instrText>
             </w:r>
             <w:r>
               <w:rPr>
@@ -2501,7 +2501,7 @@
               <w14:ligatures w14:val="standardContextual"/>
             </w:rPr>
           </w:pPr>
-          <w:hyperlink w:anchor="_Toc244207672" w:history="1">
+          <w:hyperlink w:anchor="_Toc244208343" w:history="1">
             <w:r>
               <w:rPr>
                 <w:rStyle w:val="Hyperlink"/>
@@ -2525,7 +2525,7 @@
               <w:rPr>
                 <w:noProof/>
               </w:rPr>
-              <w:instrText xml:space="preserve"> PAGEREF _Toc244207672 \h </w:instrText>
+              <w:instrText xml:space="preserve"> PAGEREF _Toc244208343 \h </w:instrText>
             </w:r>
             <w:r>
               <w:rPr>
@@ -2567,7 +2567,7 @@
               <w14:ligatures w14:val="standardContextual"/>
             </w:rPr>
           </w:pPr>
-          <w:hyperlink w:anchor="_Toc244207673" w:history="1">
+          <w:hyperlink w:anchor="_Toc244208344" w:history="1">
             <w:r>
               <w:rPr>
                 <w:rStyle w:val="Hyperlink"/>
@@ -2591,7 +2591,7 @@
               <w:rPr>
                 <w:noProof/>
               </w:rPr>
-              <w:instrText xml:space="preserve"> PAGEREF _Toc244207673 \h </w:instrText>
+              <w:instrText xml:space="preserve"> PAGEREF _Toc244208344 \h </w:instrText>
             </w:r>
             <w:r>
               <w:rPr>
@@ -2633,7 +2633,7 @@
               <w14:ligatures w14:val="standardContextual"/>
             </w:rPr>
           </w:pPr>
-          <w:hyperlink w:anchor="_Toc244207674" w:history="1">
+          <w:hyperlink w:anchor="_Toc244208345" w:history="1">
             <w:r>
               <w:rPr>
                 <w:rStyle w:val="Hyperlink"/>
@@ -2657,7 +2657,7 @@
               <w:rPr>
                 <w:noProof/>
               </w:rPr>
-              <w:instrText xml:space="preserve"> PAGEREF _Toc244207674 \h </w:instrText>
+              <w:instrText xml:space="preserve"> PAGEREF _Toc244208345 \h </w:instrText>
             </w:r>
             <w:r>
               <w:rPr>
@@ -2699,7 +2699,7 @@
               <w14:ligatures w14:val="standardContextual"/>
             </w:rPr>
           </w:pPr>
-          <w:hyperlink w:anchor="_Toc244207675" w:history="1">
+          <w:hyperlink w:anchor="_Toc244208346" w:history="1">
             <w:r>
               <w:rPr>
                 <w:rStyle w:val="Hyperlink"/>
@@ -2723,7 +2723,7 @@
               <w:rPr>
                 <w:noProof/>
               </w:rPr>
-              <w:instrText xml:space="preserve"> PAGEREF _Toc244207675 \h </w:instrText>
+              <w:instrText xml:space="preserve"> PAGEREF _Toc244208346 \h </w:instrText>
             </w:r>
             <w:r>
               <w:rPr>
@@ -2765,7 +2765,7 @@
               <w14:ligatures w14:val="standardContextual"/>
             </w:rPr>
           </w:pPr>
-          <w:hyperlink w:anchor="_Toc244207676" w:history="1">
+          <w:hyperlink w:anchor="_Toc244208347" w:history="1">
             <w:r>
               <w:rPr>
                 <w:rStyle w:val="Hyperlink"/>
@@ -2789,7 +2789,7 @@
               <w:rPr>
                 <w:noProof/>
               </w:rPr>
-              <w:instrText xml:space="preserve"> PAGEREF _Toc244207676 \h </w:instrText>
+              <w:instrText xml:space="preserve"> PAGEREF _Toc244208347 \h </w:instrText>
             </w:r>
             <w:r>
               <w:rPr>
@@ -2831,7 +2831,7 @@
               <w14:ligatures w14:val="standardContextual"/>
             </w:rPr>
           </w:pPr>
-          <w:hyperlink w:anchor="_Toc244207677" w:history="1">
+          <w:hyperlink w:anchor="_Toc244208348" w:history="1">
             <w:r>
               <w:rPr>
                 <w:rStyle w:val="Hyperlink"/>
@@ -2855,7 +2855,7 @@
               <w:rPr>
                 <w:noProof/>
               </w:rPr>
-              <w:instrText xml:space="preserve"> PAGEREF _Toc244207677 \h </w:instrText>
+              <w:instrText xml:space="preserve"> PAGEREF _Toc244208348 \h </w:instrText>
             </w:r>
             <w:r>
               <w:rPr>
@@ -2897,7 +2897,7 @@
               <w14:ligatures w14:val="standardContextual"/>
             </w:rPr>
           </w:pPr>
-          <w:hyperlink w:anchor="_Toc244207678" w:history="1">
+          <w:hyperlink w:anchor="_Toc244208349" w:history="1">
             <w:r>
               <w:rPr>
                 <w:rStyle w:val="Hyperlink"/>
@@ -2921,7 +2921,7 @@
               <w:rPr>
                 <w:noProof/>
               </w:rPr>
-              <w:instrText xml:space="preserve"> PAGEREF _Toc244207678 \h </w:instrText>
+              <w:instrText xml:space="preserve"> PAGEREF _Toc244208349 \h </w:instrText>
             </w:r>
             <w:r>
               <w:rPr>
@@ -2963,7 +2963,7 @@
               <w14:ligatures w14:val="standardContextual"/>
             </w:rPr>
           </w:pPr>
-          <w:hyperlink w:anchor="_Toc244207679" w:history="1">
+          <w:hyperlink w:anchor="_Toc244208350" w:history="1">
             <w:r>
               <w:rPr>
                 <w:rStyle w:val="Hyperlink"/>
@@ -2987,7 +2987,7 @@
               <w:rPr>
                 <w:noProof/>
               </w:rPr>
-              <w:instrText xml:space="preserve"> PAGEREF _Toc244207679 \h </w:instrText>
+              <w:instrText xml:space="preserve"> PAGEREF _Toc244208350 \h </w:instrText>
             </w:r>
             <w:r>
               <w:rPr>
@@ -3029,7 +3029,7 @@
               <w14:ligatures w14:val="standardContextual"/>
             </w:rPr>
           </w:pPr>
-          <w:hyperlink w:anchor="_Toc244207680" w:history="1">
+          <w:hyperlink w:anchor="_Toc244208351" w:history="1">
             <w:r>
               <w:rPr>
                 <w:rStyle w:val="Hyperlink"/>
@@ -3053,7 +3053,7 @@
               <w:rPr>
                 <w:noProof/>
               </w:rPr>
-              <w:instrText xml:space="preserve"> PAGEREF _Toc244207680 \h </w:instrText>
+              <w:instrText xml:space="preserve"> PAGEREF _Toc244208351 \h </w:instrText>
             </w:r>
             <w:r>
               <w:rPr>
@@ -3095,7 +3095,7 @@
               <w14:ligatures w14:val="standardContextual"/>
             </w:rPr>
           </w:pPr>
-          <w:hyperlink w:anchor="_Toc244207681" w:history="1">
+          <w:hyperlink w:anchor="_Toc244208352" w:history="1">
             <w:r>
               <w:rPr>
                 <w:rStyle w:val="Hyperlink"/>
@@ -3119,7 +3119,7 @@
               <w:rPr>
                 <w:noProof/>
               </w:rPr>
-              <w:instrText xml:space="preserve"> PAGEREF _Toc244207681 \h </w:instrText>
+              <w:instrText xml:space="preserve"> PAGEREF _Toc244208352 \h </w:instrText>
             </w:r>
             <w:r>
               <w:rPr>
@@ -3161,7 +3161,7 @@
               <w14:ligatures w14:val="standardContextual"/>
             </w:rPr>
           </w:pPr>
-          <w:hyperlink w:anchor="_Toc244207682" w:history="1">
+          <w:hyperlink w:anchor="_Toc244208353" w:history="1">
             <w:r>
               <w:rPr>
                 <w:rStyle w:val="Hyperlink"/>
@@ -3185,7 +3185,7 @@
               <w:rPr>
                 <w:noProof/>
               </w:rPr>
-              <w:instrText xml:space="preserve"> PAGEREF _Toc244207682 \h </w:instrText>
+              <w:instrText xml:space="preserve"> PAGEREF _Toc244208353 \h </w:instrText>
             </w:r>
             <w:r>
               <w:rPr>
@@ -3227,7 +3227,7 @@
               <w14:ligatures w14:val="standardContextual"/>
             </w:rPr>
           </w:pPr>
-          <w:hyperlink w:anchor="_Toc244207683" w:history="1">
+          <w:hyperlink w:anchor="_Toc244208354" w:history="1">
             <w:r>
               <w:rPr>
                 <w:rStyle w:val="Hyperlink"/>
@@ -3251,7 +3251,7 @@
               <w:rPr>
                 <w:noProof/>
               </w:rPr>
-              <w:instrText xml:space="preserve"> PAGEREF _Toc244207683 \h </w:instrText>
+              <w:instrText xml:space="preserve"> PAGEREF _Toc244208354 \h </w:instrText>
             </w:r>
             <w:r>
               <w:rPr>
@@ -3293,7 +3293,7 @@
               <w14:ligatures w14:val="standardContextual"/>
             </w:rPr>
           </w:pPr>
-          <w:hyperlink w:anchor="_Toc244207684" w:history="1">
+          <w:hyperlink w:anchor="_Toc244208355" w:history="1">
             <w:r>
               <w:rPr>
                 <w:rStyle w:val="Hyperlink"/>
@@ -3317,7 +3317,7 @@
               <w:rPr>
                 <w:noProof/>
               </w:rPr>
-              <w:instrText xml:space="preserve"> PAGEREF _Toc244207684 \h </w:instrText>
+              <w:instrText xml:space="preserve"> PAGEREF _Toc244208355 \h </w:instrText>
             </w:r>
             <w:r>
               <w:rPr>
@@ -3359,7 +3359,7 @@
               <w14:ligatures w14:val="standardContextual"/>
             </w:rPr>
           </w:pPr>
-          <w:hyperlink w:anchor="_Toc244207685" w:history="1">
+          <w:hyperlink w:anchor="_Toc244208356" w:history="1">
             <w:r>
               <w:rPr>
                 <w:rStyle w:val="Hyperlink"/>
@@ -3383,7 +3383,7 @@
               <w:rPr>
                 <w:noProof/>
               </w:rPr>
-              <w:instrText xml:space="preserve"> PAGEREF _Toc244207685 \h </w:instrText>
+              <w:instrText xml:space="preserve"> PAGEREF _Toc244208356 \h </w:instrText>
             </w:r>
             <w:r>
               <w:rPr>
@@ -3425,7 +3425,7 @@
               <w14:ligatures w14:val="standardContextual"/>
             </w:rPr>
           </w:pPr>
-          <w:hyperlink w:anchor="_Toc244207686" w:history="1">
+          <w:hyperlink w:anchor="_Toc244208357" w:history="1">
             <w:r>
               <w:rPr>
                 <w:rStyle w:val="Hyperlink"/>
@@ -3449,7 +3449,7 @@
               <w:rPr>
                 <w:noProof/>
               </w:rPr>
-              <w:instrText xml:space="preserve"> PAGEREF _Toc244207686 \h </w:instrText>
+              <w:instrText xml:space="preserve"> PAGEREF _Toc244208357 \h </w:instrText>
             </w:r>
             <w:r>
               <w:rPr>
@@ -3491,7 +3491,7 @@
               <w14:ligatures w14:val="standardContextual"/>
             </w:rPr>
           </w:pPr>
-          <w:hyperlink w:anchor="_Toc244207687" w:history="1">
+          <w:hyperlink w:anchor="_Toc244208358" w:history="1">
             <w:r>
               <w:rPr>
                 <w:rStyle w:val="Hyperlink"/>
@@ -3515,7 +3515,7 @@
               <w:rPr>
                 <w:noProof/>
               </w:rPr>
-              <w:instrText xml:space="preserve"> PAGEREF _Toc244207687 \h </w:instrText>
+              <w:instrText xml:space="preserve"> PAGEREF _Toc244208358 \h </w:instrText>
             </w:r>
             <w:r>
               <w:rPr>
@@ -3557,7 +3557,7 @@
               <w14:ligatures w14:val="standardContextual"/>
             </w:rPr>
           </w:pPr>
-          <w:hyperlink w:anchor="_Toc244207688" w:history="1">
+          <w:hyperlink w:anchor="_Toc244208359" w:history="1">
             <w:r>
               <w:rPr>
                 <w:rStyle w:val="Hyperlink"/>
@@ -3581,7 +3581,7 @@
               <w:rPr>
                 <w:noProof/>
               </w:rPr>
-              <w:instrText xml:space="preserve"> PAGEREF _Toc244207688 \h </w:instrText>
+              <w:instrText xml:space="preserve"> PAGEREF _Toc244208359 \h </w:instrText>
             </w:r>
             <w:r>
               <w:rPr>
@@ -3623,7 +3623,7 @@
               <w14:ligatures w14:val="standardContextual"/>
             </w:rPr>
           </w:pPr>
-          <w:hyperlink w:anchor="_Toc244207689" w:history="1">
+          <w:hyperlink w:anchor="_Toc244208360" w:history="1">
             <w:r>
               <w:rPr>
                 <w:rStyle w:val="Hyperlink"/>
@@ -3647,7 +3647,7 @@
               <w:rPr>
                 <w:noProof/>
               </w:rPr>
-              <w:instrText xml:space="preserve"> PAGEREF _Toc244207689 \h </w:instrText>
+              <w:instrText xml:space="preserve"> PAGEREF _Toc244208360 \h </w:instrText>
             </w:r>
             <w:r>
               <w:rPr>
@@ -3689,7 +3689,7 @@
               <w14:ligatures w14:val="standardContextual"/>
             </w:rPr>
           </w:pPr>
-          <w:hyperlink w:anchor="_Toc244207690" w:history="1">
+          <w:hyperlink w:anchor="_Toc244208361" w:history="1">
             <w:r>
               <w:rPr>
                 <w:rStyle w:val="Hyperlink"/>
@@ -3713,7 +3713,7 @@
               <w:rPr>
                 <w:noProof/>
               </w:rPr>
-              <w:instrText xml:space="preserve"> PAGEREF _Toc244207690 \h </w:instrText>
+              <w:instrText xml:space="preserve"> PAGEREF _Toc244208361 \h </w:instrText>
             </w:r>
             <w:r>
               <w:rPr>
@@ -3755,7 +3755,7 @@
               <w14:ligatures w14:val="standardContextual"/>
             </w:rPr>
           </w:pPr>
-          <w:hyperlink w:anchor="_Toc244207691" w:history="1">
+          <w:hyperlink w:anchor="_Toc244208362" w:history="1">
             <w:r>
               <w:rPr>
                 <w:rStyle w:val="Hyperlink"/>
@@ -3779,7 +3779,7 @@
               <w:rPr>
                 <w:noProof/>
               </w:rPr>
-              <w:instrText xml:space="preserve"> PAGEREF _Toc244207691 \h </w:instrText>
+              <w:instrText xml:space="preserve"> PAGEREF _Toc244208362 \h </w:instrText>
             </w:r>
             <w:r>
               <w:rPr>
@@ -3821,7 +3821,7 @@
               <w14:ligatures w14:val="standardContextual"/>
             </w:rPr>
           </w:pPr>
-          <w:hyperlink w:anchor="_Toc244207692" w:history="1">
+          <w:hyperlink w:anchor="_Toc244208363" w:history="1">
             <w:r>
               <w:rPr>
                 <w:rStyle w:val="Hyperlink"/>
@@ -3845,7 +3845,7 @@
               <w:rPr>
                 <w:noProof/>
               </w:rPr>
-              <w:instrText xml:space="preserve"> PAGEREF _Toc244207692 \h </w:instrText>
+              <w:instrText xml:space="preserve"> PAGEREF _Toc244208363 \h </w:instrText>
             </w:r>
             <w:r>
               <w:rPr>
@@ -3887,7 +3887,7 @@
               <w14:ligatures w14:val="standardContextual"/>
             </w:rPr>
           </w:pPr>
-          <w:hyperlink w:anchor="_Toc244207693" w:history="1">
+          <w:hyperlink w:anchor="_Toc244208364" w:history="1">
             <w:r>
               <w:rPr>
                 <w:rStyle w:val="Hyperlink"/>
@@ -3911,7 +3911,7 @@
               <w:rPr>
                 <w:noProof/>
               </w:rPr>
-              <w:instrText xml:space="preserve"> PAGEREF _Toc244207693 \h </w:instrText>
+              <w:instrText xml:space="preserve"> PAGEREF _Toc244208364 \h </w:instrText>
             </w:r>
             <w:r>
               <w:rPr>
@@ -3953,7 +3953,7 @@
               <w14:ligatures w14:val="standardContextual"/>
             </w:rPr>
           </w:pPr>
-          <w:hyperlink w:anchor="_Toc244207694" w:history="1">
+          <w:hyperlink w:anchor="_Toc244208365" w:history="1">
             <w:r>
               <w:rPr>
                 <w:rStyle w:val="Hyperlink"/>
@@ -3977,7 +3977,7 @@
               <w:rPr>
                 <w:noProof/>
               </w:rPr>
-              <w:instrText xml:space="preserve"> PAGEREF _Toc244207694 \h </w:instrText>
+              <w:instrText xml:space="preserve"> PAGEREF _Toc244208365 \h </w:instrText>
             </w:r>
             <w:r>
               <w:rPr>
@@ -4019,7 +4019,7 @@
               <w14:ligatures w14:val="standardContextual"/>
             </w:rPr>
           </w:pPr>
-          <w:hyperlink w:anchor="_Toc244207695" w:history="1">
+          <w:hyperlink w:anchor="_Toc244208366" w:history="1">
             <w:r>
               <w:rPr>
                 <w:rStyle w:val="Hyperlink"/>
@@ -4043,7 +4043,7 @@
               <w:rPr>
                 <w:noProof/>
               </w:rPr>
-              <w:instrText xml:space="preserve"> PAGEREF _Toc244207695 \h </w:instrText>
+              <w:instrText xml:space="preserve"> PAGEREF _Toc244208366 \h </w:instrText>
             </w:r>
             <w:r>
               <w:rPr>
@@ -4085,7 +4085,7 @@
               <w14:ligatures w14:val="standardContextual"/>
             </w:rPr>
           </w:pPr>
-          <w:hyperlink w:anchor="_Toc244207696" w:history="1">
+          <w:hyperlink w:anchor="_Toc244208367" w:history="1">
             <w:r>
               <w:rPr>
                 <w:rStyle w:val="Hyperlink"/>
@@ -4109,7 +4109,7 @@
               <w:rPr>
                 <w:noProof/>
               </w:rPr>
-              <w:instrText xml:space="preserve"> PAGEREF _Toc244207696 \h </w:instrText>
+              <w:instrText xml:space="preserve"> PAGEREF _Toc244208367 \h </w:instrText>
             </w:r>
             <w:r>
               <w:rPr>
@@ -4151,7 +4151,7 @@
               <w14:ligatures w14:val="standardContextual"/>
             </w:rPr>
           </w:pPr>
-          <w:hyperlink w:anchor="_Toc244207697" w:history="1">
+          <w:hyperlink w:anchor="_Toc244208368" w:history="1">
             <w:r>
               <w:rPr>
                 <w:rStyle w:val="Hyperlink"/>
@@ -4175,7 +4175,7 @@
               <w:rPr>
                 <w:noProof/>
               </w:rPr>
-              <w:instrText xml:space="preserve"> PAGEREF _Toc244207697 \h </w:instrText>
+              <w:instrText xml:space="preserve"> PAGEREF _Toc244208368 \h </w:instrText>
             </w:r>
             <w:r>
               <w:rPr>
@@ -4217,7 +4217,7 @@
               <w14:ligatures w14:val="standardContextual"/>
             </w:rPr>
           </w:pPr>
-          <w:hyperlink w:anchor="_Toc244207698" w:history="1">
+          <w:hyperlink w:anchor="_Toc244208369" w:history="1">
             <w:r>
               <w:rPr>
                 <w:rStyle w:val="Hyperlink"/>
@@ -4241,7 +4241,7 @@
               <w:rPr>
                 <w:noProof/>
               </w:rPr>
-              <w:instrText xml:space="preserve"> PAGEREF _Toc244207698 \h </w:instrText>
+              <w:instrText xml:space="preserve"> PAGEREF _Toc244208369 \h </w:instrText>
             </w:r>
             <w:r>
               <w:rPr>
@@ -4283,7 +4283,7 @@
               <w14:ligatures w14:val="standardContextual"/>
             </w:rPr>
           </w:pPr>
-          <w:hyperlink w:anchor="_Toc244207699" w:history="1">
+          <w:hyperlink w:anchor="_Toc244208370" w:history="1">
             <w:r>
               <w:rPr>
                 <w:rStyle w:val="Hyperlink"/>
@@ -4307,7 +4307,7 @@
               <w:rPr>
                 <w:noProof/>
               </w:rPr>
-              <w:instrText xml:space="preserve"> PAGEREF _Toc244207699 \h </w:instrText>
+              <w:instrText xml:space="preserve"> PAGEREF _Toc244208370 \h </w:instrText>
             </w:r>
             <w:r>
               <w:rPr>
@@ -4349,7 +4349,7 @@
               <w14:ligatures w14:val="standardContextual"/>
             </w:rPr>
           </w:pPr>
-          <w:hyperlink w:anchor="_Toc244207700" w:history="1">
+          <w:hyperlink w:anchor="_Toc244208371" w:history="1">
             <w:r>
               <w:rPr>
                 <w:rStyle w:val="Hyperlink"/>
@@ -4373,7 +4373,7 @@
               <w:rPr>
                 <w:noProof/>
               </w:rPr>
-              <w:instrText xml:space="preserve"> PAGEREF _Toc244207700 \h </w:instrText>
+              <w:instrText xml:space="preserve"> PAGEREF _Toc244208371 \h </w:instrText>
             </w:r>
             <w:r>
               <w:rPr>
@@ -4415,7 +4415,7 @@
               <w14:ligatures w14:val="standardContextual"/>
             </w:rPr>
           </w:pPr>
-          <w:hyperlink w:anchor="_Toc244207701" w:history="1">
+          <w:hyperlink w:anchor="_Toc244208372" w:history="1">
             <w:r>
               <w:rPr>
                 <w:rStyle w:val="Hyperlink"/>
@@ -4439,7 +4439,7 @@
               <w:rPr>
                 <w:noProof/>
               </w:rPr>
-              <w:instrText xml:space="preserve"> PAGEREF _Toc244207701 \h </w:instrText>
+              <w:instrText xml:space="preserve"> PAGEREF _Toc244208372 \h </w:instrText>
             </w:r>
             <w:r>
               <w:rPr>
@@ -4481,7 +4481,7 @@
               <w14:ligatures w14:val="standardContextual"/>
             </w:rPr>
           </w:pPr>
-          <w:hyperlink w:anchor="_Toc244207702" w:history="1">
+          <w:hyperlink w:anchor="_Toc244208373" w:history="1">
             <w:r>
               <w:rPr>
                 <w:rStyle w:val="Hyperlink"/>
@@ -4505,7 +4505,7 @@
               <w:rPr>
                 <w:noProof/>
               </w:rPr>
-              <w:instrText xml:space="preserve"> PAGEREF _Toc244207702 \h </w:instrText>
+              <w:instrText xml:space="preserve"> PAGEREF _Toc244208373 \h </w:instrText>
             </w:r>
             <w:r>
               <w:rPr>
@@ -4547,7 +4547,7 @@
               <w14:ligatures w14:val="standardContextual"/>
             </w:rPr>
           </w:pPr>
-          <w:hyperlink w:anchor="_Toc244207703" w:history="1">
+          <w:hyperlink w:anchor="_Toc244208374" w:history="1">
             <w:r>
               <w:rPr>
                 <w:rStyle w:val="Hyperlink"/>
@@ -4571,7 +4571,7 @@
               <w:rPr>
                 <w:noProof/>
               </w:rPr>
-              <w:instrText xml:space="preserve"> PAGEREF _Toc244207703 \h </w:instrText>
+              <w:instrText xml:space="preserve"> PAGEREF _Toc244208374 \h </w:instrText>
             </w:r>
             <w:r>
               <w:rPr>
@@ -4613,7 +4613,7 @@
               <w14:ligatures w14:val="standardContextual"/>
             </w:rPr>
           </w:pPr>
-          <w:hyperlink w:anchor="_Toc244207704" w:history="1">
+          <w:hyperlink w:anchor="_Toc244208375" w:history="1">
             <w:r>
               <w:rPr>
                 <w:rStyle w:val="Hyperlink"/>
@@ -4637,7 +4637,7 @@
               <w:rPr>
                 <w:noProof/>
               </w:rPr>
-              <w:instrText xml:space="preserve"> PAGEREF _Toc244207704 \h </w:instrText>
+              <w:instrText xml:space="preserve"> PAGEREF _Toc244208375 \h </w:instrText>
             </w:r>
             <w:r>
               <w:rPr>
@@ -4679,7 +4679,7 @@
               <w14:ligatures w14:val="standardContextual"/>
             </w:rPr>
           </w:pPr>
-          <w:hyperlink w:anchor="_Toc244207705" w:history="1">
+          <w:hyperlink w:anchor="_Toc244208376" w:history="1">
             <w:r>
               <w:rPr>
                 <w:rStyle w:val="Hyperlink"/>
@@ -4703,7 +4703,7 @@
               <w:rPr>
                 <w:noProof/>
               </w:rPr>
-              <w:instrText xml:space="preserve"> PAGEREF _Toc244207705 \h </w:instrText>
+              <w:instrText xml:space="preserve"> PAGEREF _Toc244208376 \h </w:instrText>
             </w:r>
             <w:r>
               <w:rPr>
@@ -4745,7 +4745,7 @@
               <w14:ligatures w14:val="standardContextual"/>
             </w:rPr>
           </w:pPr>
-          <w:hyperlink w:anchor="_Toc244207706" w:history="1">
+          <w:hyperlink w:anchor="_Toc244208377" w:history="1">
             <w:r>
               <w:rPr>
                 <w:rStyle w:val="Hyperlink"/>
@@ -4769,7 +4769,7 @@
               <w:rPr>
                 <w:noProof/>
               </w:rPr>
-              <w:instrText xml:space="preserve"> PAGEREF _Toc244207706 \h </w:instrText>
+              <w:instrText xml:space="preserve"> PAGEREF _Toc244208377 \h </w:instrText>
             </w:r>
             <w:r>
               <w:rPr>
@@ -4811,7 +4811,7 @@
               <w14:ligatures w14:val="standardContextual"/>
             </w:rPr>
           </w:pPr>
-          <w:hyperlink w:anchor="_Toc244207707" w:history="1">
+          <w:hyperlink w:anchor="_Toc244208378" w:history="1">
             <w:r>
               <w:rPr>
                 <w:rStyle w:val="Hyperlink"/>
@@ -4835,7 +4835,7 @@
               <w:rPr>
                 <w:noProof/>
               </w:rPr>
-              <w:instrText xml:space="preserve"> PAGEREF _Toc244207707 \h </w:instrText>
+              <w:instrText xml:space="preserve"> PAGEREF _Toc244208378 \h </w:instrText>
             </w:r>
             <w:r>
               <w:rPr>
@@ -4877,7 +4877,7 @@
               <w14:ligatures w14:val="standardContextual"/>
             </w:rPr>
           </w:pPr>
-          <w:hyperlink w:anchor="_Toc244207708" w:history="1">
+          <w:hyperlink w:anchor="_Toc244208379" w:history="1">
             <w:r>
               <w:rPr>
                 <w:rStyle w:val="Hyperlink"/>
@@ -4901,7 +4901,7 @@
               <w:rPr>
                 <w:noProof/>
               </w:rPr>
-              <w:instrText xml:space="preserve"> PAGEREF _Toc244207708 \h </w:instrText>
+              <w:instrText xml:space="preserve"> PAGEREF _Toc244208379 \h </w:instrText>
             </w:r>
             <w:r>
               <w:rPr>
@@ -4943,7 +4943,7 @@
               <w14:ligatures w14:val="standardContextual"/>
             </w:rPr>
           </w:pPr>
-          <w:hyperlink w:anchor="_Toc244207709" w:history="1">
+          <w:hyperlink w:anchor="_Toc244208380" w:history="1">
             <w:r>
               <w:rPr>
                 <w:rStyle w:val="Hyperlink"/>
@@ -4967,7 +4967,7 @@
               <w:rPr>
                 <w:noProof/>
               </w:rPr>
-              <w:instrText xml:space="preserve"> PAGEREF _Toc244207709 \h </w:instrText>
+              <w:instrText xml:space="preserve"> PAGEREF _Toc244208380 \h </w:instrText>
             </w:r>
             <w:r>
               <w:rPr>
@@ -5009,7 +5009,7 @@
               <w14:ligatures w14:val="standardContextual"/>
             </w:rPr>
           </w:pPr>
-          <w:hyperlink w:anchor="_Toc244207710" w:history="1">
+          <w:hyperlink w:anchor="_Toc244208381" w:history="1">
             <w:r>
               <w:rPr>
                 <w:rStyle w:val="Hyperlink"/>
@@ -5033,7 +5033,7 @@
               <w:rPr>
                 <w:noProof/>
               </w:rPr>
-              <w:instrText xml:space="preserve"> PAGEREF _Toc244207710 \h </w:instrText>
+              <w:instrText xml:space="preserve"> PAGEREF _Toc244208381 \h </w:instrText>
             </w:r>
             <w:r>
               <w:rPr>
@@ -5075,7 +5075,7 @@
               <w14:ligatures w14:val="standardContextual"/>
             </w:rPr>
           </w:pPr>
-          <w:hyperlink w:anchor="_Toc244207711" w:history="1">
+          <w:hyperlink w:anchor="_Toc244208382" w:history="1">
             <w:r>
               <w:rPr>
                 <w:rStyle w:val="Hyperlink"/>
@@ -5099,7 +5099,7 @@
               <w:rPr>
                 <w:noProof/>
               </w:rPr>
-              <w:instrText xml:space="preserve"> PAGEREF _Toc244207711 \h </w:instrText>
+              <w:instrText xml:space="preserve"> PAGEREF _Toc244208382 \h </w:instrText>
             </w:r>
             <w:r>
               <w:rPr>
@@ -5141,7 +5141,7 @@
               <w14:ligatures w14:val="standardContextual"/>
             </w:rPr>
           </w:pPr>
-          <w:hyperlink w:anchor="_Toc244207712" w:history="1">
+          <w:hyperlink w:anchor="_Toc244208383" w:history="1">
             <w:r>
               <w:rPr>
                 <w:rStyle w:val="Hyperlink"/>
@@ -5165,7 +5165,7 @@
               <w:rPr>
                 <w:noProof/>
               </w:rPr>
-              <w:instrText xml:space="preserve"> PAGEREF _Toc244207712 \h </w:instrText>
+              <w:instrText xml:space="preserve"> PAGEREF _Toc244208383 \h </w:instrText>
             </w:r>
             <w:r>
               <w:rPr>
@@ -5207,7 +5207,7 @@
               <w14:ligatures w14:val="standardContextual"/>
             </w:rPr>
           </w:pPr>
-          <w:hyperlink w:anchor="_Toc244207713" w:history="1">
+          <w:hyperlink w:anchor="_Toc244208384" w:history="1">
             <w:r>
               <w:rPr>
                 <w:rStyle w:val="Hyperlink"/>
@@ -5231,7 +5231,7 @@
               <w:rPr>
                 <w:noProof/>
               </w:rPr>
-              <w:instrText xml:space="preserve"> PAGEREF _Toc244207713 \h </w:instrText>
+              <w:instrText xml:space="preserve"> PAGEREF _Toc244208384 \h </w:instrText>
             </w:r>
             <w:r>
               <w:rPr>
@@ -5273,7 +5273,7 @@
               <w14:ligatures w14:val="standardContextual"/>
             </w:rPr>
           </w:pPr>
-          <w:hyperlink w:anchor="_Toc244207714" w:history="1">
+          <w:hyperlink w:anchor="_Toc244208385" w:history="1">
             <w:r>
               <w:rPr>
                 <w:rStyle w:val="Hyperlink"/>
@@ -5297,7 +5297,7 @@
               <w:rPr>
                 <w:noProof/>
               </w:rPr>
-              <w:instrText xml:space="preserve"> PAGEREF _Toc244207714 \h </w:instrText>
+              <w:instrText xml:space="preserve"> PAGEREF _Toc244208385 \h </w:instrText>
             </w:r>
             <w:r>
               <w:rPr>
@@ -5339,7 +5339,7 @@
               <w14:ligatures w14:val="standardContextual"/>
             </w:rPr>
           </w:pPr>
-          <w:hyperlink w:anchor="_Toc244207715" w:history="1">
+          <w:hyperlink w:anchor="_Toc244208386" w:history="1">
             <w:r>
               <w:rPr>
                 <w:rStyle w:val="Hyperlink"/>
@@ -5363,7 +5363,7 @@
               <w:rPr>
                 <w:noProof/>
               </w:rPr>
-              <w:instrText xml:space="preserve"> PAGEREF _Toc244207715 \h </w:instrText>
+              <w:instrText xml:space="preserve"> PAGEREF _Toc244208386 \h </w:instrText>
             </w:r>
             <w:r>
               <w:rPr>
@@ -5405,7 +5405,7 @@
               <w14:ligatures w14:val="standardContextual"/>
             </w:rPr>
           </w:pPr>
-          <w:hyperlink w:anchor="_Toc244207716" w:history="1">
+          <w:hyperlink w:anchor="_Toc244208387" w:history="1">
             <w:r>
               <w:rPr>
                 <w:rStyle w:val="Hyperlink"/>
@@ -5429,7 +5429,7 @@
               <w:rPr>
                 <w:noProof/>
               </w:rPr>
-              <w:instrText xml:space="preserve"> PAGEREF _Toc244207716 \h </w:instrText>
+              <w:instrText xml:space="preserve"> PAGEREF _Toc244208387 \h </w:instrText>
             </w:r>
             <w:r>
               <w:rPr>
@@ -5471,7 +5471,7 @@
               <w14:ligatures w14:val="standardContextual"/>
             </w:rPr>
           </w:pPr>
-          <w:hyperlink w:anchor="_Toc244207717" w:history="1">
+          <w:hyperlink w:anchor="_Toc244208388" w:history="1">
             <w:r>
               <w:rPr>
                 <w:rStyle w:val="Hyperlink"/>
@@ -5495,7 +5495,7 @@
               <w:rPr>
                 <w:noProof/>
               </w:rPr>
-              <w:instrText xml:space="preserve"> PAGEREF _Toc244207717 \h </w:instrText>
+              <w:instrText xml:space="preserve"> PAGEREF _Toc244208388 \h </w:instrText>
             </w:r>
             <w:r>
               <w:rPr>
@@ -5537,7 +5537,7 @@
               <w14:ligatures w14:val="standardContextual"/>
             </w:rPr>
           </w:pPr>
-          <w:hyperlink w:anchor="_Toc244207718" w:history="1">
+          <w:hyperlink w:anchor="_Toc244208389" w:history="1">
             <w:r>
               <w:rPr>
                 <w:rStyle w:val="Hyperlink"/>
@@ -5561,7 +5561,7 @@
               <w:rPr>
                 <w:noProof/>
               </w:rPr>
-              <w:instrText xml:space="preserve"> PAGEREF _Toc244207718 \h </w:instrText>
+              <w:instrText xml:space="preserve"> PAGEREF _Toc244208389 \h </w:instrText>
             </w:r>
             <w:r>
               <w:rPr>
@@ -5603,7 +5603,7 @@
               <w14:ligatures w14:val="standardContextual"/>
             </w:rPr>
           </w:pPr>
-          <w:hyperlink w:anchor="_Toc244207719" w:history="1">
+          <w:hyperlink w:anchor="_Toc244208390" w:history="1">
             <w:r>
               <w:rPr>
                 <w:rStyle w:val="Hyperlink"/>
@@ -5627,7 +5627,7 @@
               <w:rPr>
                 <w:noProof/>
               </w:rPr>
-              <w:instrText xml:space="preserve"> PAGEREF _Toc244207719 \h </w:instrText>
+              <w:instrText xml:space="preserve"> PAGEREF _Toc244208390 \h </w:instrText>
             </w:r>
             <w:r>
               <w:rPr>
@@ -5669,7 +5669,7 @@
               <w14:ligatures w14:val="standardContextual"/>
             </w:rPr>
           </w:pPr>
-          <w:hyperlink w:anchor="_Toc244207720" w:history="1">
+          <w:hyperlink w:anchor="_Toc244208391" w:history="1">
             <w:r>
               <w:rPr>
                 <w:rStyle w:val="Hyperlink"/>
@@ -5693,7 +5693,7 @@
               <w:rPr>
                 <w:noProof/>
               </w:rPr>
-              <w:instrText xml:space="preserve"> PAGEREF _Toc244207720 \h </w:instrText>
+              <w:instrText xml:space="preserve"> PAGEREF _Toc244208391 \h </w:instrText>
             </w:r>
             <w:r>
               <w:rPr>
@@ -5735,7 +5735,7 @@
               <w14:ligatures w14:val="standardContextual"/>
             </w:rPr>
           </w:pPr>
-          <w:hyperlink w:anchor="_Toc244207721" w:history="1">
+          <w:hyperlink w:anchor="_Toc244208392" w:history="1">
             <w:r>
               <w:rPr>
                 <w:rStyle w:val="Hyperlink"/>
@@ -5759,7 +5759,7 @@
               <w:rPr>
                 <w:noProof/>
               </w:rPr>
-              <w:instrText xml:space="preserve"> PAGEREF _Toc244207721 \h </w:instrText>
+              <w:instrText xml:space="preserve"> PAGEREF _Toc244208392 \h </w:instrText>
             </w:r>
             <w:r>
               <w:rPr>
@@ -5801,7 +5801,7 @@
               <w14:ligatures w14:val="standardContextual"/>
             </w:rPr>
           </w:pPr>
-          <w:hyperlink w:anchor="_Toc244207722" w:history="1">
+          <w:hyperlink w:anchor="_Toc244208393" w:history="1">
             <w:r>
               <w:rPr>
                 <w:rStyle w:val="Hyperlink"/>
@@ -5825,7 +5825,7 @@
               <w:rPr>
                 <w:noProof/>
               </w:rPr>
-              <w:instrText xml:space="preserve"> PAGEREF _Toc244207722 \h </w:instrText>
+              <w:instrText xml:space="preserve"> PAGEREF _Toc244208393 \h </w:instrText>
             </w:r>
             <w:r>
               <w:rPr>
@@ -5867,7 +5867,7 @@
               <w14:ligatures w14:val="standardContextual"/>
             </w:rPr>
           </w:pPr>
-          <w:hyperlink w:anchor="_Toc244207723" w:history="1">
+          <w:hyperlink w:anchor="_Toc244208394" w:history="1">
             <w:r>
               <w:rPr>
                 <w:rStyle w:val="Hyperlink"/>
@@ -5891,7 +5891,7 @@
               <w:rPr>
                 <w:noProof/>
               </w:rPr>
-              <w:instrText xml:space="preserve"> PAGEREF _Toc244207723 \h </w:instrText>
+              <w:instrText xml:space="preserve"> PAGEREF _Toc244208394 \h </w:instrText>
             </w:r>
             <w:r>
               <w:rPr>
@@ -5933,7 +5933,7 @@
               <w14:ligatures w14:val="standardContextual"/>
             </w:rPr>
           </w:pPr>
-          <w:hyperlink w:anchor="_Toc244207724" w:history="1">
+          <w:hyperlink w:anchor="_Toc244208395" w:history="1">
             <w:r>
               <w:rPr>
                 <w:rStyle w:val="Hyperlink"/>
@@ -5957,7 +5957,7 @@
               <w:rPr>
                 <w:noProof/>
               </w:rPr>
-              <w:instrText xml:space="preserve"> PAGEREF _Toc244207724 \h </w:instrText>
+              <w:instrText xml:space="preserve"> PAGEREF _Toc244208395 \h </w:instrText>
             </w:r>
             <w:r>
               <w:rPr>
@@ -5999,7 +5999,7 @@
               <w14:ligatures w14:val="standardContextual"/>
             </w:rPr>
           </w:pPr>
-          <w:hyperlink w:anchor="_Toc244207725" w:history="1">
+          <w:hyperlink w:anchor="_Toc244208396" w:history="1">
             <w:r>
               <w:rPr>
                 <w:rStyle w:val="Hyperlink"/>
@@ -6023,7 +6023,7 @@
               <w:rPr>
                 <w:noProof/>
               </w:rPr>
-              <w:instrText xml:space="preserve"> PAGEREF _Toc244207725 \h </w:instrText>
+              <w:instrText xml:space="preserve"> PAGEREF _Toc244208396 \h </w:instrText>
             </w:r>
             <w:r>
               <w:rPr>
@@ -6065,7 +6065,7 @@
               <w14:ligatures w14:val="standardContextual"/>
             </w:rPr>
           </w:pPr>
-          <w:hyperlink w:anchor="_Toc244207726" w:history="1">
+          <w:hyperlink w:anchor="_Toc244208397" w:history="1">
             <w:r>
               <w:rPr>
                 <w:rStyle w:val="Hyperlink"/>
@@ -6089,7 +6089,7 @@
               <w:rPr>
                 <w:noProof/>
               </w:rPr>
-              <w:instrText xml:space="preserve"> PAGEREF _Toc244207726 \h </w:instrText>
+              <w:instrText xml:space="preserve"> PAGEREF _Toc244208397 \h </w:instrText>
             </w:r>
             <w:r>
               <w:rPr>
@@ -6131,7 +6131,7 @@
               <w14:ligatures w14:val="standardContextual"/>
             </w:rPr>
           </w:pPr>
-          <w:hyperlink w:anchor="_Toc244207727" w:history="1">
+          <w:hyperlink w:anchor="_Toc244208398" w:history="1">
             <w:r>
               <w:rPr>
                 <w:rStyle w:val="Hyperlink"/>
@@ -6155,7 +6155,7 @@
               <w:rPr>
                 <w:noProof/>
               </w:rPr>
-              <w:instrText xml:space="preserve"> PAGEREF _Toc244207727 \h </w:instrText>
+              <w:instrText xml:space="preserve"> PAGEREF _Toc244208398 \h </w:instrText>
             </w:r>
             <w:r>
               <w:rPr>
@@ -6197,7 +6197,7 @@
               <w14:ligatures w14:val="standardContextual"/>
             </w:rPr>
           </w:pPr>
-          <w:hyperlink w:anchor="_Toc244207728" w:history="1">
+          <w:hyperlink w:anchor="_Toc244208399" w:history="1">
             <w:r>
               <w:rPr>
                 <w:rStyle w:val="Hyperlink"/>
@@ -6221,7 +6221,7 @@
               <w:rPr>
                 <w:noProof/>
               </w:rPr>
-              <w:instrText xml:space="preserve"> PAGEREF _Toc244207728 \h </w:instrText>
+              <w:instrText xml:space="preserve"> PAGEREF _Toc244208399 \h </w:instrText>
             </w:r>
             <w:r>
               <w:rPr>
@@ -6263,7 +6263,7 @@
               <w14:ligatures w14:val="standardContextual"/>
             </w:rPr>
           </w:pPr>
-          <w:hyperlink w:anchor="_Toc244207729" w:history="1">
+          <w:hyperlink w:anchor="_Toc244208400" w:history="1">
             <w:r>
               <w:rPr>
                 <w:rStyle w:val="Hyperlink"/>
@@ -6287,7 +6287,7 @@
               <w:rPr>
                 <w:noProof/>
               </w:rPr>
-              <w:instrText xml:space="preserve"> PAGEREF _Toc244207729 \h </w:instrText>
+              <w:instrText xml:space="preserve"> PAGEREF _Toc244208400 \h </w:instrText>
             </w:r>
             <w:r>
               <w:rPr>
@@ -6329,7 +6329,7 @@
               <w14:ligatures w14:val="standardContextual"/>
             </w:rPr>
           </w:pPr>
-          <w:hyperlink w:anchor="_Toc244207730" w:history="1">
+          <w:hyperlink w:anchor="_Toc244208401" w:history="1">
             <w:r>
               <w:rPr>
                 <w:rStyle w:val="Hyperlink"/>
@@ -6353,7 +6353,7 @@
               <w:rPr>
                 <w:noProof/>
               </w:rPr>
-              <w:instrText xml:space="preserve"> PAGEREF _Toc244207730 \h </w:instrText>
+              <w:instrText xml:space="preserve"> PAGEREF _Toc244208401 \h </w:instrText>
             </w:r>
             <w:r>
               <w:rPr>
@@ -7790,7 +7790,7 @@
     <w:sdt>
       <w:sdtPr>
         <w:alias w:val="Danh mục hình"/>
-        <w:id w:val="1916508640"/>
+        <w:id w:val="1299416259"/>
       </w:sdtPr>
       <w:sdtEndPr/>
       <w:sdtContent>
@@ -7818,7 +7818,7 @@
           <w:r>
             <w:fldChar w:fldCharType="separate"/>
           </w:r>
-          <w:hyperlink w:anchor="_Toc244207731" w:history="1">
+          <w:hyperlink w:anchor="_Toc244208402" w:history="1">
             <w:r>
               <w:rPr>
                 <w:rStyle w:val="Hyperlink"/>
@@ -7855,7 +7855,7 @@
               <w:rPr>
                 <w:noProof/>
               </w:rPr>
-              <w:instrText xml:space="preserve"> PAGEREF _Toc244207731 \h </w:instrText>
+              <w:instrText xml:space="preserve"> PAGEREF _Toc244208402 \h </w:instrText>
             </w:r>
             <w:r>
               <w:rPr>
@@ -7897,7 +7897,7 @@
               <w14:ligatures w14:val="standardContextual"/>
             </w:rPr>
           </w:pPr>
-          <w:hyperlink w:anchor="_Toc244207732" w:history="1">
+          <w:hyperlink w:anchor="_Toc244208403" w:history="1">
             <w:r>
               <w:rPr>
                 <w:rStyle w:val="Hyperlink"/>
@@ -7934,7 +7934,7 @@
               <w:rPr>
                 <w:noProof/>
               </w:rPr>
-              <w:instrText xml:space="preserve"> PAGEREF _Toc244207732 \h </w:instrText>
+              <w:instrText xml:space="preserve"> PAGEREF _Toc244208403 \h </w:instrText>
             </w:r>
             <w:r>
               <w:rPr>
@@ -7976,7 +7976,7 @@
               <w14:ligatures w14:val="standardContextual"/>
             </w:rPr>
           </w:pPr>
-          <w:hyperlink w:anchor="_Toc244207733" w:history="1">
+          <w:hyperlink w:anchor="_Toc244208404" w:history="1">
             <w:r>
               <w:rPr>
                 <w:rStyle w:val="Hyperlink"/>
@@ -8013,7 +8013,7 @@
               <w:rPr>
                 <w:noProof/>
               </w:rPr>
-              <w:instrText xml:space="preserve"> PAGEREF _Toc244207733 \h </w:instrText>
+              <w:instrText xml:space="preserve"> PAGEREF _Toc244208404 \h </w:instrText>
             </w:r>
             <w:r>
               <w:rPr>
@@ -8055,7 +8055,7 @@
               <w14:ligatures w14:val="standardContextual"/>
             </w:rPr>
           </w:pPr>
-          <w:hyperlink w:anchor="_Toc244207734" w:history="1">
+          <w:hyperlink w:anchor="_Toc244208405" w:history="1">
             <w:r>
               <w:rPr>
                 <w:rStyle w:val="Hyperlink"/>
@@ -8092,7 +8092,7 @@
               <w:rPr>
                 <w:noProof/>
               </w:rPr>
-              <w:instrText xml:space="preserve"> PAGEREF _Toc244207734 \h </w:instrText>
+              <w:instrText xml:space="preserve"> PAGEREF _Toc244208405 \h </w:instrText>
             </w:r>
             <w:r>
               <w:rPr>
@@ -8134,7 +8134,7 @@
               <w14:ligatures w14:val="standardContextual"/>
             </w:rPr>
           </w:pPr>
-          <w:hyperlink w:anchor="_Toc244207735" w:history="1">
+          <w:hyperlink w:anchor="_Toc244208406" w:history="1">
             <w:r>
               <w:rPr>
                 <w:rStyle w:val="Hyperlink"/>
@@ -8171,7 +8171,7 @@
               <w:rPr>
                 <w:noProof/>
               </w:rPr>
-              <w:instrText xml:space="preserve"> PAGEREF _Toc244207735 \h </w:instrText>
+              <w:instrText xml:space="preserve"> PAGEREF _Toc244208406 \h </w:instrText>
             </w:r>
             <w:r>
               <w:rPr>
@@ -8213,7 +8213,7 @@
               <w14:ligatures w14:val="standardContextual"/>
             </w:rPr>
           </w:pPr>
-          <w:hyperlink w:anchor="_Toc244207736" w:history="1">
+          <w:hyperlink w:anchor="_Toc244208407" w:history="1">
             <w:r>
               <w:rPr>
                 <w:rStyle w:val="Hyperlink"/>
@@ -8250,7 +8250,7 @@
               <w:rPr>
                 <w:noProof/>
               </w:rPr>
-              <w:instrText xml:space="preserve"> PAGEREF _Toc244207736 \h </w:instrText>
+              <w:instrText xml:space="preserve"> PAGEREF _Toc244208407 \h </w:instrText>
             </w:r>
             <w:r>
               <w:rPr>
@@ -8292,7 +8292,7 @@
               <w14:ligatures w14:val="standardContextual"/>
             </w:rPr>
           </w:pPr>
-          <w:hyperlink w:anchor="_Toc244207737" w:history="1">
+          <w:hyperlink w:anchor="_Toc244208408" w:history="1">
             <w:r>
               <w:rPr>
                 <w:rStyle w:val="Hyperlink"/>
@@ -8329,7 +8329,7 @@
               <w:rPr>
                 <w:noProof/>
               </w:rPr>
-              <w:instrText xml:space="preserve"> PAGEREF _Toc244207737 \h </w:instrText>
+              <w:instrText xml:space="preserve"> PAGEREF _Toc244208408 \h </w:instrText>
             </w:r>
             <w:r>
               <w:rPr>
@@ -8371,7 +8371,7 @@
               <w14:ligatures w14:val="standardContextual"/>
             </w:rPr>
           </w:pPr>
-          <w:hyperlink w:anchor="_Toc244207738" w:history="1">
+          <w:hyperlink w:anchor="_Toc244208409" w:history="1">
             <w:r>
               <w:rPr>
                 <w:rStyle w:val="Hyperlink"/>
@@ -8408,7 +8408,7 @@
               <w:rPr>
                 <w:noProof/>
               </w:rPr>
-              <w:instrText xml:space="preserve"> PAGEREF _Toc244207738 \h </w:instrText>
+              <w:instrText xml:space="preserve"> PAGEREF _Toc244208409 \h </w:instrText>
             </w:r>
             <w:r>
               <w:rPr>
@@ -8450,7 +8450,7 @@
               <w14:ligatures w14:val="standardContextual"/>
             </w:rPr>
           </w:pPr>
-          <w:hyperlink w:anchor="_Toc244207739" w:history="1">
+          <w:hyperlink w:anchor="_Toc244208410" w:history="1">
             <w:r>
               <w:rPr>
                 <w:rStyle w:val="Hyperlink"/>
@@ -8487,7 +8487,7 @@
               <w:rPr>
                 <w:noProof/>
               </w:rPr>
-              <w:instrText xml:space="preserve"> PAGEREF _Toc244207739 \h </w:instrText>
+              <w:instrText xml:space="preserve"> PAGEREF _Toc244208410 \h </w:instrText>
             </w:r>
             <w:r>
               <w:rPr>
@@ -8534,7 +8534,7 @@
     <w:sdt>
       <w:sdtPr>
         <w:alias w:val="Danh mục bảng"/>
-        <w:id w:val="2012946939"/>
+        <w:id w:val="-1677031775"/>
       </w:sdtPr>
       <w:sdtEndPr/>
       <w:sdtContent>
@@ -8562,7 +8562,7 @@
           <w:r>
             <w:fldChar w:fldCharType="separate"/>
           </w:r>
-          <w:hyperlink w:anchor="_Toc244207740" w:history="1">
+          <w:hyperlink w:anchor="_Toc244208411" w:history="1">
             <w:r>
               <w:rPr>
                 <w:rStyle w:val="Hyperlink"/>
@@ -8599,7 +8599,7 @@
               <w:rPr>
                 <w:noProof/>
               </w:rPr>
-              <w:instrText xml:space="preserve"> PAGEREF _Toc244207740 \h </w:instrText>
+              <w:instrText xml:space="preserve"> PAGEREF _Toc244208411 \h </w:instrText>
             </w:r>
             <w:r>
               <w:rPr>
@@ -8641,7 +8641,7 @@
               <w14:ligatures w14:val="standardContextual"/>
             </w:rPr>
           </w:pPr>
-          <w:hyperlink w:anchor="_Toc244207741" w:history="1">
+          <w:hyperlink w:anchor="_Toc244208412" w:history="1">
             <w:r>
               <w:rPr>
                 <w:rStyle w:val="Hyperlink"/>
@@ -8678,7 +8678,7 @@
               <w:rPr>
                 <w:noProof/>
               </w:rPr>
-              <w:instrText xml:space="preserve"> PAGEREF _Toc244207741 \h </w:instrText>
+              <w:instrText xml:space="preserve"> PAGEREF _Toc244208412 \h </w:instrText>
             </w:r>
             <w:r>
               <w:rPr>
@@ -8720,7 +8720,7 @@
               <w14:ligatures w14:val="standardContextual"/>
             </w:rPr>
           </w:pPr>
-          <w:hyperlink w:anchor="_Toc244207742" w:history="1">
+          <w:hyperlink w:anchor="_Toc244208413" w:history="1">
             <w:r>
               <w:rPr>
                 <w:rStyle w:val="Hyperlink"/>
@@ -8757,7 +8757,7 @@
               <w:rPr>
                 <w:noProof/>
               </w:rPr>
-              <w:instrText xml:space="preserve"> PAGEREF _Toc244207742 \h </w:instrText>
+              <w:instrText xml:space="preserve"> PAGEREF _Toc244208413 \h </w:instrText>
             </w:r>
             <w:r>
               <w:rPr>
@@ -8799,7 +8799,7 @@
               <w14:ligatures w14:val="standardContextual"/>
             </w:rPr>
           </w:pPr>
-          <w:hyperlink w:anchor="_Toc244207743" w:history="1">
+          <w:hyperlink w:anchor="_Toc244208414" w:history="1">
             <w:r>
               <w:rPr>
                 <w:rStyle w:val="Hyperlink"/>
@@ -8836,7 +8836,7 @@
               <w:rPr>
                 <w:noProof/>
               </w:rPr>
-              <w:instrText xml:space="preserve"> PAGEREF _Toc244207743 \h </w:instrText>
+              <w:instrText xml:space="preserve"> PAGEREF _Toc244208414 \h </w:instrText>
             </w:r>
             <w:r>
               <w:rPr>
@@ -8878,7 +8878,7 @@
               <w14:ligatures w14:val="standardContextual"/>
             </w:rPr>
           </w:pPr>
-          <w:hyperlink w:anchor="_Toc244207744" w:history="1">
+          <w:hyperlink w:anchor="_Toc244208415" w:history="1">
             <w:r>
               <w:rPr>
                 <w:rStyle w:val="Hyperlink"/>
@@ -8915,7 +8915,7 @@
               <w:rPr>
                 <w:noProof/>
               </w:rPr>
-              <w:instrText xml:space="preserve"> PAGEREF _Toc244207744 \h </w:instrText>
+              <w:instrText xml:space="preserve"> PAGEREF _Toc244208415 \h </w:instrText>
             </w:r>
             <w:r>
               <w:rPr>
@@ -8957,7 +8957,7 @@
               <w14:ligatures w14:val="standardContextual"/>
             </w:rPr>
           </w:pPr>
-          <w:hyperlink w:anchor="_Toc244207745" w:history="1">
+          <w:hyperlink w:anchor="_Toc244208416" w:history="1">
             <w:r>
               <w:rPr>
                 <w:rStyle w:val="Hyperlink"/>
@@ -8994,7 +8994,7 @@
               <w:rPr>
                 <w:noProof/>
               </w:rPr>
-              <w:instrText xml:space="preserve"> PAGEREF _Toc244207745 \h </w:instrText>
+              <w:instrText xml:space="preserve"> PAGEREF _Toc244208416 \h </w:instrText>
             </w:r>
             <w:r>
               <w:rPr>
@@ -9036,7 +9036,7 @@
               <w14:ligatures w14:val="standardContextual"/>
             </w:rPr>
           </w:pPr>
-          <w:hyperlink w:anchor="_Toc244207746" w:history="1">
+          <w:hyperlink w:anchor="_Toc244208417" w:history="1">
             <w:r>
               <w:rPr>
                 <w:rStyle w:val="Hyperlink"/>
@@ -9073,7 +9073,7 @@
               <w:rPr>
                 <w:noProof/>
               </w:rPr>
-              <w:instrText xml:space="preserve"> PAGEREF _Toc244207746 \h </w:instrText>
+              <w:instrText xml:space="preserve"> PAGEREF _Toc244208417 \h </w:instrText>
             </w:r>
             <w:r>
               <w:rPr>
@@ -9115,7 +9115,7 @@
               <w14:ligatures w14:val="standardContextual"/>
             </w:rPr>
           </w:pPr>
-          <w:hyperlink w:anchor="_Toc244207747" w:history="1">
+          <w:hyperlink w:anchor="_Toc244208418" w:history="1">
             <w:r>
               <w:rPr>
                 <w:rStyle w:val="Hyperlink"/>
@@ -9152,7 +9152,7 @@
               <w:rPr>
                 <w:noProof/>
               </w:rPr>
-              <w:instrText xml:space="preserve"> PAGEREF _Toc244207747 \h </w:instrText>
+              <w:instrText xml:space="preserve"> PAGEREF _Toc244208418 \h </w:instrText>
             </w:r>
             <w:r>
               <w:rPr>
@@ -9194,7 +9194,7 @@
               <w14:ligatures w14:val="standardContextual"/>
             </w:rPr>
           </w:pPr>
-          <w:hyperlink w:anchor="_Toc244207748" w:history="1">
+          <w:hyperlink w:anchor="_Toc244208419" w:history="1">
             <w:r>
               <w:rPr>
                 <w:rStyle w:val="Hyperlink"/>
@@ -9231,7 +9231,7 @@
               <w:rPr>
                 <w:noProof/>
               </w:rPr>
-              <w:instrText xml:space="preserve"> PAGEREF _Toc244207748 \h </w:instrText>
+              <w:instrText xml:space="preserve"> PAGEREF _Toc244208419 \h </w:instrText>
             </w:r>
             <w:r>
               <w:rPr>
@@ -9273,7 +9273,7 @@
               <w14:ligatures w14:val="standardContextual"/>
             </w:rPr>
           </w:pPr>
-          <w:hyperlink w:anchor="_Toc244207749" w:history="1">
+          <w:hyperlink w:anchor="_Toc244208420" w:history="1">
             <w:r>
               <w:rPr>
                 <w:rStyle w:val="Hyperlink"/>
@@ -9310,7 +9310,7 @@
               <w:rPr>
                 <w:noProof/>
               </w:rPr>
-              <w:instrText xml:space="preserve"> PAGEREF _Toc244207749 \h </w:instrText>
+              <w:instrText xml:space="preserve"> PAGEREF _Toc244208420 \h </w:instrText>
             </w:r>
             <w:r>
               <w:rPr>
@@ -9352,7 +9352,7 @@
               <w14:ligatures w14:val="standardContextual"/>
             </w:rPr>
           </w:pPr>
-          <w:hyperlink w:anchor="_Toc244207750" w:history="1">
+          <w:hyperlink w:anchor="_Toc244208421" w:history="1">
             <w:r>
               <w:rPr>
                 <w:rStyle w:val="Hyperlink"/>
@@ -9389,7 +9389,7 @@
               <w:rPr>
                 <w:noProof/>
               </w:rPr>
-              <w:instrText xml:space="preserve"> PAGEREF _Toc244207750 \h </w:instrText>
+              <w:instrText xml:space="preserve"> PAGEREF _Toc244208421 \h </w:instrText>
             </w:r>
             <w:r>
               <w:rPr>
@@ -9431,7 +9431,7 @@
               <w14:ligatures w14:val="standardContextual"/>
             </w:rPr>
           </w:pPr>
-          <w:hyperlink w:anchor="_Toc244207751" w:history="1">
+          <w:hyperlink w:anchor="_Toc244208422" w:history="1">
             <w:r>
               <w:rPr>
                 <w:rStyle w:val="Hyperlink"/>
@@ -9468,7 +9468,7 @@
               <w:rPr>
                 <w:noProof/>
               </w:rPr>
-              <w:instrText xml:space="preserve"> PAGEREF _Toc244207751 \h </w:instrText>
+              <w:instrText xml:space="preserve"> PAGEREF _Toc244208422 \h </w:instrText>
             </w:r>
             <w:r>
               <w:rPr>
@@ -9510,7 +9510,7 @@
               <w14:ligatures w14:val="standardContextual"/>
             </w:rPr>
           </w:pPr>
-          <w:hyperlink w:anchor="_Toc244207752" w:history="1">
+          <w:hyperlink w:anchor="_Toc244208423" w:history="1">
             <w:r>
               <w:rPr>
                 <w:rStyle w:val="Hyperlink"/>
@@ -9547,7 +9547,7 @@
               <w:rPr>
                 <w:noProof/>
               </w:rPr>
-              <w:instrText xml:space="preserve"> PAGEREF _Toc244207752 \h </w:instrText>
+              <w:instrText xml:space="preserve"> PAGEREF _Toc244208423 \h </w:instrText>
             </w:r>
             <w:r>
               <w:rPr>
@@ -9589,7 +9589,7 @@
               <w14:ligatures w14:val="standardContextual"/>
             </w:rPr>
           </w:pPr>
-          <w:hyperlink w:anchor="_Toc244207753" w:history="1">
+          <w:hyperlink w:anchor="_Toc244208424" w:history="1">
             <w:r>
               <w:rPr>
                 <w:rStyle w:val="Hyperlink"/>
@@ -9626,7 +9626,7 @@
               <w:rPr>
                 <w:noProof/>
               </w:rPr>
-              <w:instrText xml:space="preserve"> PAGEREF _Toc244207753 \h </w:instrText>
+              <w:instrText xml:space="preserve"> PAGEREF _Toc244208424 \h </w:instrText>
             </w:r>
             <w:r>
               <w:rPr>
@@ -9668,7 +9668,7 @@
               <w14:ligatures w14:val="standardContextual"/>
             </w:rPr>
           </w:pPr>
-          <w:hyperlink w:anchor="_Toc244207754" w:history="1">
+          <w:hyperlink w:anchor="_Toc244208425" w:history="1">
             <w:r>
               <w:rPr>
                 <w:rStyle w:val="Hyperlink"/>
@@ -9705,7 +9705,7 @@
               <w:rPr>
                 <w:noProof/>
               </w:rPr>
-              <w:instrText xml:space="preserve"> PAGEREF _Toc244207754 \h </w:instrText>
+              <w:instrText xml:space="preserve"> PAGEREF _Toc244208425 \h </w:instrText>
             </w:r>
             <w:r>
               <w:rPr>
@@ -9747,7 +9747,7 @@
               <w14:ligatures w14:val="standardContextual"/>
             </w:rPr>
           </w:pPr>
-          <w:hyperlink w:anchor="_Toc244207755" w:history="1">
+          <w:hyperlink w:anchor="_Toc244208426" w:history="1">
             <w:r>
               <w:rPr>
                 <w:rStyle w:val="Hyperlink"/>
@@ -9784,7 +9784,7 @@
               <w:rPr>
                 <w:noProof/>
               </w:rPr>
-              <w:instrText xml:space="preserve"> PAGEREF _Toc244207755 \h </w:instrText>
+              <w:instrText xml:space="preserve"> PAGEREF _Toc244208426 \h </w:instrText>
             </w:r>
             <w:r>
               <w:rPr>
@@ -9826,7 +9826,7 @@
               <w14:ligatures w14:val="standardContextual"/>
             </w:rPr>
           </w:pPr>
-          <w:hyperlink w:anchor="_Toc244207756" w:history="1">
+          <w:hyperlink w:anchor="_Toc244208427" w:history="1">
             <w:r>
               <w:rPr>
                 <w:rStyle w:val="Hyperlink"/>
@@ -9863,7 +9863,7 @@
               <w:rPr>
                 <w:noProof/>
               </w:rPr>
-              <w:instrText xml:space="preserve"> PAGEREF _Toc244207756 \h </w:instrText>
+              <w:instrText xml:space="preserve"> PAGEREF _Toc244208427 \h </w:instrText>
             </w:r>
             <w:r>
               <w:rPr>
@@ -9905,7 +9905,7 @@
               <w14:ligatures w14:val="standardContextual"/>
             </w:rPr>
           </w:pPr>
-          <w:hyperlink w:anchor="_Toc244207757" w:history="1">
+          <w:hyperlink w:anchor="_Toc244208428" w:history="1">
             <w:r>
               <w:rPr>
                 <w:rStyle w:val="Hyperlink"/>
@@ -9942,7 +9942,7 @@
               <w:rPr>
                 <w:noProof/>
               </w:rPr>
-              <w:instrText xml:space="preserve"> PAGEREF _Toc244207757 \h </w:instrText>
+              <w:instrText xml:space="preserve"> PAGEREF _Toc244208428 \h </w:instrText>
             </w:r>
             <w:r>
               <w:rPr>
@@ -9993,7 +9993,7 @@
         <w:pStyle w:val="Heading1"/>
         <w:pageBreakBefore/>
       </w:pPr>
-      <w:bookmarkStart w:id="0" w:name="_Toc244207652"/>
+      <w:bookmarkStart w:id="0" w:name="_Toc244208323"/>
       <w:r>
         <w:lastRenderedPageBreak/>
         <w:t>LỜI MỞ ĐẦU</w:t>
@@ -10004,7 +10004,7 @@
       <w:pPr>
         <w:pStyle w:val="Heading2"/>
       </w:pPr>
-      <w:bookmarkStart w:id="1" w:name="_Toc244207653"/>
+      <w:bookmarkStart w:id="1" w:name="_Toc244208324"/>
       <w:r>
         <w:t>Lý do chọn đề tài</w:t>
       </w:r>
@@ -10077,7 +10077,7 @@
       <w:pPr>
         <w:pStyle w:val="Heading2"/>
       </w:pPr>
-      <w:bookmarkStart w:id="2" w:name="_Toc244207654"/>
+      <w:bookmarkStart w:id="2" w:name="_Toc244208325"/>
       <w:r>
         <w:t>Mục tiêu đề tài</w:t>
       </w:r>
@@ -10143,7 +10143,7 @@
       <w:pPr>
         <w:pStyle w:val="Heading2"/>
       </w:pPr>
-      <w:bookmarkStart w:id="3" w:name="_Toc244207655"/>
+      <w:bookmarkStart w:id="3" w:name="_Toc244208326"/>
       <w:r>
         <w:t>Đối tượng và phạm vi</w:t>
       </w:r>
@@ -10196,7 +10196,7 @@
       <w:pPr>
         <w:pStyle w:val="Heading2"/>
       </w:pPr>
-      <w:bookmarkStart w:id="4" w:name="_Toc244207656"/>
+      <w:bookmarkStart w:id="4" w:name="_Toc244208327"/>
       <w:r>
         <w:t>Phương pháp thực hiện</w:t>
       </w:r>
@@ -10248,7 +10248,7 @@
       <w:pPr>
         <w:pStyle w:val="Heading2"/>
       </w:pPr>
-      <w:bookmarkStart w:id="5" w:name="_Toc244207657"/>
+      <w:bookmarkStart w:id="5" w:name="_Toc244208328"/>
       <w:r>
         <w:t>Bố cục báo cáo</w:t>
       </w:r>
@@ -10371,7 +10371,7 @@
         <w:pStyle w:val="Heading1"/>
         <w:pageBreakBefore/>
       </w:pPr>
-      <w:bookmarkStart w:id="6" w:name="_Toc244207658"/>
+      <w:bookmarkStart w:id="6" w:name="_Toc244208329"/>
       <w:r>
         <w:lastRenderedPageBreak/>
         <w:t>CHƯƠNG 1. TỔNG QUAN VỀ CƠ SỞ DỮ LIỆU PHÂN TÁN</w:t>
@@ -10382,7 +10382,7 @@
       <w:pPr>
         <w:pStyle w:val="Heading2"/>
       </w:pPr>
-      <w:bookmarkStart w:id="7" w:name="_Toc244207659"/>
+      <w:bookmarkStart w:id="7" w:name="_Toc244208330"/>
       <w:r>
         <w:t>1.1 Khái niệm cơ sở dữ liệu phân tán</w:t>
       </w:r>
@@ -10511,7 +10511,7 @@
           <w:noProof/>
         </w:rPr>
         <w:drawing>
-          <wp:inline distT="0" distB="0" distL="0" distR="0" wp14:anchorId="2B2A8723" wp14:editId="198F080F">
+          <wp:inline distT="0" distB="0" distL="0" distR="0" wp14:anchorId="6D75FB35" wp14:editId="62330422">
             <wp:extent cx="5619750" cy="3619500"/>
             <wp:effectExtent l="0" t="0" r="0" b="0"/>
             <wp:docPr id="1" name="Picture 1"/>
@@ -10556,7 +10556,7 @@
         <w:spacing w:after="160"/>
         <w:jc w:val="center"/>
       </w:pPr>
-      <w:bookmarkStart w:id="8" w:name="_Toc244207731"/>
+      <w:bookmarkStart w:id="8" w:name="_Toc244208402"/>
       <w:r>
         <w:rPr>
           <w:b/>
@@ -10579,7 +10579,7 @@
       <w:pPr>
         <w:pStyle w:val="Heading2"/>
       </w:pPr>
-      <w:bookmarkStart w:id="9" w:name="_Toc244207660"/>
+      <w:bookmarkStart w:id="9" w:name="_Toc244208331"/>
       <w:r>
         <w:lastRenderedPageBreak/>
         <w:t>1.2 So sánh CSDL tập trung và CSDL phân tán</w:t>
@@ -10603,7 +10603,7 @@
         <w:spacing w:before="120" w:after="160"/>
         <w:jc w:val="center"/>
       </w:pPr>
-      <w:bookmarkStart w:id="10" w:name="_Toc244207740"/>
+      <w:bookmarkStart w:id="10" w:name="_Toc244208411"/>
       <w:r>
         <w:rPr>
           <w:b/>
@@ -11470,7 +11470,7 @@
       <w:pPr>
         <w:pStyle w:val="Heading2"/>
       </w:pPr>
-      <w:bookmarkStart w:id="11" w:name="_Toc244207661"/>
+      <w:bookmarkStart w:id="11" w:name="_Toc244208332"/>
       <w:r>
         <w:t>1.3 Kiến trúc tham chiếu của CSDL phân tán</w:t>
       </w:r>
@@ -11592,7 +11592,7 @@
           <w:noProof/>
         </w:rPr>
         <w:drawing>
-          <wp:inline distT="0" distB="0" distL="0" distR="0" wp14:anchorId="1F34DFB9" wp14:editId="4A777F7E">
+          <wp:inline distT="0" distB="0" distL="0" distR="0" wp14:anchorId="5A326B22" wp14:editId="5B44EEF0">
             <wp:extent cx="5619750" cy="4905375"/>
             <wp:effectExtent l="0" t="0" r="0" b="0"/>
             <wp:docPr id="2" name="Picture 2"/>
@@ -11637,7 +11637,7 @@
         <w:spacing w:after="160"/>
         <w:jc w:val="center"/>
       </w:pPr>
-      <w:bookmarkStart w:id="12" w:name="_Toc244207732"/>
+      <w:bookmarkStart w:id="12" w:name="_Toc244208403"/>
       <w:r>
         <w:rPr>
           <w:b/>
@@ -11660,7 +11660,7 @@
       <w:pPr>
         <w:pStyle w:val="Heading2"/>
       </w:pPr>
-      <w:bookmarkStart w:id="13" w:name="_Toc244207662"/>
+      <w:bookmarkStart w:id="13" w:name="_Toc244208333"/>
       <w:r>
         <w:t>1.4 Tính trong suốt trong CSDL phân tán</w:t>
       </w:r>
@@ -11775,7 +11775,7 @@
       <w:pPr>
         <w:pStyle w:val="Heading2"/>
       </w:pPr>
-      <w:bookmarkStart w:id="14" w:name="_Toc244207663"/>
+      <w:bookmarkStart w:id="14" w:name="_Toc244208334"/>
       <w:r>
         <w:t>1.5 Thiết kế cơ sở dữ liệu phân tán</w:t>
       </w:r>
@@ -11785,7 +11785,7 @@
       <w:pPr>
         <w:pStyle w:val="Heading3"/>
       </w:pPr>
-      <w:bookmarkStart w:id="15" w:name="_Toc244207664"/>
+      <w:bookmarkStart w:id="15" w:name="_Toc244208335"/>
       <w:r>
         <w:t>1.5.1 Hai hướng tiếp cận</w:t>
       </w:r>
@@ -11837,7 +11837,7 @@
       <w:pPr>
         <w:pStyle w:val="Heading3"/>
       </w:pPr>
-      <w:bookmarkStart w:id="16" w:name="_Toc244207665"/>
+      <w:bookmarkStart w:id="16" w:name="_Toc244208336"/>
       <w:r>
         <w:t>1.5.2 Hai bài toán chính: phân mảnh và cấp phát</w:t>
       </w:r>
@@ -11913,7 +11913,7 @@
       <w:pPr>
         <w:pStyle w:val="Heading2"/>
       </w:pPr>
-      <w:bookmarkStart w:id="17" w:name="_Toc244207666"/>
+      <w:bookmarkStart w:id="17" w:name="_Toc244208337"/>
       <w:r>
         <w:t>1.6 Kết chương</w:t>
       </w:r>
@@ -11934,7 +11934,7 @@
         <w:pStyle w:val="Heading1"/>
         <w:pageBreakBefore/>
       </w:pPr>
-      <w:bookmarkStart w:id="18" w:name="_Toc244207667"/>
+      <w:bookmarkStart w:id="18" w:name="_Toc244208338"/>
       <w:r>
         <w:lastRenderedPageBreak/>
         <w:t>CHƯƠNG 2. PHÂN MẢNH DỮ LIỆU TRONG CSDL PHÂN TÁN</w:t>
@@ -11945,7 +11945,7 @@
       <w:pPr>
         <w:pStyle w:val="Heading2"/>
       </w:pPr>
-      <w:bookmarkStart w:id="19" w:name="_Toc244207668"/>
+      <w:bookmarkStart w:id="19" w:name="_Toc244208339"/>
       <w:r>
         <w:t>2.1 Lý do và đơn vị phân mảnh</w:t>
       </w:r>
@@ -12125,7 +12125,7 @@
           <w:noProof/>
         </w:rPr>
         <w:drawing>
-          <wp:inline distT="0" distB="0" distL="0" distR="0" wp14:anchorId="6562E2F5" wp14:editId="1DA9B735">
+          <wp:inline distT="0" distB="0" distL="0" distR="0" wp14:anchorId="7E8F4320" wp14:editId="590F2FF0">
             <wp:extent cx="5619750" cy="1790700"/>
             <wp:effectExtent l="0" t="0" r="0" b="0"/>
             <wp:docPr id="3" name="Picture 3"/>
@@ -12170,7 +12170,7 @@
         <w:spacing w:after="160"/>
         <w:jc w:val="center"/>
       </w:pPr>
-      <w:bookmarkStart w:id="20" w:name="_Toc244207733"/>
+      <w:bookmarkStart w:id="20" w:name="_Toc244208404"/>
       <w:r>
         <w:rPr>
           <w:b/>
@@ -12193,7 +12193,7 @@
       <w:pPr>
         <w:pStyle w:val="Heading2"/>
       </w:pPr>
-      <w:bookmarkStart w:id="21" w:name="_Toc244207669"/>
+      <w:bookmarkStart w:id="21" w:name="_Toc244208340"/>
       <w:r>
         <w:lastRenderedPageBreak/>
         <w:t>2.2 Các quy tắc đúng đắn của phân mảnh</w:t>
@@ -12331,7 +12331,7 @@
       <w:pPr>
         <w:pStyle w:val="Heading2"/>
       </w:pPr>
-      <w:bookmarkStart w:id="22" w:name="_Toc244207670"/>
+      <w:bookmarkStart w:id="22" w:name="_Toc244208341"/>
       <w:r>
         <w:t>2.3 Phân mảnh ngang nguyên thủy</w:t>
       </w:r>
@@ -12341,7 +12341,7 @@
       <w:pPr>
         <w:pStyle w:val="Heading3"/>
       </w:pPr>
-      <w:bookmarkStart w:id="23" w:name="_Toc244207671"/>
+      <w:bookmarkStart w:id="23" w:name="_Toc244208342"/>
       <w:r>
         <w:t>2.3.1 Định nghĩa</w:t>
       </w:r>
@@ -12437,7 +12437,7 @@
       <w:pPr>
         <w:pStyle w:val="Heading3"/>
       </w:pPr>
-      <w:bookmarkStart w:id="24" w:name="_Toc244207672"/>
+      <w:bookmarkStart w:id="24" w:name="_Toc244208343"/>
       <w:r>
         <w:t>2.3.2 Vị từ đơn giản và vị từ hội sơ cấp</w:t>
       </w:r>
@@ -12607,7 +12607,7 @@
       <w:pPr>
         <w:pStyle w:val="Heading3"/>
       </w:pPr>
-      <w:bookmarkStart w:id="25" w:name="_Toc244207673"/>
+      <w:bookmarkStart w:id="25" w:name="_Toc244208344"/>
       <w:r>
         <w:t>2.3.3 Tính đầy đủ và cực tiểu của tập vị từ</w:t>
       </w:r>
@@ -12774,7 +12774,7 @@
       <w:pPr>
         <w:pStyle w:val="Heading3"/>
       </w:pPr>
-      <w:bookmarkStart w:id="26" w:name="_Toc244207674"/>
+      <w:bookmarkStart w:id="26" w:name="_Toc244208345"/>
       <w:r>
         <w:t>2.3.4 Ví dụ</w:t>
       </w:r>
@@ -12997,7 +12997,7 @@
       <w:pPr>
         <w:pStyle w:val="Heading2"/>
       </w:pPr>
-      <w:bookmarkStart w:id="27" w:name="_Toc244207675"/>
+      <w:bookmarkStart w:id="27" w:name="_Toc244208346"/>
       <w:r>
         <w:t>2.4 Phân mảnh ngang dẫn xuất</w:t>
       </w:r>
@@ -13007,7 +13007,7 @@
       <w:pPr>
         <w:pStyle w:val="Heading3"/>
       </w:pPr>
-      <w:bookmarkStart w:id="28" w:name="_Toc244207676"/>
+      <w:bookmarkStart w:id="28" w:name="_Toc244208347"/>
       <w:r>
         <w:t>2.4.1 Định nghĩa</w:t>
       </w:r>
@@ -13112,7 +13112,7 @@
       <w:pPr>
         <w:pStyle w:val="Heading3"/>
       </w:pPr>
-      <w:bookmarkStart w:id="29" w:name="_Toc244207677"/>
+      <w:bookmarkStart w:id="29" w:name="_Toc244208348"/>
       <w:r>
         <w:t>2.4.2 Ví dụ</w:t>
       </w:r>
@@ -13227,7 +13227,7 @@
           <w:noProof/>
         </w:rPr>
         <w:drawing>
-          <wp:inline distT="0" distB="0" distL="0" distR="0" wp14:anchorId="12E63CCE" wp14:editId="25B7686E">
+          <wp:inline distT="0" distB="0" distL="0" distR="0" wp14:anchorId="36AEFA35" wp14:editId="71C18BEE">
             <wp:extent cx="5619750" cy="1228725"/>
             <wp:effectExtent l="0" t="0" r="0" b="0"/>
             <wp:docPr id="4" name="Picture 4"/>
@@ -13272,7 +13272,7 @@
         <w:spacing w:after="160"/>
         <w:jc w:val="center"/>
       </w:pPr>
-      <w:bookmarkStart w:id="30" w:name="_Toc244207734"/>
+      <w:bookmarkStart w:id="30" w:name="_Toc244208405"/>
       <w:r>
         <w:rPr>
           <w:b/>
@@ -13344,7 +13344,7 @@
       <w:pPr>
         <w:pStyle w:val="Heading3"/>
       </w:pPr>
-      <w:bookmarkStart w:id="31" w:name="_Toc244207678"/>
+      <w:bookmarkStart w:id="31" w:name="_Toc244208349"/>
       <w:r>
         <w:t>2.4.3 Tính đúng đắn và lựa chọn quan hệ chủ</w:t>
       </w:r>
@@ -13445,7 +13445,7 @@
       <w:pPr>
         <w:pStyle w:val="Heading2"/>
       </w:pPr>
-      <w:bookmarkStart w:id="32" w:name="_Toc244207679"/>
+      <w:bookmarkStart w:id="32" w:name="_Toc244208350"/>
       <w:r>
         <w:t>2.5 Phân mảnh dọc</w:t>
       </w:r>
@@ -13455,7 +13455,7 @@
       <w:pPr>
         <w:pStyle w:val="Heading3"/>
       </w:pPr>
-      <w:bookmarkStart w:id="33" w:name="_Toc244207680"/>
+      <w:bookmarkStart w:id="33" w:name="_Toc244208351"/>
       <w:r>
         <w:t>2.5.1 Định nghĩa</w:t>
       </w:r>
@@ -13606,7 +13606,7 @@
       <w:pPr>
         <w:pStyle w:val="Heading3"/>
       </w:pPr>
-      <w:bookmarkStart w:id="34" w:name="_Toc244207681"/>
+      <w:bookmarkStart w:id="34" w:name="_Toc244208352"/>
       <w:r>
         <w:t>2.5.2 Ma trận sử dụng và ma trận ái lực</w:t>
       </w:r>
@@ -13792,7 +13792,7 @@
       <w:pPr>
         <w:pStyle w:val="Heading3"/>
       </w:pPr>
-      <w:bookmarkStart w:id="35" w:name="_Toc244207682"/>
+      <w:bookmarkStart w:id="35" w:name="_Toc244208353"/>
       <w:r>
         <w:t>2.5.3 Thuật toán BEA</w:t>
       </w:r>
@@ -13967,7 +13967,7 @@
       <w:pPr>
         <w:pStyle w:val="Heading3"/>
       </w:pPr>
-      <w:bookmarkStart w:id="36" w:name="_Toc244207683"/>
+      <w:bookmarkStart w:id="36" w:name="_Toc244208354"/>
       <w:r>
         <w:t>2.5.4 Thuật toán SPLIT</w:t>
       </w:r>
@@ -14011,7 +14011,7 @@
       <w:pPr>
         <w:pStyle w:val="Heading3"/>
       </w:pPr>
-      <w:bookmarkStart w:id="37" w:name="_Toc244207684"/>
+      <w:bookmarkStart w:id="37" w:name="_Toc244208355"/>
       <w:r>
         <w:t>2.5.5 Ví dụ</w:t>
       </w:r>
@@ -14034,7 +14034,7 @@
         <w:spacing w:before="120" w:after="160"/>
         <w:jc w:val="center"/>
       </w:pPr>
-      <w:bookmarkStart w:id="38" w:name="_Toc244207741"/>
+      <w:bookmarkStart w:id="38" w:name="_Toc244208412"/>
       <w:r>
         <w:rPr>
           <w:b/>
@@ -15029,7 +15029,7 @@
         <w:spacing w:before="120" w:after="160"/>
         <w:jc w:val="center"/>
       </w:pPr>
-      <w:bookmarkStart w:id="39" w:name="_Toc244207742"/>
+      <w:bookmarkStart w:id="39" w:name="_Toc244208413"/>
       <w:r>
         <w:rPr>
           <w:b/>
@@ -16033,7 +16033,7 @@
         <w:spacing w:before="120" w:after="160"/>
         <w:jc w:val="center"/>
       </w:pPr>
-      <w:bookmarkStart w:id="40" w:name="_Toc244207743"/>
+      <w:bookmarkStart w:id="40" w:name="_Toc244208414"/>
       <w:r>
         <w:rPr>
           <w:b/>
@@ -17225,7 +17225,7 @@
         <w:spacing w:before="120" w:after="160"/>
         <w:jc w:val="center"/>
       </w:pPr>
-      <w:bookmarkStart w:id="41" w:name="_Toc244207744"/>
+      <w:bookmarkStart w:id="41" w:name="_Toc244208415"/>
       <w:r>
         <w:rPr>
           <w:b/>
@@ -18415,7 +18415,7 @@
         <w:spacing w:before="120" w:after="160"/>
         <w:jc w:val="center"/>
       </w:pPr>
-      <w:bookmarkStart w:id="42" w:name="_Toc244207745"/>
+      <w:bookmarkStart w:id="42" w:name="_Toc244208416"/>
       <w:r>
         <w:rPr>
           <w:b/>
@@ -19330,7 +19330,7 @@
       <w:pPr>
         <w:pStyle w:val="Heading2"/>
       </w:pPr>
-      <w:bookmarkStart w:id="43" w:name="_Toc244207685"/>
+      <w:bookmarkStart w:id="43" w:name="_Toc244208356"/>
       <w:r>
         <w:t>2.6 Cấp phát và nhân bản</w:t>
       </w:r>
@@ -19426,7 +19426,7 @@
       <w:pPr>
         <w:pStyle w:val="Heading2"/>
       </w:pPr>
-      <w:bookmarkStart w:id="44" w:name="_Toc244207686"/>
+      <w:bookmarkStart w:id="44" w:name="_Toc244208357"/>
       <w:r>
         <w:lastRenderedPageBreak/>
         <w:t>2.7 Kết chương</w:t>
@@ -19448,7 +19448,7 @@
         <w:pStyle w:val="Heading1"/>
         <w:pageBreakBefore/>
       </w:pPr>
-      <w:bookmarkStart w:id="45" w:name="_Toc244207687"/>
+      <w:bookmarkStart w:id="45" w:name="_Toc244208358"/>
       <w:r>
         <w:lastRenderedPageBreak/>
         <w:t>CHƯƠNG 3. PHÂN MẢNH HỖN HỢP</w:t>
@@ -19459,7 +19459,7 @@
       <w:pPr>
         <w:pStyle w:val="Heading2"/>
       </w:pPr>
-      <w:bookmarkStart w:id="46" w:name="_Toc244207688"/>
+      <w:bookmarkStart w:id="46" w:name="_Toc244208359"/>
       <w:r>
         <w:t>3.1 Định nghĩa và động cơ sử dụng</w:t>
       </w:r>
@@ -19469,7 +19469,7 @@
       <w:pPr>
         <w:pStyle w:val="Heading3"/>
       </w:pPr>
-      <w:bookmarkStart w:id="47" w:name="_Toc244207689"/>
+      <w:bookmarkStart w:id="47" w:name="_Toc244208360"/>
       <w:r>
         <w:t>3.1.1 Động cơ</w:t>
       </w:r>
@@ -19512,7 +19512,7 @@
         <w:spacing w:before="120" w:after="160"/>
         <w:jc w:val="center"/>
       </w:pPr>
-      <w:bookmarkStart w:id="48" w:name="_Toc244207746"/>
+      <w:bookmarkStart w:id="48" w:name="_Toc244208417"/>
       <w:r>
         <w:rPr>
           <w:b/>
@@ -20057,7 +20057,7 @@
       <w:pPr>
         <w:pStyle w:val="Heading3"/>
       </w:pPr>
-      <w:bookmarkStart w:id="49" w:name="_Toc244207690"/>
+      <w:bookmarkStart w:id="49" w:name="_Toc244208361"/>
       <w:r>
         <w:t>3.1.2 Định nghĩa</w:t>
       </w:r>
@@ -20238,7 +20238,7 @@
       <w:pPr>
         <w:pStyle w:val="Heading2"/>
       </w:pPr>
-      <w:bookmarkStart w:id="50" w:name="_Toc244207691"/>
+      <w:bookmarkStart w:id="50" w:name="_Toc244208362"/>
       <w:r>
         <w:t>3.2 Chiến lược ngang trước, dọc sau (HV)</w:t>
       </w:r>
@@ -20417,7 +20417,7 @@
         </w:rPr>
         <w:lastRenderedPageBreak/>
         <w:drawing>
-          <wp:inline distT="0" distB="0" distL="0" distR="0" wp14:anchorId="082E0347" wp14:editId="684080EC">
+          <wp:inline distT="0" distB="0" distL="0" distR="0" wp14:anchorId="29223102" wp14:editId="1FBEE3D5">
             <wp:extent cx="5619750" cy="2800350"/>
             <wp:effectExtent l="0" t="0" r="0" b="0"/>
             <wp:docPr id="5" name="Picture 5"/>
@@ -20462,7 +20462,7 @@
         <w:spacing w:after="160"/>
         <w:jc w:val="center"/>
       </w:pPr>
-      <w:bookmarkStart w:id="51" w:name="_Toc244207735"/>
+      <w:bookmarkStart w:id="51" w:name="_Toc244208406"/>
       <w:r>
         <w:rPr>
           <w:b/>
@@ -20485,7 +20485,7 @@
       <w:pPr>
         <w:pStyle w:val="Heading2"/>
       </w:pPr>
-      <w:bookmarkStart w:id="52" w:name="_Toc244207692"/>
+      <w:bookmarkStart w:id="52" w:name="_Toc244208363"/>
       <w:r>
         <w:t>3.3 Chiến lược dọc trước, ngang sau (VH)</w:t>
       </w:r>
@@ -20671,7 +20671,7 @@
         </w:rPr>
         <w:lastRenderedPageBreak/>
         <w:drawing>
-          <wp:inline distT="0" distB="0" distL="0" distR="0" wp14:anchorId="0D9EDE8A" wp14:editId="22CC10D4">
+          <wp:inline distT="0" distB="0" distL="0" distR="0" wp14:anchorId="79372E81" wp14:editId="54FFF9AE">
             <wp:extent cx="5619750" cy="3028950"/>
             <wp:effectExtent l="0" t="0" r="0" b="0"/>
             <wp:docPr id="6" name="Picture 6"/>
@@ -20716,7 +20716,7 @@
         <w:spacing w:after="160"/>
         <w:jc w:val="center"/>
       </w:pPr>
-      <w:bookmarkStart w:id="53" w:name="_Toc244207736"/>
+      <w:bookmarkStart w:id="53" w:name="_Toc244208407"/>
       <w:r>
         <w:rPr>
           <w:b/>
@@ -20739,7 +20739,7 @@
       <w:pPr>
         <w:pStyle w:val="Heading3"/>
       </w:pPr>
-      <w:bookmarkStart w:id="54" w:name="_Toc244207693"/>
+      <w:bookmarkStart w:id="54" w:name="_Toc244208364"/>
       <w:r>
         <w:t>3.3.1 Quan hệ giữa HV và VH</w:t>
       </w:r>
@@ -20897,7 +20897,7 @@
       <w:pPr>
         <w:pStyle w:val="Heading2"/>
       </w:pPr>
-      <w:bookmarkStart w:id="55" w:name="_Toc244207694"/>
+      <w:bookmarkStart w:id="55" w:name="_Toc244208365"/>
       <w:r>
         <w:t>3.4 Cây phân mảnh và biểu diễn bằng đại số quan hệ</w:t>
       </w:r>
@@ -21110,7 +21110,7 @@
       <w:pPr>
         <w:pStyle w:val="Heading2"/>
       </w:pPr>
-      <w:bookmarkStart w:id="56" w:name="_Toc244207695"/>
+      <w:bookmarkStart w:id="56" w:name="_Toc244208366"/>
       <w:r>
         <w:t>3.5 Tái thiết quan hệ toàn cục</w:t>
       </w:r>
@@ -21569,7 +21569,7 @@
       <w:pPr>
         <w:pStyle w:val="Heading2"/>
       </w:pPr>
-      <w:bookmarkStart w:id="57" w:name="_Toc244207696"/>
+      <w:bookmarkStart w:id="57" w:name="_Toc244208367"/>
       <w:r>
         <w:t>3.6 Kiểm tra tính đúng đắn</w:t>
       </w:r>
@@ -21717,7 +21717,7 @@
       <w:pPr>
         <w:pStyle w:val="Heading2"/>
       </w:pPr>
-      <w:bookmarkStart w:id="58" w:name="_Toc244207697"/>
+      <w:bookmarkStart w:id="58" w:name="_Toc244208368"/>
       <w:r>
         <w:t>3.7 Cấp phát mảnh hỗn hợp và ảnh hưởng đến xử lý</w:t>
       </w:r>
@@ -21727,7 +21727,7 @@
       <w:pPr>
         <w:pStyle w:val="Heading3"/>
       </w:pPr>
-      <w:bookmarkStart w:id="59" w:name="_Toc244207698"/>
+      <w:bookmarkStart w:id="59" w:name="_Toc244208369"/>
       <w:r>
         <w:t>3.7.1 Cấp phát</w:t>
       </w:r>
@@ -21757,7 +21757,7 @@
       <w:pPr>
         <w:pStyle w:val="Heading3"/>
       </w:pPr>
-      <w:bookmarkStart w:id="60" w:name="_Toc244207699"/>
+      <w:bookmarkStart w:id="60" w:name="_Toc244208370"/>
       <w:r>
         <w:t>3.7.2 Ảnh hưởng đến xử lý truy vấn</w:t>
       </w:r>
@@ -21911,7 +21911,7 @@
       <w:pPr>
         <w:pStyle w:val="Heading3"/>
       </w:pPr>
-      <w:bookmarkStart w:id="61" w:name="_Toc244207700"/>
+      <w:bookmarkStart w:id="61" w:name="_Toc244208371"/>
       <w:r>
         <w:lastRenderedPageBreak/>
         <w:t>3.7.3 Ảnh hưởng đến cập nhật và giao dịch</w:t>
@@ -21994,7 +21994,7 @@
       <w:pPr>
         <w:pStyle w:val="Heading2"/>
       </w:pPr>
-      <w:bookmarkStart w:id="62" w:name="_Toc244207701"/>
+      <w:bookmarkStart w:id="62" w:name="_Toc244208372"/>
       <w:r>
         <w:t>3.8 Ưu điểm, hạn chế và so sánh</w:t>
       </w:r>
@@ -22178,7 +22178,7 @@
         <w:spacing w:before="120" w:after="160"/>
         <w:jc w:val="center"/>
       </w:pPr>
-      <w:bookmarkStart w:id="63" w:name="_Toc244207747"/>
+      <w:bookmarkStart w:id="63" w:name="_Toc244208418"/>
       <w:r>
         <w:rPr>
           <w:b/>
@@ -23291,7 +23291,7 @@
       <w:pPr>
         <w:pStyle w:val="Heading2"/>
       </w:pPr>
-      <w:bookmarkStart w:id="64" w:name="_Toc244207702"/>
+      <w:bookmarkStart w:id="64" w:name="_Toc244208373"/>
       <w:r>
         <w:t>3.9 Hỗ trợ trong các hệ quản trị thực tế</w:t>
       </w:r>
@@ -23507,7 +23507,7 @@
       <w:pPr>
         <w:pStyle w:val="Heading2"/>
       </w:pPr>
-      <w:bookmarkStart w:id="65" w:name="_Toc244207703"/>
+      <w:bookmarkStart w:id="65" w:name="_Toc244208374"/>
       <w:r>
         <w:t>3.10 Kết chương</w:t>
       </w:r>
@@ -23532,7 +23532,7 @@
         <w:pStyle w:val="Heading1"/>
         <w:pageBreakBefore/>
       </w:pPr>
-      <w:bookmarkStart w:id="66" w:name="_Toc244207704"/>
+      <w:bookmarkStart w:id="66" w:name="_Toc244208375"/>
       <w:r>
         <w:lastRenderedPageBreak/>
         <w:t>CHƯƠNG 4. ỨNG DỤNG PHÂN MẢNH HỖN HỢP CHO HỆ THỐNG QUẢN LÝ ĐƠN HÀNG</w:t>
@@ -23543,7 +23543,7 @@
       <w:pPr>
         <w:pStyle w:val="Heading2"/>
       </w:pPr>
-      <w:bookmarkStart w:id="67" w:name="_Toc244207705"/>
+      <w:bookmarkStart w:id="67" w:name="_Toc244208376"/>
       <w:r>
         <w:t>4.1 Mô tả bài toán</w:t>
       </w:r>
@@ -23566,7 +23566,7 @@
         <w:spacing w:before="120" w:after="160"/>
         <w:jc w:val="center"/>
       </w:pPr>
-      <w:bookmarkStart w:id="68" w:name="_Toc244207748"/>
+      <w:bookmarkStart w:id="68" w:name="_Toc244208419"/>
       <w:r>
         <w:rPr>
           <w:b/>
@@ -24377,7 +24377,7 @@
       <w:pPr>
         <w:pStyle w:val="Heading2"/>
       </w:pPr>
-      <w:bookmarkStart w:id="69" w:name="_Toc244207706"/>
+      <w:bookmarkStart w:id="69" w:name="_Toc244208377"/>
       <w:r>
         <w:t>4.2 Lược đồ toàn cục</w:t>
       </w:r>
@@ -24568,7 +24568,7 @@
           <w:noProof/>
         </w:rPr>
         <w:drawing>
-          <wp:inline distT="0" distB="0" distL="0" distR="0" wp14:anchorId="09AE4D71" wp14:editId="7EDD92E8">
+          <wp:inline distT="0" distB="0" distL="0" distR="0" wp14:anchorId="7B1A7AEC" wp14:editId="41EAB375">
             <wp:extent cx="5619750" cy="3076575"/>
             <wp:effectExtent l="0" t="0" r="0" b="0"/>
             <wp:docPr id="7" name="Picture 7"/>
@@ -24613,7 +24613,7 @@
         <w:spacing w:after="160"/>
         <w:jc w:val="center"/>
       </w:pPr>
-      <w:bookmarkStart w:id="70" w:name="_Toc244207737"/>
+      <w:bookmarkStart w:id="70" w:name="_Toc244208408"/>
       <w:r>
         <w:rPr>
           <w:b/>
@@ -24636,7 +24636,7 @@
       <w:pPr>
         <w:pStyle w:val="Heading2"/>
       </w:pPr>
-      <w:bookmarkStart w:id="71" w:name="_Toc244207707"/>
+      <w:bookmarkStart w:id="71" w:name="_Toc244208378"/>
       <w:r>
         <w:t>4.3 Phân tích ứng dụng</w:t>
       </w:r>
@@ -24659,7 +24659,7 @@
         <w:spacing w:before="120" w:after="160"/>
         <w:jc w:val="center"/>
       </w:pPr>
-      <w:bookmarkStart w:id="72" w:name="_Toc244207749"/>
+      <w:bookmarkStart w:id="72" w:name="_Toc244208420"/>
       <w:r>
         <w:rPr>
           <w:b/>
@@ -26007,7 +26007,7 @@
           <w:noProof/>
         </w:rPr>
         <w:drawing>
-          <wp:inline distT="0" distB="0" distL="0" distR="0" wp14:anchorId="1559CA97" wp14:editId="30BDC385">
+          <wp:inline distT="0" distB="0" distL="0" distR="0" wp14:anchorId="63F375EE" wp14:editId="0E0010EB">
             <wp:extent cx="5619750" cy="1809750"/>
             <wp:effectExtent l="0" t="0" r="0" b="0"/>
             <wp:docPr id="8" name="Picture 8"/>
@@ -26052,7 +26052,7 @@
         <w:spacing w:after="160"/>
         <w:jc w:val="center"/>
       </w:pPr>
-      <w:bookmarkStart w:id="73" w:name="_Toc244207738"/>
+      <w:bookmarkStart w:id="73" w:name="_Toc244208409"/>
       <w:r>
         <w:rPr>
           <w:b/>
@@ -26075,7 +26075,7 @@
       <w:pPr>
         <w:pStyle w:val="Heading2"/>
       </w:pPr>
-      <w:bookmarkStart w:id="74" w:name="_Toc244207708"/>
+      <w:bookmarkStart w:id="74" w:name="_Toc244208379"/>
       <w:r>
         <w:t>4.4 Thiết kế phân mảnh</w:t>
       </w:r>
@@ -26098,7 +26098,7 @@
         <w:spacing w:before="120" w:after="160"/>
         <w:jc w:val="center"/>
       </w:pPr>
-      <w:bookmarkStart w:id="75" w:name="_Toc244207750"/>
+      <w:bookmarkStart w:id="75" w:name="_Toc244208421"/>
       <w:r>
         <w:rPr>
           <w:b/>
@@ -26914,7 +26914,7 @@
       <w:pPr>
         <w:pStyle w:val="Heading3"/>
       </w:pPr>
-      <w:bookmarkStart w:id="76" w:name="_Toc244207709"/>
+      <w:bookmarkStart w:id="76" w:name="_Toc244208380"/>
       <w:r>
         <w:t>4.4.1 KhachHang – phân mảnh hỗn hợp HV</w:t>
       </w:r>
@@ -27317,7 +27317,7 @@
       <w:pPr>
         <w:pStyle w:val="Heading3"/>
       </w:pPr>
-      <w:bookmarkStart w:id="77" w:name="_Toc244207710"/>
+      <w:bookmarkStart w:id="77" w:name="_Toc244208381"/>
       <w:r>
         <w:t>4.4.2 NhanVien – phân mảnh hỗn hợp VH</w:t>
       </w:r>
@@ -27616,7 +27616,7 @@
       <w:pPr>
         <w:pStyle w:val="Heading3"/>
       </w:pPr>
-      <w:bookmarkStart w:id="78" w:name="_Toc244207711"/>
+      <w:bookmarkStart w:id="78" w:name="_Toc244208382"/>
       <w:r>
         <w:t>4.4.3 DonHang, ChiTietDonHang – phân mảnh ngang dẫn xuất</w:t>
       </w:r>
@@ -27748,7 +27748,7 @@
       <w:pPr>
         <w:pStyle w:val="Heading3"/>
       </w:pPr>
-      <w:bookmarkStart w:id="79" w:name="_Toc244207712"/>
+      <w:bookmarkStart w:id="79" w:name="_Toc244208383"/>
       <w:r>
         <w:t>4.4.4 ChiNhanh, SanPham – nhân bản toàn phần</w:t>
       </w:r>
@@ -27768,7 +27768,7 @@
       <w:pPr>
         <w:pStyle w:val="Heading2"/>
       </w:pPr>
-      <w:bookmarkStart w:id="80" w:name="_Toc244207713"/>
+      <w:bookmarkStart w:id="80" w:name="_Toc244208384"/>
       <w:r>
         <w:t>4.5 Kiểm tra tính đúng đắn</w:t>
       </w:r>
@@ -27791,7 +27791,7 @@
         <w:spacing w:before="120" w:after="160"/>
         <w:jc w:val="center"/>
       </w:pPr>
-      <w:bookmarkStart w:id="81" w:name="_Toc244207751"/>
+      <w:bookmarkStart w:id="81" w:name="_Toc244208422"/>
       <w:r>
         <w:rPr>
           <w:b/>
@@ -28317,7 +28317,7 @@
       <w:pPr>
         <w:pStyle w:val="Heading2"/>
       </w:pPr>
-      <w:bookmarkStart w:id="82" w:name="_Toc244207714"/>
+      <w:bookmarkStart w:id="82" w:name="_Toc244208385"/>
       <w:r>
         <w:lastRenderedPageBreak/>
         <w:t>4.6 Lược đồ cấp phát</w:t>
@@ -28341,7 +28341,7 @@
         <w:spacing w:before="120" w:after="160"/>
         <w:jc w:val="center"/>
       </w:pPr>
-      <w:bookmarkStart w:id="83" w:name="_Toc244207752"/>
+      <w:bookmarkStart w:id="83" w:name="_Toc244208423"/>
       <w:r>
         <w:rPr>
           <w:b/>
@@ -28738,7 +28738,7 @@
           <w:noProof/>
         </w:rPr>
         <w:drawing>
-          <wp:inline distT="0" distB="0" distL="0" distR="0" wp14:anchorId="7B0295C9" wp14:editId="2D39435F">
+          <wp:inline distT="0" distB="0" distL="0" distR="0" wp14:anchorId="3395B89A" wp14:editId="11D7AC63">
             <wp:extent cx="5619750" cy="3486150"/>
             <wp:effectExtent l="0" t="0" r="0" b="0"/>
             <wp:docPr id="9" name="Picture 9"/>
@@ -28783,7 +28783,7 @@
         <w:spacing w:after="160"/>
         <w:jc w:val="center"/>
       </w:pPr>
-      <w:bookmarkStart w:id="84" w:name="_Toc244207739"/>
+      <w:bookmarkStart w:id="84" w:name="_Toc244208410"/>
       <w:r>
         <w:rPr>
           <w:b/>
@@ -28892,7 +28892,7 @@
       <w:pPr>
         <w:pStyle w:val="Heading2"/>
       </w:pPr>
-      <w:bookmarkStart w:id="85" w:name="_Toc244207715"/>
+      <w:bookmarkStart w:id="85" w:name="_Toc244208386"/>
       <w:r>
         <w:lastRenderedPageBreak/>
         <w:t>4.7 Cài đặt thực nghiệm trên SQL Server</w:t>
@@ -28903,7 +28903,7 @@
       <w:pPr>
         <w:pStyle w:val="Heading3"/>
       </w:pPr>
-      <w:bookmarkStart w:id="86" w:name="_Toc244207716"/>
+      <w:bookmarkStart w:id="86" w:name="_Toc244208387"/>
       <w:r>
         <w:t>4.7.1 Môi trường và cách mô phỏng</w:t>
       </w:r>
@@ -28972,7 +28972,7 @@
         <w:spacing w:before="120" w:after="160"/>
         <w:jc w:val="center"/>
       </w:pPr>
-      <w:bookmarkStart w:id="87" w:name="_Toc244207753"/>
+      <w:bookmarkStart w:id="87" w:name="_Toc244208424"/>
       <w:r>
         <w:rPr>
           <w:b/>
@@ -29372,7 +29372,7 @@
       <w:pPr>
         <w:pStyle w:val="Heading3"/>
       </w:pPr>
-      <w:bookmarkStart w:id="88" w:name="_Toc244207717"/>
+      <w:bookmarkStart w:id="88" w:name="_Toc244208388"/>
       <w:r>
         <w:t>4.7.2 Tạo các mảnh</w:t>
       </w:r>
@@ -29801,7 +29801,7 @@
         <w:spacing w:before="120" w:after="160"/>
         <w:jc w:val="center"/>
       </w:pPr>
-      <w:bookmarkStart w:id="89" w:name="_Toc244207754"/>
+      <w:bookmarkStart w:id="89" w:name="_Toc244208425"/>
       <w:r>
         <w:rPr>
           <w:b/>
@@ -30209,7 +30209,7 @@
       <w:pPr>
         <w:pStyle w:val="Heading3"/>
       </w:pPr>
-      <w:bookmarkStart w:id="90" w:name="_Toc244207718"/>
+      <w:bookmarkStart w:id="90" w:name="_Toc244208389"/>
       <w:r>
         <w:t>4.7.3 Tái thiết và kiểm tra tính đúng đắn</w:t>
       </w:r>
@@ -30573,7 +30573,7 @@
         <w:spacing w:before="120" w:after="160"/>
         <w:jc w:val="center"/>
       </w:pPr>
-      <w:bookmarkStart w:id="91" w:name="_Toc244207755"/>
+      <w:bookmarkStart w:id="91" w:name="_Toc244208426"/>
       <w:r>
         <w:rPr>
           <w:b/>
@@ -33293,7 +33293,7 @@
       <w:pPr>
         <w:pStyle w:val="Heading3"/>
       </w:pPr>
-      <w:bookmarkStart w:id="92" w:name="_Toc244207719"/>
+      <w:bookmarkStart w:id="92" w:name="_Toc244208390"/>
       <w:r>
         <w:t>4.7.4 Truy vấn minh họa</w:t>
       </w:r>
@@ -33480,7 +33480,7 @@
         <w:spacing w:before="120" w:after="160"/>
         <w:jc w:val="center"/>
       </w:pPr>
-      <w:bookmarkStart w:id="93" w:name="_Toc244207756"/>
+      <w:bookmarkStart w:id="93" w:name="_Toc244208427"/>
       <w:r>
         <w:rPr>
           <w:b/>
@@ -34264,7 +34264,7 @@
         <w:spacing w:before="120" w:after="160"/>
         <w:jc w:val="center"/>
       </w:pPr>
-      <w:bookmarkStart w:id="94" w:name="_Toc244207757"/>
+      <w:bookmarkStart w:id="94" w:name="_Toc244208428"/>
       <w:r>
         <w:rPr>
           <w:b/>
@@ -34819,7 +34819,7 @@
       <w:pPr>
         <w:pStyle w:val="Heading3"/>
       </w:pPr>
-      <w:bookmarkStart w:id="95" w:name="_Toc244207720"/>
+      <w:bookmarkStart w:id="95" w:name="_Toc244208391"/>
       <w:r>
         <w:t>4.7.5 Giao dịch phân tán</w:t>
       </w:r>
@@ -35466,7 +35466,7 @@
       <w:pPr>
         <w:pStyle w:val="Heading2"/>
       </w:pPr>
-      <w:bookmarkStart w:id="96" w:name="_Toc244207721"/>
+      <w:bookmarkStart w:id="96" w:name="_Toc244208392"/>
       <w:r>
         <w:t>4.8 Đánh giá</w:t>
       </w:r>
@@ -35630,7 +35630,7 @@
       <w:pPr>
         <w:pStyle w:val="Heading2"/>
       </w:pPr>
-      <w:bookmarkStart w:id="97" w:name="_Toc244207722"/>
+      <w:bookmarkStart w:id="97" w:name="_Toc244208393"/>
       <w:r>
         <w:t>4.9 Kết chương</w:t>
       </w:r>
@@ -35655,7 +35655,7 @@
         <w:pStyle w:val="Heading1"/>
         <w:pageBreakBefore/>
       </w:pPr>
-      <w:bookmarkStart w:id="98" w:name="_Toc244207723"/>
+      <w:bookmarkStart w:id="98" w:name="_Toc244208394"/>
       <w:r>
         <w:lastRenderedPageBreak/>
         <w:t>CHƯƠNG 5. KẾT LUẬN VÀ HƯỚNG PHÁT TRIỂN</w:t>
@@ -35666,7 +35666,7 @@
       <w:pPr>
         <w:pStyle w:val="Heading2"/>
       </w:pPr>
-      <w:bookmarkStart w:id="99" w:name="_Toc244207724"/>
+      <w:bookmarkStart w:id="99" w:name="_Toc244208395"/>
       <w:r>
         <w:t>5.1 Kết quả đạt được</w:t>
       </w:r>
@@ -35719,7 +35719,7 @@
       <w:pPr>
         <w:pStyle w:val="Heading2"/>
       </w:pPr>
-      <w:bookmarkStart w:id="100" w:name="_Toc244207725"/>
+      <w:bookmarkStart w:id="100" w:name="_Toc244208396"/>
       <w:r>
         <w:t>5.2 Hạn chế</w:t>
       </w:r>
@@ -35785,7 +35785,7 @@
       <w:pPr>
         <w:pStyle w:val="Heading2"/>
       </w:pPr>
-      <w:bookmarkStart w:id="101" w:name="_Toc244207726"/>
+      <w:bookmarkStart w:id="101" w:name="_Toc244208397"/>
       <w:r>
         <w:t>5.3 Hướng phát triển</w:t>
       </w:r>
@@ -35867,7 +35867,7 @@
         <w:pStyle w:val="Heading1"/>
         <w:pageBreakBefore/>
       </w:pPr>
-      <w:bookmarkStart w:id="102" w:name="_Toc244207727"/>
+      <w:bookmarkStart w:id="102" w:name="_Toc244208398"/>
       <w:r>
         <w:lastRenderedPageBreak/>
         <w:t>TÀI LIỆU THAM KHẢO</w:t>
@@ -35982,7 +35982,7 @@
         <w:pStyle w:val="Heading1"/>
         <w:pageBreakBefore/>
       </w:pPr>
-      <w:bookmarkStart w:id="103" w:name="_Toc244207728"/>
+      <w:bookmarkStart w:id="103" w:name="_Toc244208399"/>
       <w:r>
         <w:lastRenderedPageBreak/>
         <w:t>PHỤ LỤC</w:t>
@@ -36003,7 +36003,7 @@
       <w:pPr>
         <w:pStyle w:val="Heading2"/>
       </w:pPr>
-      <w:bookmarkStart w:id="104" w:name="_Toc244207729"/>
+      <w:bookmarkStart w:id="104" w:name="_Toc244208400"/>
       <w:r>
         <w:t>Phụ lục A. Script tái thiết và kiểm tra tính đúng đắn</w:t>
       </w:r>
@@ -43181,7 +43181,7 @@
       <w:pPr>
         <w:pStyle w:val="Heading2"/>
       </w:pPr>
-      <w:bookmarkStart w:id="105" w:name="_Toc244207730"/>
+      <w:bookmarkStart w:id="105" w:name="_Toc244208401"/>
       <w:r>
         <w:t>Phụ lục B. Script truy vấn minh họa và giao dịch phân tán</w:t>
       </w:r>
@@ -51035,10 +51035,10 @@
 <file path=word/numbering.xml><?xml version="1.0" encoding="utf-8"?>
 <w:numbering xmlns:wpc="http://schemas.microsoft.com/office/word/2010/wordprocessingCanvas" xmlns:cx="http://schemas.microsoft.com/office/drawing/2014/chartex" xmlns:cx1="http://schemas.microsoft.com/office/drawing/2015/9/8/chartex" xmlns:cx2="http://schemas.microsoft.com/office/drawing/2015/10/21/chartex" xmlns:cx3="http://schemas.microsoft.com/office/drawing/2016/5/9/chartex" xmlns:cx4="http://schemas.microsoft.com/office/drawing/2016/5/10/chartex" xmlns:cx5="http://schemas.microsoft.com/office/drawing/2016/5/11/chartex" xmlns:cx6="http://schemas.microsoft.com/office/drawing/2016/5/12/chartex" xmlns:cx7="http://schemas.microsoft.com/office/drawing/2016/5/13/chartex" xmlns:cx8="http://schemas.microsoft.com/office/drawing/2016/5/14/chartex" xmlns:mc="http://schemas.openxmlformats.org/markup-compatibility/2006" xmlns:aink="http://schemas.microsoft.com/office/drawing/2016/ink" xmlns:am3d="http://schemas.microsoft.com/office/drawing/2017/model3d" xmlns:o="urn:schemas-microsoft-com:office:office" xmlns:oel="http://schemas.microsoft.com/office/2019/extlst" xmlns:r="http://schemas.openxmlformats.org/officeDocument/2006/relationships" xmlns:m="http://schemas.openxmlformats.org/officeDocument/2006/math" xmlns:v="urn:schemas-microsoft-com:vml" xmlns:wp14="http://schemas.microsoft.com/office/word/2010/wordprocessingDrawing" xmlns:wp="http://schemas.openxmlformats.org/drawingml/2006/wordprocessingDrawing" xmlns:w10="urn:schemas-microsoft-com:office:word" xmlns:w="http://schemas.openxmlformats.org/wordprocessingml/2006/main" xmlns:w14="http://schemas.microsoft.com/office/word/2010/wordml" xmlns:w15="http://schemas.microsoft.com/office/word/2012/wordml" xmlns:w16cex="http://schemas.microsoft.com/office/word/2018/wordml/cex" xmlns:w16cid="http://schemas.microsoft.com/office/word/2016/wordml/cid" xmlns:w16="http://schemas.microsoft.com/office/word/2018/wordml" xmlns:w16sdtdh="http://schemas.microsoft.com/office/word/2020/wordml/sdtdatahash" xmlns:w16se="http://schemas.microsoft.com/office/word/2015/wordml/symex" xmlns:wpg="http://schemas.microsoft.com/office/word/2010/wordprocessingGroup" xmlns:wpi="http://schemas.microsoft.com/office/word/2010/wordprocessingInk" xmlns:wne="http://schemas.microsoft.com/office/word/2006/wordml" xmlns:wps="http://schemas.microsoft.com/office/word/2010/wordprocessingShape" mc:Ignorable="w14 w15 w16se w16cid w16 w16cex w16sdtdh wp14">
   <w:abstractNum w:abstractNumId="0" w15:restartNumberingAfterBreak="0">
-    <w:nsid w:val="4C9B25EB"/>
+    <w:nsid w:val="21016764"/>
     <w:multiLevelType w:val="hybridMultilevel"/>
-    <w:tmpl w:val="C0FABC8E"/>
-    <w:lvl w:ilvl="0" w:tplc="2E96B50E">
+    <w:tmpl w:val="86C01CC0"/>
+    <w:lvl w:ilvl="0" w:tplc="402C62AC">
       <w:start w:val="1"/>
       <w:numFmt w:val="bullet"/>
       <w:lvlText w:val="–"/>
@@ -51047,7 +51047,7 @@
         <w:ind w:left="720" w:hanging="360"/>
       </w:pPr>
     </w:lvl>
-    <w:lvl w:ilvl="1" w:tplc="5C62AFE4" w:tentative="1">
+    <w:lvl w:ilvl="1" w:tplc="C1AA3002" w:tentative="1">
       <w:start w:val="1"/>
       <w:numFmt w:val="bullet"/>
       <w:lvlText w:val="+"/>
@@ -51056,47 +51056,133 @@
         <w:ind w:left="1260" w:hanging="360"/>
       </w:pPr>
     </w:lvl>
-    <w:lvl w:ilvl="2" w:tplc="3FA03E3A">
+    <w:lvl w:ilvl="2" w:tplc="358452B4">
       <w:numFmt w:val="decimal"/>
       <w:lvlText w:val=""/>
       <w:lvlJc w:val="left"/>
     </w:lvl>
-    <w:lvl w:ilvl="3" w:tplc="882A3FD8">
+    <w:lvl w:ilvl="3" w:tplc="1C008542">
       <w:numFmt w:val="decimal"/>
       <w:lvlText w:val=""/>
       <w:lvlJc w:val="left"/>
     </w:lvl>
-    <w:lvl w:ilvl="4" w:tplc="C2A23C76">
+    <w:lvl w:ilvl="4" w:tplc="C9185B86">
       <w:numFmt w:val="decimal"/>
       <w:lvlText w:val=""/>
       <w:lvlJc w:val="left"/>
     </w:lvl>
-    <w:lvl w:ilvl="5" w:tplc="0262A774">
+    <w:lvl w:ilvl="5" w:tplc="97BA24E4">
       <w:numFmt w:val="decimal"/>
       <w:lvlText w:val=""/>
       <w:lvlJc w:val="left"/>
     </w:lvl>
-    <w:lvl w:ilvl="6" w:tplc="8D5ED292">
+    <w:lvl w:ilvl="6" w:tplc="A68234A2">
       <w:numFmt w:val="decimal"/>
       <w:lvlText w:val=""/>
       <w:lvlJc w:val="left"/>
     </w:lvl>
-    <w:lvl w:ilvl="7" w:tplc="D804C536">
+    <w:lvl w:ilvl="7" w:tplc="90B4AB6A">
       <w:numFmt w:val="decimal"/>
       <w:lvlText w:val=""/>
       <w:lvlJc w:val="left"/>
     </w:lvl>
-    <w:lvl w:ilvl="8" w:tplc="2E9C75A0">
+    <w:lvl w:ilvl="8" w:tplc="A81A5FE4">
       <w:numFmt w:val="decimal"/>
       <w:lvlText w:val=""/>
       <w:lvlJc w:val="left"/>
     </w:lvl>
   </w:abstractNum>
   <w:abstractNum w:abstractNumId="1" w15:restartNumberingAfterBreak="0">
-    <w:nsid w:val="57B346BA"/>
+    <w:nsid w:val="34F60225"/>
     <w:multiLevelType w:val="hybridMultilevel"/>
-    <w:tmpl w:val="0BB2F614"/>
-    <w:lvl w:ilvl="0" w:tplc="E0C227DA">
+    <w:tmpl w:val="E9F870D4"/>
+    <w:lvl w:ilvl="0" w:tplc="010CA13E" w:tentative="1">
+      <w:start w:val="1"/>
+      <w:numFmt w:val="bullet"/>
+      <w:lvlText w:val="●"/>
+      <w:lvlJc w:val="left"/>
+      <w:pPr>
+        <w:ind w:left="720" w:hanging="360"/>
+      </w:pPr>
+    </w:lvl>
+    <w:lvl w:ilvl="1" w:tplc="304C53EC" w:tentative="1">
+      <w:start w:val="1"/>
+      <w:numFmt w:val="bullet"/>
+      <w:lvlText w:val="○"/>
+      <w:lvlJc w:val="left"/>
+      <w:pPr>
+        <w:ind w:left="1440" w:hanging="360"/>
+      </w:pPr>
+    </w:lvl>
+    <w:lvl w:ilvl="2" w:tplc="EF32E3BC" w:tentative="1">
+      <w:start w:val="1"/>
+      <w:numFmt w:val="bullet"/>
+      <w:lvlText w:val="■"/>
+      <w:lvlJc w:val="left"/>
+      <w:pPr>
+        <w:ind w:left="2160" w:hanging="360"/>
+      </w:pPr>
+    </w:lvl>
+    <w:lvl w:ilvl="3" w:tplc="4F5025D6" w:tentative="1">
+      <w:start w:val="1"/>
+      <w:numFmt w:val="bullet"/>
+      <w:lvlText w:val="●"/>
+      <w:lvlJc w:val="left"/>
+      <w:pPr>
+        <w:ind w:left="2880" w:hanging="360"/>
+      </w:pPr>
+    </w:lvl>
+    <w:lvl w:ilvl="4" w:tplc="044AFEA4" w:tentative="1">
+      <w:start w:val="1"/>
+      <w:numFmt w:val="bullet"/>
+      <w:lvlText w:val="○"/>
+      <w:lvlJc w:val="left"/>
+      <w:pPr>
+        <w:ind w:left="3600" w:hanging="360"/>
+      </w:pPr>
+    </w:lvl>
+    <w:lvl w:ilvl="5" w:tplc="8F5640FA" w:tentative="1">
+      <w:start w:val="1"/>
+      <w:numFmt w:val="bullet"/>
+      <w:lvlText w:val="■"/>
+      <w:lvlJc w:val="left"/>
+      <w:pPr>
+        <w:ind w:left="4320" w:hanging="360"/>
+      </w:pPr>
+    </w:lvl>
+    <w:lvl w:ilvl="6" w:tplc="3078E00C" w:tentative="1">
+      <w:start w:val="1"/>
+      <w:numFmt w:val="bullet"/>
+      <w:lvlText w:val="●"/>
+      <w:lvlJc w:val="left"/>
+      <w:pPr>
+        <w:ind w:left="5040" w:hanging="360"/>
+      </w:pPr>
+    </w:lvl>
+    <w:lvl w:ilvl="7" w:tplc="DF7AD840" w:tentative="1">
+      <w:start w:val="1"/>
+      <w:numFmt w:val="bullet"/>
+      <w:lvlText w:val="●"/>
+      <w:lvlJc w:val="left"/>
+      <w:pPr>
+        <w:ind w:left="5760" w:hanging="360"/>
+      </w:pPr>
+    </w:lvl>
+    <w:lvl w:ilvl="8" w:tplc="B15E0A1E" w:tentative="1">
+      <w:start w:val="1"/>
+      <w:numFmt w:val="bullet"/>
+      <w:lvlText w:val="●"/>
+      <w:lvlJc w:val="left"/>
+      <w:pPr>
+        <w:ind w:left="6480" w:hanging="360"/>
+      </w:pPr>
+    </w:lvl>
+  </w:abstractNum>
+  <w:abstractNum w:abstractNumId="2" w15:restartNumberingAfterBreak="0">
+    <w:nsid w:val="4CA80A82"/>
+    <w:multiLevelType w:val="hybridMultilevel"/>
+    <w:tmpl w:val="BDEA2A28"/>
+    <w:lvl w:ilvl="0" w:tplc="A6AE14E0">
       <w:start w:val="1"/>
       <w:numFmt w:val="decimal"/>
       <w:lvlText w:val="%1."/>
@@ -51105,140 +51191,54 @@
         <w:ind w:left="720" w:hanging="360"/>
       </w:pPr>
     </w:lvl>
-    <w:lvl w:ilvl="1" w:tplc="35C2AF38">
+    <w:lvl w:ilvl="1" w:tplc="483CAC64">
       <w:numFmt w:val="decimal"/>
       <w:lvlText w:val=""/>
       <w:lvlJc w:val="left"/>
     </w:lvl>
-    <w:lvl w:ilvl="2" w:tplc="99864FDE">
+    <w:lvl w:ilvl="2" w:tplc="16E0189A">
       <w:numFmt w:val="decimal"/>
       <w:lvlText w:val=""/>
       <w:lvlJc w:val="left"/>
     </w:lvl>
-    <w:lvl w:ilvl="3" w:tplc="747E8BC8">
+    <w:lvl w:ilvl="3" w:tplc="1806232A">
       <w:numFmt w:val="decimal"/>
       <w:lvlText w:val=""/>
       <w:lvlJc w:val="left"/>
     </w:lvl>
-    <w:lvl w:ilvl="4" w:tplc="F4EC9094">
+    <w:lvl w:ilvl="4" w:tplc="7102ECF0">
       <w:numFmt w:val="decimal"/>
       <w:lvlText w:val=""/>
       <w:lvlJc w:val="left"/>
     </w:lvl>
-    <w:lvl w:ilvl="5" w:tplc="15B29398">
+    <w:lvl w:ilvl="5" w:tplc="4570664C">
       <w:numFmt w:val="decimal"/>
       <w:lvlText w:val=""/>
       <w:lvlJc w:val="left"/>
     </w:lvl>
-    <w:lvl w:ilvl="6" w:tplc="A5042D2E">
+    <w:lvl w:ilvl="6" w:tplc="020E1380">
       <w:numFmt w:val="decimal"/>
       <w:lvlText w:val=""/>
       <w:lvlJc w:val="left"/>
     </w:lvl>
-    <w:lvl w:ilvl="7" w:tplc="967CB9D6">
+    <w:lvl w:ilvl="7" w:tplc="52F84798">
       <w:numFmt w:val="decimal"/>
       <w:lvlText w:val=""/>
       <w:lvlJc w:val="left"/>
     </w:lvl>
-    <w:lvl w:ilvl="8" w:tplc="D20A77C8">
+    <w:lvl w:ilvl="8" w:tplc="28D029AA">
       <w:numFmt w:val="decimal"/>
       <w:lvlText w:val=""/>
       <w:lvlJc w:val="left"/>
     </w:lvl>
   </w:abstractNum>
-  <w:abstractNum w:abstractNumId="2" w15:restartNumberingAfterBreak="0">
-    <w:nsid w:val="6F073C37"/>
-    <w:multiLevelType w:val="hybridMultilevel"/>
-    <w:tmpl w:val="A2401186"/>
-    <w:lvl w:ilvl="0" w:tplc="997A82EC" w:tentative="1">
-      <w:start w:val="1"/>
-      <w:numFmt w:val="bullet"/>
-      <w:lvlText w:val="●"/>
-      <w:lvlJc w:val="left"/>
-      <w:pPr>
-        <w:ind w:left="720" w:hanging="360"/>
-      </w:pPr>
-    </w:lvl>
-    <w:lvl w:ilvl="1" w:tplc="11DEBEF0" w:tentative="1">
-      <w:start w:val="1"/>
-      <w:numFmt w:val="bullet"/>
-      <w:lvlText w:val="○"/>
-      <w:lvlJc w:val="left"/>
-      <w:pPr>
-        <w:ind w:left="1440" w:hanging="360"/>
-      </w:pPr>
-    </w:lvl>
-    <w:lvl w:ilvl="2" w:tplc="76562F00" w:tentative="1">
-      <w:start w:val="1"/>
-      <w:numFmt w:val="bullet"/>
-      <w:lvlText w:val="■"/>
-      <w:lvlJc w:val="left"/>
-      <w:pPr>
-        <w:ind w:left="2160" w:hanging="360"/>
-      </w:pPr>
-    </w:lvl>
-    <w:lvl w:ilvl="3" w:tplc="6568D210" w:tentative="1">
-      <w:start w:val="1"/>
-      <w:numFmt w:val="bullet"/>
-      <w:lvlText w:val="●"/>
-      <w:lvlJc w:val="left"/>
-      <w:pPr>
-        <w:ind w:left="2880" w:hanging="360"/>
-      </w:pPr>
-    </w:lvl>
-    <w:lvl w:ilvl="4" w:tplc="65B09A64" w:tentative="1">
-      <w:start w:val="1"/>
-      <w:numFmt w:val="bullet"/>
-      <w:lvlText w:val="○"/>
-      <w:lvlJc w:val="left"/>
-      <w:pPr>
-        <w:ind w:left="3600" w:hanging="360"/>
-      </w:pPr>
-    </w:lvl>
-    <w:lvl w:ilvl="5" w:tplc="779E55EC" w:tentative="1">
-      <w:start w:val="1"/>
-      <w:numFmt w:val="bullet"/>
-      <w:lvlText w:val="■"/>
-      <w:lvlJc w:val="left"/>
-      <w:pPr>
-        <w:ind w:left="4320" w:hanging="360"/>
-      </w:pPr>
-    </w:lvl>
-    <w:lvl w:ilvl="6" w:tplc="ABE88F62" w:tentative="1">
-      <w:start w:val="1"/>
-      <w:numFmt w:val="bullet"/>
-      <w:lvlText w:val="●"/>
-      <w:lvlJc w:val="left"/>
-      <w:pPr>
-        <w:ind w:left="5040" w:hanging="360"/>
-      </w:pPr>
-    </w:lvl>
-    <w:lvl w:ilvl="7" w:tplc="1F14AFB6" w:tentative="1">
-      <w:start w:val="1"/>
-      <w:numFmt w:val="bullet"/>
-      <w:lvlText w:val="●"/>
-      <w:lvlJc w:val="left"/>
-      <w:pPr>
-        <w:ind w:left="5760" w:hanging="360"/>
-      </w:pPr>
-    </w:lvl>
-    <w:lvl w:ilvl="8" w:tplc="5094C5B2" w:tentative="1">
-      <w:start w:val="1"/>
-      <w:numFmt w:val="bullet"/>
-      <w:lvlText w:val="●"/>
-      <w:lvlJc w:val="left"/>
-      <w:pPr>
-        <w:ind w:left="6480" w:hanging="360"/>
-      </w:pPr>
-    </w:lvl>
-  </w:abstractNum>
-  <w:num w:numId="1" w16cid:durableId="651447657">
-    <w:abstractNumId w:val="2"/>
+  <w:num w:numId="1" w16cid:durableId="272520828">
+    <w:abstractNumId w:val="1"/>
     <w:lvlOverride w:ilvl="0">
       <w:startOverride w:val="1"/>
     </w:lvlOverride>
   </w:num>
-  <w:num w:numId="2" w16cid:durableId="717169372">
+  <w:num w:numId="2" w16cid:durableId="1419062409">
     <w:abstractNumId w:val="0"/>
     <w:lvlOverride w:ilvl="0">
       <w:startOverride w:val="1"/>
@@ -51247,20 +51247,20 @@
       <w:startOverride w:val="1"/>
     </w:lvlOverride>
   </w:num>
-  <w:num w:numId="3" w16cid:durableId="1044332624">
-    <w:abstractNumId w:val="1"/>
+  <w:num w:numId="3" w16cid:durableId="1926645597">
+    <w:abstractNumId w:val="2"/>
     <w:lvlOverride w:ilvl="0">
       <w:startOverride w:val="1"/>
     </w:lvlOverride>
   </w:num>
-  <w:num w:numId="4" w16cid:durableId="434790140">
-    <w:abstractNumId w:val="1"/>
+  <w:num w:numId="4" w16cid:durableId="1475760875">
+    <w:abstractNumId w:val="2"/>
     <w:lvlOverride w:ilvl="0">
       <w:startOverride w:val="1"/>
     </w:lvlOverride>
   </w:num>
-  <w:num w:numId="5" w16cid:durableId="1057431056">
-    <w:abstractNumId w:val="1"/>
+  <w:num w:numId="5" w16cid:durableId="1356426310">
+    <w:abstractNumId w:val="2"/>
     <w:lvlOverride w:ilvl="0">
       <w:startOverride w:val="1"/>
     </w:lvlOverride>

</xml_diff>